<commit_message>
report + graph changes
</commit_message>
<xml_diff>
--- a/report_data_preprocessing.docx
+++ b/report_data_preprocessing.docx
@@ -124,7 +124,23 @@
           <w:sz w:val="20"/>
           <w:szCs w:val="20"/>
         </w:rPr>
-        <w:t>data exploration methods used on patient data. The target audience is comprised of data scientists and analysts who will use the ABT table for further analysis, predictive modeling and decision-making purposes.</w:t>
+        <w:t>data exploration methods used on patient data. The target audience is comp</w:t>
+      </w:r>
+      <w:r>
+        <w:rPr>
+          <w:rFonts w:ascii="Arial" w:hAnsi="Arial" w:cs="Arial"/>
+          <w:sz w:val="20"/>
+          <w:szCs w:val="20"/>
+        </w:rPr>
+        <w:t>o</w:t>
+      </w:r>
+      <w:r>
+        <w:rPr>
+          <w:rFonts w:ascii="Arial" w:hAnsi="Arial" w:cs="Arial"/>
+          <w:sz w:val="20"/>
+          <w:szCs w:val="20"/>
+        </w:rPr>
+        <w:t>sed of data scientists and analysts who will use the ABT table for further analysis, predictive modeling and decision-making purposes.</w:t>
       </w:r>
     </w:p>
     <w:p>
@@ -171,37 +187,6 @@
           <w:rFonts w:ascii="Garamond" w:hAnsi="Garamond"/>
         </w:rPr>
         <w:t xml:space="preserve"> &amp; Understanding</w:t>
-      </w:r>
-    </w:p>
-    <w:p>
-      <w:pPr>
-        <w:rPr>
-          <w:rFonts w:ascii="Garamond" w:hAnsi="Garamond"/>
-          <w:lang w:val="pt-PT"/>
-        </w:rPr>
-      </w:pPr>
-      <w:r>
-        <w:rPr>
-          <w:rFonts w:ascii="Garamond" w:hAnsi="Garamond"/>
-          <w:lang w:val="pt-PT"/>
-        </w:rPr>
-        <w:t xml:space="preserve">(dizer que cada </w:t>
-      </w:r>
-      <w:proofErr w:type="spellStart"/>
-      <w:r>
-        <w:rPr>
-          <w:rFonts w:ascii="Garamond" w:hAnsi="Garamond"/>
-          <w:lang w:val="pt-PT"/>
-        </w:rPr>
-        <w:t>row</w:t>
-      </w:r>
-      <w:proofErr w:type="spellEnd"/>
-      <w:r>
-        <w:rPr>
-          <w:rFonts w:ascii="Garamond" w:hAnsi="Garamond"/>
-          <w:lang w:val="pt-PT"/>
-        </w:rPr>
-        <w:t xml:space="preserve"> pertence a uma consulta)</w:t>
       </w:r>
     </w:p>
     <w:p>
@@ -339,7 +324,23 @@
           <w:sz w:val="20"/>
           <w:szCs w:val="20"/>
         </w:rPr>
-        <w:t xml:space="preserve">as the index, since its purpose is to differentiate the clients’ appointments. </w:t>
+        <w:t>as the index, since its purpose is to differentiate the clients’ appointments</w:t>
+      </w:r>
+      <w:r>
+        <w:rPr>
+          <w:rFonts w:ascii="Arial" w:hAnsi="Arial" w:cs="Arial"/>
+          <w:sz w:val="20"/>
+          <w:szCs w:val="20"/>
+        </w:rPr>
+        <w:t xml:space="preserve"> - each row is a different appointment</w:t>
+      </w:r>
+      <w:r>
+        <w:rPr>
+          <w:rFonts w:ascii="Arial" w:hAnsi="Arial" w:cs="Arial"/>
+          <w:sz w:val="20"/>
+          <w:szCs w:val="20"/>
+        </w:rPr>
+        <w:t xml:space="preserve">. </w:t>
       </w:r>
       <w:r>
         <w:rPr>
@@ -889,13 +890,13 @@
           <w:szCs w:val="20"/>
         </w:rPr>
         <w:drawing>
-          <wp:anchor distT="0" distB="0" distL="114300" distR="114300" simplePos="0" relativeHeight="251658240" behindDoc="0" locked="0" layoutInCell="1" allowOverlap="1" wp14:anchorId="00ABB3FE" wp14:editId="4CB15D7D">
+          <wp:anchor distT="0" distB="0" distL="114300" distR="114300" simplePos="0" relativeHeight="251658240" behindDoc="0" locked="0" layoutInCell="1" allowOverlap="1" wp14:anchorId="00ABB3FE" wp14:editId="1725A4D3">
             <wp:simplePos x="0" y="0"/>
             <wp:positionH relativeFrom="margin">
-              <wp:posOffset>1382395</wp:posOffset>
+              <wp:posOffset>1392174</wp:posOffset>
             </wp:positionH>
             <wp:positionV relativeFrom="margin">
-              <wp:posOffset>6343015</wp:posOffset>
+              <wp:posOffset>6240329</wp:posOffset>
             </wp:positionV>
             <wp:extent cx="2826385" cy="2123440"/>
             <wp:effectExtent l="0" t="0" r="5715" b="0"/>
@@ -1027,6 +1028,37 @@
     </w:p>
     <w:p>
       <w:pPr>
+        <w:rPr>
+          <w:rFonts w:ascii="Arial" w:hAnsi="Arial" w:cs="Arial"/>
+          <w:b/>
+          <w:bCs/>
+          <w:sz w:val="20"/>
+          <w:szCs w:val="20"/>
+        </w:rPr>
+      </w:pPr>
+      <w:r>
+        <w:rPr>
+          <w:rFonts w:ascii="Arial" w:hAnsi="Arial" w:cs="Arial"/>
+          <w:b/>
+          <w:bCs/>
+          <w:sz w:val="20"/>
+          <w:szCs w:val="20"/>
+        </w:rPr>
+        <w:t>Missing At Random</w:t>
+      </w:r>
+      <w:r>
+        <w:rPr>
+          <w:rFonts w:ascii="Arial" w:hAnsi="Arial" w:cs="Arial"/>
+          <w:b/>
+          <w:bCs/>
+          <w:sz w:val="20"/>
+          <w:szCs w:val="20"/>
+        </w:rPr>
+        <w:t xml:space="preserve"> (MAR)</w:t>
+      </w:r>
+    </w:p>
+    <w:p>
+      <w:pPr>
         <w:ind w:firstLine="720"/>
         <w:rPr>
           <w:rFonts w:ascii="Arial" w:hAnsi="Arial" w:cs="Arial"/>
@@ -1582,7 +1614,7 @@
           <w:sz w:val="20"/>
           <w:szCs w:val="20"/>
         </w:rPr>
-        <w:t>Missing At Random (explain why)</w:t>
+        <w:t>As the values missing in this column were filled for the same Patient in other appointments, and we can fill this information with information from other rows, we can conclude that the missing values where Missing at Random.</w:t>
       </w:r>
     </w:p>
     <w:p>
@@ -1987,7 +2019,25 @@
           <w:szCs w:val="20"/>
           <w:lang w:val="en-US"/>
         </w:rPr>
-        <w:t>, since these for patients with missing coverage, those were the only 2 providers associated.</w:t>
+        <w:t>, since those were the only 2 providers associated</w:t>
+      </w:r>
+      <w:r>
+        <w:rPr>
+          <w:rFonts w:ascii="Arial" w:hAnsi="Arial" w:cs="Arial"/>
+          <w:sz w:val="20"/>
+          <w:szCs w:val="20"/>
+          <w:lang w:val="en-US"/>
+        </w:rPr>
+        <w:t xml:space="preserve"> with missing Insurance Coverage</w:t>
+      </w:r>
+      <w:r>
+        <w:rPr>
+          <w:rFonts w:ascii="Arial" w:hAnsi="Arial" w:cs="Arial"/>
+          <w:sz w:val="20"/>
+          <w:szCs w:val="20"/>
+          <w:lang w:val="en-US"/>
+        </w:rPr>
+        <w:t>.</w:t>
       </w:r>
       <w:r>
         <w:rPr>
@@ -2309,82 +2359,194 @@
         </w:rPr>
         <w:t xml:space="preserve"> for this provider were imputed as 90% of the consultation price.</w:t>
       </w:r>
-    </w:p>
-    <w:p>
-      <w:pPr>
-        <w:rPr>
-          <w:rFonts w:ascii="Arial" w:hAnsi="Arial" w:cs="Arial"/>
-          <w:b/>
-          <w:bCs/>
-          <w:sz w:val="20"/>
-          <w:szCs w:val="20"/>
-        </w:rPr>
-      </w:pPr>
-    </w:p>
-    <w:p>
-      <w:pPr>
-        <w:rPr>
-          <w:rFonts w:ascii="Arial" w:hAnsi="Arial" w:cs="Arial"/>
-          <w:b/>
-          <w:bCs/>
-          <w:sz w:val="20"/>
-          <w:szCs w:val="20"/>
-        </w:rPr>
-      </w:pPr>
-    </w:p>
-    <w:p>
-      <w:pPr>
-        <w:rPr>
-          <w:rFonts w:ascii="Arial" w:hAnsi="Arial" w:cs="Arial"/>
-          <w:b/>
-          <w:bCs/>
-          <w:sz w:val="20"/>
-          <w:szCs w:val="20"/>
-        </w:rPr>
-      </w:pPr>
-    </w:p>
-    <w:p>
-      <w:pPr>
-        <w:rPr>
-          <w:rFonts w:ascii="Arial" w:hAnsi="Arial" w:cs="Arial"/>
-          <w:b/>
-          <w:bCs/>
-          <w:sz w:val="20"/>
-          <w:szCs w:val="20"/>
-        </w:rPr>
-      </w:pPr>
-    </w:p>
-    <w:p>
-      <w:pPr>
-        <w:rPr>
-          <w:rFonts w:ascii="Arial" w:hAnsi="Arial" w:cs="Arial"/>
-          <w:b/>
-          <w:bCs/>
-          <w:sz w:val="20"/>
-          <w:szCs w:val="20"/>
-        </w:rPr>
-      </w:pPr>
-    </w:p>
-    <w:p>
-      <w:pPr>
-        <w:rPr>
-          <w:rFonts w:ascii="Arial" w:hAnsi="Arial" w:cs="Arial"/>
-          <w:b/>
-          <w:bCs/>
-          <w:sz w:val="20"/>
-          <w:szCs w:val="20"/>
-        </w:rPr>
-      </w:pPr>
-      <w:r>
-        <w:rPr>
-          <w:rFonts w:ascii="Arial" w:hAnsi="Arial" w:cs="Arial"/>
-          <w:b/>
-          <w:bCs/>
-          <w:sz w:val="20"/>
-          <w:szCs w:val="20"/>
-        </w:rPr>
-        <w:lastRenderedPageBreak/>
-        <w:t>Missing not at random (explain)</w:t>
+      <w:r>
+        <w:rPr>
+          <w:rFonts w:ascii="Arial" w:hAnsi="Arial" w:cs="Arial"/>
+          <w:sz w:val="20"/>
+          <w:szCs w:val="20"/>
+        </w:rPr>
+        <w:t xml:space="preserve"> Any inconsistencies where the </w:t>
+      </w:r>
+      <w:r>
+        <w:rPr>
+          <w:rFonts w:ascii="Arial" w:hAnsi="Arial" w:cs="Arial"/>
+          <w:b/>
+          <w:bCs/>
+          <w:sz w:val="20"/>
+          <w:szCs w:val="20"/>
+        </w:rPr>
+        <w:t>Insurance Coverage</w:t>
+      </w:r>
+      <w:r>
+        <w:rPr>
+          <w:rFonts w:ascii="Arial" w:hAnsi="Arial" w:cs="Arial"/>
+          <w:sz w:val="20"/>
+          <w:szCs w:val="20"/>
+        </w:rPr>
+        <w:t xml:space="preserve"> surpassed the consultation price were replaced with 90% of the </w:t>
+      </w:r>
+      <w:r>
+        <w:rPr>
+          <w:rFonts w:ascii="Arial" w:hAnsi="Arial" w:cs="Arial"/>
+          <w:b/>
+          <w:bCs/>
+          <w:sz w:val="20"/>
+          <w:szCs w:val="20"/>
+        </w:rPr>
+        <w:t>Consultation Price</w:t>
+      </w:r>
+      <w:r>
+        <w:rPr>
+          <w:rFonts w:ascii="Arial" w:hAnsi="Arial" w:cs="Arial"/>
+          <w:sz w:val="20"/>
+          <w:szCs w:val="20"/>
+        </w:rPr>
+        <w:t>.</w:t>
+      </w:r>
+    </w:p>
+    <w:p>
+      <w:pPr>
+        <w:rPr>
+          <w:rFonts w:ascii="Arial" w:hAnsi="Arial" w:cs="Arial"/>
+          <w:b/>
+          <w:bCs/>
+          <w:sz w:val="20"/>
+          <w:szCs w:val="20"/>
+        </w:rPr>
+      </w:pPr>
+    </w:p>
+    <w:p>
+      <w:pPr>
+        <w:rPr>
+          <w:rFonts w:ascii="Arial" w:hAnsi="Arial" w:cs="Arial"/>
+          <w:b/>
+          <w:bCs/>
+          <w:sz w:val="20"/>
+          <w:szCs w:val="20"/>
+        </w:rPr>
+      </w:pPr>
+    </w:p>
+    <w:p>
+      <w:pPr>
+        <w:rPr>
+          <w:rFonts w:ascii="Arial" w:hAnsi="Arial" w:cs="Arial"/>
+          <w:b/>
+          <w:bCs/>
+          <w:sz w:val="20"/>
+          <w:szCs w:val="20"/>
+        </w:rPr>
+      </w:pPr>
+    </w:p>
+    <w:p>
+      <w:pPr>
+        <w:rPr>
+          <w:rFonts w:ascii="Arial" w:hAnsi="Arial" w:cs="Arial"/>
+          <w:b/>
+          <w:bCs/>
+          <w:sz w:val="20"/>
+          <w:szCs w:val="20"/>
+        </w:rPr>
+      </w:pPr>
+    </w:p>
+    <w:p>
+      <w:pPr>
+        <w:rPr>
+          <w:rFonts w:ascii="Arial" w:hAnsi="Arial" w:cs="Arial"/>
+          <w:b/>
+          <w:bCs/>
+          <w:sz w:val="20"/>
+          <w:szCs w:val="20"/>
+        </w:rPr>
+      </w:pPr>
+    </w:p>
+    <w:p>
+      <w:pPr>
+        <w:rPr>
+          <w:rFonts w:ascii="Arial" w:hAnsi="Arial" w:cs="Arial"/>
+          <w:b/>
+          <w:bCs/>
+          <w:sz w:val="20"/>
+          <w:szCs w:val="20"/>
+        </w:rPr>
+      </w:pPr>
+      <w:r>
+        <w:rPr>
+          <w:rFonts w:ascii="Arial" w:hAnsi="Arial" w:cs="Arial"/>
+          <w:b/>
+          <w:bCs/>
+          <w:sz w:val="20"/>
+          <w:szCs w:val="20"/>
+        </w:rPr>
+        <w:t xml:space="preserve">Missing not at random </w:t>
+      </w:r>
+    </w:p>
+    <w:p>
+      <w:pPr>
+        <w:rPr>
+          <w:rFonts w:ascii="Arial" w:hAnsi="Arial" w:cs="Arial"/>
+          <w:sz w:val="20"/>
+          <w:szCs w:val="20"/>
+        </w:rPr>
+      </w:pPr>
+      <w:r>
+        <w:rPr>
+          <w:rFonts w:ascii="Arial" w:hAnsi="Arial" w:cs="Arial"/>
+          <w:b/>
+          <w:bCs/>
+          <w:sz w:val="20"/>
+          <w:szCs w:val="20"/>
+        </w:rPr>
+        <w:tab/>
+      </w:r>
+      <w:r>
+        <w:rPr>
+          <w:rFonts w:ascii="Arial" w:hAnsi="Arial" w:cs="Arial"/>
+          <w:sz w:val="20"/>
+          <w:szCs w:val="20"/>
+        </w:rPr>
+        <w:t xml:space="preserve">This focused </w:t>
+      </w:r>
+      <w:r>
+        <w:rPr>
+          <w:rFonts w:ascii="Arial" w:hAnsi="Arial" w:cs="Arial"/>
+          <w:sz w:val="20"/>
+          <w:szCs w:val="20"/>
+        </w:rPr>
+        <w:t>on</w:t>
+      </w:r>
+      <w:r>
+        <w:rPr>
+          <w:rFonts w:ascii="Arial" w:hAnsi="Arial" w:cs="Arial"/>
+          <w:sz w:val="20"/>
+          <w:szCs w:val="20"/>
+        </w:rPr>
+        <w:t xml:space="preserve"> the values that are not missing at random – its missingness is related to the value that it’s missing.</w:t>
+      </w:r>
+      <w:r>
+        <w:rPr>
+          <w:rFonts w:ascii="Arial" w:hAnsi="Arial" w:cs="Arial"/>
+          <w:sz w:val="20"/>
+          <w:szCs w:val="20"/>
+        </w:rPr>
+        <w:t xml:space="preserve"> To fill </w:t>
+      </w:r>
+      <w:proofErr w:type="gramStart"/>
+      <w:r>
+        <w:rPr>
+          <w:rFonts w:ascii="Arial" w:hAnsi="Arial" w:cs="Arial"/>
+          <w:sz w:val="20"/>
+          <w:szCs w:val="20"/>
+        </w:rPr>
+        <w:t>this values</w:t>
+      </w:r>
+      <w:proofErr w:type="gramEnd"/>
+      <w:r>
+        <w:rPr>
+          <w:rFonts w:ascii="Arial" w:hAnsi="Arial" w:cs="Arial"/>
+          <w:sz w:val="20"/>
+          <w:szCs w:val="20"/>
+        </w:rPr>
+        <w:t>, we analysed individually the remaining features that still contained missing values.</w:t>
       </w:r>
     </w:p>
     <w:p>
@@ -2430,7 +2592,39 @@
           <w:sz w:val="20"/>
           <w:szCs w:val="20"/>
         </w:rPr>
-        <w:t xml:space="preserve">ll patients with missing values exhibited missingness for this feature in all their consultations. </w:t>
+        <w:t>ll patients with missing values</w:t>
+      </w:r>
+      <w:r>
+        <w:rPr>
+          <w:rFonts w:ascii="Arial" w:hAnsi="Arial" w:cs="Arial"/>
+          <w:sz w:val="20"/>
+          <w:szCs w:val="20"/>
+        </w:rPr>
+        <w:t xml:space="preserve"> </w:t>
+      </w:r>
+      <w:r>
+        <w:rPr>
+          <w:rFonts w:ascii="Arial" w:hAnsi="Arial" w:cs="Arial"/>
+          <w:sz w:val="20"/>
+          <w:szCs w:val="20"/>
+        </w:rPr>
+        <w:t xml:space="preserve">for this feature </w:t>
+      </w:r>
+      <w:r>
+        <w:rPr>
+          <w:rFonts w:ascii="Arial" w:hAnsi="Arial" w:cs="Arial"/>
+          <w:sz w:val="20"/>
+          <w:szCs w:val="20"/>
+        </w:rPr>
+        <w:t xml:space="preserve">had it missing for </w:t>
+      </w:r>
+      <w:r>
+        <w:rPr>
+          <w:rFonts w:ascii="Arial" w:hAnsi="Arial" w:cs="Arial"/>
+          <w:sz w:val="20"/>
+          <w:szCs w:val="20"/>
+        </w:rPr>
+        <w:t xml:space="preserve">all their consultations. </w:t>
       </w:r>
     </w:p>
     <w:p>
@@ -2552,7 +2746,75 @@
           <w:sz w:val="20"/>
           <w:szCs w:val="20"/>
         </w:rPr>
-        <w:t xml:space="preserve"> (???)</w:t>
+        <w:t xml:space="preserve"> </w:t>
+      </w:r>
+    </w:p>
+    <w:p>
+      <w:pPr>
+        <w:rPr>
+          <w:rFonts w:ascii="Arial" w:hAnsi="Arial" w:cs="Arial"/>
+          <w:sz w:val="20"/>
+          <w:szCs w:val="20"/>
+        </w:rPr>
+      </w:pPr>
+      <w:r>
+        <w:rPr>
+          <w:rFonts w:ascii="Arial" w:hAnsi="Arial" w:cs="Arial"/>
+          <w:sz w:val="20"/>
+          <w:szCs w:val="20"/>
+        </w:rPr>
+        <w:t>Missing values in Education Level were considered MAR, depending on the patients’ age, as we can see through the following graph.</w:t>
+      </w:r>
+    </w:p>
+    <w:p>
+      <w:pPr>
+        <w:rPr>
+          <w:rFonts w:ascii="Arial" w:hAnsi="Arial" w:cs="Arial"/>
+          <w:sz w:val="20"/>
+          <w:szCs w:val="20"/>
+        </w:rPr>
+      </w:pPr>
+      <w:r>
+        <w:rPr>
+          <w:rFonts w:ascii="Arial" w:hAnsi="Arial" w:cs="Arial"/>
+          <w:sz w:val="20"/>
+          <w:szCs w:val="20"/>
+        </w:rPr>
+        <w:drawing>
+          <wp:inline distT="0" distB="0" distL="0" distR="0" wp14:anchorId="1C3EF36F" wp14:editId="47D77EC3">
+            <wp:extent cx="4503542" cy="2662373"/>
+            <wp:effectExtent l="0" t="0" r="0" b="5080"/>
+            <wp:docPr id="1581414083" name="Picture 1"/>
+            <wp:cNvGraphicFramePr>
+              <a:graphicFrameLocks xmlns:a="http://schemas.openxmlformats.org/drawingml/2006/main" noChangeAspect="1"/>
+            </wp:cNvGraphicFramePr>
+            <a:graphic xmlns:a="http://schemas.openxmlformats.org/drawingml/2006/main">
+              <a:graphicData uri="http://schemas.openxmlformats.org/drawingml/2006/picture">
+                <pic:pic xmlns:pic="http://schemas.openxmlformats.org/drawingml/2006/picture">
+                  <pic:nvPicPr>
+                    <pic:cNvPr id="1581414083" name=""/>
+                    <pic:cNvPicPr/>
+                  </pic:nvPicPr>
+                  <pic:blipFill>
+                    <a:blip r:embed="rId11"/>
+                    <a:stretch>
+                      <a:fillRect/>
+                    </a:stretch>
+                  </pic:blipFill>
+                  <pic:spPr>
+                    <a:xfrm>
+                      <a:off x="0" y="0"/>
+                      <a:ext cx="4511866" cy="2667294"/>
+                    </a:xfrm>
+                    <a:prstGeom prst="rect">
+                      <a:avLst/>
+                    </a:prstGeom>
+                  </pic:spPr>
+                </pic:pic>
+              </a:graphicData>
+            </a:graphic>
+          </wp:inline>
+        </w:drawing>
       </w:r>
     </w:p>
     <w:p>
@@ -2617,51 +2879,50 @@
           <w:sz w:val="20"/>
           <w:szCs w:val="20"/>
         </w:rPr>
+        <w:t xml:space="preserve">completely </w:t>
+      </w:r>
+      <w:r>
+        <w:rPr>
+          <w:rFonts w:ascii="Arial" w:hAnsi="Arial" w:cs="Arial"/>
+          <w:sz w:val="20"/>
+          <w:szCs w:val="20"/>
+        </w:rPr>
         <w:t xml:space="preserve">resolved </w:t>
       </w:r>
-      <w:proofErr w:type="gramStart"/>
-      <w:r>
-        <w:rPr>
-          <w:rFonts w:ascii="Arial" w:hAnsi="Arial" w:cs="Arial"/>
-          <w:sz w:val="20"/>
-          <w:szCs w:val="20"/>
-        </w:rPr>
-        <w:t xml:space="preserve">all </w:t>
-      </w:r>
-      <w:r>
-        <w:rPr>
-          <w:rFonts w:ascii="Arial" w:hAnsi="Arial" w:cs="Arial"/>
-          <w:sz w:val="20"/>
-          <w:szCs w:val="20"/>
-        </w:rPr>
-        <w:t>of</w:t>
-      </w:r>
-      <w:proofErr w:type="gramEnd"/>
-      <w:r>
-        <w:rPr>
-          <w:rFonts w:ascii="Arial" w:hAnsi="Arial" w:cs="Arial"/>
-          <w:sz w:val="20"/>
-          <w:szCs w:val="20"/>
-        </w:rPr>
-        <w:t xml:space="preserve"> the missing values. </w:t>
-      </w:r>
-    </w:p>
-    <w:p>
-      <w:pPr>
-        <w:rPr>
-          <w:rFonts w:ascii="Arial" w:hAnsi="Arial" w:cs="Arial"/>
-          <w:sz w:val="20"/>
-          <w:szCs w:val="20"/>
-        </w:rPr>
-      </w:pPr>
-      <w:r>
-        <w:rPr>
-          <w:rFonts w:ascii="Arial" w:hAnsi="Arial" w:cs="Arial"/>
-          <w:b/>
-          <w:bCs/>
-          <w:sz w:val="20"/>
-          <w:szCs w:val="20"/>
-        </w:rPr>
+      <w:r>
+        <w:rPr>
+          <w:rFonts w:ascii="Arial" w:hAnsi="Arial" w:cs="Arial"/>
+          <w:sz w:val="20"/>
+          <w:szCs w:val="20"/>
+        </w:rPr>
+        <w:t>all</w:t>
+      </w:r>
+      <w:r>
+        <w:rPr>
+          <w:rFonts w:ascii="Arial" w:hAnsi="Arial" w:cs="Arial"/>
+          <w:sz w:val="20"/>
+          <w:szCs w:val="20"/>
+        </w:rPr>
+        <w:t xml:space="preserve"> missing values. </w:t>
+      </w:r>
+    </w:p>
+    <w:p>
+      <w:pPr>
+        <w:rPr>
+          <w:rFonts w:ascii="Arial" w:hAnsi="Arial" w:cs="Arial"/>
+          <w:sz w:val="20"/>
+          <w:szCs w:val="20"/>
+        </w:rPr>
+      </w:pPr>
+      <w:r>
+        <w:rPr>
+          <w:rFonts w:ascii="Arial" w:hAnsi="Arial" w:cs="Arial"/>
+          <w:b/>
+          <w:bCs/>
+          <w:sz w:val="20"/>
+          <w:szCs w:val="20"/>
+        </w:rPr>
+        <w:lastRenderedPageBreak/>
         <w:t>Approximate Annual Income</w:t>
       </w:r>
       <w:r>
@@ -2942,7 +3203,7 @@
                     <pic:cNvPicPr/>
                   </pic:nvPicPr>
                   <pic:blipFill>
-                    <a:blip r:embed="rId11" cstate="print">
+                    <a:blip r:embed="rId12" cstate="print">
                       <a:extLst>
                         <a:ext uri="{28A0092B-C50C-407E-A947-70E740481C1C}">
                           <a14:useLocalDpi xmlns:a14="http://schemas.microsoft.com/office/drawing/2010/main" val="0"/>
@@ -3038,15 +3299,23 @@
           <w:sz w:val="20"/>
           <w:szCs w:val="20"/>
         </w:rPr>
-        <w:t xml:space="preserve">: </w:t>
-      </w:r>
-      <w:r>
-        <w:rPr>
-          <w:rFonts w:ascii="Arial" w:hAnsi="Arial" w:cs="Arial"/>
-          <w:sz w:val="20"/>
-          <w:szCs w:val="20"/>
-        </w:rPr>
-        <w:t>The remaining</w:t>
+        <w:t>:</w:t>
+      </w:r>
+      <w:r>
+        <w:rPr>
+          <w:rFonts w:ascii="Arial" w:hAnsi="Arial" w:cs="Arial"/>
+          <w:sz w:val="20"/>
+          <w:szCs w:val="20"/>
+        </w:rPr>
+        <w:t xml:space="preserve"> T</w:t>
+      </w:r>
+      <w:r>
+        <w:rPr>
+          <w:rFonts w:ascii="Arial" w:hAnsi="Arial" w:cs="Arial"/>
+          <w:sz w:val="20"/>
+          <w:szCs w:val="20"/>
+        </w:rPr>
+        <w:t>he remaining</w:t>
       </w:r>
       <w:r>
         <w:rPr>
@@ -3083,113 +3352,702 @@
           <w:sz w:val="20"/>
           <w:szCs w:val="20"/>
         </w:rPr>
+        <w:t>O</w:t>
+      </w:r>
+      <w:r>
+        <w:rPr>
+          <w:rFonts w:ascii="Arial" w:hAnsi="Arial" w:cs="Arial"/>
+          <w:b/>
+          <w:bCs/>
+          <w:sz w:val="20"/>
+          <w:szCs w:val="20"/>
+        </w:rPr>
+        <w:t>utliers</w:t>
+      </w:r>
+    </w:p>
+    <w:p>
+      <w:pPr>
+        <w:rPr>
+          <w:rFonts w:ascii="Arial" w:hAnsi="Arial" w:cs="Arial"/>
+          <w:sz w:val="20"/>
+          <w:szCs w:val="20"/>
+        </w:rPr>
+      </w:pPr>
+      <w:r>
+        <w:rPr>
+          <w:rFonts w:ascii="Arial" w:hAnsi="Arial" w:cs="Arial"/>
+          <w:sz w:val="20"/>
+          <w:szCs w:val="20"/>
+        </w:rPr>
+        <w:t>In the process of Exploratory Data Analysis, several numerical features showed the presence of extreme values. To maintain the quality of the data and the accuracy of further analysis, an outlier treatment was conducted, based on domain knowledge and the Interquartile Range technique (IQR).</w:t>
+      </w:r>
+    </w:p>
+    <w:p>
+      <w:pPr>
+        <w:rPr>
+          <w:rFonts w:ascii="Arial" w:hAnsi="Arial" w:cs="Arial"/>
+          <w:b/>
+          <w:bCs/>
+          <w:sz w:val="20"/>
+          <w:szCs w:val="20"/>
+        </w:rPr>
+      </w:pPr>
+      <w:r>
+        <w:rPr>
+          <w:rFonts w:ascii="Arial" w:hAnsi="Arial" w:cs="Arial"/>
+          <w:b/>
+          <w:bCs/>
+          <w:sz w:val="20"/>
+          <w:szCs w:val="20"/>
+        </w:rPr>
+        <w:t>Age</w:t>
+      </w:r>
+    </w:p>
+    <w:p>
+      <w:pPr>
+        <w:rPr>
+          <w:rFonts w:ascii="Arial" w:hAnsi="Arial" w:cs="Arial"/>
+          <w:sz w:val="20"/>
+          <w:szCs w:val="20"/>
+        </w:rPr>
+      </w:pPr>
+      <w:r>
+        <w:rPr>
+          <w:rFonts w:ascii="Arial" w:hAnsi="Arial" w:cs="Arial"/>
+          <w:sz w:val="20"/>
+          <w:szCs w:val="20"/>
+        </w:rPr>
+        <w:t>All observations above 127 (</w:t>
+      </w:r>
+      <w:r>
+        <w:rPr>
+          <w:rFonts w:ascii="Arial" w:hAnsi="Arial" w:cs="Arial"/>
+          <w:sz w:val="20"/>
+          <w:szCs w:val="20"/>
+        </w:rPr>
+        <w:t xml:space="preserve">corresponding to </w:t>
+      </w:r>
+      <w:r>
+        <w:rPr>
+          <w:rFonts w:ascii="Arial" w:hAnsi="Arial" w:cs="Arial"/>
+          <w:sz w:val="20"/>
+          <w:szCs w:val="20"/>
+        </w:rPr>
+        <w:t xml:space="preserve">Q3+IQR) were considered outliers, therefore, the respective age was </w:t>
+      </w:r>
+      <w:r>
+        <w:rPr>
+          <w:rFonts w:ascii="Arial" w:hAnsi="Arial" w:cs="Arial"/>
+          <w:sz w:val="20"/>
+          <w:szCs w:val="20"/>
+        </w:rPr>
+        <w:t>capped</w:t>
+      </w:r>
+      <w:r>
+        <w:rPr>
+          <w:rFonts w:ascii="Arial" w:hAnsi="Arial" w:cs="Arial"/>
+          <w:sz w:val="20"/>
+          <w:szCs w:val="20"/>
+        </w:rPr>
+        <w:t xml:space="preserve"> </w:t>
+      </w:r>
+      <w:r>
+        <w:rPr>
+          <w:rFonts w:ascii="Arial" w:hAnsi="Arial" w:cs="Arial"/>
+          <w:sz w:val="20"/>
+          <w:szCs w:val="20"/>
+        </w:rPr>
+        <w:t>at that value.</w:t>
+      </w:r>
+    </w:p>
+    <w:p>
+      <w:pPr>
+        <w:rPr>
+          <w:rFonts w:ascii="Arial" w:hAnsi="Arial" w:cs="Arial"/>
+          <w:b/>
+          <w:bCs/>
+          <w:sz w:val="20"/>
+          <w:szCs w:val="20"/>
+        </w:rPr>
+      </w:pPr>
+      <w:r>
+        <w:rPr>
+          <w:rFonts w:ascii="Arial" w:hAnsi="Arial" w:cs="Arial"/>
+          <w:b/>
+          <w:bCs/>
+          <w:sz w:val="20"/>
+          <w:szCs w:val="20"/>
+        </w:rPr>
+        <w:t>Consultation Duration</w:t>
+      </w:r>
+    </w:p>
+    <w:p>
+      <w:pPr>
+        <w:rPr>
+          <w:rFonts w:ascii="Arial" w:hAnsi="Arial" w:cs="Arial"/>
+          <w:sz w:val="20"/>
+          <w:szCs w:val="20"/>
+        </w:rPr>
+      </w:pPr>
+      <w:r>
+        <w:rPr>
+          <w:rFonts w:ascii="Arial" w:hAnsi="Arial" w:cs="Arial"/>
+          <w:sz w:val="20"/>
+          <w:szCs w:val="20"/>
+        </w:rPr>
+        <w:t>All observations above 173.5 minutes (nearly 3 hours) were considered outliers (the lower bound is a negative value and there are no consultations with negative durations)</w:t>
+      </w:r>
+    </w:p>
+    <w:p>
+      <w:pPr>
+        <w:rPr>
+          <w:rFonts w:ascii="Arial" w:hAnsi="Arial" w:cs="Arial"/>
+          <w:b/>
+          <w:bCs/>
+          <w:sz w:val="20"/>
+          <w:szCs w:val="20"/>
+        </w:rPr>
+      </w:pPr>
+      <w:r>
+        <w:rPr>
+          <w:rFonts w:ascii="Arial" w:hAnsi="Arial" w:cs="Arial"/>
+          <w:b/>
+          <w:bCs/>
+          <w:sz w:val="20"/>
+          <w:szCs w:val="20"/>
+        </w:rPr>
+        <w:t>Satisfaction Level</w:t>
+      </w:r>
+    </w:p>
+    <w:p>
+      <w:pPr>
+        <w:rPr>
+          <w:rFonts w:ascii="Arial" w:hAnsi="Arial" w:cs="Arial"/>
+          <w:sz w:val="20"/>
+          <w:szCs w:val="20"/>
+        </w:rPr>
+      </w:pPr>
+      <w:r>
+        <w:rPr>
+          <w:rFonts w:ascii="Arial" w:hAnsi="Arial" w:cs="Arial"/>
+          <w:sz w:val="20"/>
+          <w:szCs w:val="20"/>
+        </w:rPr>
+        <w:t xml:space="preserve">Since this feature has only a range of 1-5, all values outside this range were considered data errors and so for values higher than 5 </w:t>
+      </w:r>
+      <w:r>
+        <w:rPr>
+          <w:rFonts w:ascii="Arial" w:hAnsi="Arial" w:cs="Arial"/>
+          <w:sz w:val="20"/>
+          <w:szCs w:val="20"/>
+        </w:rPr>
+        <w:t>–</w:t>
+      </w:r>
+      <w:r>
+        <w:rPr>
+          <w:rFonts w:ascii="Arial" w:hAnsi="Arial" w:cs="Arial"/>
+          <w:sz w:val="20"/>
+          <w:szCs w:val="20"/>
+        </w:rPr>
+        <w:t xml:space="preserve"> observations</w:t>
+      </w:r>
+      <w:r>
+        <w:rPr>
+          <w:rFonts w:ascii="Arial" w:hAnsi="Arial" w:cs="Arial"/>
+          <w:sz w:val="20"/>
+          <w:szCs w:val="20"/>
+        </w:rPr>
+        <w:t xml:space="preserve"> with </w:t>
+      </w:r>
+      <w:r>
+        <w:rPr>
+          <w:rFonts w:ascii="Arial" w:hAnsi="Arial" w:cs="Arial"/>
+          <w:sz w:val="20"/>
+          <w:szCs w:val="20"/>
+        </w:rPr>
+        <w:t>a satisfaction level of 6</w:t>
+      </w:r>
+      <w:r>
+        <w:rPr>
+          <w:rFonts w:ascii="Arial" w:hAnsi="Arial" w:cs="Arial"/>
+          <w:sz w:val="20"/>
+          <w:szCs w:val="20"/>
+        </w:rPr>
+        <w:t xml:space="preserve">- </w:t>
+      </w:r>
+      <w:r>
+        <w:rPr>
+          <w:rFonts w:ascii="Arial" w:hAnsi="Arial" w:cs="Arial"/>
+          <w:sz w:val="20"/>
+          <w:szCs w:val="20"/>
+        </w:rPr>
+        <w:t>were replaced by 5.</w:t>
+      </w:r>
+    </w:p>
+    <w:p>
+      <w:pPr>
+        <w:rPr>
+          <w:rFonts w:ascii="Arial" w:hAnsi="Arial" w:cs="Arial"/>
+          <w:b/>
+          <w:bCs/>
+          <w:sz w:val="20"/>
+          <w:szCs w:val="20"/>
+        </w:rPr>
+      </w:pPr>
+      <w:r>
+        <w:rPr>
+          <w:rFonts w:ascii="Arial" w:hAnsi="Arial" w:cs="Arial"/>
+          <w:b/>
+          <w:bCs/>
+          <w:sz w:val="20"/>
+          <w:szCs w:val="20"/>
+        </w:rPr>
+        <w:t>Consultation Price</w:t>
+      </w:r>
+    </w:p>
+    <w:p>
+      <w:pPr>
+        <w:rPr>
+          <w:rFonts w:ascii="Arial" w:hAnsi="Arial" w:cs="Arial"/>
+          <w:sz w:val="20"/>
+          <w:szCs w:val="20"/>
+          <w:lang/>
+        </w:rPr>
+      </w:pPr>
+      <w:r>
+        <w:rPr>
+          <w:rFonts w:ascii="Arial" w:hAnsi="Arial" w:cs="Arial"/>
+          <w:sz w:val="20"/>
+          <w:szCs w:val="20"/>
+          <w:lang/>
+        </w:rPr>
+        <w:t>E</w:t>
+      </w:r>
+      <w:r>
+        <w:rPr>
+          <w:rFonts w:ascii="Arial" w:hAnsi="Arial" w:cs="Arial"/>
+          <w:sz w:val="20"/>
+          <w:szCs w:val="20"/>
+          <w:lang/>
+        </w:rPr>
+        <w:t xml:space="preserve">xtreme high values (&gt;10000) were </w:t>
+      </w:r>
+      <w:r>
+        <w:rPr>
+          <w:rFonts w:ascii="Arial" w:hAnsi="Arial" w:cs="Arial"/>
+          <w:sz w:val="20"/>
+          <w:szCs w:val="20"/>
+          <w:lang/>
+        </w:rPr>
+        <w:t>considered data</w:t>
+      </w:r>
+      <w:r>
+        <w:rPr>
+          <w:rFonts w:ascii="Arial" w:hAnsi="Arial" w:cs="Arial"/>
+          <w:sz w:val="20"/>
+          <w:szCs w:val="20"/>
+          <w:lang/>
+        </w:rPr>
+        <w:t xml:space="preserve"> errors and removed</w:t>
+      </w:r>
+      <w:r>
+        <w:rPr>
+          <w:rFonts w:ascii="Arial" w:hAnsi="Arial" w:cs="Arial"/>
+          <w:sz w:val="20"/>
+          <w:szCs w:val="20"/>
+          <w:lang/>
+        </w:rPr>
+        <w:t>, while v</w:t>
+      </w:r>
+      <w:r>
+        <w:rPr>
+          <w:rFonts w:ascii="Arial" w:hAnsi="Arial" w:cs="Arial"/>
+          <w:sz w:val="20"/>
+          <w:szCs w:val="20"/>
+          <w:lang/>
+        </w:rPr>
+        <w:t>alues within a plausible range</w:t>
+      </w:r>
+      <w:r>
+        <w:rPr>
+          <w:rFonts w:ascii="Arial" w:hAnsi="Arial" w:cs="Arial"/>
+          <w:sz w:val="20"/>
+          <w:szCs w:val="20"/>
+          <w:lang w:val="en-US"/>
+        </w:rPr>
+        <w:t xml:space="preserve">, </w:t>
+      </w:r>
+      <w:r>
+        <w:rPr>
+          <w:rFonts w:ascii="Arial" w:hAnsi="Arial" w:cs="Arial"/>
+          <w:sz w:val="20"/>
+          <w:szCs w:val="20"/>
+          <w:lang/>
+        </w:rPr>
+        <w:t>even if high</w:t>
+      </w:r>
+      <w:r>
+        <w:rPr>
+          <w:rFonts w:ascii="Arial" w:hAnsi="Arial" w:cs="Arial"/>
+          <w:sz w:val="20"/>
+          <w:szCs w:val="20"/>
+          <w:lang w:val="en-US"/>
+        </w:rPr>
+        <w:t>,</w:t>
+      </w:r>
+      <w:r>
+        <w:rPr>
+          <w:rFonts w:ascii="Arial" w:hAnsi="Arial" w:cs="Arial"/>
+          <w:sz w:val="20"/>
+          <w:szCs w:val="20"/>
+          <w:lang/>
+        </w:rPr>
+        <w:t xml:space="preserve"> were </w:t>
+      </w:r>
+      <w:r>
+        <w:rPr>
+          <w:rFonts w:ascii="Arial" w:hAnsi="Arial" w:cs="Arial"/>
+          <w:sz w:val="20"/>
+          <w:szCs w:val="20"/>
+          <w:lang/>
+        </w:rPr>
+        <w:t>mantained</w:t>
+      </w:r>
+      <w:r>
+        <w:rPr>
+          <w:rFonts w:ascii="Arial" w:hAnsi="Arial" w:cs="Arial"/>
+          <w:sz w:val="20"/>
+          <w:szCs w:val="20"/>
+          <w:lang/>
+        </w:rPr>
+        <w:t>.</w:t>
+      </w:r>
+    </w:p>
+    <w:p>
+      <w:pPr>
+        <w:rPr>
+          <w:rFonts w:ascii="Arial" w:hAnsi="Arial" w:cs="Arial"/>
+          <w:b/>
+          <w:bCs/>
+          <w:sz w:val="20"/>
+          <w:szCs w:val="20"/>
+        </w:rPr>
+      </w:pPr>
+      <w:r>
+        <w:rPr>
+          <w:rFonts w:ascii="Arial" w:hAnsi="Arial" w:cs="Arial"/>
+          <w:b/>
+          <w:bCs/>
+          <w:sz w:val="20"/>
+          <w:szCs w:val="20"/>
+        </w:rPr>
+        <w:t>Insurance Coverage</w:t>
+      </w:r>
+    </w:p>
+    <w:p>
+      <w:pPr>
+        <w:rPr>
+          <w:rFonts w:ascii="Arial" w:hAnsi="Arial" w:cs="Arial"/>
+          <w:sz w:val="20"/>
+          <w:szCs w:val="20"/>
+          <w:lang/>
+        </w:rPr>
+      </w:pPr>
+      <w:r>
+        <w:rPr>
+          <w:rFonts w:ascii="Arial" w:hAnsi="Arial" w:cs="Arial"/>
+          <w:sz w:val="20"/>
+          <w:szCs w:val="20"/>
+          <w:lang/>
+        </w:rPr>
+        <w:t>Some observations had high values however,</w:t>
+      </w:r>
+      <w:r>
+        <w:rPr>
+          <w:rFonts w:ascii="Arial" w:hAnsi="Arial" w:cs="Arial"/>
+          <w:sz w:val="20"/>
+          <w:szCs w:val="20"/>
+          <w:lang/>
+        </w:rPr>
+        <w:t xml:space="preserve"> they were plausible given </w:t>
+      </w:r>
+      <w:r>
+        <w:rPr>
+          <w:rFonts w:ascii="Arial" w:hAnsi="Arial" w:cs="Arial"/>
+          <w:sz w:val="20"/>
+          <w:szCs w:val="20"/>
+          <w:lang/>
+        </w:rPr>
+        <w:t>that the</w:t>
+      </w:r>
+      <w:r>
+        <w:rPr>
+          <w:rFonts w:ascii="Arial" w:hAnsi="Arial" w:cs="Arial"/>
+          <w:sz w:val="20"/>
+          <w:szCs w:val="20"/>
+          <w:lang/>
+        </w:rPr>
+        <w:t xml:space="preserve"> corresponding Consultation Price</w:t>
+      </w:r>
+      <w:r>
+        <w:rPr>
+          <w:rFonts w:ascii="Arial" w:hAnsi="Arial" w:cs="Arial"/>
+          <w:sz w:val="20"/>
+          <w:szCs w:val="20"/>
+          <w:lang/>
+        </w:rPr>
+        <w:t xml:space="preserve"> was also high. Therefore, n</w:t>
+      </w:r>
+      <w:r>
+        <w:rPr>
+          <w:rFonts w:ascii="Arial" w:hAnsi="Arial" w:cs="Arial"/>
+          <w:sz w:val="20"/>
+          <w:szCs w:val="20"/>
+          <w:lang/>
+        </w:rPr>
+        <w:t>o removal or clipping was applied</w:t>
+      </w:r>
+      <w:r>
+        <w:rPr>
+          <w:rFonts w:ascii="Arial" w:hAnsi="Arial" w:cs="Arial"/>
+          <w:sz w:val="20"/>
+          <w:szCs w:val="20"/>
+          <w:lang/>
+        </w:rPr>
+        <w:t>.</w:t>
+      </w:r>
+    </w:p>
+    <w:p>
+      <w:pPr>
+        <w:rPr>
+          <w:rFonts w:ascii="Arial" w:hAnsi="Arial" w:cs="Arial"/>
+          <w:b/>
+          <w:bCs/>
+          <w:sz w:val="20"/>
+          <w:szCs w:val="20"/>
+        </w:rPr>
+      </w:pPr>
+      <w:r>
+        <w:rPr>
+          <w:rFonts w:ascii="Arial" w:hAnsi="Arial" w:cs="Arial"/>
+          <w:b/>
+          <w:bCs/>
+          <w:sz w:val="20"/>
+          <w:szCs w:val="20"/>
+        </w:rPr>
+        <w:t>D</w:t>
+      </w:r>
+      <w:r>
+        <w:rPr>
+          <w:rFonts w:ascii="Arial" w:hAnsi="Arial" w:cs="Arial"/>
+          <w:b/>
+          <w:bCs/>
+          <w:sz w:val="20"/>
+          <w:szCs w:val="20"/>
+        </w:rPr>
+        <w:t>ata</w:t>
+      </w:r>
+      <w:r>
+        <w:rPr>
+          <w:rFonts w:ascii="Arial" w:hAnsi="Arial" w:cs="Arial"/>
+          <w:b/>
+          <w:bCs/>
+          <w:sz w:val="20"/>
+          <w:szCs w:val="20"/>
+        </w:rPr>
+        <w:t xml:space="preserve"> </w:t>
+      </w:r>
+      <w:r>
+        <w:rPr>
+          <w:rFonts w:ascii="Arial" w:hAnsi="Arial" w:cs="Arial"/>
+          <w:b/>
+          <w:bCs/>
+          <w:sz w:val="20"/>
+          <w:szCs w:val="20"/>
+        </w:rPr>
+        <w:t>Types</w:t>
+      </w:r>
+    </w:p>
+    <w:p>
+      <w:pPr>
+        <w:rPr>
+          <w:rFonts w:ascii="Arial" w:hAnsi="Arial" w:cs="Arial"/>
+          <w:sz w:val="20"/>
+          <w:szCs w:val="20"/>
+        </w:rPr>
+      </w:pPr>
+      <w:r>
+        <w:rPr>
+          <w:rFonts w:ascii="Arial" w:hAnsi="Arial" w:cs="Arial"/>
+          <w:sz w:val="20"/>
+          <w:szCs w:val="20"/>
+        </w:rPr>
         <w:lastRenderedPageBreak/>
-        <w:t>O</w:t>
-      </w:r>
-      <w:r>
-        <w:rPr>
-          <w:rFonts w:ascii="Arial" w:hAnsi="Arial" w:cs="Arial"/>
-          <w:b/>
-          <w:bCs/>
-          <w:sz w:val="20"/>
-          <w:szCs w:val="20"/>
-        </w:rPr>
-        <w:t>utliers</w:t>
-      </w:r>
-    </w:p>
-    <w:p>
-      <w:pPr>
-        <w:rPr>
-          <w:rFonts w:ascii="Arial" w:hAnsi="Arial" w:cs="Arial"/>
-          <w:sz w:val="20"/>
-          <w:szCs w:val="20"/>
-        </w:rPr>
-      </w:pPr>
-      <w:r>
-        <w:rPr>
-          <w:rFonts w:ascii="Arial" w:hAnsi="Arial" w:cs="Arial"/>
-          <w:sz w:val="20"/>
-          <w:szCs w:val="20"/>
-        </w:rPr>
-        <w:t>In the process of Exploratory Data Analysis, several numerical features showed the presence of extreme values. To maintain the quality of the data and the accuracy of further analysis, an outlier treatment was conducted, based on domain knowledge and the Interquartile Range technique (IQR).</w:t>
-      </w:r>
-    </w:p>
-    <w:p>
-      <w:pPr>
-        <w:rPr>
-          <w:rFonts w:ascii="Arial" w:hAnsi="Arial" w:cs="Arial"/>
-          <w:b/>
-          <w:bCs/>
-          <w:sz w:val="20"/>
-          <w:szCs w:val="20"/>
-        </w:rPr>
-      </w:pPr>
-      <w:r>
-        <w:rPr>
-          <w:rFonts w:ascii="Arial" w:hAnsi="Arial" w:cs="Arial"/>
-          <w:b/>
-          <w:bCs/>
-          <w:sz w:val="20"/>
-          <w:szCs w:val="20"/>
-        </w:rPr>
-        <w:t>Age</w:t>
-      </w:r>
-    </w:p>
-    <w:p>
-      <w:pPr>
-        <w:rPr>
-          <w:rFonts w:ascii="Arial" w:hAnsi="Arial" w:cs="Arial"/>
-          <w:sz w:val="20"/>
-          <w:szCs w:val="20"/>
-        </w:rPr>
-      </w:pPr>
-      <w:r>
-        <w:rPr>
-          <w:rFonts w:ascii="Arial" w:hAnsi="Arial" w:cs="Arial"/>
-          <w:sz w:val="20"/>
-          <w:szCs w:val="20"/>
-        </w:rPr>
-        <w:t>All observations above 12</w:t>
-      </w:r>
-      <w:r>
-        <w:rPr>
-          <w:rFonts w:ascii="Arial" w:hAnsi="Arial" w:cs="Arial"/>
-          <w:sz w:val="20"/>
-          <w:szCs w:val="20"/>
-        </w:rPr>
-        <w:t>7</w:t>
-      </w:r>
-      <w:r>
-        <w:rPr>
-          <w:rFonts w:ascii="Arial" w:hAnsi="Arial" w:cs="Arial"/>
-          <w:sz w:val="20"/>
-          <w:szCs w:val="20"/>
-        </w:rPr>
-        <w:t xml:space="preserve"> (</w:t>
-      </w:r>
-      <w:r>
-        <w:rPr>
-          <w:rFonts w:ascii="Arial" w:hAnsi="Arial" w:cs="Arial"/>
-          <w:sz w:val="20"/>
-          <w:szCs w:val="20"/>
-        </w:rPr>
-        <w:t xml:space="preserve">corresponding to </w:t>
-      </w:r>
-      <w:r>
-        <w:rPr>
-          <w:rFonts w:ascii="Arial" w:hAnsi="Arial" w:cs="Arial"/>
-          <w:sz w:val="20"/>
-          <w:szCs w:val="20"/>
-        </w:rPr>
-        <w:t xml:space="preserve">Q3+IQR) were considered outliers, therefore, the respective age was </w:t>
-      </w:r>
-      <w:r>
-        <w:rPr>
-          <w:rFonts w:ascii="Arial" w:hAnsi="Arial" w:cs="Arial"/>
-          <w:sz w:val="20"/>
-          <w:szCs w:val="20"/>
-        </w:rPr>
-        <w:t>capped</w:t>
+        <w:t>For memory optimization and improved performance, a mapping of the appropriate datatypes for each column was applied.</w:t>
+      </w:r>
+    </w:p>
+    <w:p>
+      <w:pPr>
+        <w:rPr>
+          <w:rFonts w:ascii="Arial" w:hAnsi="Arial" w:cs="Arial"/>
+          <w:b/>
+          <w:bCs/>
+          <w:sz w:val="20"/>
+          <w:szCs w:val="20"/>
+        </w:rPr>
+      </w:pPr>
+      <w:r>
+        <w:rPr>
+          <w:rFonts w:ascii="Arial" w:hAnsi="Arial" w:cs="Arial"/>
+          <w:b/>
+          <w:bCs/>
+          <w:sz w:val="20"/>
+          <w:szCs w:val="20"/>
+        </w:rPr>
+        <w:t>Deduplication</w:t>
+      </w:r>
+    </w:p>
+    <w:p>
+      <w:pPr>
+        <w:rPr>
+          <w:rFonts w:ascii="Arial" w:hAnsi="Arial" w:cs="Arial"/>
+          <w:sz w:val="20"/>
+          <w:szCs w:val="20"/>
+          <w:lang/>
+        </w:rPr>
+      </w:pPr>
+      <w:r>
+        <w:rPr>
+          <w:rFonts w:ascii="Arial" w:hAnsi="Arial" w:cs="Arial"/>
+          <w:sz w:val="20"/>
+          <w:szCs w:val="20"/>
+          <w:lang/>
+        </w:rPr>
+        <w:t>For data integrity purposes, the duplicates in the dataset were identified and then removed.</w:t>
+      </w:r>
+    </w:p>
+    <w:p>
+      <w:pPr>
+        <w:rPr>
+          <w:rFonts w:ascii="Arial" w:hAnsi="Arial" w:cs="Arial"/>
+          <w:b/>
+          <w:bCs/>
+          <w:sz w:val="20"/>
+          <w:szCs w:val="20"/>
+        </w:rPr>
+      </w:pPr>
+      <w:r>
+        <w:rPr>
+          <w:rFonts w:ascii="Arial" w:hAnsi="Arial" w:cs="Arial"/>
+          <w:b/>
+          <w:bCs/>
+          <w:sz w:val="20"/>
+          <w:szCs w:val="20"/>
+        </w:rPr>
+        <w:t>Data Transformation</w:t>
+      </w:r>
+    </w:p>
+    <w:p>
+      <w:pPr>
+        <w:rPr>
+          <w:rFonts w:ascii="Arial" w:hAnsi="Arial" w:cs="Arial"/>
+          <w:b/>
+          <w:bCs/>
+          <w:sz w:val="20"/>
+          <w:szCs w:val="20"/>
+        </w:rPr>
+      </w:pPr>
+      <w:r>
+        <w:rPr>
+          <w:rFonts w:ascii="Arial" w:hAnsi="Arial" w:cs="Arial"/>
+          <w:b/>
+          <w:bCs/>
+          <w:sz w:val="20"/>
+          <w:szCs w:val="20"/>
+        </w:rPr>
+        <w:t>Distribution and Skewness Analysis</w:t>
+      </w:r>
+    </w:p>
+    <w:p>
+      <w:pPr>
+        <w:rPr>
+          <w:rFonts w:ascii="Arial" w:hAnsi="Arial" w:cs="Arial"/>
+          <w:sz w:val="20"/>
+          <w:szCs w:val="20"/>
+        </w:rPr>
+      </w:pPr>
+      <w:r>
+        <w:rPr>
+          <w:rFonts w:ascii="Arial" w:hAnsi="Arial" w:cs="Arial"/>
+          <w:sz w:val="20"/>
+          <w:szCs w:val="20"/>
+        </w:rPr>
+        <w:t xml:space="preserve">To determine the degree of skewness and the need for </w:t>
+      </w:r>
+      <w:r>
+        <w:rPr>
+          <w:rFonts w:ascii="Arial" w:hAnsi="Arial" w:cs="Arial"/>
+          <w:sz w:val="20"/>
+          <w:szCs w:val="20"/>
+        </w:rPr>
+        <w:t xml:space="preserve">data transformations, the distributions of </w:t>
+      </w:r>
+      <w:r>
+        <w:rPr>
+          <w:rFonts w:ascii="Arial" w:hAnsi="Arial" w:cs="Arial"/>
+          <w:sz w:val="20"/>
+          <w:szCs w:val="20"/>
+        </w:rPr>
+        <w:t xml:space="preserve">the numerical variables were </w:t>
+      </w:r>
+      <w:r>
+        <w:rPr>
+          <w:rFonts w:ascii="Arial" w:hAnsi="Arial" w:cs="Arial"/>
+          <w:sz w:val="20"/>
+          <w:szCs w:val="20"/>
+        </w:rPr>
+        <w:t>examined.</w:t>
+      </w:r>
+    </w:p>
+    <w:p>
+      <w:pPr>
+        <w:rPr>
+          <w:rFonts w:ascii="Arial" w:hAnsi="Arial" w:cs="Arial"/>
+          <w:sz w:val="20"/>
+          <w:szCs w:val="20"/>
+        </w:rPr>
+      </w:pPr>
+      <w:r>
+        <w:rPr>
+          <w:rFonts w:ascii="Arial" w:hAnsi="Arial" w:cs="Arial"/>
+          <w:sz w:val="20"/>
+          <w:szCs w:val="20"/>
+        </w:rPr>
+        <w:t>Skewness</w:t>
+      </w:r>
+      <w:r>
+        <w:rPr>
+          <w:rFonts w:ascii="Arial" w:hAnsi="Arial" w:cs="Arial"/>
+          <w:sz w:val="20"/>
+          <w:szCs w:val="20"/>
+        </w:rPr>
+        <w:t xml:space="preserve"> was computed for all </w:t>
+      </w:r>
+      <w:r>
+        <w:rPr>
+          <w:rFonts w:ascii="Arial" w:hAnsi="Arial" w:cs="Arial"/>
+          <w:sz w:val="20"/>
+          <w:szCs w:val="20"/>
+        </w:rPr>
+        <w:t xml:space="preserve">the </w:t>
+      </w:r>
+      <w:r>
+        <w:rPr>
+          <w:rFonts w:ascii="Arial" w:hAnsi="Arial" w:cs="Arial"/>
+          <w:sz w:val="20"/>
+          <w:szCs w:val="20"/>
+        </w:rPr>
+        <w:t>numerical features to classify their distributions</w:t>
       </w:r>
       <w:r>
         <w:rPr>
@@ -3205,220 +4063,103 @@
           <w:sz w:val="20"/>
           <w:szCs w:val="20"/>
         </w:rPr>
-        <w:t>at that value.</w:t>
-      </w:r>
-    </w:p>
-    <w:p>
-      <w:pPr>
-        <w:rPr>
-          <w:rFonts w:ascii="Arial" w:hAnsi="Arial" w:cs="Arial"/>
-          <w:b/>
-          <w:bCs/>
-          <w:sz w:val="20"/>
-          <w:szCs w:val="20"/>
-        </w:rPr>
-      </w:pPr>
-      <w:r>
-        <w:rPr>
-          <w:rFonts w:ascii="Arial" w:hAnsi="Arial" w:cs="Arial"/>
-          <w:b/>
-          <w:bCs/>
-          <w:sz w:val="20"/>
-          <w:szCs w:val="20"/>
-        </w:rPr>
-        <w:t>Consultation Duration</w:t>
-      </w:r>
-    </w:p>
-    <w:p>
-      <w:pPr>
-        <w:rPr>
-          <w:rFonts w:ascii="Arial" w:hAnsi="Arial" w:cs="Arial"/>
-          <w:sz w:val="20"/>
-          <w:szCs w:val="20"/>
-        </w:rPr>
-      </w:pPr>
-      <w:r>
-        <w:rPr>
-          <w:rFonts w:ascii="Arial" w:hAnsi="Arial" w:cs="Arial"/>
-          <w:sz w:val="20"/>
-          <w:szCs w:val="20"/>
-        </w:rPr>
-        <w:t>All observations above 173.5 minutes (nearly 3 hours) were considered outliers (the lower bound is a negative value and there are no consultations with negative durations)</w:t>
-      </w:r>
-    </w:p>
-    <w:p>
-      <w:pPr>
-        <w:rPr>
-          <w:rFonts w:ascii="Arial" w:hAnsi="Arial" w:cs="Arial"/>
-          <w:b/>
-          <w:bCs/>
-          <w:sz w:val="20"/>
-          <w:szCs w:val="20"/>
-        </w:rPr>
-      </w:pPr>
-      <w:r>
-        <w:rPr>
-          <w:rFonts w:ascii="Arial" w:hAnsi="Arial" w:cs="Arial"/>
-          <w:b/>
-          <w:bCs/>
-          <w:sz w:val="20"/>
-          <w:szCs w:val="20"/>
-        </w:rPr>
-        <w:t>Satisfaction Level</w:t>
-      </w:r>
-    </w:p>
-    <w:p>
-      <w:pPr>
-        <w:rPr>
-          <w:rFonts w:ascii="Arial" w:hAnsi="Arial" w:cs="Arial"/>
-          <w:sz w:val="20"/>
-          <w:szCs w:val="20"/>
-        </w:rPr>
-      </w:pPr>
-      <w:r>
-        <w:rPr>
-          <w:rFonts w:ascii="Arial" w:hAnsi="Arial" w:cs="Arial"/>
-          <w:sz w:val="20"/>
-          <w:szCs w:val="20"/>
-        </w:rPr>
-        <w:t>Since this feature has only a range of 1-5, all values outside this range were considered data errors and so for values higher than 5 (many observations had a satisfaction level of 6) were replaced by 5.</w:t>
-      </w:r>
-    </w:p>
-    <w:p>
-      <w:pPr>
-        <w:rPr>
-          <w:rFonts w:ascii="Arial" w:hAnsi="Arial" w:cs="Arial"/>
-          <w:b/>
-          <w:bCs/>
-          <w:sz w:val="20"/>
-          <w:szCs w:val="20"/>
-        </w:rPr>
-      </w:pPr>
-      <w:r>
-        <w:rPr>
-          <w:rFonts w:ascii="Arial" w:hAnsi="Arial" w:cs="Arial"/>
-          <w:b/>
-          <w:bCs/>
-          <w:sz w:val="20"/>
-          <w:szCs w:val="20"/>
-        </w:rPr>
-        <w:t>Consultation Price</w:t>
-      </w:r>
-    </w:p>
-    <w:p>
-      <w:pPr>
-        <w:rPr>
-          <w:rFonts w:ascii="Arial" w:hAnsi="Arial" w:cs="Arial"/>
-          <w:sz w:val="20"/>
-          <w:szCs w:val="20"/>
-          <w:lang w:val="en-PT"/>
-        </w:rPr>
-      </w:pPr>
-      <w:r>
-        <w:rPr>
-          <w:rFonts w:ascii="Arial" w:hAnsi="Arial" w:cs="Arial"/>
-          <w:sz w:val="20"/>
-          <w:szCs w:val="20"/>
-          <w:lang w:val="en-PT"/>
-        </w:rPr>
-        <w:t>E</w:t>
-      </w:r>
-      <w:r>
-        <w:rPr>
-          <w:rFonts w:ascii="Arial" w:hAnsi="Arial" w:cs="Arial"/>
-          <w:sz w:val="20"/>
-          <w:szCs w:val="20"/>
-          <w:lang w:val="en-PT"/>
-        </w:rPr>
-        <w:t xml:space="preserve">xtreme high values (&gt;10000) were </w:t>
-      </w:r>
-      <w:r>
-        <w:rPr>
-          <w:rFonts w:ascii="Arial" w:hAnsi="Arial" w:cs="Arial"/>
-          <w:sz w:val="20"/>
-          <w:szCs w:val="20"/>
-          <w:lang w:val="en-PT"/>
-        </w:rPr>
-        <w:t>considered data</w:t>
-      </w:r>
-      <w:r>
-        <w:rPr>
-          <w:rFonts w:ascii="Arial" w:hAnsi="Arial" w:cs="Arial"/>
-          <w:sz w:val="20"/>
-          <w:szCs w:val="20"/>
-          <w:lang w:val="en-PT"/>
-        </w:rPr>
-        <w:t xml:space="preserve"> errors and removed</w:t>
-      </w:r>
-      <w:r>
-        <w:rPr>
-          <w:rFonts w:ascii="Arial" w:hAnsi="Arial" w:cs="Arial"/>
-          <w:sz w:val="20"/>
-          <w:szCs w:val="20"/>
-          <w:lang w:val="en-PT"/>
-        </w:rPr>
-        <w:t>, while v</w:t>
-      </w:r>
-      <w:r>
-        <w:rPr>
-          <w:rFonts w:ascii="Arial" w:hAnsi="Arial" w:cs="Arial"/>
-          <w:sz w:val="20"/>
-          <w:szCs w:val="20"/>
-          <w:lang w:val="en-PT"/>
-        </w:rPr>
-        <w:t>alues within a plausible range</w:t>
-      </w:r>
-      <w:r>
-        <w:rPr>
-          <w:rFonts w:ascii="Arial" w:hAnsi="Arial" w:cs="Arial"/>
-          <w:sz w:val="20"/>
-          <w:szCs w:val="20"/>
-          <w:lang w:val="en-PT"/>
-        </w:rPr>
-        <w:t xml:space="preserve"> (</w:t>
-      </w:r>
-      <w:r>
-        <w:rPr>
-          <w:rFonts w:ascii="Arial" w:hAnsi="Arial" w:cs="Arial"/>
-          <w:sz w:val="20"/>
-          <w:szCs w:val="20"/>
-          <w:lang w:val="en-PT"/>
-        </w:rPr>
-        <w:t>even if high</w:t>
-      </w:r>
-      <w:r>
-        <w:rPr>
-          <w:rFonts w:ascii="Arial" w:hAnsi="Arial" w:cs="Arial"/>
-          <w:sz w:val="20"/>
-          <w:szCs w:val="20"/>
-          <w:lang w:val="en-PT"/>
-        </w:rPr>
-        <w:t>)</w:t>
-      </w:r>
-      <w:r>
-        <w:rPr>
-          <w:rFonts w:ascii="Arial" w:hAnsi="Arial" w:cs="Arial"/>
-          <w:sz w:val="20"/>
-          <w:szCs w:val="20"/>
-          <w:lang w:val="en-PT"/>
-        </w:rPr>
-        <w:t xml:space="preserve"> were </w:t>
-      </w:r>
-      <w:r>
-        <w:rPr>
-          <w:rFonts w:ascii="Arial" w:hAnsi="Arial" w:cs="Arial"/>
-          <w:sz w:val="20"/>
-          <w:szCs w:val="20"/>
-          <w:lang w:val="en-PT"/>
-        </w:rPr>
-        <w:t>mantained</w:t>
-      </w:r>
-      <w:r>
-        <w:rPr>
-          <w:rFonts w:ascii="Arial" w:hAnsi="Arial" w:cs="Arial"/>
-          <w:sz w:val="20"/>
-          <w:szCs w:val="20"/>
-          <w:lang w:val="en-PT"/>
+        <w:t xml:space="preserve">as approximately symmetric, left-skewed, or right-skewed. </w:t>
+      </w:r>
+    </w:p>
+    <w:p>
+      <w:pPr>
+        <w:rPr>
+          <w:rFonts w:ascii="Arial" w:hAnsi="Arial" w:cs="Arial"/>
+          <w:sz w:val="20"/>
+          <w:szCs w:val="20"/>
+          <w:u w:val="single"/>
+        </w:rPr>
+      </w:pPr>
+      <w:r>
+        <w:rPr>
+          <w:rFonts w:ascii="Arial" w:hAnsi="Arial" w:cs="Arial"/>
+          <w:sz w:val="20"/>
+          <w:szCs w:val="20"/>
+          <w:u w:val="single"/>
+        </w:rPr>
+        <w:t>Approximately Symmetric</w:t>
+      </w:r>
+      <w:r>
+        <w:rPr>
+          <w:rFonts w:ascii="Arial" w:hAnsi="Arial" w:cs="Arial"/>
+          <w:sz w:val="20"/>
+          <w:szCs w:val="20"/>
+          <w:u w:val="single"/>
+        </w:rPr>
+        <w:t>:</w:t>
+      </w:r>
+    </w:p>
+    <w:p>
+      <w:pPr>
+        <w:rPr>
+          <w:rFonts w:ascii="Arial" w:hAnsi="Arial" w:cs="Arial"/>
+          <w:sz w:val="20"/>
+          <w:szCs w:val="20"/>
+        </w:rPr>
+      </w:pPr>
+      <w:r>
+        <w:rPr>
+          <w:rFonts w:ascii="Arial" w:hAnsi="Arial" w:cs="Arial"/>
+          <w:sz w:val="20"/>
+          <w:szCs w:val="20"/>
+        </w:rPr>
+        <w:t xml:space="preserve">Age, Satisfaction Level, and Insurance Coverage exhibited approximately symmetric distributions. </w:t>
+      </w:r>
+    </w:p>
+    <w:p>
+      <w:pPr>
+        <w:rPr>
+          <w:rFonts w:ascii="Arial" w:hAnsi="Arial" w:cs="Arial"/>
+          <w:sz w:val="20"/>
+          <w:szCs w:val="20"/>
+          <w:u w:val="single"/>
+        </w:rPr>
+      </w:pPr>
+      <w:r>
+        <w:rPr>
+          <w:rFonts w:ascii="Arial" w:hAnsi="Arial" w:cs="Arial"/>
+          <w:sz w:val="20"/>
+          <w:szCs w:val="20"/>
+          <w:u w:val="single"/>
+        </w:rPr>
+        <w:t>Moderate right-skewed</w:t>
+      </w:r>
+      <w:r>
+        <w:rPr>
+          <w:rFonts w:ascii="Arial" w:hAnsi="Arial" w:cs="Arial"/>
+          <w:sz w:val="20"/>
+          <w:szCs w:val="20"/>
+          <w:u w:val="single"/>
+        </w:rPr>
+        <w:t>:</w:t>
+      </w:r>
+    </w:p>
+    <w:p>
+      <w:pPr>
+        <w:rPr>
+          <w:rFonts w:ascii="Arial" w:hAnsi="Arial" w:cs="Arial"/>
+          <w:sz w:val="20"/>
+          <w:szCs w:val="20"/>
+        </w:rPr>
+      </w:pPr>
+      <w:r>
+        <w:rPr>
+          <w:rFonts w:ascii="Arial" w:hAnsi="Arial" w:cs="Arial"/>
+          <w:sz w:val="20"/>
+          <w:szCs w:val="20"/>
+        </w:rPr>
+        <w:t>Consultation Duration showed moderate right-skewness, indicating occasional long consultations</w:t>
+      </w:r>
+      <w:r>
+        <w:rPr>
+          <w:rFonts w:ascii="Arial" w:hAnsi="Arial" w:cs="Arial"/>
+          <w:sz w:val="20"/>
+          <w:szCs w:val="20"/>
         </w:rPr>
         <w:t>.</w:t>
       </w:r>
@@ -3427,92 +4168,136 @@
       <w:pPr>
         <w:rPr>
           <w:rFonts w:ascii="Arial" w:hAnsi="Arial" w:cs="Arial"/>
-          <w:b/>
-          <w:bCs/>
-          <w:sz w:val="20"/>
-          <w:szCs w:val="20"/>
-        </w:rPr>
-      </w:pPr>
-      <w:r>
-        <w:rPr>
-          <w:rFonts w:ascii="Arial" w:hAnsi="Arial" w:cs="Arial"/>
-          <w:b/>
-          <w:bCs/>
-          <w:sz w:val="20"/>
-          <w:szCs w:val="20"/>
-        </w:rPr>
-        <w:t>Insurance Coverage</w:t>
-      </w:r>
-    </w:p>
-    <w:p>
-      <w:pPr>
-        <w:rPr>
-          <w:rFonts w:ascii="Arial" w:hAnsi="Arial" w:cs="Arial"/>
-          <w:sz w:val="20"/>
-          <w:szCs w:val="20"/>
-          <w:lang w:val="en-PT"/>
-        </w:rPr>
-      </w:pPr>
-      <w:r>
-        <w:rPr>
-          <w:rFonts w:ascii="Arial" w:hAnsi="Arial" w:cs="Arial"/>
-          <w:sz w:val="20"/>
-          <w:szCs w:val="20"/>
-          <w:lang w:val="en-PT"/>
-        </w:rPr>
-        <w:t>Some observations had high values however,</w:t>
-      </w:r>
-      <w:r>
-        <w:rPr>
-          <w:rFonts w:ascii="Arial" w:hAnsi="Arial" w:cs="Arial"/>
-          <w:sz w:val="20"/>
-          <w:szCs w:val="20"/>
-          <w:lang w:val="en-PT"/>
-        </w:rPr>
-        <w:t xml:space="preserve"> they were plausible given </w:t>
-      </w:r>
-      <w:r>
-        <w:rPr>
-          <w:rFonts w:ascii="Arial" w:hAnsi="Arial" w:cs="Arial"/>
-          <w:sz w:val="20"/>
-          <w:szCs w:val="20"/>
-          <w:lang w:val="en-PT"/>
-        </w:rPr>
-        <w:t>that the</w:t>
-      </w:r>
-      <w:r>
-        <w:rPr>
-          <w:rFonts w:ascii="Arial" w:hAnsi="Arial" w:cs="Arial"/>
-          <w:sz w:val="20"/>
-          <w:szCs w:val="20"/>
-          <w:lang w:val="en-PT"/>
-        </w:rPr>
-        <w:t xml:space="preserve"> corresponding Consultation Price</w:t>
-      </w:r>
-      <w:r>
-        <w:rPr>
-          <w:rFonts w:ascii="Arial" w:hAnsi="Arial" w:cs="Arial"/>
-          <w:sz w:val="20"/>
-          <w:szCs w:val="20"/>
-          <w:lang w:val="en-PT"/>
-        </w:rPr>
-        <w:t xml:space="preserve"> was also high. Therefore, n</w:t>
-      </w:r>
-      <w:r>
-        <w:rPr>
-          <w:rFonts w:ascii="Arial" w:hAnsi="Arial" w:cs="Arial"/>
-          <w:sz w:val="20"/>
-          <w:szCs w:val="20"/>
-          <w:lang w:val="en-PT"/>
-        </w:rPr>
-        <w:t>o removal or clipping was applied</w:t>
-      </w:r>
-      <w:r>
-        <w:rPr>
-          <w:rFonts w:ascii="Arial" w:hAnsi="Arial" w:cs="Arial"/>
-          <w:sz w:val="20"/>
-          <w:szCs w:val="20"/>
-          <w:lang w:val="en-PT"/>
+          <w:sz w:val="20"/>
+          <w:szCs w:val="20"/>
+          <w:u w:val="single"/>
+        </w:rPr>
+      </w:pPr>
+      <w:r>
+        <w:rPr>
+          <w:rFonts w:ascii="Arial" w:hAnsi="Arial" w:cs="Arial"/>
+          <w:sz w:val="20"/>
+          <w:szCs w:val="20"/>
+          <w:u w:val="single"/>
+        </w:rPr>
+        <w:t>Heavily right-skewed</w:t>
+      </w:r>
+      <w:r>
+        <w:rPr>
+          <w:rFonts w:ascii="Arial" w:hAnsi="Arial" w:cs="Arial"/>
+          <w:sz w:val="20"/>
+          <w:szCs w:val="20"/>
+          <w:u w:val="single"/>
+        </w:rPr>
+        <w:t>:</w:t>
+      </w:r>
+    </w:p>
+    <w:p>
+      <w:pPr>
+        <w:rPr>
+          <w:rFonts w:ascii="Arial" w:hAnsi="Arial" w:cs="Arial"/>
+          <w:sz w:val="20"/>
+          <w:szCs w:val="20"/>
+        </w:rPr>
+      </w:pPr>
+      <w:r>
+        <w:rPr>
+          <w:rFonts w:ascii="Arial" w:hAnsi="Arial" w:cs="Arial"/>
+          <w:sz w:val="20"/>
+          <w:szCs w:val="20"/>
+        </w:rPr>
+        <w:t xml:space="preserve"> Approximate Annual Income and Consultation Price displayed heavy right-skewness due to strong high-end outliers.</w:t>
+      </w:r>
+      <w:r>
+        <w:rPr>
+          <w:rFonts w:ascii="Arial" w:hAnsi="Arial" w:cs="Arial"/>
+          <w:sz w:val="20"/>
+          <w:szCs w:val="20"/>
+        </w:rPr>
+        <w:t xml:space="preserve"> </w:t>
+      </w:r>
+    </w:p>
+    <w:p>
+      <w:pPr>
+        <w:rPr>
+          <w:rFonts w:ascii="Arial" w:hAnsi="Arial" w:cs="Arial"/>
+          <w:sz w:val="20"/>
+          <w:szCs w:val="20"/>
+        </w:rPr>
+      </w:pPr>
+      <w:r>
+        <w:rPr>
+          <w:rFonts w:ascii="Arial" w:hAnsi="Arial" w:cs="Arial"/>
+          <w:sz w:val="20"/>
+          <w:szCs w:val="20"/>
+        </w:rPr>
+        <w:t>Therefore, to</w:t>
+      </w:r>
+      <w:r>
+        <w:rPr>
+          <w:rFonts w:ascii="Arial" w:hAnsi="Arial" w:cs="Arial"/>
+          <w:sz w:val="20"/>
+          <w:szCs w:val="20"/>
+        </w:rPr>
+        <w:t xml:space="preserve"> reduce skewness </w:t>
+      </w:r>
+      <w:r>
+        <w:rPr>
+          <w:rFonts w:ascii="Arial" w:hAnsi="Arial" w:cs="Arial"/>
+          <w:sz w:val="20"/>
+          <w:szCs w:val="20"/>
+        </w:rPr>
+        <w:t xml:space="preserve">for predictive </w:t>
+      </w:r>
+      <w:r>
+        <w:rPr>
+          <w:rFonts w:ascii="Arial" w:hAnsi="Arial" w:cs="Arial"/>
+          <w:sz w:val="20"/>
+          <w:szCs w:val="20"/>
+        </w:rPr>
+        <w:t>modelling, log transformations were applied to the heavily skewed variables</w:t>
+      </w:r>
+      <w:r>
+        <w:rPr>
+          <w:rFonts w:ascii="Arial" w:hAnsi="Arial" w:cs="Arial"/>
+          <w:sz w:val="20"/>
+          <w:szCs w:val="20"/>
+        </w:rPr>
+        <w:t xml:space="preserve">, consisting of the variables </w:t>
+      </w:r>
+      <w:proofErr w:type="spellStart"/>
+      <w:r>
+        <w:rPr>
+          <w:rFonts w:ascii="Arial" w:hAnsi="Arial" w:cs="Arial"/>
+          <w:sz w:val="20"/>
+          <w:szCs w:val="20"/>
+        </w:rPr>
+        <w:t>Income_log</w:t>
+      </w:r>
+      <w:proofErr w:type="spellEnd"/>
+      <w:r>
+        <w:rPr>
+          <w:rFonts w:ascii="Arial" w:hAnsi="Arial" w:cs="Arial"/>
+          <w:sz w:val="20"/>
+          <w:szCs w:val="20"/>
+        </w:rPr>
+        <w:t xml:space="preserve"> and </w:t>
+      </w:r>
+      <w:proofErr w:type="spellStart"/>
+      <w:r>
+        <w:rPr>
+          <w:rFonts w:ascii="Arial" w:hAnsi="Arial" w:cs="Arial"/>
+          <w:sz w:val="20"/>
+          <w:szCs w:val="20"/>
+        </w:rPr>
+        <w:t>Consultation_price_log</w:t>
+      </w:r>
+      <w:proofErr w:type="spellEnd"/>
+      <w:r>
+        <w:rPr>
+          <w:rFonts w:ascii="Arial" w:hAnsi="Arial" w:cs="Arial"/>
+          <w:sz w:val="20"/>
+          <w:szCs w:val="20"/>
         </w:rPr>
         <w:t>.</w:t>
       </w:r>
@@ -3527,481 +4312,137 @@
           <w:szCs w:val="20"/>
         </w:rPr>
       </w:pPr>
-      <w:proofErr w:type="spellStart"/>
-      <w:r>
-        <w:rPr>
-          <w:rFonts w:ascii="Arial" w:hAnsi="Arial" w:cs="Arial"/>
-          <w:b/>
-          <w:bCs/>
-          <w:sz w:val="20"/>
-          <w:szCs w:val="20"/>
-        </w:rPr>
-        <w:t>D</w:t>
-      </w:r>
-      <w:r>
-        <w:rPr>
-          <w:rFonts w:ascii="Arial" w:hAnsi="Arial" w:cs="Arial"/>
-          <w:b/>
-          <w:bCs/>
-          <w:sz w:val="20"/>
-          <w:szCs w:val="20"/>
-        </w:rPr>
-        <w:t>ataTypes</w:t>
-      </w:r>
-      <w:proofErr w:type="spellEnd"/>
-    </w:p>
-    <w:p>
-      <w:pPr>
-        <w:rPr>
-          <w:rFonts w:ascii="Arial" w:hAnsi="Arial" w:cs="Arial"/>
-          <w:sz w:val="20"/>
-          <w:szCs w:val="20"/>
-        </w:rPr>
-      </w:pPr>
-      <w:r>
-        <w:rPr>
-          <w:rFonts w:ascii="Arial" w:hAnsi="Arial" w:cs="Arial"/>
-          <w:sz w:val="20"/>
-          <w:szCs w:val="20"/>
-        </w:rPr>
-        <w:t>For memory optimization and improved performance, a mapping of the appropriate datatypes for each column was applied.</w:t>
-      </w:r>
-    </w:p>
-    <w:p>
-      <w:pPr>
-        <w:rPr>
-          <w:rFonts w:ascii="Arial" w:hAnsi="Arial" w:cs="Arial"/>
-          <w:b/>
-          <w:bCs/>
-          <w:sz w:val="20"/>
-          <w:szCs w:val="20"/>
-        </w:rPr>
-      </w:pPr>
-      <w:r>
-        <w:rPr>
-          <w:rFonts w:ascii="Arial" w:hAnsi="Arial" w:cs="Arial"/>
-          <w:b/>
-          <w:bCs/>
-          <w:sz w:val="20"/>
-          <w:szCs w:val="20"/>
-        </w:rPr>
-        <w:t>Deduplication</w:t>
-      </w:r>
-    </w:p>
-    <w:p>
-      <w:pPr>
-        <w:rPr>
-          <w:rFonts w:ascii="Arial" w:hAnsi="Arial" w:cs="Arial"/>
-          <w:sz w:val="20"/>
-          <w:szCs w:val="20"/>
-          <w:lang w:val="en-PT"/>
-        </w:rPr>
-      </w:pPr>
-      <w:r>
-        <w:rPr>
-          <w:rFonts w:ascii="Arial" w:hAnsi="Arial" w:cs="Arial"/>
-          <w:sz w:val="20"/>
-          <w:szCs w:val="20"/>
-          <w:lang w:val="en-PT"/>
-        </w:rPr>
-        <w:t>For data integrity purposes, the duplicates in the dataset were identified and then removed.</w:t>
-      </w:r>
-    </w:p>
-    <w:p>
-      <w:pPr>
-        <w:rPr>
-          <w:rFonts w:ascii="Arial" w:hAnsi="Arial" w:cs="Arial"/>
-          <w:b/>
-          <w:bCs/>
-          <w:sz w:val="20"/>
-          <w:szCs w:val="20"/>
-        </w:rPr>
-      </w:pPr>
-      <w:r>
-        <w:rPr>
-          <w:rFonts w:ascii="Arial" w:hAnsi="Arial" w:cs="Arial"/>
-          <w:b/>
-          <w:bCs/>
-          <w:sz w:val="20"/>
-          <w:szCs w:val="20"/>
-        </w:rPr>
-        <w:t>Data Transformation</w:t>
-      </w:r>
-      <w:r>
-        <w:rPr>
-          <w:rFonts w:ascii="Arial" w:hAnsi="Arial" w:cs="Arial"/>
-          <w:b/>
-          <w:bCs/>
-          <w:sz w:val="20"/>
-          <w:szCs w:val="20"/>
-        </w:rPr>
-        <w:t xml:space="preserve"> / Feature Engineering</w:t>
-      </w:r>
-    </w:p>
-    <w:p>
-      <w:pPr>
-        <w:rPr>
-          <w:rFonts w:ascii="Arial" w:hAnsi="Arial" w:cs="Arial"/>
-          <w:b/>
-          <w:bCs/>
-          <w:sz w:val="20"/>
-          <w:szCs w:val="20"/>
-        </w:rPr>
-      </w:pPr>
-      <w:r>
-        <w:rPr>
-          <w:rFonts w:ascii="Arial" w:hAnsi="Arial" w:cs="Arial"/>
-          <w:b/>
-          <w:bCs/>
-          <w:sz w:val="20"/>
-          <w:szCs w:val="20"/>
-        </w:rPr>
-        <w:t>Distribution and Skewness Analysis</w:t>
-      </w:r>
-    </w:p>
-    <w:p>
-      <w:pPr>
-        <w:rPr>
-          <w:rFonts w:ascii="Arial" w:hAnsi="Arial" w:cs="Arial"/>
-          <w:sz w:val="20"/>
-          <w:szCs w:val="20"/>
-        </w:rPr>
-      </w:pPr>
-      <w:r>
-        <w:rPr>
-          <w:rFonts w:ascii="Arial" w:hAnsi="Arial" w:cs="Arial"/>
-          <w:sz w:val="20"/>
-          <w:szCs w:val="20"/>
-        </w:rPr>
-        <w:t xml:space="preserve">To determine the degree of skewness and the need for </w:t>
-      </w:r>
-      <w:r>
-        <w:rPr>
-          <w:rFonts w:ascii="Arial" w:hAnsi="Arial" w:cs="Arial"/>
-          <w:sz w:val="20"/>
-          <w:szCs w:val="20"/>
-        </w:rPr>
-        <w:t xml:space="preserve">data transformations, the distributions of </w:t>
-      </w:r>
-      <w:r>
-        <w:rPr>
-          <w:rFonts w:ascii="Arial" w:hAnsi="Arial" w:cs="Arial"/>
-          <w:sz w:val="20"/>
-          <w:szCs w:val="20"/>
-        </w:rPr>
-        <w:t xml:space="preserve">the numerical variables were </w:t>
-      </w:r>
-      <w:r>
-        <w:rPr>
-          <w:rFonts w:ascii="Arial" w:hAnsi="Arial" w:cs="Arial"/>
-          <w:sz w:val="20"/>
-          <w:szCs w:val="20"/>
-        </w:rPr>
-        <w:t>examined.</w:t>
-      </w:r>
-    </w:p>
-    <w:p>
-      <w:pPr>
-        <w:rPr>
-          <w:rFonts w:ascii="Arial" w:hAnsi="Arial" w:cs="Arial"/>
-          <w:sz w:val="20"/>
-          <w:szCs w:val="20"/>
-        </w:rPr>
-      </w:pPr>
-      <w:r>
-        <w:rPr>
-          <w:rFonts w:ascii="Arial" w:hAnsi="Arial" w:cs="Arial"/>
-          <w:sz w:val="20"/>
-          <w:szCs w:val="20"/>
-        </w:rPr>
-        <w:t>Skewness</w:t>
-      </w:r>
-      <w:r>
-        <w:rPr>
-          <w:rFonts w:ascii="Arial" w:hAnsi="Arial" w:cs="Arial"/>
-          <w:sz w:val="20"/>
-          <w:szCs w:val="20"/>
-        </w:rPr>
-        <w:t xml:space="preserve"> was computed for all </w:t>
-      </w:r>
-      <w:r>
-        <w:rPr>
-          <w:rFonts w:ascii="Arial" w:hAnsi="Arial" w:cs="Arial"/>
-          <w:sz w:val="20"/>
-          <w:szCs w:val="20"/>
-        </w:rPr>
-        <w:t xml:space="preserve">the </w:t>
-      </w:r>
-      <w:r>
-        <w:rPr>
-          <w:rFonts w:ascii="Arial" w:hAnsi="Arial" w:cs="Arial"/>
-          <w:sz w:val="20"/>
-          <w:szCs w:val="20"/>
-        </w:rPr>
-        <w:t>numerical features to classify their distributions</w:t>
-      </w:r>
-      <w:r>
-        <w:rPr>
-          <w:rFonts w:ascii="Arial" w:hAnsi="Arial" w:cs="Arial"/>
-          <w:sz w:val="20"/>
-          <w:szCs w:val="20"/>
-        </w:rPr>
-        <w:t xml:space="preserve"> </w:t>
-      </w:r>
-      <w:r>
-        <w:rPr>
-          <w:rFonts w:ascii="Arial" w:hAnsi="Arial" w:cs="Arial"/>
-          <w:sz w:val="20"/>
-          <w:szCs w:val="20"/>
-        </w:rPr>
-        <w:t xml:space="preserve">as approximately symmetric, left-skewed, or right-skewed. </w:t>
-      </w:r>
-    </w:p>
-    <w:p>
-      <w:pPr>
-        <w:rPr>
-          <w:rFonts w:ascii="Arial" w:hAnsi="Arial" w:cs="Arial"/>
-          <w:sz w:val="20"/>
-          <w:szCs w:val="20"/>
-        </w:rPr>
-      </w:pPr>
-      <w:r>
-        <w:rPr>
-          <w:rFonts w:ascii="Arial" w:hAnsi="Arial" w:cs="Arial"/>
-          <w:sz w:val="20"/>
-          <w:szCs w:val="20"/>
-        </w:rPr>
-        <w:t>Approximately Symmetric</w:t>
-      </w:r>
-    </w:p>
-    <w:p>
-      <w:pPr>
-        <w:rPr>
-          <w:rFonts w:ascii="Arial" w:hAnsi="Arial" w:cs="Arial"/>
-          <w:sz w:val="20"/>
-          <w:szCs w:val="20"/>
-        </w:rPr>
-      </w:pPr>
-      <w:r>
-        <w:rPr>
-          <w:rFonts w:ascii="Arial" w:hAnsi="Arial" w:cs="Arial"/>
-          <w:sz w:val="20"/>
-          <w:szCs w:val="20"/>
-        </w:rPr>
-        <w:t xml:space="preserve">Age, Satisfaction Level, and Insurance Coverage exhibited approximately symmetric distributions. </w:t>
-      </w:r>
-    </w:p>
-    <w:p>
-      <w:pPr>
-        <w:rPr>
-          <w:rFonts w:ascii="Arial" w:hAnsi="Arial" w:cs="Arial"/>
-          <w:sz w:val="20"/>
-          <w:szCs w:val="20"/>
-        </w:rPr>
-      </w:pPr>
-      <w:r>
-        <w:rPr>
-          <w:rFonts w:ascii="Arial" w:hAnsi="Arial" w:cs="Arial"/>
-          <w:sz w:val="20"/>
-          <w:szCs w:val="20"/>
-        </w:rPr>
-        <w:t>Moderate right-skewed</w:t>
-      </w:r>
-    </w:p>
-    <w:p>
-      <w:pPr>
-        <w:rPr>
-          <w:rFonts w:ascii="Arial" w:hAnsi="Arial" w:cs="Arial"/>
-          <w:sz w:val="20"/>
-          <w:szCs w:val="20"/>
-        </w:rPr>
-      </w:pPr>
-      <w:r>
-        <w:rPr>
-          <w:rFonts w:ascii="Arial" w:hAnsi="Arial" w:cs="Arial"/>
-          <w:sz w:val="20"/>
-          <w:szCs w:val="20"/>
-        </w:rPr>
-        <w:t>Consultation Duration showed moderate right-skewness, indicating occasional long consultations</w:t>
-      </w:r>
-      <w:r>
-        <w:rPr>
-          <w:rFonts w:ascii="Arial" w:hAnsi="Arial" w:cs="Arial"/>
-          <w:sz w:val="20"/>
-          <w:szCs w:val="20"/>
-        </w:rPr>
-        <w:t>.</w:t>
-      </w:r>
-    </w:p>
-    <w:p>
-      <w:pPr>
-        <w:rPr>
-          <w:rFonts w:ascii="Arial" w:hAnsi="Arial" w:cs="Arial"/>
-          <w:sz w:val="20"/>
-          <w:szCs w:val="20"/>
-        </w:rPr>
-      </w:pPr>
-      <w:r>
-        <w:rPr>
-          <w:rFonts w:ascii="Arial" w:hAnsi="Arial" w:cs="Arial"/>
-          <w:sz w:val="20"/>
-          <w:szCs w:val="20"/>
-        </w:rPr>
-        <w:t>Heavily right-skewed</w:t>
-      </w:r>
-    </w:p>
-    <w:p>
-      <w:pPr>
-        <w:rPr>
-          <w:rFonts w:ascii="Arial" w:hAnsi="Arial" w:cs="Arial"/>
-          <w:sz w:val="20"/>
-          <w:szCs w:val="20"/>
-        </w:rPr>
-      </w:pPr>
-      <w:r>
-        <w:rPr>
-          <w:rFonts w:ascii="Arial" w:hAnsi="Arial" w:cs="Arial"/>
-          <w:sz w:val="20"/>
-          <w:szCs w:val="20"/>
-        </w:rPr>
-        <w:t xml:space="preserve"> Approximate Annual Income and Consultation Price displayed heavy right-skewness due to strong high-end outliers.</w:t>
-      </w:r>
-      <w:r>
-        <w:rPr>
-          <w:rFonts w:ascii="Arial" w:hAnsi="Arial" w:cs="Arial"/>
-          <w:sz w:val="20"/>
-          <w:szCs w:val="20"/>
-        </w:rPr>
-        <w:t xml:space="preserve"> </w:t>
-      </w:r>
-    </w:p>
-    <w:p>
-      <w:pPr>
-        <w:rPr>
-          <w:rFonts w:ascii="Arial" w:hAnsi="Arial" w:cs="Arial"/>
-          <w:sz w:val="20"/>
-          <w:szCs w:val="20"/>
-        </w:rPr>
-      </w:pPr>
-      <w:r>
-        <w:rPr>
-          <w:rFonts w:ascii="Arial" w:hAnsi="Arial" w:cs="Arial"/>
-          <w:sz w:val="20"/>
-          <w:szCs w:val="20"/>
-        </w:rPr>
-        <w:lastRenderedPageBreak/>
-        <w:t>Therefore, to</w:t>
-      </w:r>
-      <w:r>
-        <w:rPr>
-          <w:rFonts w:ascii="Arial" w:hAnsi="Arial" w:cs="Arial"/>
-          <w:sz w:val="20"/>
-          <w:szCs w:val="20"/>
-        </w:rPr>
-        <w:t xml:space="preserve"> reduce skewness </w:t>
-      </w:r>
-      <w:r>
-        <w:rPr>
-          <w:rFonts w:ascii="Arial" w:hAnsi="Arial" w:cs="Arial"/>
-          <w:sz w:val="20"/>
-          <w:szCs w:val="20"/>
-        </w:rPr>
-        <w:t xml:space="preserve">for predictive </w:t>
-      </w:r>
-      <w:r>
-        <w:rPr>
-          <w:rFonts w:ascii="Arial" w:hAnsi="Arial" w:cs="Arial"/>
-          <w:sz w:val="20"/>
-          <w:szCs w:val="20"/>
-        </w:rPr>
-        <w:t>modelling</w:t>
-      </w:r>
-      <w:r>
-        <w:rPr>
-          <w:rFonts w:ascii="Arial" w:hAnsi="Arial" w:cs="Arial"/>
-          <w:sz w:val="20"/>
-          <w:szCs w:val="20"/>
-        </w:rPr>
-        <w:t>, log transformations were applied to the heavily skewed variables</w:t>
-      </w:r>
-      <w:r>
-        <w:rPr>
-          <w:rFonts w:ascii="Arial" w:hAnsi="Arial" w:cs="Arial"/>
-          <w:sz w:val="20"/>
-          <w:szCs w:val="20"/>
-        </w:rPr>
-        <w:t xml:space="preserve">, consisting of the variables </w:t>
-      </w:r>
-      <w:proofErr w:type="spellStart"/>
-      <w:r>
-        <w:rPr>
-          <w:rFonts w:ascii="Arial" w:hAnsi="Arial" w:cs="Arial"/>
-          <w:sz w:val="20"/>
-          <w:szCs w:val="20"/>
-        </w:rPr>
-        <w:t>Income_log</w:t>
-      </w:r>
-      <w:proofErr w:type="spellEnd"/>
-      <w:r>
-        <w:rPr>
-          <w:rFonts w:ascii="Arial" w:hAnsi="Arial" w:cs="Arial"/>
-          <w:sz w:val="20"/>
-          <w:szCs w:val="20"/>
-        </w:rPr>
-        <w:t xml:space="preserve"> and </w:t>
-      </w:r>
-      <w:proofErr w:type="spellStart"/>
-      <w:r>
-        <w:rPr>
-          <w:rFonts w:ascii="Arial" w:hAnsi="Arial" w:cs="Arial"/>
-          <w:sz w:val="20"/>
-          <w:szCs w:val="20"/>
-        </w:rPr>
-        <w:t>Consultation_price_log</w:t>
-      </w:r>
-      <w:proofErr w:type="spellEnd"/>
-      <w:r>
-        <w:rPr>
-          <w:rFonts w:ascii="Arial" w:hAnsi="Arial" w:cs="Arial"/>
-          <w:sz w:val="20"/>
-          <w:szCs w:val="20"/>
-        </w:rPr>
-        <w:t>.</w:t>
-      </w:r>
-    </w:p>
-    <w:p>
-      <w:pPr>
-        <w:rPr>
-          <w:rFonts w:ascii="Arial" w:hAnsi="Arial" w:cs="Arial"/>
-          <w:sz w:val="20"/>
-          <w:szCs w:val="20"/>
-        </w:rPr>
-      </w:pPr>
-    </w:p>
-    <w:p>
-      <w:pPr>
-        <w:rPr>
-          <w:rFonts w:ascii="Arial" w:hAnsi="Arial" w:cs="Arial"/>
-          <w:sz w:val="20"/>
-          <w:szCs w:val="20"/>
-        </w:rPr>
-      </w:pPr>
-    </w:p>
-    <w:p>
-      <w:pPr>
-        <w:rPr>
-          <w:rFonts w:ascii="Arial" w:hAnsi="Arial" w:cs="Arial"/>
-          <w:sz w:val="20"/>
-          <w:szCs w:val="20"/>
-          <w:lang w:val="en-PT"/>
-        </w:rPr>
-      </w:pPr>
-      <w:r>
-        <w:rPr>
-          <w:rFonts w:ascii="Arial" w:hAnsi="Arial" w:cs="Arial"/>
-          <w:sz w:val="20"/>
-          <w:szCs w:val="20"/>
-          <w:lang w:val="en-PT"/>
+    </w:p>
+    <w:p>
+      <w:pPr>
+        <w:rPr>
+          <w:rFonts w:ascii="Arial" w:hAnsi="Arial" w:cs="Arial"/>
+          <w:b/>
+          <w:bCs/>
+          <w:sz w:val="20"/>
+          <w:szCs w:val="20"/>
+        </w:rPr>
+      </w:pPr>
+      <w:r>
+        <w:rPr>
+          <w:rFonts w:ascii="Arial" w:hAnsi="Arial" w:cs="Arial"/>
+          <w:b/>
+          <w:bCs/>
+          <w:sz w:val="20"/>
+          <w:szCs w:val="20"/>
+        </w:rPr>
+        <w:t>Feature Engineering</w:t>
+      </w:r>
+    </w:p>
+    <w:p>
+      <w:pPr>
+        <w:rPr>
+          <w:rFonts w:ascii="Arial" w:hAnsi="Arial" w:cs="Arial"/>
+          <w:sz w:val="20"/>
+          <w:szCs w:val="20"/>
+        </w:rPr>
+      </w:pPr>
+      <w:r>
+        <w:rPr>
+          <w:rFonts w:ascii="Arial" w:hAnsi="Arial" w:cs="Arial"/>
+          <w:sz w:val="20"/>
+          <w:szCs w:val="20"/>
+          <w:u w:val="single"/>
+        </w:rPr>
+        <w:t>Insurance Coverage Percentage</w:t>
+      </w:r>
+      <w:r>
+        <w:rPr>
+          <w:rFonts w:ascii="Arial" w:hAnsi="Arial" w:cs="Arial"/>
+          <w:sz w:val="20"/>
+          <w:szCs w:val="20"/>
+        </w:rPr>
+        <w:t xml:space="preserve"> – to see the Insurance Coverage Percentage a new column was created, consisting in the division of the Insurance Coverage by the Consultation Price, this column was used to understand that each Insurance Provider covered a different percentage</w:t>
+      </w:r>
+    </w:p>
+    <w:p>
+      <w:pPr>
+        <w:rPr>
+          <w:rFonts w:ascii="Arial" w:hAnsi="Arial" w:cs="Arial"/>
+          <w:sz w:val="20"/>
+          <w:szCs w:val="20"/>
+        </w:rPr>
+      </w:pPr>
+      <w:r>
+        <w:rPr>
+          <w:rFonts w:ascii="Arial" w:hAnsi="Arial" w:cs="Arial"/>
+          <w:sz w:val="20"/>
+          <w:szCs w:val="20"/>
+          <w:u w:val="single"/>
+        </w:rPr>
+        <w:t>Age Range</w:t>
+      </w:r>
+      <w:r>
+        <w:rPr>
+          <w:rFonts w:ascii="Arial" w:hAnsi="Arial" w:cs="Arial"/>
+          <w:sz w:val="20"/>
+          <w:szCs w:val="20"/>
+        </w:rPr>
+        <w:t xml:space="preserve"> – to see the age range of each patient a new column was added with intervals of five starting in 0 and going up to 130 to see in which age range each patient was in</w:t>
+      </w:r>
+    </w:p>
+    <w:p>
+      <w:pPr>
+        <w:rPr>
+          <w:rFonts w:ascii="Arial" w:hAnsi="Arial" w:cs="Arial"/>
+          <w:sz w:val="20"/>
+          <w:szCs w:val="20"/>
+        </w:rPr>
+      </w:pPr>
+      <w:r>
+        <w:rPr>
+          <w:rFonts w:ascii="Arial" w:hAnsi="Arial" w:cs="Arial"/>
+          <w:sz w:val="20"/>
+          <w:szCs w:val="20"/>
+          <w:u w:val="single"/>
+        </w:rPr>
+        <w:t>Days since last visit</w:t>
+      </w:r>
+      <w:r>
+        <w:rPr>
+          <w:rFonts w:ascii="Arial" w:hAnsi="Arial" w:cs="Arial"/>
+          <w:sz w:val="20"/>
+          <w:szCs w:val="20"/>
+        </w:rPr>
+        <w:t xml:space="preserve"> – this column displays the number of days since the last appointment</w:t>
+      </w:r>
+    </w:p>
+    <w:p>
+      <w:pPr>
+        <w:rPr>
+          <w:rFonts w:ascii="Arial" w:hAnsi="Arial" w:cs="Arial"/>
+          <w:b/>
+          <w:bCs/>
+          <w:sz w:val="20"/>
+          <w:szCs w:val="20"/>
+          <w:lang w:val="en-US"/>
+        </w:rPr>
+      </w:pPr>
+    </w:p>
+    <w:p>
+      <w:pPr>
+        <w:rPr>
+          <w:rFonts w:ascii="Arial" w:hAnsi="Arial" w:cs="Arial"/>
+          <w:b/>
+          <w:bCs/>
+          <w:sz w:val="20"/>
+          <w:szCs w:val="20"/>
+          <w:lang/>
+        </w:rPr>
+      </w:pPr>
+      <w:r>
+        <w:rPr>
+          <w:rFonts w:ascii="Arial" w:hAnsi="Arial" w:cs="Arial"/>
+          <w:b/>
+          <w:bCs/>
+          <w:sz w:val="20"/>
+          <w:szCs w:val="20"/>
+          <w:lang/>
         </w:rPr>
         <w:t>Analytical Base Table (ABT) Construction</w:t>
       </w:r>
@@ -4012,36 +4453,17 @@
           <w:rFonts w:ascii="Arial" w:hAnsi="Arial" w:cs="Arial"/>
           <w:sz w:val="20"/>
           <w:szCs w:val="20"/>
-          <w:lang w:val="en-PT"/>
-        </w:rPr>
-      </w:pPr>
-      <w:r>
-        <w:rPr>
-          <w:rFonts w:ascii="Arial" w:hAnsi="Arial" w:cs="Arial"/>
-          <w:sz w:val="20"/>
-          <w:szCs w:val="20"/>
-          <w:lang w:val="en-PT"/>
+          <w:lang w:val="en-US"/>
+        </w:rPr>
+      </w:pPr>
+      <w:r>
+        <w:rPr>
+          <w:rFonts w:ascii="Arial" w:hAnsi="Arial" w:cs="Arial"/>
+          <w:sz w:val="20"/>
+          <w:szCs w:val="20"/>
+          <w:lang/>
         </w:rPr>
         <w:t>To construct the table, the following steps were executed.</w:t>
-      </w:r>
-    </w:p>
-    <w:p>
-      <w:pPr>
-        <w:rPr>
-          <w:rFonts w:ascii="Arial" w:hAnsi="Arial" w:cs="Arial"/>
-          <w:sz w:val="20"/>
-          <w:szCs w:val="20"/>
-          <w:lang w:val="en-PT"/>
-        </w:rPr>
-      </w:pPr>
-      <w:r>
-        <w:rPr>
-          <w:rFonts w:ascii="Arial" w:hAnsi="Arial" w:cs="Arial"/>
-          <w:sz w:val="20"/>
-          <w:szCs w:val="20"/>
-          <w:lang w:val="en-PT"/>
-        </w:rPr>
-        <w:t>(creation of new variables)</w:t>
       </w:r>
     </w:p>
     <w:p>
@@ -4055,15 +4477,15 @@
           <w:rFonts w:ascii="Arial" w:hAnsi="Arial" w:cs="Arial"/>
           <w:sz w:val="20"/>
           <w:szCs w:val="20"/>
-          <w:lang w:val="en-PT"/>
-        </w:rPr>
-      </w:pPr>
-      <w:r>
-        <w:rPr>
-          <w:rFonts w:ascii="Arial" w:hAnsi="Arial" w:cs="Arial"/>
-          <w:sz w:val="20"/>
-          <w:szCs w:val="20"/>
-          <w:lang w:val="en-PT"/>
+          <w:lang/>
+        </w:rPr>
+      </w:pPr>
+      <w:r>
+        <w:rPr>
+          <w:rFonts w:ascii="Arial" w:hAnsi="Arial" w:cs="Arial"/>
+          <w:sz w:val="20"/>
+          <w:szCs w:val="20"/>
+          <w:lang/>
         </w:rPr>
         <w:t>Aggregation</w:t>
       </w:r>
@@ -4075,7 +4497,7 @@
           <w:rFonts w:ascii="Arial" w:hAnsi="Arial" w:cs="Arial"/>
           <w:sz w:val="20"/>
           <w:szCs w:val="20"/>
-          <w:lang w:val="en-PT"/>
+          <w:lang/>
         </w:rPr>
       </w:pPr>
     </w:p>
@@ -4086,15 +4508,15 @@
           <w:rFonts w:ascii="Arial" w:hAnsi="Arial" w:cs="Arial"/>
           <w:sz w:val="20"/>
           <w:szCs w:val="20"/>
-          <w:lang w:val="en-PT"/>
-        </w:rPr>
-      </w:pPr>
-      <w:r>
-        <w:rPr>
-          <w:rFonts w:ascii="Arial" w:hAnsi="Arial" w:cs="Arial"/>
-          <w:sz w:val="20"/>
-          <w:szCs w:val="20"/>
-          <w:lang w:val="en-PT"/>
+          <w:lang/>
+        </w:rPr>
+      </w:pPr>
+      <w:r>
+        <w:rPr>
+          <w:rFonts w:ascii="Arial" w:hAnsi="Arial" w:cs="Arial"/>
+          <w:sz w:val="20"/>
+          <w:szCs w:val="20"/>
+          <w:lang/>
         </w:rPr>
         <w:t>Patient-specific data was aggregated in the following way.</w:t>
       </w:r>
@@ -4105,15 +4527,15 @@
           <w:rFonts w:ascii="Arial" w:hAnsi="Arial" w:cs="Arial"/>
           <w:sz w:val="20"/>
           <w:szCs w:val="20"/>
-          <w:lang w:val="en-PT"/>
-        </w:rPr>
-      </w:pPr>
-      <w:r>
-        <w:rPr>
-          <w:rFonts w:ascii="Arial" w:hAnsi="Arial" w:cs="Arial"/>
-          <w:sz w:val="20"/>
-          <w:szCs w:val="20"/>
-          <w:lang w:val="en-PT"/>
+          <w:lang/>
+        </w:rPr>
+      </w:pPr>
+      <w:r>
+        <w:rPr>
+          <w:rFonts w:ascii="Arial" w:hAnsi="Arial" w:cs="Arial"/>
+          <w:sz w:val="20"/>
+          <w:szCs w:val="20"/>
+          <w:lang/>
         </w:rPr>
         <w:t>Age</w:t>
       </w:r>
@@ -4122,7 +4544,7 @@
           <w:rFonts w:ascii="Arial" w:hAnsi="Arial" w:cs="Arial"/>
           <w:sz w:val="20"/>
           <w:szCs w:val="20"/>
-          <w:lang w:val="en-PT"/>
+          <w:lang/>
         </w:rPr>
         <w:t xml:space="preserve"> and Visit Date: max – to capture the most recent age and visit date for each patient</w:t>
       </w:r>
@@ -4133,15 +4555,15 @@
           <w:rFonts w:ascii="Arial" w:hAnsi="Arial" w:cs="Arial"/>
           <w:sz w:val="20"/>
           <w:szCs w:val="20"/>
-          <w:lang w:val="en-PT"/>
-        </w:rPr>
-      </w:pPr>
-      <w:r>
-        <w:rPr>
-          <w:rFonts w:ascii="Arial" w:hAnsi="Arial" w:cs="Arial"/>
-          <w:sz w:val="20"/>
-          <w:szCs w:val="20"/>
-          <w:lang w:val="en-PT"/>
+          <w:lang/>
+        </w:rPr>
+      </w:pPr>
+      <w:r>
+        <w:rPr>
+          <w:rFonts w:ascii="Arial" w:hAnsi="Arial" w:cs="Arial"/>
+          <w:sz w:val="20"/>
+          <w:szCs w:val="20"/>
+          <w:lang/>
         </w:rPr>
         <w:t>Gender: first – considering it does not change overtime</w:t>
       </w:r>
@@ -4152,16 +4574,17 @@
           <w:rFonts w:ascii="Arial" w:hAnsi="Arial" w:cs="Arial"/>
           <w:sz w:val="20"/>
           <w:szCs w:val="20"/>
-          <w:lang w:val="en-PT"/>
-        </w:rPr>
-      </w:pPr>
-      <w:r>
-        <w:rPr>
-          <w:rFonts w:ascii="Arial" w:hAnsi="Arial" w:cs="Arial"/>
-          <w:sz w:val="20"/>
-          <w:szCs w:val="20"/>
-          <w:lang w:val="en-PT"/>
-        </w:rPr>
+          <w:lang/>
+        </w:rPr>
+      </w:pPr>
+      <w:r>
+        <w:rPr>
+          <w:rFonts w:ascii="Arial" w:hAnsi="Arial" w:cs="Arial"/>
+          <w:sz w:val="20"/>
+          <w:szCs w:val="20"/>
+          <w:lang/>
+        </w:rPr>
+        <w:lastRenderedPageBreak/>
         <w:t>City of Residence, Profession, Insurance Provider, Family History, Education Level, Marital Status, Age Range, Days since last visit</w:t>
       </w:r>
       <w:r>
@@ -4169,7 +4592,7 @@
           <w:rFonts w:ascii="Arial" w:hAnsi="Arial" w:cs="Arial"/>
           <w:sz w:val="20"/>
           <w:szCs w:val="20"/>
-          <w:lang w:val="en-PT"/>
+          <w:lang/>
         </w:rPr>
         <w:t xml:space="preserve">, </w:t>
       </w:r>
@@ -4178,7 +4601,7 @@
           <w:rFonts w:ascii="Arial" w:hAnsi="Arial" w:cs="Arial"/>
           <w:sz w:val="20"/>
           <w:szCs w:val="20"/>
-          <w:lang w:val="en-PT"/>
+          <w:lang/>
         </w:rPr>
         <w:t>Approximate Annual Income, Income_log</w:t>
       </w:r>
@@ -4187,7 +4610,7 @@
           <w:rFonts w:ascii="Arial" w:hAnsi="Arial" w:cs="Arial"/>
           <w:sz w:val="20"/>
           <w:szCs w:val="20"/>
-          <w:lang w:val="en-PT"/>
+          <w:lang/>
         </w:rPr>
         <w:t>: last – most recent value in case of updates</w:t>
       </w:r>
@@ -4198,15 +4621,15 @@
           <w:rFonts w:ascii="Arial" w:hAnsi="Arial" w:cs="Arial"/>
           <w:sz w:val="20"/>
           <w:szCs w:val="20"/>
-          <w:lang w:val="en-PT"/>
-        </w:rPr>
-      </w:pPr>
-      <w:r>
-        <w:rPr>
-          <w:rFonts w:ascii="Arial" w:hAnsi="Arial" w:cs="Arial"/>
-          <w:sz w:val="20"/>
-          <w:szCs w:val="20"/>
-          <w:lang w:val="en-PT"/>
+          <w:lang/>
+        </w:rPr>
+      </w:pPr>
+      <w:r>
+        <w:rPr>
+          <w:rFonts w:ascii="Arial" w:hAnsi="Arial" w:cs="Arial"/>
+          <w:sz w:val="20"/>
+          <w:szCs w:val="20"/>
+          <w:lang/>
         </w:rPr>
         <w:t>Department: list – all the departments visited by each patient</w:t>
       </w:r>
@@ -4217,15 +4640,15 @@
           <w:rFonts w:ascii="Arial" w:hAnsi="Arial" w:cs="Arial"/>
           <w:sz w:val="20"/>
           <w:szCs w:val="20"/>
-          <w:lang w:val="en-PT"/>
-        </w:rPr>
-      </w:pPr>
-      <w:r>
-        <w:rPr>
-          <w:rFonts w:ascii="Arial" w:hAnsi="Arial" w:cs="Arial"/>
-          <w:sz w:val="20"/>
-          <w:szCs w:val="20"/>
-          <w:lang w:val="en-PT"/>
+          <w:lang/>
+        </w:rPr>
+      </w:pPr>
+      <w:r>
+        <w:rPr>
+          <w:rFonts w:ascii="Arial" w:hAnsi="Arial" w:cs="Arial"/>
+          <w:sz w:val="20"/>
+          <w:szCs w:val="20"/>
+          <w:lang/>
         </w:rPr>
         <w:t>Consultation Duration, Satisfaction Level, Consultation Price, Insurance Coverage, Insurance Coverage Percentage, Consultation_price_log</w:t>
       </w:r>
@@ -4234,7 +4657,7 @@
           <w:rFonts w:ascii="Arial" w:hAnsi="Arial" w:cs="Arial"/>
           <w:sz w:val="20"/>
           <w:szCs w:val="20"/>
-          <w:lang w:val="en-PT"/>
+          <w:lang/>
         </w:rPr>
         <w:t>: mean – average value for each patient, indicative of standard behaviour (patterns)</w:t>
       </w:r>
@@ -4245,19 +4668,1106 @@
           <w:rFonts w:ascii="Arial" w:hAnsi="Arial" w:cs="Arial"/>
           <w:sz w:val="20"/>
           <w:szCs w:val="20"/>
-          <w:lang w:val="en-PT"/>
-        </w:rPr>
-      </w:pPr>
-    </w:p>
-    <w:p>
-      <w:pPr>
-        <w:rPr>
-          <w:rFonts w:ascii="Arial" w:hAnsi="Arial" w:cs="Arial"/>
-          <w:sz w:val="20"/>
-          <w:szCs w:val="20"/>
-          <w:lang w:val="en-PT"/>
-        </w:rPr>
-      </w:pPr>
+          <w:lang w:val="en-US"/>
+        </w:rPr>
+      </w:pPr>
+      <w:r>
+        <w:rPr>
+          <w:rFonts w:ascii="Arial" w:hAnsi="Arial" w:cs="Arial"/>
+          <w:sz w:val="20"/>
+          <w:szCs w:val="20"/>
+          <w:lang w:val="en-US"/>
+        </w:rPr>
+        <w:t>For a better understanding of what each column represents the column names were changed to match the operations stated above. For example, Approximate Annual Income is then named Average Approximate Annual Income and Visit Date is then named Last Visit Date.</w:t>
+      </w:r>
+    </w:p>
+    <w:p>
+      <w:pPr>
+        <w:rPr>
+          <w:rFonts w:ascii="Arial" w:hAnsi="Arial" w:cs="Arial"/>
+          <w:sz w:val="20"/>
+          <w:szCs w:val="20"/>
+          <w:lang w:val="en-US"/>
+        </w:rPr>
+      </w:pPr>
+      <w:r>
+        <w:rPr>
+          <w:rFonts w:ascii="Arial" w:hAnsi="Arial" w:cs="Arial"/>
+          <w:sz w:val="20"/>
+          <w:szCs w:val="20"/>
+          <w:lang w:val="en-US"/>
+        </w:rPr>
+        <w:t>The datatype of the ‘Last Visit Date’ is converted to string instead of datetime object so when exported this column shows the correct date.</w:t>
+      </w:r>
+    </w:p>
+    <w:p>
+      <w:pPr>
+        <w:rPr>
+          <w:rFonts w:ascii="Arial" w:hAnsi="Arial" w:cs="Arial"/>
+          <w:sz w:val="20"/>
+          <w:szCs w:val="20"/>
+          <w:lang w:val="en-US"/>
+        </w:rPr>
+      </w:pPr>
+      <w:proofErr w:type="gramStart"/>
+      <w:r>
+        <w:rPr>
+          <w:rFonts w:ascii="Arial" w:hAnsi="Arial" w:cs="Arial"/>
+          <w:sz w:val="20"/>
+          <w:szCs w:val="20"/>
+          <w:lang w:val="en-US"/>
+        </w:rPr>
+        <w:t>Finally</w:t>
+      </w:r>
+      <w:proofErr w:type="gramEnd"/>
+      <w:r>
+        <w:rPr>
+          <w:rFonts w:ascii="Arial" w:hAnsi="Arial" w:cs="Arial"/>
+          <w:sz w:val="20"/>
+          <w:szCs w:val="20"/>
+          <w:lang w:val="en-US"/>
+        </w:rPr>
+        <w:t xml:space="preserve"> the table is exported to csv with the name ‘</w:t>
+      </w:r>
+      <w:proofErr w:type="spellStart"/>
+      <w:r>
+        <w:rPr>
+          <w:rFonts w:ascii="Arial" w:hAnsi="Arial" w:cs="Arial"/>
+          <w:sz w:val="20"/>
+          <w:szCs w:val="20"/>
+          <w:lang w:val="en-US"/>
+        </w:rPr>
+        <w:t>ABT_city_hospital</w:t>
+      </w:r>
+      <w:proofErr w:type="spellEnd"/>
+      <w:r>
+        <w:rPr>
+          <w:rFonts w:ascii="Arial" w:hAnsi="Arial" w:cs="Arial"/>
+          <w:sz w:val="20"/>
+          <w:szCs w:val="20"/>
+          <w:lang w:val="en-US"/>
+        </w:rPr>
+        <w:t>’.</w:t>
+      </w:r>
+    </w:p>
+    <w:p>
+      <w:pPr>
+        <w:rPr>
+          <w:rFonts w:ascii="Arial" w:hAnsi="Arial" w:cs="Arial"/>
+          <w:sz w:val="20"/>
+          <w:szCs w:val="20"/>
+          <w:lang w:val="en-US"/>
+        </w:rPr>
+      </w:pPr>
+    </w:p>
+    <w:p>
+      <w:pPr>
+        <w:rPr>
+          <w:rFonts w:ascii="Arial" w:hAnsi="Arial" w:cs="Arial"/>
+          <w:b/>
+          <w:bCs/>
+          <w:sz w:val="20"/>
+          <w:szCs w:val="20"/>
+          <w:lang w:val="en-US"/>
+        </w:rPr>
+      </w:pPr>
+      <w:r>
+        <w:rPr>
+          <w:rFonts w:ascii="Arial" w:hAnsi="Arial" w:cs="Arial"/>
+          <w:b/>
+          <w:bCs/>
+          <w:sz w:val="20"/>
+          <w:szCs w:val="20"/>
+          <w:lang w:val="en-US"/>
+        </w:rPr>
+        <w:t>Exploratory Visualization &amp; Insights</w:t>
+      </w:r>
+    </w:p>
+    <w:p>
+      <w:pPr>
+        <w:rPr>
+          <w:rFonts w:ascii="Arial" w:hAnsi="Arial" w:cs="Arial"/>
+          <w:sz w:val="20"/>
+          <w:szCs w:val="20"/>
+          <w:lang w:val="en-US"/>
+        </w:rPr>
+      </w:pPr>
+      <w:r>
+        <w:rPr>
+          <w:rFonts w:ascii="Arial" w:hAnsi="Arial" w:cs="Arial"/>
+          <w:sz w:val="20"/>
+          <w:szCs w:val="20"/>
+          <w:lang w:val="en-US"/>
+        </w:rPr>
+        <w:t xml:space="preserve">Distribution of </w:t>
+      </w:r>
+      <w:r>
+        <w:rPr>
+          <w:rFonts w:ascii="Arial" w:hAnsi="Arial" w:cs="Arial"/>
+          <w:sz w:val="20"/>
+          <w:szCs w:val="20"/>
+          <w:lang w:val="en-US"/>
+        </w:rPr>
+        <w:t>Age, Gender, Annual Income and Annual Income Log</w:t>
+      </w:r>
+    </w:p>
+    <w:p>
+      <w:pPr>
+        <w:rPr>
+          <w:rFonts w:ascii="Arial" w:hAnsi="Arial" w:cs="Arial"/>
+          <w:sz w:val="20"/>
+          <w:szCs w:val="20"/>
+          <w:u w:val="single"/>
+          <w:lang w:val="en-US"/>
+        </w:rPr>
+      </w:pPr>
+      <w:r>
+        <w:rPr>
+          <w:rFonts w:ascii="Arial" w:hAnsi="Arial" w:cs="Arial"/>
+          <w:sz w:val="20"/>
+          <w:szCs w:val="20"/>
+          <w:lang w:val="en-US"/>
+        </w:rPr>
+        <w:drawing>
+          <wp:anchor distT="0" distB="0" distL="114300" distR="114300" simplePos="0" relativeHeight="251659264" behindDoc="1" locked="0" layoutInCell="1" allowOverlap="1" wp14:anchorId="1AADA9F1" wp14:editId="6A4B4FDA">
+            <wp:simplePos x="0" y="0"/>
+            <wp:positionH relativeFrom="page">
+              <wp:posOffset>4194810</wp:posOffset>
+            </wp:positionH>
+            <wp:positionV relativeFrom="paragraph">
+              <wp:posOffset>119380</wp:posOffset>
+            </wp:positionV>
+            <wp:extent cx="2816860" cy="2186305"/>
+            <wp:effectExtent l="0" t="0" r="2540" b="4445"/>
+            <wp:wrapTight wrapText="bothSides">
+              <wp:wrapPolygon edited="0">
+                <wp:start x="0" y="0"/>
+                <wp:lineTo x="0" y="21456"/>
+                <wp:lineTo x="21473" y="21456"/>
+                <wp:lineTo x="21473" y="0"/>
+                <wp:lineTo x="0" y="0"/>
+              </wp:wrapPolygon>
+            </wp:wrapTight>
+            <wp:docPr id="422426303" name="Picture 1" descr="A graph of distribution by gender&#10;&#10;AI-generated content may be incorrect."/>
+            <wp:cNvGraphicFramePr>
+              <a:graphicFrameLocks xmlns:a="http://schemas.openxmlformats.org/drawingml/2006/main" noChangeAspect="1"/>
+            </wp:cNvGraphicFramePr>
+            <a:graphic xmlns:a="http://schemas.openxmlformats.org/drawingml/2006/main">
+              <a:graphicData uri="http://schemas.openxmlformats.org/drawingml/2006/picture">
+                <pic:pic xmlns:pic="http://schemas.openxmlformats.org/drawingml/2006/picture">
+                  <pic:nvPicPr>
+                    <pic:cNvPr id="422426303" name="Picture 1" descr="A graph of distribution by gender&#10;&#10;AI-generated content may be incorrect."/>
+                    <pic:cNvPicPr/>
+                  </pic:nvPicPr>
+                  <pic:blipFill>
+                    <a:blip r:embed="rId13" cstate="print">
+                      <a:extLst>
+                        <a:ext uri="{28A0092B-C50C-407E-A947-70E740481C1C}">
+                          <a14:useLocalDpi xmlns:a14="http://schemas.microsoft.com/office/drawing/2010/main" val="0"/>
+                        </a:ext>
+                      </a:extLst>
+                    </a:blip>
+                    <a:stretch>
+                      <a:fillRect/>
+                    </a:stretch>
+                  </pic:blipFill>
+                  <pic:spPr>
+                    <a:xfrm>
+                      <a:off x="0" y="0"/>
+                      <a:ext cx="2816860" cy="2186305"/>
+                    </a:xfrm>
+                    <a:prstGeom prst="rect">
+                      <a:avLst/>
+                    </a:prstGeom>
+                  </pic:spPr>
+                </pic:pic>
+              </a:graphicData>
+            </a:graphic>
+            <wp14:sizeRelH relativeFrom="margin">
+              <wp14:pctWidth>0</wp14:pctWidth>
+            </wp14:sizeRelH>
+            <wp14:sizeRelV relativeFrom="margin">
+              <wp14:pctHeight>0</wp14:pctHeight>
+            </wp14:sizeRelV>
+          </wp:anchor>
+        </w:drawing>
+      </w:r>
+      <w:r>
+        <w:rPr>
+          <w:rFonts w:ascii="Arial" w:hAnsi="Arial" w:cs="Arial"/>
+          <w:sz w:val="20"/>
+          <w:szCs w:val="20"/>
+          <w:u w:val="single"/>
+          <w:lang w:val="en-US"/>
+        </w:rPr>
+        <w:drawing>
+          <wp:inline distT="0" distB="0" distL="0" distR="0" wp14:anchorId="66AD0B4C" wp14:editId="63F45183">
+            <wp:extent cx="2967505" cy="2239547"/>
+            <wp:effectExtent l="0" t="0" r="4445" b="8890"/>
+            <wp:docPr id="625950171" name="Picture 1" descr="A graph of pink bars"/>
+            <wp:cNvGraphicFramePr>
+              <a:graphicFrameLocks xmlns:a="http://schemas.openxmlformats.org/drawingml/2006/main" noChangeAspect="1"/>
+            </wp:cNvGraphicFramePr>
+            <a:graphic xmlns:a="http://schemas.openxmlformats.org/drawingml/2006/main">
+              <a:graphicData uri="http://schemas.openxmlformats.org/drawingml/2006/picture">
+                <pic:pic xmlns:pic="http://schemas.openxmlformats.org/drawingml/2006/picture">
+                  <pic:nvPicPr>
+                    <pic:cNvPr id="625950171" name="Picture 1" descr="A graph of pink bars"/>
+                    <pic:cNvPicPr/>
+                  </pic:nvPicPr>
+                  <pic:blipFill rotWithShape="1">
+                    <a:blip r:embed="rId14"/>
+                    <a:srcRect b="847"/>
+                    <a:stretch>
+                      <a:fillRect/>
+                    </a:stretch>
+                  </pic:blipFill>
+                  <pic:spPr bwMode="auto">
+                    <a:xfrm>
+                      <a:off x="0" y="0"/>
+                      <a:ext cx="2983356" cy="2251510"/>
+                    </a:xfrm>
+                    <a:prstGeom prst="rect">
+                      <a:avLst/>
+                    </a:prstGeom>
+                    <a:ln>
+                      <a:noFill/>
+                    </a:ln>
+                    <a:extLst>
+                      <a:ext uri="{53640926-AAD7-44D8-BBD7-CCE9431645EC}">
+                        <a14:shadowObscured xmlns:a14="http://schemas.microsoft.com/office/drawing/2010/main"/>
+                      </a:ext>
+                    </a:extLst>
+                  </pic:spPr>
+                </pic:pic>
+              </a:graphicData>
+            </a:graphic>
+          </wp:inline>
+        </w:drawing>
+      </w:r>
+    </w:p>
+    <w:p>
+      <w:pPr>
+        <w:rPr>
+          <w:rFonts w:ascii="Arial" w:hAnsi="Arial" w:cs="Arial"/>
+          <w:sz w:val="20"/>
+          <w:szCs w:val="20"/>
+          <w:lang w:val="en-US"/>
+        </w:rPr>
+      </w:pPr>
+      <w:r>
+        <w:rPr>
+          <w:rFonts w:ascii="Arial" w:hAnsi="Arial" w:cs="Arial"/>
+          <w:sz w:val="20"/>
+          <w:szCs w:val="20"/>
+          <w:lang/>
+        </w:rPr>
+        <w:drawing>
+          <wp:anchor distT="0" distB="0" distL="114300" distR="114300" simplePos="0" relativeHeight="251660288" behindDoc="1" locked="0" layoutInCell="1" allowOverlap="1" wp14:anchorId="7ABCAA75" wp14:editId="5E001583">
+            <wp:simplePos x="0" y="0"/>
+            <wp:positionH relativeFrom="column">
+              <wp:posOffset>3442335</wp:posOffset>
+            </wp:positionH>
+            <wp:positionV relativeFrom="paragraph">
+              <wp:posOffset>3810</wp:posOffset>
+            </wp:positionV>
+            <wp:extent cx="2943225" cy="2310130"/>
+            <wp:effectExtent l="0" t="0" r="9525" b="0"/>
+            <wp:wrapTight wrapText="bothSides">
+              <wp:wrapPolygon edited="0">
+                <wp:start x="0" y="0"/>
+                <wp:lineTo x="0" y="21374"/>
+                <wp:lineTo x="21530" y="21374"/>
+                <wp:lineTo x="21530" y="0"/>
+                <wp:lineTo x="0" y="0"/>
+              </wp:wrapPolygon>
+            </wp:wrapTight>
+            <wp:docPr id="1294297059" name="Picture 1" descr="A graph of a distribution by income log&#10;&#10;AI-generated content may be incorrect."/>
+            <wp:cNvGraphicFramePr>
+              <a:graphicFrameLocks xmlns:a="http://schemas.openxmlformats.org/drawingml/2006/main" noChangeAspect="1"/>
+            </wp:cNvGraphicFramePr>
+            <a:graphic xmlns:a="http://schemas.openxmlformats.org/drawingml/2006/main">
+              <a:graphicData uri="http://schemas.openxmlformats.org/drawingml/2006/picture">
+                <pic:pic xmlns:pic="http://schemas.openxmlformats.org/drawingml/2006/picture">
+                  <pic:nvPicPr>
+                    <pic:cNvPr id="1294297059" name="Picture 1" descr="A graph of a distribution by income log&#10;&#10;AI-generated content may be incorrect."/>
+                    <pic:cNvPicPr/>
+                  </pic:nvPicPr>
+                  <pic:blipFill>
+                    <a:blip r:embed="rId15" cstate="print">
+                      <a:extLst>
+                        <a:ext uri="{28A0092B-C50C-407E-A947-70E740481C1C}">
+                          <a14:useLocalDpi xmlns:a14="http://schemas.microsoft.com/office/drawing/2010/main" val="0"/>
+                        </a:ext>
+                      </a:extLst>
+                    </a:blip>
+                    <a:stretch>
+                      <a:fillRect/>
+                    </a:stretch>
+                  </pic:blipFill>
+                  <pic:spPr>
+                    <a:xfrm>
+                      <a:off x="0" y="0"/>
+                      <a:ext cx="2943225" cy="2310130"/>
+                    </a:xfrm>
+                    <a:prstGeom prst="rect">
+                      <a:avLst/>
+                    </a:prstGeom>
+                  </pic:spPr>
+                </pic:pic>
+              </a:graphicData>
+            </a:graphic>
+            <wp14:sizeRelH relativeFrom="margin">
+              <wp14:pctWidth>0</wp14:pctWidth>
+            </wp14:sizeRelH>
+            <wp14:sizeRelV relativeFrom="margin">
+              <wp14:pctHeight>0</wp14:pctHeight>
+            </wp14:sizeRelV>
+          </wp:anchor>
+        </w:drawing>
+      </w:r>
+      <w:r>
+        <w:rPr>
+          <w:rFonts w:ascii="Arial" w:hAnsi="Arial" w:cs="Arial"/>
+          <w:sz w:val="20"/>
+          <w:szCs w:val="20"/>
+          <w:lang/>
+        </w:rPr>
+        <w:drawing>
+          <wp:inline distT="0" distB="0" distL="0" distR="0" wp14:anchorId="6B1F074B" wp14:editId="16FC5CC2">
+            <wp:extent cx="3149057" cy="2422626"/>
+            <wp:effectExtent l="0" t="0" r="0" b="0"/>
+            <wp:docPr id="1725972002" name="Picture 1" descr="A graph of distribution by an income&#10;&#10;AI-generated content may be incorrect."/>
+            <wp:cNvGraphicFramePr>
+              <a:graphicFrameLocks xmlns:a="http://schemas.openxmlformats.org/drawingml/2006/main" noChangeAspect="1"/>
+            </wp:cNvGraphicFramePr>
+            <a:graphic xmlns:a="http://schemas.openxmlformats.org/drawingml/2006/main">
+              <a:graphicData uri="http://schemas.openxmlformats.org/drawingml/2006/picture">
+                <pic:pic xmlns:pic="http://schemas.openxmlformats.org/drawingml/2006/picture">
+                  <pic:nvPicPr>
+                    <pic:cNvPr id="1725972002" name="Picture 1" descr="A graph of distribution by an income&#10;&#10;AI-generated content may be incorrect."/>
+                    <pic:cNvPicPr/>
+                  </pic:nvPicPr>
+                  <pic:blipFill>
+                    <a:blip r:embed="rId16"/>
+                    <a:stretch>
+                      <a:fillRect/>
+                    </a:stretch>
+                  </pic:blipFill>
+                  <pic:spPr>
+                    <a:xfrm>
+                      <a:off x="0" y="0"/>
+                      <a:ext cx="3168952" cy="2437932"/>
+                    </a:xfrm>
+                    <a:prstGeom prst="rect">
+                      <a:avLst/>
+                    </a:prstGeom>
+                  </pic:spPr>
+                </pic:pic>
+              </a:graphicData>
+            </a:graphic>
+          </wp:inline>
+        </w:drawing>
+      </w:r>
+    </w:p>
+    <w:p>
+      <w:pPr>
+        <w:rPr>
+          <w:rFonts w:ascii="Arial" w:hAnsi="Arial" w:cs="Arial"/>
+          <w:b/>
+          <w:bCs/>
+          <w:sz w:val="20"/>
+          <w:szCs w:val="20"/>
+          <w:lang w:val="en-US"/>
+        </w:rPr>
+      </w:pPr>
+    </w:p>
+    <w:p>
+      <w:pPr>
+        <w:rPr>
+          <w:rFonts w:ascii="Arial" w:hAnsi="Arial" w:cs="Arial"/>
+          <w:b/>
+          <w:bCs/>
+          <w:sz w:val="20"/>
+          <w:szCs w:val="20"/>
+          <w:lang w:val="en-US"/>
+        </w:rPr>
+      </w:pPr>
+      <w:r>
+        <w:rPr>
+          <w:rFonts w:ascii="Arial" w:hAnsi="Arial" w:cs="Arial"/>
+          <w:b/>
+          <w:bCs/>
+          <w:sz w:val="20"/>
+          <w:szCs w:val="20"/>
+          <w:lang w:val="en-US"/>
+        </w:rPr>
+        <w:lastRenderedPageBreak/>
+        <w:t>Number of visits per department over time</w:t>
+      </w:r>
+    </w:p>
+    <w:p>
+      <w:pPr>
+        <w:rPr>
+          <w:rFonts w:ascii="Arial" w:hAnsi="Arial" w:cs="Arial"/>
+          <w:sz w:val="20"/>
+          <w:szCs w:val="20"/>
+          <w:lang w:val="en-US"/>
+        </w:rPr>
+      </w:pPr>
+      <w:r>
+        <w:rPr>
+          <w:rFonts w:ascii="Arial" w:hAnsi="Arial" w:cs="Arial"/>
+          <w:noProof/>
+          <w:sz w:val="20"/>
+          <w:szCs w:val="20"/>
+          <w:lang w:val="en-US"/>
+        </w:rPr>
+        <w:drawing>
+          <wp:inline distT="0" distB="0" distL="0" distR="0" wp14:anchorId="00203866" wp14:editId="512D2BCE">
+            <wp:extent cx="5725795" cy="2547620"/>
+            <wp:effectExtent l="0" t="0" r="8255" b="5080"/>
+            <wp:docPr id="688989418" name="Picture 1"/>
+            <wp:cNvGraphicFramePr>
+              <a:graphicFrameLocks xmlns:a="http://schemas.openxmlformats.org/drawingml/2006/main" noChangeAspect="1"/>
+            </wp:cNvGraphicFramePr>
+            <a:graphic xmlns:a="http://schemas.openxmlformats.org/drawingml/2006/main">
+              <a:graphicData uri="http://schemas.openxmlformats.org/drawingml/2006/picture">
+                <pic:pic xmlns:pic="http://schemas.openxmlformats.org/drawingml/2006/picture">
+                  <pic:nvPicPr>
+                    <pic:cNvPr id="0" name="Picture 1"/>
+                    <pic:cNvPicPr>
+                      <a:picLocks noChangeAspect="1" noChangeArrowheads="1"/>
+                    </pic:cNvPicPr>
+                  </pic:nvPicPr>
+                  <pic:blipFill>
+                    <a:blip r:embed="rId17">
+                      <a:extLst>
+                        <a:ext uri="{28A0092B-C50C-407E-A947-70E740481C1C}">
+                          <a14:useLocalDpi xmlns:a14="http://schemas.microsoft.com/office/drawing/2010/main" val="0"/>
+                        </a:ext>
+                      </a:extLst>
+                    </a:blip>
+                    <a:srcRect/>
+                    <a:stretch>
+                      <a:fillRect/>
+                    </a:stretch>
+                  </pic:blipFill>
+                  <pic:spPr bwMode="auto">
+                    <a:xfrm>
+                      <a:off x="0" y="0"/>
+                      <a:ext cx="5725795" cy="2547620"/>
+                    </a:xfrm>
+                    <a:prstGeom prst="rect">
+                      <a:avLst/>
+                    </a:prstGeom>
+                    <a:noFill/>
+                    <a:ln>
+                      <a:noFill/>
+                    </a:ln>
+                  </pic:spPr>
+                </pic:pic>
+              </a:graphicData>
+            </a:graphic>
+          </wp:inline>
+        </w:drawing>
+      </w:r>
+    </w:p>
+    <w:p>
+      <w:pPr>
+        <w:rPr>
+          <w:rFonts w:ascii="Arial" w:hAnsi="Arial" w:cs="Arial"/>
+          <w:b/>
+          <w:bCs/>
+          <w:sz w:val="20"/>
+          <w:szCs w:val="20"/>
+          <w:lang w:val="en-US"/>
+        </w:rPr>
+      </w:pPr>
+      <w:r>
+        <w:rPr>
+          <w:rFonts w:ascii="Arial" w:hAnsi="Arial" w:cs="Arial"/>
+          <w:b/>
+          <w:bCs/>
+          <w:sz w:val="20"/>
+          <w:szCs w:val="20"/>
+          <w:lang w:val="en-US"/>
+        </w:rPr>
+        <w:t>Department visits by Gender</w:t>
+      </w:r>
+    </w:p>
+    <w:p>
+      <w:pPr>
+        <w:rPr>
+          <w:rFonts w:ascii="Arial" w:hAnsi="Arial" w:cs="Arial"/>
+          <w:b/>
+          <w:bCs/>
+          <w:noProof/>
+          <w:sz w:val="20"/>
+          <w:szCs w:val="20"/>
+          <w:lang w:val="en-US"/>
+        </w:rPr>
+      </w:pPr>
+      <w:r>
+        <w:rPr>
+          <w:rFonts w:ascii="Arial" w:hAnsi="Arial" w:cs="Arial"/>
+          <w:b/>
+          <w:bCs/>
+          <w:noProof/>
+          <w:sz w:val="20"/>
+          <w:szCs w:val="20"/>
+          <w:lang w:val="en-US"/>
+        </w:rPr>
+        <w:drawing>
+          <wp:inline distT="0" distB="0" distL="0" distR="0" wp14:anchorId="433903E1" wp14:editId="15BC48FB">
+            <wp:extent cx="5725795" cy="2547620"/>
+            <wp:effectExtent l="0" t="0" r="8255" b="5080"/>
+            <wp:docPr id="241957885" name="Picture 2"/>
+            <wp:cNvGraphicFramePr>
+              <a:graphicFrameLocks xmlns:a="http://schemas.openxmlformats.org/drawingml/2006/main" noChangeAspect="1"/>
+            </wp:cNvGraphicFramePr>
+            <a:graphic xmlns:a="http://schemas.openxmlformats.org/drawingml/2006/main">
+              <a:graphicData uri="http://schemas.openxmlformats.org/drawingml/2006/picture">
+                <pic:pic xmlns:pic="http://schemas.openxmlformats.org/drawingml/2006/picture">
+                  <pic:nvPicPr>
+                    <pic:cNvPr id="0" name="Picture 2"/>
+                    <pic:cNvPicPr>
+                      <a:picLocks noChangeAspect="1" noChangeArrowheads="1"/>
+                    </pic:cNvPicPr>
+                  </pic:nvPicPr>
+                  <pic:blipFill>
+                    <a:blip r:embed="rId18">
+                      <a:extLst>
+                        <a:ext uri="{28A0092B-C50C-407E-A947-70E740481C1C}">
+                          <a14:useLocalDpi xmlns:a14="http://schemas.microsoft.com/office/drawing/2010/main" val="0"/>
+                        </a:ext>
+                      </a:extLst>
+                    </a:blip>
+                    <a:srcRect/>
+                    <a:stretch>
+                      <a:fillRect/>
+                    </a:stretch>
+                  </pic:blipFill>
+                  <pic:spPr bwMode="auto">
+                    <a:xfrm>
+                      <a:off x="0" y="0"/>
+                      <a:ext cx="5725795" cy="2547620"/>
+                    </a:xfrm>
+                    <a:prstGeom prst="rect">
+                      <a:avLst/>
+                    </a:prstGeom>
+                    <a:noFill/>
+                    <a:ln>
+                      <a:noFill/>
+                    </a:ln>
+                  </pic:spPr>
+                </pic:pic>
+              </a:graphicData>
+            </a:graphic>
+          </wp:inline>
+        </w:drawing>
+      </w:r>
+      <w:r>
+        <w:rPr>
+          <w:rFonts w:ascii="Arial" w:hAnsi="Arial" w:cs="Arial"/>
+          <w:sz w:val="20"/>
+          <w:szCs w:val="20"/>
+          <w:lang w:val="en-US"/>
+        </w:rPr>
+        <w:tab/>
+      </w:r>
+    </w:p>
+    <w:p>
+      <w:pPr>
+        <w:tabs>
+          <w:tab w:val="left" w:pos="1471"/>
+        </w:tabs>
+        <w:rPr>
+          <w:rFonts w:ascii="Arial" w:hAnsi="Arial" w:cs="Arial"/>
+          <w:b/>
+          <w:bCs/>
+          <w:sz w:val="20"/>
+          <w:szCs w:val="20"/>
+          <w:lang w:val="en-US"/>
+        </w:rPr>
+      </w:pPr>
+      <w:r>
+        <w:rPr>
+          <w:rFonts w:ascii="Arial" w:hAnsi="Arial" w:cs="Arial"/>
+          <w:b/>
+          <w:bCs/>
+          <w:sz w:val="20"/>
+          <w:szCs w:val="20"/>
+          <w:lang w:val="en-US"/>
+        </w:rPr>
+        <w:t>Insights</w:t>
+      </w:r>
+    </w:p>
+    <w:p>
+      <w:pPr>
+        <w:tabs>
+          <w:tab w:val="left" w:pos="1471"/>
+        </w:tabs>
+        <w:rPr>
+          <w:rFonts w:ascii="Arial" w:hAnsi="Arial" w:cs="Arial"/>
+          <w:b/>
+          <w:bCs/>
+          <w:sz w:val="20"/>
+          <w:szCs w:val="20"/>
+          <w:lang w:val="en-US"/>
+        </w:rPr>
+      </w:pPr>
+      <w:r>
+        <w:rPr>
+          <w:rFonts w:ascii="Arial" w:hAnsi="Arial" w:cs="Arial"/>
+          <w:b/>
+          <w:bCs/>
+          <w:sz w:val="20"/>
+          <w:szCs w:val="20"/>
+          <w:lang w:val="en-US"/>
+        </w:rPr>
+        <w:t>Consultation Price and Duration by Satisfaction Level</w:t>
+      </w:r>
+    </w:p>
+    <w:p>
+      <w:pPr>
+        <w:tabs>
+          <w:tab w:val="left" w:pos="1471"/>
+        </w:tabs>
+        <w:rPr>
+          <w:rFonts w:ascii="Arial" w:hAnsi="Arial" w:cs="Arial"/>
+          <w:b/>
+          <w:bCs/>
+          <w:sz w:val="20"/>
+          <w:szCs w:val="20"/>
+          <w:lang w:val="en-US"/>
+        </w:rPr>
+      </w:pPr>
+      <w:r>
+        <w:rPr>
+          <w:rFonts w:ascii="Arial" w:hAnsi="Arial" w:cs="Arial"/>
+          <w:b/>
+          <w:bCs/>
+          <w:noProof/>
+          <w:sz w:val="20"/>
+          <w:szCs w:val="20"/>
+          <w:lang w:val="en-US"/>
+        </w:rPr>
+        <w:drawing>
+          <wp:anchor distT="0" distB="0" distL="114300" distR="114300" simplePos="0" relativeHeight="251661312" behindDoc="1" locked="0" layoutInCell="1" allowOverlap="1" wp14:anchorId="6EA7C35A" wp14:editId="33C468CE">
+            <wp:simplePos x="0" y="0"/>
+            <wp:positionH relativeFrom="margin">
+              <wp:align>left</wp:align>
+            </wp:positionH>
+            <wp:positionV relativeFrom="paragraph">
+              <wp:posOffset>11668</wp:posOffset>
+            </wp:positionV>
+            <wp:extent cx="4463219" cy="2660072"/>
+            <wp:effectExtent l="0" t="0" r="0" b="6985"/>
+            <wp:wrapNone/>
+            <wp:docPr id="49344326" name="Picture 4" descr="A chart of different colored squares&#10;&#10;AI-generated content may be incorrect."/>
+            <wp:cNvGraphicFramePr>
+              <a:graphicFrameLocks xmlns:a="http://schemas.openxmlformats.org/drawingml/2006/main" noChangeAspect="1"/>
+            </wp:cNvGraphicFramePr>
+            <a:graphic xmlns:a="http://schemas.openxmlformats.org/drawingml/2006/main">
+              <a:graphicData uri="http://schemas.openxmlformats.org/drawingml/2006/picture">
+                <pic:pic xmlns:pic="http://schemas.openxmlformats.org/drawingml/2006/picture">
+                  <pic:nvPicPr>
+                    <pic:cNvPr id="49344326" name="Picture 4" descr="A chart of different colored squares&#10;&#10;AI-generated content may be incorrect."/>
+                    <pic:cNvPicPr>
+                      <a:picLocks noChangeAspect="1" noChangeArrowheads="1"/>
+                    </pic:cNvPicPr>
+                  </pic:nvPicPr>
+                  <pic:blipFill>
+                    <a:blip r:embed="rId19">
+                      <a:extLst>
+                        <a:ext uri="{28A0092B-C50C-407E-A947-70E740481C1C}">
+                          <a14:useLocalDpi xmlns:a14="http://schemas.microsoft.com/office/drawing/2010/main" val="0"/>
+                        </a:ext>
+                      </a:extLst>
+                    </a:blip>
+                    <a:srcRect/>
+                    <a:stretch>
+                      <a:fillRect/>
+                    </a:stretch>
+                  </pic:blipFill>
+                  <pic:spPr bwMode="auto">
+                    <a:xfrm>
+                      <a:off x="0" y="0"/>
+                      <a:ext cx="4463219" cy="2660072"/>
+                    </a:xfrm>
+                    <a:prstGeom prst="rect">
+                      <a:avLst/>
+                    </a:prstGeom>
+                    <a:noFill/>
+                    <a:ln>
+                      <a:noFill/>
+                    </a:ln>
+                  </pic:spPr>
+                </pic:pic>
+              </a:graphicData>
+            </a:graphic>
+            <wp14:sizeRelH relativeFrom="margin">
+              <wp14:pctWidth>0</wp14:pctWidth>
+            </wp14:sizeRelH>
+            <wp14:sizeRelV relativeFrom="margin">
+              <wp14:pctHeight>0</wp14:pctHeight>
+            </wp14:sizeRelV>
+          </wp:anchor>
+        </w:drawing>
+      </w:r>
+    </w:p>
+    <w:p>
+      <w:pPr>
+        <w:rPr>
+          <w:rFonts w:ascii="Arial" w:hAnsi="Arial" w:cs="Arial"/>
+          <w:b/>
+          <w:bCs/>
+          <w:sz w:val="20"/>
+          <w:szCs w:val="20"/>
+          <w:lang w:val="en-US"/>
+        </w:rPr>
+      </w:pPr>
+      <w:r>
+        <w:rPr>
+          <w:rFonts w:ascii="Arial" w:hAnsi="Arial" w:cs="Arial"/>
+          <w:b/>
+          <w:bCs/>
+          <w:sz w:val="20"/>
+          <w:szCs w:val="20"/>
+          <w:lang w:val="en-US"/>
+        </w:rPr>
+        <w:br w:type="page"/>
+      </w:r>
+    </w:p>
+    <w:p>
+      <w:pPr>
+        <w:tabs>
+          <w:tab w:val="left" w:pos="1471"/>
+        </w:tabs>
+        <w:rPr>
+          <w:rFonts w:ascii="Arial" w:hAnsi="Arial" w:cs="Arial"/>
+          <w:b/>
+          <w:bCs/>
+          <w:sz w:val="20"/>
+          <w:szCs w:val="20"/>
+          <w:lang w:val="en-US"/>
+        </w:rPr>
+      </w:pPr>
+      <w:r>
+        <w:rPr>
+          <w:rFonts w:ascii="Arial" w:hAnsi="Arial" w:cs="Arial"/>
+          <w:b/>
+          <w:bCs/>
+          <w:sz w:val="20"/>
+          <w:szCs w:val="20"/>
+          <w:lang w:val="en-US"/>
+        </w:rPr>
+        <w:lastRenderedPageBreak/>
+        <w:t>Relationship between Consultation Price and Insurance Coverage by Insurance Provider</w:t>
+      </w:r>
+    </w:p>
+    <w:p>
+      <w:pPr>
+        <w:tabs>
+          <w:tab w:val="left" w:pos="1471"/>
+        </w:tabs>
+        <w:rPr>
+          <w:rFonts w:ascii="Arial" w:hAnsi="Arial" w:cs="Arial"/>
+          <w:b/>
+          <w:bCs/>
+          <w:sz w:val="20"/>
+          <w:szCs w:val="20"/>
+          <w:lang w:val="en-US"/>
+        </w:rPr>
+      </w:pPr>
+    </w:p>
+    <w:p>
+      <w:pPr>
+        <w:tabs>
+          <w:tab w:val="left" w:pos="1471"/>
+        </w:tabs>
+        <w:rPr>
+          <w:rFonts w:ascii="Arial" w:hAnsi="Arial" w:cs="Arial"/>
+          <w:b/>
+          <w:bCs/>
+          <w:noProof/>
+          <w:sz w:val="20"/>
+          <w:szCs w:val="20"/>
+          <w:lang w:val="en-US"/>
+        </w:rPr>
+      </w:pPr>
+      <w:r>
+        <w:rPr>
+          <w:rFonts w:ascii="Arial" w:hAnsi="Arial" w:cs="Arial"/>
+          <w:b/>
+          <w:bCs/>
+          <w:noProof/>
+          <w:sz w:val="20"/>
+          <w:szCs w:val="20"/>
+          <w:lang w:val="en-US"/>
+        </w:rPr>
+        <w:drawing>
+          <wp:inline distT="0" distB="0" distL="0" distR="0" wp14:anchorId="2B20D42E" wp14:editId="5ADAAA19">
+            <wp:extent cx="5725795" cy="3686810"/>
+            <wp:effectExtent l="0" t="0" r="8255" b="8890"/>
+            <wp:docPr id="1252330177" name="Picture 5"/>
+            <wp:cNvGraphicFramePr>
+              <a:graphicFrameLocks xmlns:a="http://schemas.openxmlformats.org/drawingml/2006/main" noChangeAspect="1"/>
+            </wp:cNvGraphicFramePr>
+            <a:graphic xmlns:a="http://schemas.openxmlformats.org/drawingml/2006/main">
+              <a:graphicData uri="http://schemas.openxmlformats.org/drawingml/2006/picture">
+                <pic:pic xmlns:pic="http://schemas.openxmlformats.org/drawingml/2006/picture">
+                  <pic:nvPicPr>
+                    <pic:cNvPr id="0" name="Picture 5"/>
+                    <pic:cNvPicPr>
+                      <a:picLocks noChangeAspect="1" noChangeArrowheads="1"/>
+                    </pic:cNvPicPr>
+                  </pic:nvPicPr>
+                  <pic:blipFill>
+                    <a:blip r:embed="rId20">
+                      <a:extLst>
+                        <a:ext uri="{28A0092B-C50C-407E-A947-70E740481C1C}">
+                          <a14:useLocalDpi xmlns:a14="http://schemas.microsoft.com/office/drawing/2010/main" val="0"/>
+                        </a:ext>
+                      </a:extLst>
+                    </a:blip>
+                    <a:srcRect/>
+                    <a:stretch>
+                      <a:fillRect/>
+                    </a:stretch>
+                  </pic:blipFill>
+                  <pic:spPr bwMode="auto">
+                    <a:xfrm>
+                      <a:off x="0" y="0"/>
+                      <a:ext cx="5725795" cy="3686810"/>
+                    </a:xfrm>
+                    <a:prstGeom prst="rect">
+                      <a:avLst/>
+                    </a:prstGeom>
+                    <a:noFill/>
+                    <a:ln>
+                      <a:noFill/>
+                    </a:ln>
+                  </pic:spPr>
+                </pic:pic>
+              </a:graphicData>
+            </a:graphic>
+          </wp:inline>
+        </w:drawing>
+      </w:r>
+    </w:p>
+    <w:p>
+      <w:pPr>
+        <w:tabs>
+          <w:tab w:val="left" w:pos="2464"/>
+        </w:tabs>
+        <w:rPr>
+          <w:rFonts w:ascii="Arial" w:hAnsi="Arial" w:cs="Arial"/>
+          <w:b/>
+          <w:bCs/>
+          <w:sz w:val="20"/>
+          <w:szCs w:val="20"/>
+          <w:lang w:val="en-US"/>
+        </w:rPr>
+      </w:pPr>
+      <w:r>
+        <w:rPr>
+          <w:rFonts w:ascii="Arial" w:hAnsi="Arial" w:cs="Arial"/>
+          <w:b/>
+          <w:bCs/>
+          <w:sz w:val="20"/>
+          <w:szCs w:val="20"/>
+          <w:lang w:val="en-US"/>
+        </w:rPr>
+        <w:t>Consultation Price by Department</w:t>
+      </w:r>
+    </w:p>
+    <w:p>
+      <w:pPr>
+        <w:tabs>
+          <w:tab w:val="left" w:pos="2464"/>
+        </w:tabs>
+        <w:rPr>
+          <w:rFonts w:ascii="Arial" w:hAnsi="Arial" w:cs="Arial"/>
+          <w:sz w:val="20"/>
+          <w:szCs w:val="20"/>
+          <w:lang w:val="en-US"/>
+        </w:rPr>
+      </w:pPr>
+    </w:p>
+    <w:p>
+      <w:pPr>
+        <w:rPr>
+          <w:rFonts w:ascii="Arial" w:hAnsi="Arial" w:cs="Arial"/>
+          <w:sz w:val="20"/>
+          <w:szCs w:val="20"/>
+          <w:lang w:val="en-US"/>
+        </w:rPr>
+      </w:pPr>
+      <w:r>
+        <w:rPr>
+          <w:rFonts w:ascii="Arial" w:hAnsi="Arial" w:cs="Arial"/>
+          <w:noProof/>
+          <w:sz w:val="20"/>
+          <w:szCs w:val="20"/>
+          <w:lang w:val="en-US"/>
+        </w:rPr>
+        <w:drawing>
+          <wp:inline distT="0" distB="0" distL="0" distR="0" wp14:anchorId="61F10565" wp14:editId="74448D58">
+            <wp:extent cx="4811602" cy="3759848"/>
+            <wp:effectExtent l="0" t="0" r="8255" b="0"/>
+            <wp:docPr id="1971681470" name="Picture 6" descr="A graph of a chart&#10;&#10;AI-generated content may be incorrect."/>
+            <wp:cNvGraphicFramePr>
+              <a:graphicFrameLocks xmlns:a="http://schemas.openxmlformats.org/drawingml/2006/main" noChangeAspect="1"/>
+            </wp:cNvGraphicFramePr>
+            <a:graphic xmlns:a="http://schemas.openxmlformats.org/drawingml/2006/main">
+              <a:graphicData uri="http://schemas.openxmlformats.org/drawingml/2006/picture">
+                <pic:pic xmlns:pic="http://schemas.openxmlformats.org/drawingml/2006/picture">
+                  <pic:nvPicPr>
+                    <pic:cNvPr id="1971681470" name="Picture 6" descr="A graph of a chart&#10;&#10;AI-generated content may be incorrect."/>
+                    <pic:cNvPicPr>
+                      <a:picLocks noChangeAspect="1" noChangeArrowheads="1"/>
+                    </pic:cNvPicPr>
+                  </pic:nvPicPr>
+                  <pic:blipFill>
+                    <a:blip r:embed="rId21">
+                      <a:extLst>
+                        <a:ext uri="{28A0092B-C50C-407E-A947-70E740481C1C}">
+                          <a14:useLocalDpi xmlns:a14="http://schemas.microsoft.com/office/drawing/2010/main" val="0"/>
+                        </a:ext>
+                      </a:extLst>
+                    </a:blip>
+                    <a:srcRect/>
+                    <a:stretch>
+                      <a:fillRect/>
+                    </a:stretch>
+                  </pic:blipFill>
+                  <pic:spPr bwMode="auto">
+                    <a:xfrm>
+                      <a:off x="0" y="0"/>
+                      <a:ext cx="4825605" cy="3770790"/>
+                    </a:xfrm>
+                    <a:prstGeom prst="rect">
+                      <a:avLst/>
+                    </a:prstGeom>
+                    <a:noFill/>
+                    <a:ln>
+                      <a:noFill/>
+                    </a:ln>
+                  </pic:spPr>
+                </pic:pic>
+              </a:graphicData>
+            </a:graphic>
+          </wp:inline>
+        </w:drawing>
+      </w:r>
+      <w:r>
+        <w:rPr>
+          <w:rFonts w:ascii="Arial" w:hAnsi="Arial" w:cs="Arial"/>
+          <w:sz w:val="20"/>
+          <w:szCs w:val="20"/>
+          <w:lang w:val="en-US"/>
+        </w:rPr>
+        <w:br w:type="page"/>
+      </w:r>
+    </w:p>
+    <w:p>
+      <w:pPr>
+        <w:tabs>
+          <w:tab w:val="left" w:pos="2464"/>
+        </w:tabs>
+        <w:rPr>
+          <w:rFonts w:ascii="Arial" w:hAnsi="Arial" w:cs="Arial"/>
+          <w:b/>
+          <w:bCs/>
+          <w:sz w:val="20"/>
+          <w:szCs w:val="20"/>
+          <w:lang w:val="en-US"/>
+        </w:rPr>
+      </w:pPr>
+      <w:r>
+        <w:rPr>
+          <w:rFonts w:ascii="Arial" w:hAnsi="Arial" w:cs="Arial"/>
+          <w:b/>
+          <w:bCs/>
+          <w:sz w:val="20"/>
+          <w:szCs w:val="20"/>
+          <w:lang w:val="en-US"/>
+        </w:rPr>
+        <w:lastRenderedPageBreak/>
+        <w:t>Number of visits per department</w:t>
+      </w:r>
+    </w:p>
+    <w:p>
+      <w:pPr>
+        <w:tabs>
+          <w:tab w:val="left" w:pos="2464"/>
+        </w:tabs>
+        <w:rPr>
+          <w:rFonts w:ascii="Arial" w:hAnsi="Arial" w:cs="Arial"/>
+          <w:sz w:val="20"/>
+          <w:szCs w:val="20"/>
+          <w:lang w:val="en-US"/>
+        </w:rPr>
+      </w:pPr>
+      <w:r>
+        <w:rPr>
+          <w:rFonts w:ascii="Arial" w:hAnsi="Arial" w:cs="Arial"/>
+          <w:noProof/>
+          <w:sz w:val="20"/>
+          <w:szCs w:val="20"/>
+          <w:lang w:val="en-US"/>
+        </w:rPr>
+        <w:drawing>
+          <wp:inline distT="0" distB="0" distL="0" distR="0" wp14:anchorId="26989690" wp14:editId="5A3DC757">
+            <wp:extent cx="4354521" cy="4210152"/>
+            <wp:effectExtent l="0" t="0" r="8255" b="0"/>
+            <wp:docPr id="2110586592" name="Picture 7"/>
+            <wp:cNvGraphicFramePr>
+              <a:graphicFrameLocks xmlns:a="http://schemas.openxmlformats.org/drawingml/2006/main" noChangeAspect="1"/>
+            </wp:cNvGraphicFramePr>
+            <a:graphic xmlns:a="http://schemas.openxmlformats.org/drawingml/2006/main">
+              <a:graphicData uri="http://schemas.openxmlformats.org/drawingml/2006/picture">
+                <pic:pic xmlns:pic="http://schemas.openxmlformats.org/drawingml/2006/picture">
+                  <pic:nvPicPr>
+                    <pic:cNvPr id="0" name="Picture 7"/>
+                    <pic:cNvPicPr>
+                      <a:picLocks noChangeAspect="1" noChangeArrowheads="1"/>
+                    </pic:cNvPicPr>
+                  </pic:nvPicPr>
+                  <pic:blipFill>
+                    <a:blip r:embed="rId22">
+                      <a:extLst>
+                        <a:ext uri="{28A0092B-C50C-407E-A947-70E740481C1C}">
+                          <a14:useLocalDpi xmlns:a14="http://schemas.microsoft.com/office/drawing/2010/main" val="0"/>
+                        </a:ext>
+                      </a:extLst>
+                    </a:blip>
+                    <a:srcRect/>
+                    <a:stretch>
+                      <a:fillRect/>
+                    </a:stretch>
+                  </pic:blipFill>
+                  <pic:spPr bwMode="auto">
+                    <a:xfrm>
+                      <a:off x="0" y="0"/>
+                      <a:ext cx="4360581" cy="4216012"/>
+                    </a:xfrm>
+                    <a:prstGeom prst="rect">
+                      <a:avLst/>
+                    </a:prstGeom>
+                    <a:noFill/>
+                    <a:ln>
+                      <a:noFill/>
+                    </a:ln>
+                  </pic:spPr>
+                </pic:pic>
+              </a:graphicData>
+            </a:graphic>
+          </wp:inline>
+        </w:drawing>
+      </w:r>
     </w:p>
     <w:sectPr>
       <w:pgSz w:w="11906" w:h="16838"/>
@@ -5552,7 +7062,6 @@
   <w:style w:type="character" w:default="1" w:styleId="DefaultParagraphFont">
     <w:name w:val="Default Paragraph Font"/>
     <w:uiPriority w:val="1"/>
-    <w:semiHidden/>
     <w:unhideWhenUsed/>
   </w:style>
   <w:style w:type="table" w:default="1" w:styleId="TableNormal">

</xml_diff>

<commit_message>
código organizado + report
</commit_message>
<xml_diff>
--- a/report_data_preprocessing.docx
+++ b/report_data_preprocessing.docx
@@ -194,9 +194,8 @@
           <w:bCs/>
           <w:lang w:val="pt-PT"/>
         </w:rPr>
-        <w:t xml:space="preserve">Data </w:t>
-      </w:r>
-      <w:proofErr w:type="spellStart"/>
+        <w:t>Data Overview</w:t>
+      </w:r>
       <w:r>
         <w:rPr>
           <w:rFonts w:ascii="Garamond" w:hAnsi="Garamond"/>
@@ -204,9 +203,8 @@
           <w:bCs/>
           <w:lang w:val="pt-PT"/>
         </w:rPr>
-        <w:t>Overview</w:t>
-      </w:r>
-      <w:proofErr w:type="spellEnd"/>
+        <w:t xml:space="preserve"> &amp; Understanding</w:t>
+      </w:r>
       <w:r>
         <w:rPr>
           <w:rFonts w:ascii="Garamond" w:hAnsi="Garamond"/>
@@ -214,36 +212,7 @@
           <w:bCs/>
           <w:lang w:val="pt-PT"/>
         </w:rPr>
-        <w:t xml:space="preserve"> &amp; </w:t>
-      </w:r>
-      <w:proofErr w:type="spellStart"/>
-      <w:r>
-        <w:rPr>
-          <w:rFonts w:ascii="Garamond" w:hAnsi="Garamond"/>
-          <w:b/>
-          <w:bCs/>
-          <w:lang w:val="pt-PT"/>
-        </w:rPr>
-        <w:t>Understanding</w:t>
-      </w:r>
-      <w:proofErr w:type="spellEnd"/>
-      <w:r>
-        <w:rPr>
-          <w:rFonts w:ascii="Garamond" w:hAnsi="Garamond"/>
-          <w:b/>
-          <w:bCs/>
-          <w:lang w:val="pt-PT"/>
-        </w:rPr>
-        <w:t xml:space="preserve"> (SE CALHAR É IMPORTANTE </w:t>
-      </w:r>
-      <w:r>
-        <w:rPr>
-          <w:rFonts w:ascii="Garamond" w:hAnsi="Garamond"/>
-          <w:b/>
-          <w:bCs/>
-          <w:lang w:val="pt-PT"/>
-        </w:rPr>
-        <w:t>POR ALGUM output DE UM DOS METODOS)</w:t>
+        <w:t xml:space="preserve"> </w:t>
       </w:r>
     </w:p>
     <w:p>
@@ -571,6 +540,7 @@
           <w:szCs w:val="20"/>
         </w:rPr>
       </w:pPr>
+      <w:proofErr w:type="gramStart"/>
       <w:r>
         <w:rPr>
           <w:rFonts w:ascii="Consolas" w:hAnsi="Consolas" w:cs="Consolas"/>
@@ -579,7 +549,18 @@
           <w:sz w:val="20"/>
           <w:szCs w:val="20"/>
         </w:rPr>
-        <w:t>info()</w:t>
+        <w:t>info(</w:t>
+      </w:r>
+      <w:proofErr w:type="gramEnd"/>
+      <w:r>
+        <w:rPr>
+          <w:rFonts w:ascii="Consolas" w:hAnsi="Consolas" w:cs="Consolas"/>
+          <w:b/>
+          <w:bCs/>
+          <w:sz w:val="20"/>
+          <w:szCs w:val="20"/>
+        </w:rPr>
+        <w:t>)</w:t>
       </w:r>
       <w:r>
         <w:rPr>
@@ -603,7 +584,16 @@
           <w:sz w:val="20"/>
           <w:szCs w:val="20"/>
         </w:rPr>
-        <w:t>as well as their datatypes</w:t>
+        <w:t xml:space="preserve">as well as their </w:t>
+      </w:r>
+      <w:proofErr w:type="gramStart"/>
+      <w:r>
+        <w:rPr>
+          <w:rFonts w:ascii="Arial" w:hAnsi="Arial" w:cs="Arial"/>
+          <w:sz w:val="20"/>
+          <w:szCs w:val="20"/>
+        </w:rPr>
+        <w:t>datatypes</w:t>
       </w:r>
       <w:r>
         <w:rPr>
@@ -613,6 +603,7 @@
         </w:rPr>
         <w:t>;</w:t>
       </w:r>
+      <w:proofErr w:type="gramEnd"/>
     </w:p>
     <w:p>
       <w:pPr>
@@ -627,6 +618,7 @@
           <w:szCs w:val="20"/>
         </w:rPr>
       </w:pPr>
+      <w:proofErr w:type="gramStart"/>
       <w:r>
         <w:rPr>
           <w:rFonts w:ascii="Consolas" w:hAnsi="Consolas" w:cs="Consolas"/>
@@ -635,7 +627,18 @@
           <w:sz w:val="20"/>
           <w:szCs w:val="20"/>
         </w:rPr>
-        <w:t>describe()</w:t>
+        <w:t>describe(</w:t>
+      </w:r>
+      <w:proofErr w:type="gramEnd"/>
+      <w:r>
+        <w:rPr>
+          <w:rFonts w:ascii="Consolas" w:hAnsi="Consolas" w:cs="Consolas"/>
+          <w:b/>
+          <w:bCs/>
+          <w:sz w:val="20"/>
+          <w:szCs w:val="20"/>
+        </w:rPr>
+        <w:t>)</w:t>
       </w:r>
       <w:r>
         <w:rPr>
@@ -742,6 +745,68 @@
         <w:t>features.</w:t>
       </w:r>
     </w:p>
+    <w:p>
+      <w:pPr>
+        <w:keepNext/>
+      </w:pPr>
+      <w:r>
+        <w:rPr>
+          <w:rFonts w:ascii="Arial" w:hAnsi="Arial" w:cs="Arial"/>
+          <w:sz w:val="20"/>
+          <w:szCs w:val="20"/>
+        </w:rPr>
+        <w:drawing>
+          <wp:inline distT="0" distB="0" distL="0" distR="0" wp14:anchorId="1A9F4E42" wp14:editId="616740FC">
+            <wp:extent cx="5731510" cy="633095"/>
+            <wp:effectExtent l="0" t="0" r="2540" b="0"/>
+            <wp:docPr id="691922556" name="Picture 1"/>
+            <wp:cNvGraphicFramePr>
+              <a:graphicFrameLocks xmlns:a="http://schemas.openxmlformats.org/drawingml/2006/main" noChangeAspect="1"/>
+            </wp:cNvGraphicFramePr>
+            <a:graphic xmlns:a="http://schemas.openxmlformats.org/drawingml/2006/main">
+              <a:graphicData uri="http://schemas.openxmlformats.org/drawingml/2006/picture">
+                <pic:pic xmlns:pic="http://schemas.openxmlformats.org/drawingml/2006/picture">
+                  <pic:nvPicPr>
+                    <pic:cNvPr id="691922556" name=""/>
+                    <pic:cNvPicPr/>
+                  </pic:nvPicPr>
+                  <pic:blipFill>
+                    <a:blip r:embed="rId7"/>
+                    <a:stretch>
+                      <a:fillRect/>
+                    </a:stretch>
+                  </pic:blipFill>
+                  <pic:spPr>
+                    <a:xfrm>
+                      <a:off x="0" y="0"/>
+                      <a:ext cx="5731510" cy="633095"/>
+                    </a:xfrm>
+                    <a:prstGeom prst="rect">
+                      <a:avLst/>
+                    </a:prstGeom>
+                  </pic:spPr>
+                </pic:pic>
+              </a:graphicData>
+            </a:graphic>
+          </wp:inline>
+        </w:drawing>
+      </w:r>
+    </w:p>
+    <w:p>
+      <w:pPr>
+        <w:pStyle w:val="Caption"/>
+        <w:jc w:val="center"/>
+      </w:pPr>
+      <w:proofErr w:type="gramStart"/>
+      <w:r>
+        <w:t>head(</w:t>
+      </w:r>
+      <w:proofErr w:type="gramEnd"/>
+      <w:r>
+        <w:t>) method output</w:t>
+      </w:r>
+    </w:p>
+    <w:p/>
     <w:p>
       <w:pPr>
         <w:pStyle w:val="p1"/>
@@ -948,13 +1013,13 @@
           <w:szCs w:val="20"/>
         </w:rPr>
         <w:drawing>
-          <wp:anchor distT="0" distB="0" distL="114300" distR="114300" simplePos="0" relativeHeight="251658240" behindDoc="0" locked="0" layoutInCell="1" allowOverlap="1" wp14:anchorId="00ABB3FE" wp14:editId="0E69FA11">
+          <wp:anchor distT="0" distB="0" distL="114300" distR="114300" simplePos="0" relativeHeight="251658240" behindDoc="0" locked="0" layoutInCell="1" allowOverlap="1" wp14:anchorId="00ABB3FE" wp14:editId="6BB04879">
             <wp:simplePos x="0" y="0"/>
             <wp:positionH relativeFrom="margin">
-              <wp:posOffset>1391920</wp:posOffset>
+              <wp:posOffset>1162098</wp:posOffset>
             </wp:positionH>
             <wp:positionV relativeFrom="margin">
-              <wp:posOffset>6347590</wp:posOffset>
+              <wp:posOffset>7599259</wp:posOffset>
             </wp:positionV>
             <wp:extent cx="2826385" cy="2123440"/>
             <wp:effectExtent l="0" t="0" r="5715" b="0"/>
@@ -971,7 +1036,7 @@
                     <pic:cNvPicPr/>
                   </pic:nvPicPr>
                   <pic:blipFill>
-                    <a:blip r:embed="rId7" cstate="print">
+                    <a:blip r:embed="rId8" cstate="print">
                       <a:extLst>
                         <a:ext uri="{28A0092B-C50C-407E-A947-70E740481C1C}">
                           <a14:useLocalDpi xmlns:a14="http://schemas.microsoft.com/office/drawing/2010/main" val="0"/>
@@ -1046,58 +1111,6 @@
     </w:p>
     <w:p>
       <w:pPr>
-        <w:ind w:firstLine="720"/>
-        <w:rPr>
-          <w:rFonts w:ascii="Arial" w:hAnsi="Arial" w:cs="Arial"/>
-          <w:sz w:val="20"/>
-          <w:szCs w:val="20"/>
-        </w:rPr>
-      </w:pPr>
-    </w:p>
-    <w:p>
-      <w:pPr>
-        <w:ind w:firstLine="720"/>
-        <w:rPr>
-          <w:rFonts w:ascii="Arial" w:hAnsi="Arial" w:cs="Arial"/>
-          <w:sz w:val="20"/>
-          <w:szCs w:val="20"/>
-        </w:rPr>
-      </w:pPr>
-    </w:p>
-    <w:p>
-      <w:pPr>
-        <w:ind w:firstLine="720"/>
-        <w:rPr>
-          <w:rFonts w:ascii="Arial" w:hAnsi="Arial" w:cs="Arial"/>
-          <w:sz w:val="20"/>
-          <w:szCs w:val="20"/>
-        </w:rPr>
-      </w:pPr>
-    </w:p>
-    <w:p>
-      <w:pPr>
-        <w:ind w:firstLine="720"/>
-        <w:rPr>
-          <w:rFonts w:ascii="Arial" w:hAnsi="Arial" w:cs="Arial"/>
-          <w:sz w:val="20"/>
-          <w:szCs w:val="20"/>
-        </w:rPr>
-      </w:pPr>
-    </w:p>
-    <w:p>
-      <w:pPr>
-        <w:rPr>
-          <w:rFonts w:ascii="Arial" w:hAnsi="Arial" w:cs="Arial"/>
-          <w:b/>
-          <w:bCs/>
-          <w:sz w:val="20"/>
-          <w:szCs w:val="20"/>
-        </w:rPr>
-      </w:pPr>
-    </w:p>
-    <w:p>
-      <w:pPr>
-        <w:ind w:firstLine="720"/>
         <w:rPr>
           <w:rFonts w:ascii="Arial" w:hAnsi="Arial" w:cs="Arial"/>
           <w:sz w:val="20"/>
@@ -1113,13 +1126,13 @@
         </w:rPr>
         <w:lastRenderedPageBreak/>
         <w:drawing>
-          <wp:anchor distT="0" distB="0" distL="114300" distR="114300" simplePos="0" relativeHeight="251662336" behindDoc="0" locked="0" layoutInCell="1" allowOverlap="1" wp14:anchorId="27CE04BF" wp14:editId="4A664F29">
+          <wp:anchor distT="0" distB="0" distL="114300" distR="114300" simplePos="0" relativeHeight="251662336" behindDoc="0" locked="0" layoutInCell="1" allowOverlap="1" wp14:anchorId="27CE04BF" wp14:editId="55B15394">
             <wp:simplePos x="0" y="0"/>
             <wp:positionH relativeFrom="margin">
-              <wp:posOffset>0</wp:posOffset>
+              <wp:posOffset>-126555</wp:posOffset>
             </wp:positionH>
             <wp:positionV relativeFrom="margin">
-              <wp:posOffset>943615</wp:posOffset>
+              <wp:posOffset>-679314</wp:posOffset>
             </wp:positionV>
             <wp:extent cx="5731510" cy="4248785"/>
             <wp:effectExtent l="0" t="0" r="0" b="5715"/>
@@ -1136,7 +1149,7 @@
                     <pic:cNvPicPr/>
                   </pic:nvPicPr>
                   <pic:blipFill>
-                    <a:blip r:embed="rId8" cstate="print">
+                    <a:blip r:embed="rId9" cstate="print">
                       <a:extLst>
                         <a:ext uri="{28A0092B-C50C-407E-A947-70E740481C1C}">
                           <a14:useLocalDpi xmlns:a14="http://schemas.microsoft.com/office/drawing/2010/main" val="0"/>
@@ -1162,6 +1175,16 @@
           </wp:anchor>
         </w:drawing>
       </w:r>
+    </w:p>
+    <w:p>
+      <w:pPr>
+        <w:ind w:firstLine="720"/>
+        <w:rPr>
+          <w:rFonts w:ascii="Arial" w:hAnsi="Arial" w:cs="Arial"/>
+          <w:sz w:val="20"/>
+          <w:szCs w:val="20"/>
+        </w:rPr>
+      </w:pPr>
       <w:r>
         <w:rPr>
           <w:rFonts w:ascii="Arial" w:hAnsi="Arial" w:cs="Arial"/>
@@ -1789,18 +1812,7 @@
           <w:szCs w:val="20"/>
           <w:lang w:val="en-US"/>
         </w:rPr>
-        <w:t xml:space="preserve">missingness is </w:t>
-      </w:r>
-      <w:r>
-        <w:rPr>
-          <w:rFonts w:ascii="Arial" w:hAnsi="Arial" w:cs="Arial"/>
-          <w:b/>
-          <w:bCs/>
-          <w:sz w:val="20"/>
-          <w:szCs w:val="20"/>
-          <w:lang w:val="en-US"/>
-        </w:rPr>
-        <w:t>random</w:t>
+        <w:t>missingness is random</w:t>
       </w:r>
       <w:r>
         <w:rPr>
@@ -1820,18 +1832,7 @@
           <w:szCs w:val="20"/>
           <w:lang w:val="en-US"/>
         </w:rPr>
-        <w:t>completely</w:t>
-      </w:r>
-      <w:r>
-        <w:rPr>
-          <w:rFonts w:ascii="Arial" w:hAnsi="Arial" w:cs="Arial"/>
-          <w:b/>
-          <w:bCs/>
-          <w:sz w:val="20"/>
-          <w:szCs w:val="20"/>
-          <w:lang w:val="en-US"/>
-        </w:rPr>
-        <w:t xml:space="preserve"> unrelated to the actual value or any other feature</w:t>
+        <w:t>completely unrelated to the actual value or any other feature</w:t>
       </w:r>
       <w:r>
         <w:rPr>
@@ -1845,21 +1846,11 @@
     </w:p>
     <w:p>
       <w:pPr>
-        <w:ind w:firstLine="720"/>
-        <w:rPr>
-          <w:rFonts w:ascii="Garamond" w:hAnsi="Garamond"/>
-          <w:b/>
-          <w:bCs/>
-        </w:rPr>
-      </w:pPr>
-    </w:p>
-    <w:p>
-      <w:pPr>
-        <w:ind w:firstLine="720"/>
-        <w:rPr>
-          <w:rFonts w:ascii="Garamond" w:hAnsi="Garamond"/>
-          <w:b/>
-          <w:bCs/>
+        <w:rPr>
+          <w:rFonts w:ascii="Arial" w:hAnsi="Arial" w:cs="Arial"/>
+          <w:sz w:val="20"/>
+          <w:szCs w:val="20"/>
+          <w:lang w:val="en-US"/>
         </w:rPr>
       </w:pPr>
     </w:p>
@@ -1881,116 +1872,116 @@
           <w:b/>
           <w:bCs/>
         </w:rPr>
+        <w:t>Age</w:t>
+      </w:r>
+    </w:p>
+    <w:p>
+      <w:pPr>
+        <w:rPr>
+          <w:rFonts w:ascii="Arial" w:hAnsi="Arial" w:cs="Arial"/>
+          <w:sz w:val="20"/>
+          <w:szCs w:val="20"/>
+        </w:rPr>
+      </w:pPr>
+      <w:r>
+        <w:rPr>
+          <w:rFonts w:ascii="Arial" w:hAnsi="Arial" w:cs="Arial"/>
+          <w:sz w:val="20"/>
+          <w:szCs w:val="20"/>
+        </w:rPr>
+        <w:t xml:space="preserve">For </w:t>
+      </w:r>
+      <w:r>
+        <w:rPr>
+          <w:rFonts w:ascii="Arial" w:hAnsi="Arial" w:cs="Arial"/>
+          <w:sz w:val="20"/>
+          <w:szCs w:val="20"/>
+        </w:rPr>
+        <w:t>this feature,</w:t>
+      </w:r>
+      <w:r>
+        <w:rPr>
+          <w:rFonts w:ascii="Arial" w:hAnsi="Arial" w:cs="Arial"/>
+          <w:sz w:val="20"/>
+          <w:szCs w:val="20"/>
+        </w:rPr>
+        <w:t xml:space="preserve"> the </w:t>
+      </w:r>
+      <w:r>
+        <w:rPr>
+          <w:rFonts w:ascii="Arial" w:hAnsi="Arial" w:cs="Arial"/>
+          <w:b/>
+          <w:bCs/>
+          <w:sz w:val="20"/>
+          <w:szCs w:val="20"/>
+        </w:rPr>
+        <w:t>patient</w:t>
+      </w:r>
+      <w:r>
+        <w:rPr>
+          <w:rFonts w:ascii="Cambria Math" w:hAnsi="Cambria Math" w:cs="Cambria Math"/>
+          <w:b/>
+          <w:bCs/>
+          <w:sz w:val="20"/>
+          <w:szCs w:val="20"/>
+        </w:rPr>
+        <w:t>‑</w:t>
+      </w:r>
+      <w:r>
+        <w:rPr>
+          <w:rFonts w:ascii="Arial" w:hAnsi="Arial" w:cs="Arial"/>
+          <w:b/>
+          <w:bCs/>
+          <w:sz w:val="20"/>
+          <w:szCs w:val="20"/>
+        </w:rPr>
+        <w:t>level carry</w:t>
+      </w:r>
+      <w:r>
+        <w:rPr>
+          <w:rFonts w:ascii="Cambria Math" w:hAnsi="Cambria Math" w:cs="Cambria Math"/>
+          <w:b/>
+          <w:bCs/>
+          <w:sz w:val="20"/>
+          <w:szCs w:val="20"/>
+        </w:rPr>
+        <w:t>‑</w:t>
+      </w:r>
+      <w:r>
+        <w:rPr>
+          <w:rFonts w:ascii="Arial" w:hAnsi="Arial" w:cs="Arial"/>
+          <w:b/>
+          <w:bCs/>
+          <w:sz w:val="20"/>
+          <w:szCs w:val="20"/>
+        </w:rPr>
+        <w:t>forward imputation</w:t>
+      </w:r>
+      <w:r>
+        <w:rPr>
+          <w:rFonts w:ascii="Arial" w:hAnsi="Arial" w:cs="Arial"/>
+          <w:sz w:val="20"/>
+          <w:szCs w:val="20"/>
+        </w:rPr>
+        <w:t xml:space="preserve"> completely resolved missing values.</w:t>
+      </w:r>
+    </w:p>
+    <w:p>
+      <w:pPr>
+        <w:rPr>
+          <w:rFonts w:ascii="Arial" w:hAnsi="Arial" w:cs="Arial"/>
+          <w:sz w:val="20"/>
+          <w:szCs w:val="20"/>
+        </w:rPr>
+      </w:pPr>
+      <w:r>
+        <w:rPr>
+          <w:rFonts w:ascii="Arial" w:hAnsi="Arial" w:cs="Arial"/>
+          <w:noProof/>
+          <w:sz w:val="20"/>
+          <w:szCs w:val="20"/>
+        </w:rPr>
         <w:lastRenderedPageBreak/>
-        <w:t>Age</w:t>
-      </w:r>
-    </w:p>
-    <w:p>
-      <w:pPr>
-        <w:rPr>
-          <w:rFonts w:ascii="Arial" w:hAnsi="Arial" w:cs="Arial"/>
-          <w:sz w:val="20"/>
-          <w:szCs w:val="20"/>
-        </w:rPr>
-      </w:pPr>
-      <w:r>
-        <w:rPr>
-          <w:rFonts w:ascii="Arial" w:hAnsi="Arial" w:cs="Arial"/>
-          <w:sz w:val="20"/>
-          <w:szCs w:val="20"/>
-        </w:rPr>
-        <w:t xml:space="preserve">For </w:t>
-      </w:r>
-      <w:r>
-        <w:rPr>
-          <w:rFonts w:ascii="Arial" w:hAnsi="Arial" w:cs="Arial"/>
-          <w:sz w:val="20"/>
-          <w:szCs w:val="20"/>
-        </w:rPr>
-        <w:t>this feature,</w:t>
-      </w:r>
-      <w:r>
-        <w:rPr>
-          <w:rFonts w:ascii="Arial" w:hAnsi="Arial" w:cs="Arial"/>
-          <w:sz w:val="20"/>
-          <w:szCs w:val="20"/>
-        </w:rPr>
-        <w:t xml:space="preserve"> the </w:t>
-      </w:r>
-      <w:r>
-        <w:rPr>
-          <w:rFonts w:ascii="Arial" w:hAnsi="Arial" w:cs="Arial"/>
-          <w:b/>
-          <w:bCs/>
-          <w:sz w:val="20"/>
-          <w:szCs w:val="20"/>
-        </w:rPr>
-        <w:t>patient</w:t>
-      </w:r>
-      <w:r>
-        <w:rPr>
-          <w:rFonts w:ascii="Cambria Math" w:hAnsi="Cambria Math" w:cs="Cambria Math"/>
-          <w:b/>
-          <w:bCs/>
-          <w:sz w:val="20"/>
-          <w:szCs w:val="20"/>
-        </w:rPr>
-        <w:t>‑</w:t>
-      </w:r>
-      <w:r>
-        <w:rPr>
-          <w:rFonts w:ascii="Arial" w:hAnsi="Arial" w:cs="Arial"/>
-          <w:b/>
-          <w:bCs/>
-          <w:sz w:val="20"/>
-          <w:szCs w:val="20"/>
-        </w:rPr>
-        <w:t>level carry</w:t>
-      </w:r>
-      <w:r>
-        <w:rPr>
-          <w:rFonts w:ascii="Cambria Math" w:hAnsi="Cambria Math" w:cs="Cambria Math"/>
-          <w:b/>
-          <w:bCs/>
-          <w:sz w:val="20"/>
-          <w:szCs w:val="20"/>
-        </w:rPr>
-        <w:t>‑</w:t>
-      </w:r>
-      <w:r>
-        <w:rPr>
-          <w:rFonts w:ascii="Arial" w:hAnsi="Arial" w:cs="Arial"/>
-          <w:b/>
-          <w:bCs/>
-          <w:sz w:val="20"/>
-          <w:szCs w:val="20"/>
-        </w:rPr>
-        <w:t>forward imputation</w:t>
-      </w:r>
-      <w:r>
-        <w:rPr>
-          <w:rFonts w:ascii="Arial" w:hAnsi="Arial" w:cs="Arial"/>
-          <w:sz w:val="20"/>
-          <w:szCs w:val="20"/>
-        </w:rPr>
-        <w:t xml:space="preserve"> completely resolved missing values.</w:t>
-      </w:r>
-    </w:p>
-    <w:p>
-      <w:pPr>
-        <w:rPr>
-          <w:rFonts w:ascii="Arial" w:hAnsi="Arial" w:cs="Arial"/>
-          <w:sz w:val="20"/>
-          <w:szCs w:val="20"/>
-        </w:rPr>
-      </w:pPr>
-      <w:r>
-        <w:rPr>
-          <w:rFonts w:ascii="Arial" w:hAnsi="Arial" w:cs="Arial"/>
-          <w:noProof/>
-          <w:sz w:val="20"/>
-          <w:szCs w:val="20"/>
-        </w:rPr>
         <w:drawing>
           <wp:inline distT="0" distB="0" distL="0" distR="0" wp14:anchorId="3EBDE812" wp14:editId="69206FF7">
             <wp:extent cx="5731510" cy="1284605"/>
@@ -2007,7 +1998,7 @@
                     <pic:cNvPicPr/>
                   </pic:nvPicPr>
                   <pic:blipFill>
-                    <a:blip r:embed="rId9" cstate="print">
+                    <a:blip r:embed="rId10" cstate="print">
                       <a:extLst>
                         <a:ext uri="{28A0092B-C50C-407E-A947-70E740481C1C}">
                           <a14:useLocalDpi xmlns:a14="http://schemas.microsoft.com/office/drawing/2010/main" val="0"/>
@@ -2458,7 +2449,7 @@
                     <pic:cNvPicPr/>
                   </pic:nvPicPr>
                   <pic:blipFill>
-                    <a:blip r:embed="rId10" cstate="print">
+                    <a:blip r:embed="rId11" cstate="print">
                       <a:extLst>
                         <a:ext uri="{28A0092B-C50C-407E-A947-70E740481C1C}">
                           <a14:useLocalDpi xmlns:a14="http://schemas.microsoft.com/office/drawing/2010/main" val="0"/>
@@ -2692,53 +2683,53 @@
           <w:szCs w:val="20"/>
           <w:lang w:val="en-US"/>
         </w:rPr>
+        <w:t xml:space="preserve">Has Provider: </w:t>
+      </w:r>
+      <w:r>
+        <w:rPr>
+          <w:rFonts w:ascii="Arial" w:hAnsi="Arial" w:cs="Arial"/>
+          <w:sz w:val="20"/>
+          <w:szCs w:val="20"/>
+          <w:lang w:val="en-US"/>
+        </w:rPr>
+        <w:t xml:space="preserve">Insurance Provider present but Insurance Coverage missing </w:t>
+      </w:r>
+      <w:r>
+        <w:rPr>
+          <w:rFonts w:ascii="Arial" w:hAnsi="Arial" w:cs="Arial"/>
+          <w:sz w:val="20"/>
+          <w:szCs w:val="20"/>
+          <w:lang w:val="en-US"/>
+        </w:rPr>
+        <w:sym w:font="Wingdings" w:char="F0E0"/>
+      </w:r>
+      <w:r>
+        <w:rPr>
+          <w:rFonts w:ascii="Arial" w:hAnsi="Arial" w:cs="Arial"/>
+          <w:sz w:val="20"/>
+          <w:szCs w:val="20"/>
+          <w:lang w:val="en-US"/>
+        </w:rPr>
+        <w:t xml:space="preserve"> provider specific rules applied.</w:t>
+      </w:r>
+    </w:p>
+    <w:p>
+      <w:pPr>
+        <w:rPr>
+          <w:rFonts w:ascii="Arial" w:hAnsi="Arial" w:cs="Arial"/>
+          <w:sz w:val="20"/>
+          <w:szCs w:val="20"/>
+          <w:lang w:val="en-US"/>
+        </w:rPr>
+      </w:pPr>
+      <w:r>
+        <w:rPr>
+          <w:rFonts w:ascii="Arial" w:hAnsi="Arial" w:cs="Arial"/>
+          <w:sz w:val="20"/>
+          <w:szCs w:val="20"/>
+          <w:lang w:val="en-US"/>
+        </w:rPr>
         <w:lastRenderedPageBreak/>
-        <w:t xml:space="preserve">Has Provider: </w:t>
-      </w:r>
-      <w:r>
-        <w:rPr>
-          <w:rFonts w:ascii="Arial" w:hAnsi="Arial" w:cs="Arial"/>
-          <w:sz w:val="20"/>
-          <w:szCs w:val="20"/>
-          <w:lang w:val="en-US"/>
-        </w:rPr>
-        <w:t xml:space="preserve">Insurance Provider present but Insurance Coverage missing </w:t>
-      </w:r>
-      <w:r>
-        <w:rPr>
-          <w:rFonts w:ascii="Arial" w:hAnsi="Arial" w:cs="Arial"/>
-          <w:sz w:val="20"/>
-          <w:szCs w:val="20"/>
-          <w:lang w:val="en-US"/>
-        </w:rPr>
-        <w:sym w:font="Wingdings" w:char="F0E0"/>
-      </w:r>
-      <w:r>
-        <w:rPr>
-          <w:rFonts w:ascii="Arial" w:hAnsi="Arial" w:cs="Arial"/>
-          <w:sz w:val="20"/>
-          <w:szCs w:val="20"/>
-          <w:lang w:val="en-US"/>
-        </w:rPr>
-        <w:t xml:space="preserve"> provider specific rules applied.</w:t>
-      </w:r>
-    </w:p>
-    <w:p>
-      <w:pPr>
-        <w:rPr>
-          <w:rFonts w:ascii="Arial" w:hAnsi="Arial" w:cs="Arial"/>
-          <w:sz w:val="20"/>
-          <w:szCs w:val="20"/>
-          <w:lang w:val="en-US"/>
-        </w:rPr>
-      </w:pPr>
-      <w:r>
-        <w:rPr>
-          <w:rFonts w:ascii="Arial" w:hAnsi="Arial" w:cs="Arial"/>
-          <w:sz w:val="20"/>
-          <w:szCs w:val="20"/>
-          <w:lang w:val="en-US"/>
-        </w:rPr>
         <w:t xml:space="preserve">For the </w:t>
       </w:r>
       <w:r>
@@ -3309,7 +3300,7 @@
                     <pic:cNvPicPr/>
                   </pic:nvPicPr>
                   <pic:blipFill>
-                    <a:blip r:embed="rId11">
+                    <a:blip r:embed="rId12">
                       <a:extLst>
                         <a:ext uri="{28A0092B-C50C-407E-A947-70E740481C1C}">
                           <a14:useLocalDpi xmlns:a14="http://schemas.microsoft.com/office/drawing/2010/main" val="0"/>
@@ -3715,7 +3706,7 @@
                     <pic:cNvPicPr/>
                   </pic:nvPicPr>
                   <pic:blipFill>
-                    <a:blip r:embed="rId12" cstate="print">
+                    <a:blip r:embed="rId13" cstate="print">
                       <a:extLst>
                         <a:ext uri="{28A0092B-C50C-407E-A947-70E740481C1C}">
                           <a14:useLocalDpi xmlns:a14="http://schemas.microsoft.com/office/drawing/2010/main" val="0"/>
@@ -4063,7 +4054,7 @@
                     <pic:cNvPicPr/>
                   </pic:nvPicPr>
                   <pic:blipFill>
-                    <a:blip r:embed="rId13" cstate="print">
+                    <a:blip r:embed="rId14" cstate="print">
                       <a:extLst>
                         <a:ext uri="{28A0092B-C50C-407E-A947-70E740481C1C}">
                           <a14:useLocalDpi xmlns:a14="http://schemas.microsoft.com/office/drawing/2010/main" val="0"/>
@@ -4248,7 +4239,6 @@
           <w:lang w:val="pt-PT"/>
         </w:rPr>
       </w:pPr>
-      <w:proofErr w:type="spellStart"/>
       <w:r>
         <w:rPr>
           <w:rFonts w:ascii="Garamond" w:hAnsi="Garamond"/>
@@ -4259,637 +4249,1438 @@
         <w:lastRenderedPageBreak/>
         <w:t>Outliers</w:t>
       </w:r>
+    </w:p>
+    <w:p>
+      <w:pPr>
+        <w:ind w:firstLine="720"/>
+        <w:rPr>
+          <w:rFonts w:ascii="Arial" w:hAnsi="Arial" w:cs="Arial"/>
+          <w:sz w:val="20"/>
+          <w:szCs w:val="20"/>
+        </w:rPr>
+      </w:pPr>
+      <w:r>
+        <w:rPr>
+          <w:rFonts w:ascii="Arial" w:hAnsi="Arial" w:cs="Arial"/>
+          <w:sz w:val="20"/>
+          <w:szCs w:val="20"/>
+        </w:rPr>
+        <w:t xml:space="preserve">In the process of </w:t>
+      </w:r>
+      <w:r>
+        <w:rPr>
+          <w:rFonts w:ascii="Arial" w:hAnsi="Arial" w:cs="Arial"/>
+          <w:b/>
+          <w:bCs/>
+          <w:sz w:val="20"/>
+          <w:szCs w:val="20"/>
+        </w:rPr>
+        <w:t>Exploratory Data Analysis</w:t>
+      </w:r>
+      <w:r>
+        <w:rPr>
+          <w:rFonts w:ascii="Arial" w:hAnsi="Arial" w:cs="Arial"/>
+          <w:sz w:val="20"/>
+          <w:szCs w:val="20"/>
+        </w:rPr>
+        <w:t>, several numerical features showed the presence of extreme values. To maintain the quality of the data and the accuracy of further analysis, an outlier treatment was conducted</w:t>
+      </w:r>
+      <w:r>
+        <w:rPr>
+          <w:rFonts w:ascii="Arial" w:hAnsi="Arial" w:cs="Arial"/>
+          <w:sz w:val="20"/>
+          <w:szCs w:val="20"/>
+        </w:rPr>
+        <w:t xml:space="preserve"> – capping (replacing outliers beyond a certain threshold with the value of that threshold)</w:t>
+      </w:r>
+      <w:r>
+        <w:rPr>
+          <w:rFonts w:ascii="Arial" w:hAnsi="Arial" w:cs="Arial"/>
+          <w:sz w:val="20"/>
+          <w:szCs w:val="20"/>
+        </w:rPr>
+        <w:t>, based on domain knowledge and the Interquartile Range technique (IQR).</w:t>
+      </w:r>
+      <w:r>
+        <w:rPr>
+          <w:rFonts w:ascii="Arial" w:hAnsi="Arial" w:cs="Arial"/>
+          <w:sz w:val="20"/>
+          <w:szCs w:val="20"/>
+        </w:rPr>
+        <w:t xml:space="preserve"> This technique considers to be outliers any value below </w:t>
+      </w:r>
+      <w:r>
+        <w:rPr>
+          <w:rFonts w:ascii="Consolas" w:hAnsi="Consolas" w:cs="Consolas"/>
+          <w:b/>
+          <w:bCs/>
+          <w:sz w:val="20"/>
+          <w:szCs w:val="20"/>
+        </w:rPr>
+        <w:t xml:space="preserve">Q1 – k </w:t>
+      </w:r>
+      <w:r>
+        <w:rPr>
+          <w:rFonts w:ascii="Consolas" w:hAnsi="Consolas" w:cs="Consolas"/>
+          <w:b/>
+          <w:bCs/>
+          <w:sz w:val="20"/>
+          <w:szCs w:val="20"/>
+        </w:rPr>
+        <w:sym w:font="Symbol" w:char="F02A"/>
+      </w:r>
+      <w:r>
+        <w:rPr>
+          <w:rFonts w:ascii="Consolas" w:hAnsi="Consolas" w:cs="Consolas"/>
+          <w:b/>
+          <w:bCs/>
+          <w:sz w:val="20"/>
+          <w:szCs w:val="20"/>
+        </w:rPr>
+        <w:t xml:space="preserve"> IQR</w:t>
+      </w:r>
+      <w:r>
+        <w:rPr>
+          <w:rFonts w:ascii="Arial" w:hAnsi="Arial" w:cs="Arial"/>
+          <w:sz w:val="20"/>
+          <w:szCs w:val="20"/>
+        </w:rPr>
+        <w:t xml:space="preserve"> or above </w:t>
+      </w:r>
+      <w:r>
+        <w:rPr>
+          <w:rFonts w:ascii="Consolas" w:hAnsi="Consolas" w:cs="Consolas"/>
+          <w:b/>
+          <w:bCs/>
+          <w:sz w:val="20"/>
+          <w:szCs w:val="20"/>
+        </w:rPr>
+        <w:t xml:space="preserve">Q3 + k </w:t>
+      </w:r>
+      <w:r>
+        <w:rPr>
+          <w:rFonts w:ascii="Consolas" w:hAnsi="Consolas" w:cs="Consolas"/>
+          <w:b/>
+          <w:bCs/>
+          <w:sz w:val="20"/>
+          <w:szCs w:val="20"/>
+        </w:rPr>
+        <w:sym w:font="Symbol" w:char="F02A"/>
+      </w:r>
+      <w:r>
+        <w:rPr>
+          <w:rFonts w:ascii="Consolas" w:hAnsi="Consolas" w:cs="Consolas"/>
+          <w:b/>
+          <w:bCs/>
+          <w:sz w:val="20"/>
+          <w:szCs w:val="20"/>
+        </w:rPr>
+        <w:t xml:space="preserve"> IQR,</w:t>
+      </w:r>
+      <w:r>
+        <w:rPr>
+          <w:rFonts w:ascii="Arial" w:hAnsi="Arial" w:cs="Arial"/>
+          <w:sz w:val="20"/>
+          <w:szCs w:val="20"/>
+        </w:rPr>
+        <w:t xml:space="preserve"> with </w:t>
+      </w:r>
+      <w:r>
+        <w:rPr>
+          <w:rFonts w:ascii="Consolas" w:hAnsi="Consolas" w:cs="Consolas"/>
+          <w:b/>
+          <w:bCs/>
+          <w:sz w:val="20"/>
+          <w:szCs w:val="20"/>
+        </w:rPr>
+        <w:t>IQR</w:t>
+      </w:r>
+      <w:r>
+        <w:rPr>
+          <w:rFonts w:ascii="Arial" w:hAnsi="Arial" w:cs="Arial"/>
+          <w:sz w:val="20"/>
+          <w:szCs w:val="20"/>
+        </w:rPr>
+        <w:t xml:space="preserve"> being </w:t>
+      </w:r>
+      <w:r>
+        <w:rPr>
+          <w:rFonts w:ascii="Consolas" w:hAnsi="Consolas" w:cs="Consolas"/>
+          <w:b/>
+          <w:bCs/>
+          <w:sz w:val="20"/>
+          <w:szCs w:val="20"/>
+        </w:rPr>
+        <w:t>Q3-Q1</w:t>
+      </w:r>
+      <w:r>
+        <w:rPr>
+          <w:rFonts w:ascii="Arial" w:hAnsi="Arial" w:cs="Arial"/>
+          <w:sz w:val="20"/>
+          <w:szCs w:val="20"/>
+        </w:rPr>
+        <w:t xml:space="preserve"> and </w:t>
+      </w:r>
+      <w:r>
+        <w:rPr>
+          <w:rFonts w:ascii="Consolas" w:hAnsi="Consolas" w:cs="Consolas"/>
+          <w:b/>
+          <w:bCs/>
+          <w:sz w:val="20"/>
+          <w:szCs w:val="20"/>
+        </w:rPr>
+        <w:t>k</w:t>
+      </w:r>
+      <w:r>
+        <w:rPr>
+          <w:rFonts w:ascii="Arial" w:hAnsi="Arial" w:cs="Arial"/>
+          <w:sz w:val="20"/>
+          <w:szCs w:val="20"/>
+        </w:rPr>
+        <w:t>,</w:t>
+      </w:r>
+      <w:r>
+        <w:rPr>
+          <w:rFonts w:ascii="Arial" w:hAnsi="Arial" w:cs="Arial"/>
+          <w:sz w:val="20"/>
+          <w:szCs w:val="20"/>
+        </w:rPr>
+        <w:t xml:space="preserve"> although normally set to </w:t>
+      </w:r>
+      <w:r>
+        <w:rPr>
+          <w:rFonts w:ascii="Consolas" w:hAnsi="Consolas" w:cs="Consolas"/>
+          <w:b/>
+          <w:bCs/>
+          <w:sz w:val="20"/>
+          <w:szCs w:val="20"/>
+        </w:rPr>
+        <w:t>1.5</w:t>
+      </w:r>
+      <w:r>
+        <w:rPr>
+          <w:rFonts w:ascii="Arial" w:hAnsi="Arial" w:cs="Arial"/>
+          <w:sz w:val="20"/>
+          <w:szCs w:val="20"/>
+        </w:rPr>
+        <w:t>, it can be set to any positive number.</w:t>
+      </w:r>
+    </w:p>
+    <w:p>
+      <w:pPr>
+        <w:rPr>
+          <w:rFonts w:ascii="Arial" w:hAnsi="Arial" w:cs="Arial"/>
+          <w:b/>
+          <w:bCs/>
+          <w:sz w:val="20"/>
+          <w:szCs w:val="20"/>
+        </w:rPr>
+      </w:pPr>
+      <w:r>
+        <w:rPr>
+          <w:rFonts w:ascii="Garamond" w:hAnsi="Garamond"/>
+          <w:b/>
+          <w:bCs/>
+        </w:rPr>
+        <w:t>Age</w:t>
+      </w:r>
+    </w:p>
+    <w:p>
+      <w:pPr>
+        <w:rPr>
+          <w:rFonts w:ascii="Arial" w:hAnsi="Arial" w:cs="Arial"/>
+          <w:sz w:val="20"/>
+          <w:szCs w:val="20"/>
+        </w:rPr>
+      </w:pPr>
+      <w:r>
+        <w:rPr>
+          <w:rFonts w:ascii="Arial" w:hAnsi="Arial" w:cs="Arial"/>
+          <w:sz w:val="20"/>
+          <w:szCs w:val="20"/>
+        </w:rPr>
+        <w:t>All observations above 127 (</w:t>
+      </w:r>
+      <w:r>
+        <w:rPr>
+          <w:rFonts w:ascii="Arial" w:hAnsi="Arial" w:cs="Arial"/>
+          <w:sz w:val="20"/>
+          <w:szCs w:val="20"/>
+        </w:rPr>
+        <w:t xml:space="preserve">corresponding to </w:t>
+      </w:r>
+      <w:r>
+        <w:rPr>
+          <w:rFonts w:ascii="Consolas" w:hAnsi="Consolas" w:cs="Consolas"/>
+          <w:b/>
+          <w:bCs/>
+          <w:sz w:val="20"/>
+          <w:szCs w:val="20"/>
+        </w:rPr>
+        <w:t>Q3+IQR</w:t>
+      </w:r>
+      <w:r>
+        <w:rPr>
+          <w:rFonts w:ascii="Consolas" w:hAnsi="Consolas" w:cs="Consolas"/>
+          <w:b/>
+          <w:bCs/>
+          <w:sz w:val="20"/>
+          <w:szCs w:val="20"/>
+        </w:rPr>
+        <w:t>,</w:t>
+      </w:r>
+      <w:r>
+        <w:rPr>
+          <w:rFonts w:ascii="Arial" w:hAnsi="Arial" w:cs="Arial"/>
+          <w:sz w:val="20"/>
+          <w:szCs w:val="20"/>
+        </w:rPr>
+        <w:t xml:space="preserve"> with </w:t>
+      </w:r>
+      <w:r>
+        <w:rPr>
+          <w:rFonts w:ascii="Consolas" w:hAnsi="Consolas" w:cs="Consolas"/>
+          <w:b/>
+          <w:bCs/>
+          <w:sz w:val="20"/>
+          <w:szCs w:val="20"/>
+        </w:rPr>
+        <w:t>k</w:t>
+      </w:r>
+      <w:r>
+        <w:rPr>
+          <w:rFonts w:ascii="Arial" w:hAnsi="Arial" w:cs="Arial"/>
+          <w:sz w:val="20"/>
+          <w:szCs w:val="20"/>
+        </w:rPr>
+        <w:t xml:space="preserve"> set to </w:t>
+      </w:r>
+      <w:r>
+        <w:rPr>
+          <w:rFonts w:ascii="Consolas" w:hAnsi="Consolas" w:cs="Consolas"/>
+          <w:b/>
+          <w:bCs/>
+          <w:sz w:val="20"/>
+          <w:szCs w:val="20"/>
+        </w:rPr>
+        <w:t>1</w:t>
+      </w:r>
+      <w:r>
+        <w:rPr>
+          <w:rFonts w:ascii="Arial" w:hAnsi="Arial" w:cs="Arial"/>
+          <w:sz w:val="20"/>
+          <w:szCs w:val="20"/>
+        </w:rPr>
+        <w:t xml:space="preserve">) </w:t>
+      </w:r>
+      <w:r>
+        <w:rPr>
+          <w:rFonts w:ascii="Arial" w:hAnsi="Arial" w:cs="Arial"/>
+          <w:sz w:val="20"/>
+          <w:szCs w:val="20"/>
+        </w:rPr>
+        <w:t xml:space="preserve">were capped. </w:t>
+      </w:r>
+      <w:r>
+        <w:rPr>
+          <w:rFonts w:ascii="Arial" w:hAnsi="Arial" w:cs="Arial"/>
+          <w:sz w:val="20"/>
+          <w:szCs w:val="20"/>
+        </w:rPr>
+        <w:t xml:space="preserve">If the default value for </w:t>
+      </w:r>
+      <w:r>
+        <w:rPr>
+          <w:rFonts w:ascii="Consolas" w:hAnsi="Consolas" w:cs="Consolas"/>
+          <w:b/>
+          <w:bCs/>
+          <w:sz w:val="20"/>
+          <w:szCs w:val="20"/>
+        </w:rPr>
+        <w:t>k</w:t>
+      </w:r>
+      <w:r>
+        <w:rPr>
+          <w:rFonts w:ascii="Arial" w:hAnsi="Arial" w:cs="Arial"/>
+          <w:sz w:val="20"/>
+          <w:szCs w:val="20"/>
+        </w:rPr>
+        <w:t xml:space="preserve"> was used, the capping threshold would be even higher, allowing unrealistic ages to remain in the dataset.</w:t>
+      </w:r>
+    </w:p>
+    <w:p>
+      <w:pPr>
+        <w:rPr>
+          <w:rFonts w:ascii="Arial" w:hAnsi="Arial" w:cs="Arial"/>
+          <w:sz w:val="20"/>
+          <w:szCs w:val="20"/>
+        </w:rPr>
+      </w:pPr>
+      <w:r>
+        <w:rPr>
+          <w:rFonts w:ascii="Arial" w:hAnsi="Arial" w:cs="Arial"/>
+          <w:noProof/>
+          <w:sz w:val="20"/>
+          <w:szCs w:val="20"/>
+        </w:rPr>
+        <w:drawing>
+          <wp:inline distT="0" distB="0" distL="0" distR="0" wp14:anchorId="6B5D545F" wp14:editId="4845D80B">
+            <wp:extent cx="2994154" cy="2488928"/>
+            <wp:effectExtent l="0" t="0" r="0" b="6985"/>
+            <wp:docPr id="740286290" name="Picture 1"/>
+            <wp:cNvGraphicFramePr>
+              <a:graphicFrameLocks xmlns:a="http://schemas.openxmlformats.org/drawingml/2006/main" noChangeAspect="1"/>
+            </wp:cNvGraphicFramePr>
+            <a:graphic xmlns:a="http://schemas.openxmlformats.org/drawingml/2006/main">
+              <a:graphicData uri="http://schemas.openxmlformats.org/drawingml/2006/picture">
+                <pic:pic xmlns:pic="http://schemas.openxmlformats.org/drawingml/2006/picture">
+                  <pic:nvPicPr>
+                    <pic:cNvPr id="0" name="Picture 1"/>
+                    <pic:cNvPicPr>
+                      <a:picLocks noChangeAspect="1" noChangeArrowheads="1"/>
+                    </pic:cNvPicPr>
+                  </pic:nvPicPr>
+                  <pic:blipFill>
+                    <a:blip r:embed="rId15">
+                      <a:extLst>
+                        <a:ext uri="{28A0092B-C50C-407E-A947-70E740481C1C}">
+                          <a14:useLocalDpi xmlns:a14="http://schemas.microsoft.com/office/drawing/2010/main" val="0"/>
+                        </a:ext>
+                      </a:extLst>
+                    </a:blip>
+                    <a:srcRect/>
+                    <a:stretch>
+                      <a:fillRect/>
+                    </a:stretch>
+                  </pic:blipFill>
+                  <pic:spPr bwMode="auto">
+                    <a:xfrm>
+                      <a:off x="0" y="0"/>
+                      <a:ext cx="3005313" cy="2498204"/>
+                    </a:xfrm>
+                    <a:prstGeom prst="rect">
+                      <a:avLst/>
+                    </a:prstGeom>
+                    <a:noFill/>
+                    <a:ln>
+                      <a:noFill/>
+                    </a:ln>
+                  </pic:spPr>
+                </pic:pic>
+              </a:graphicData>
+            </a:graphic>
+          </wp:inline>
+        </w:drawing>
+      </w:r>
+    </w:p>
+    <w:p>
+      <w:pPr>
+        <w:rPr>
+          <w:rFonts w:ascii="Garamond" w:hAnsi="Garamond"/>
+          <w:b/>
+          <w:bCs/>
+        </w:rPr>
+      </w:pPr>
+      <w:r>
+        <w:rPr>
+          <w:rFonts w:ascii="Garamond" w:hAnsi="Garamond"/>
+          <w:b/>
+          <w:bCs/>
+        </w:rPr>
+        <w:t>Consultation Duration</w:t>
+      </w:r>
+    </w:p>
+    <w:p>
+      <w:pPr>
+        <w:rPr>
+          <w:rFonts w:ascii="Arial" w:hAnsi="Arial" w:cs="Arial"/>
+          <w:sz w:val="20"/>
+          <w:szCs w:val="20"/>
+        </w:rPr>
+      </w:pPr>
+      <w:r>
+        <w:rPr>
+          <w:rFonts w:ascii="Arial" w:hAnsi="Arial" w:cs="Arial"/>
+          <w:sz w:val="20"/>
+          <w:szCs w:val="20"/>
+        </w:rPr>
+        <w:t xml:space="preserve">All observations above 173.5 minutes </w:t>
+      </w:r>
+      <w:r>
+        <w:rPr>
+          <w:rFonts w:ascii="Arial" w:hAnsi="Arial" w:cs="Arial"/>
+          <w:sz w:val="20"/>
+          <w:szCs w:val="20"/>
+        </w:rPr>
+        <w:t xml:space="preserve">(corresponding to </w:t>
+      </w:r>
+      <w:r>
+        <w:rPr>
+          <w:rFonts w:ascii="Consolas" w:hAnsi="Consolas" w:cs="Consolas"/>
+          <w:b/>
+          <w:bCs/>
+          <w:sz w:val="20"/>
+          <w:szCs w:val="20"/>
+        </w:rPr>
+        <w:t>Q3+IQR</w:t>
+      </w:r>
+      <w:r>
+        <w:rPr>
+          <w:rFonts w:ascii="Consolas" w:hAnsi="Consolas" w:cs="Consolas"/>
+          <w:b/>
+          <w:bCs/>
+          <w:sz w:val="20"/>
+          <w:szCs w:val="20"/>
+        </w:rPr>
+        <w:t>,</w:t>
+      </w:r>
+      <w:r>
+        <w:rPr>
+          <w:rFonts w:ascii="Arial" w:hAnsi="Arial" w:cs="Arial"/>
+          <w:sz w:val="20"/>
+          <w:szCs w:val="20"/>
+        </w:rPr>
+        <w:t xml:space="preserve"> with </w:t>
+      </w:r>
+      <w:r>
+        <w:rPr>
+          <w:rFonts w:ascii="Consolas" w:hAnsi="Consolas" w:cs="Consolas"/>
+          <w:b/>
+          <w:bCs/>
+          <w:sz w:val="20"/>
+          <w:szCs w:val="20"/>
+        </w:rPr>
+        <w:t>k</w:t>
+      </w:r>
+      <w:r>
+        <w:rPr>
+          <w:rFonts w:ascii="Arial" w:hAnsi="Arial" w:cs="Arial"/>
+          <w:sz w:val="20"/>
+          <w:szCs w:val="20"/>
+        </w:rPr>
+        <w:t xml:space="preserve"> set to </w:t>
+      </w:r>
+      <w:r>
+        <w:rPr>
+          <w:rFonts w:ascii="Consolas" w:hAnsi="Consolas" w:cs="Consolas"/>
+          <w:b/>
+          <w:bCs/>
+          <w:sz w:val="20"/>
+          <w:szCs w:val="20"/>
+        </w:rPr>
+        <w:t>1</w:t>
+      </w:r>
+      <w:r>
+        <w:rPr>
+          <w:rFonts w:ascii="Consolas" w:hAnsi="Consolas" w:cs="Consolas"/>
+          <w:b/>
+          <w:bCs/>
+          <w:sz w:val="20"/>
+          <w:szCs w:val="20"/>
+        </w:rPr>
+        <w:t>.5</w:t>
+      </w:r>
+      <w:r>
+        <w:rPr>
+          <w:rFonts w:ascii="Arial" w:hAnsi="Arial" w:cs="Arial"/>
+          <w:sz w:val="20"/>
+          <w:szCs w:val="20"/>
+        </w:rPr>
+        <w:t xml:space="preserve">) </w:t>
+      </w:r>
+      <w:r>
+        <w:rPr>
+          <w:rFonts w:ascii="Arial" w:hAnsi="Arial" w:cs="Arial"/>
+          <w:sz w:val="20"/>
+          <w:szCs w:val="20"/>
+        </w:rPr>
+        <w:t>were considered outliers</w:t>
+      </w:r>
+      <w:r>
+        <w:rPr>
+          <w:rFonts w:ascii="Arial" w:hAnsi="Arial" w:cs="Arial"/>
+          <w:sz w:val="20"/>
+          <w:szCs w:val="20"/>
+        </w:rPr>
+        <w:t xml:space="preserve">. Although </w:t>
+      </w:r>
+      <w:r>
+        <w:rPr>
+          <w:rFonts w:ascii="Arial" w:hAnsi="Arial" w:cs="Arial"/>
+          <w:sz w:val="20"/>
+          <w:szCs w:val="20"/>
+        </w:rPr>
+        <w:t xml:space="preserve">the lower bound </w:t>
+      </w:r>
+      <w:r>
+        <w:rPr>
+          <w:rFonts w:ascii="Arial" w:hAnsi="Arial" w:cs="Arial"/>
+          <w:sz w:val="20"/>
+          <w:szCs w:val="20"/>
+        </w:rPr>
+        <w:t xml:space="preserve">was also calculated with the IQR method, it </w:t>
+      </w:r>
+      <w:r>
+        <w:rPr>
+          <w:rFonts w:ascii="Arial" w:hAnsi="Arial" w:cs="Arial"/>
+          <w:sz w:val="20"/>
+          <w:szCs w:val="20"/>
+        </w:rPr>
+        <w:t>is a negative value</w:t>
+      </w:r>
+      <w:r>
+        <w:rPr>
+          <w:rFonts w:ascii="Arial" w:hAnsi="Arial" w:cs="Arial"/>
+          <w:sz w:val="20"/>
+          <w:szCs w:val="20"/>
+        </w:rPr>
+        <w:t>. As</w:t>
+      </w:r>
+      <w:r>
+        <w:rPr>
+          <w:rFonts w:ascii="Arial" w:hAnsi="Arial" w:cs="Arial"/>
+          <w:sz w:val="20"/>
+          <w:szCs w:val="20"/>
+        </w:rPr>
+        <w:t xml:space="preserve"> </w:t>
+      </w:r>
+      <w:r>
+        <w:rPr>
+          <w:rFonts w:ascii="Arial" w:hAnsi="Arial" w:cs="Arial"/>
+          <w:sz w:val="20"/>
+          <w:szCs w:val="20"/>
+        </w:rPr>
+        <w:t>consultation durations cannot be negative, no outliers were removed at the lower end.</w:t>
+      </w:r>
+    </w:p>
+    <w:p>
+      <w:pPr>
+        <w:rPr>
+          <w:rFonts w:ascii="Arial" w:hAnsi="Arial" w:cs="Arial"/>
+          <w:sz w:val="20"/>
+          <w:szCs w:val="20"/>
+        </w:rPr>
+      </w:pPr>
+      <w:r>
+        <w:rPr>
+          <w:rFonts w:ascii="Arial" w:hAnsi="Arial" w:cs="Arial"/>
+          <w:noProof/>
+          <w:sz w:val="20"/>
+          <w:szCs w:val="20"/>
+        </w:rPr>
+        <w:drawing>
+          <wp:inline distT="0" distB="0" distL="0" distR="0" wp14:anchorId="1AC9BB56" wp14:editId="14A39252">
+            <wp:extent cx="2664963" cy="2215286"/>
+            <wp:effectExtent l="0" t="0" r="2540" b="0"/>
+            <wp:docPr id="1730166707" name="Picture 2"/>
+            <wp:cNvGraphicFramePr>
+              <a:graphicFrameLocks xmlns:a="http://schemas.openxmlformats.org/drawingml/2006/main" noChangeAspect="1"/>
+            </wp:cNvGraphicFramePr>
+            <a:graphic xmlns:a="http://schemas.openxmlformats.org/drawingml/2006/main">
+              <a:graphicData uri="http://schemas.openxmlformats.org/drawingml/2006/picture">
+                <pic:pic xmlns:pic="http://schemas.openxmlformats.org/drawingml/2006/picture">
+                  <pic:nvPicPr>
+                    <pic:cNvPr id="0" name="Picture 2"/>
+                    <pic:cNvPicPr>
+                      <a:picLocks noChangeAspect="1" noChangeArrowheads="1"/>
+                    </pic:cNvPicPr>
+                  </pic:nvPicPr>
+                  <pic:blipFill>
+                    <a:blip r:embed="rId16">
+                      <a:extLst>
+                        <a:ext uri="{28A0092B-C50C-407E-A947-70E740481C1C}">
+                          <a14:useLocalDpi xmlns:a14="http://schemas.microsoft.com/office/drawing/2010/main" val="0"/>
+                        </a:ext>
+                      </a:extLst>
+                    </a:blip>
+                    <a:srcRect/>
+                    <a:stretch>
+                      <a:fillRect/>
+                    </a:stretch>
+                  </pic:blipFill>
+                  <pic:spPr bwMode="auto">
+                    <a:xfrm>
+                      <a:off x="0" y="0"/>
+                      <a:ext cx="2679942" cy="2227737"/>
+                    </a:xfrm>
+                    <a:prstGeom prst="rect">
+                      <a:avLst/>
+                    </a:prstGeom>
+                    <a:noFill/>
+                    <a:ln>
+                      <a:noFill/>
+                    </a:ln>
+                  </pic:spPr>
+                </pic:pic>
+              </a:graphicData>
+            </a:graphic>
+          </wp:inline>
+        </w:drawing>
+      </w:r>
+    </w:p>
+    <w:p>
+      <w:pPr>
+        <w:rPr>
+          <w:rFonts w:ascii="Garamond" w:hAnsi="Garamond"/>
+          <w:b/>
+          <w:bCs/>
+        </w:rPr>
+      </w:pPr>
+      <w:r>
+        <w:rPr>
+          <w:rFonts w:ascii="Garamond" w:hAnsi="Garamond"/>
+          <w:b/>
+          <w:bCs/>
+        </w:rPr>
+        <w:t>Satisfaction Level</w:t>
+      </w:r>
+    </w:p>
+    <w:p>
+      <w:pPr>
+        <w:rPr>
+          <w:rFonts w:ascii="Arial" w:hAnsi="Arial" w:cs="Arial"/>
+          <w:sz w:val="20"/>
+          <w:szCs w:val="20"/>
+        </w:rPr>
+      </w:pPr>
+      <w:r>
+        <w:rPr>
+          <w:rFonts w:ascii="Arial" w:hAnsi="Arial" w:cs="Arial"/>
+          <w:sz w:val="20"/>
+          <w:szCs w:val="20"/>
+        </w:rPr>
+        <w:t xml:space="preserve">Since this feature has only a range of 1-5, all values outside this range were considered data errors and so for values higher than 5 </w:t>
+      </w:r>
+      <w:r>
+        <w:rPr>
+          <w:rFonts w:ascii="Arial" w:hAnsi="Arial" w:cs="Arial"/>
+          <w:sz w:val="20"/>
+          <w:szCs w:val="20"/>
+        </w:rPr>
+        <w:t>–</w:t>
+      </w:r>
+      <w:r>
+        <w:rPr>
+          <w:rFonts w:ascii="Arial" w:hAnsi="Arial" w:cs="Arial"/>
+          <w:sz w:val="20"/>
+          <w:szCs w:val="20"/>
+        </w:rPr>
+        <w:t xml:space="preserve"> observations</w:t>
+      </w:r>
+      <w:r>
+        <w:rPr>
+          <w:rFonts w:ascii="Arial" w:hAnsi="Arial" w:cs="Arial"/>
+          <w:sz w:val="20"/>
+          <w:szCs w:val="20"/>
+        </w:rPr>
+        <w:t xml:space="preserve"> with </w:t>
+      </w:r>
+      <w:r>
+        <w:rPr>
+          <w:rFonts w:ascii="Arial" w:hAnsi="Arial" w:cs="Arial"/>
+          <w:sz w:val="20"/>
+          <w:szCs w:val="20"/>
+        </w:rPr>
+        <w:t xml:space="preserve">a satisfaction level </w:t>
+      </w:r>
+      <w:r>
+        <w:rPr>
+          <w:rFonts w:ascii="Arial" w:hAnsi="Arial" w:cs="Arial"/>
+          <w:sz w:val="20"/>
+          <w:szCs w:val="20"/>
+        </w:rPr>
+        <w:t>of 6 – were replaced by 5.</w:t>
+      </w:r>
+    </w:p>
+    <w:p>
+      <w:pPr>
+        <w:rPr>
+          <w:rFonts w:ascii="Arial" w:hAnsi="Arial" w:cs="Arial"/>
+          <w:sz w:val="20"/>
+          <w:szCs w:val="20"/>
+        </w:rPr>
+      </w:pPr>
+      <w:r>
+        <w:rPr>
+          <w:rFonts w:ascii="Arial" w:hAnsi="Arial" w:cs="Arial"/>
+          <w:noProof/>
+          <w:sz w:val="20"/>
+          <w:szCs w:val="20"/>
+        </w:rPr>
+        <w:lastRenderedPageBreak/>
+        <w:drawing>
+          <wp:inline distT="0" distB="0" distL="0" distR="0" wp14:anchorId="4D31EAC6" wp14:editId="6D6D9CCA">
+            <wp:extent cx="3005919" cy="2498708"/>
+            <wp:effectExtent l="0" t="0" r="4445" b="0"/>
+            <wp:docPr id="728862033" name="Picture 3"/>
+            <wp:cNvGraphicFramePr>
+              <a:graphicFrameLocks xmlns:a="http://schemas.openxmlformats.org/drawingml/2006/main" noChangeAspect="1"/>
+            </wp:cNvGraphicFramePr>
+            <a:graphic xmlns:a="http://schemas.openxmlformats.org/drawingml/2006/main">
+              <a:graphicData uri="http://schemas.openxmlformats.org/drawingml/2006/picture">
+                <pic:pic xmlns:pic="http://schemas.openxmlformats.org/drawingml/2006/picture">
+                  <pic:nvPicPr>
+                    <pic:cNvPr id="0" name="Picture 3"/>
+                    <pic:cNvPicPr>
+                      <a:picLocks noChangeAspect="1" noChangeArrowheads="1"/>
+                    </pic:cNvPicPr>
+                  </pic:nvPicPr>
+                  <pic:blipFill>
+                    <a:blip r:embed="rId17">
+                      <a:extLst>
+                        <a:ext uri="{28A0092B-C50C-407E-A947-70E740481C1C}">
+                          <a14:useLocalDpi xmlns:a14="http://schemas.microsoft.com/office/drawing/2010/main" val="0"/>
+                        </a:ext>
+                      </a:extLst>
+                    </a:blip>
+                    <a:srcRect/>
+                    <a:stretch>
+                      <a:fillRect/>
+                    </a:stretch>
+                  </pic:blipFill>
+                  <pic:spPr bwMode="auto">
+                    <a:xfrm>
+                      <a:off x="0" y="0"/>
+                      <a:ext cx="3015098" cy="2506338"/>
+                    </a:xfrm>
+                    <a:prstGeom prst="rect">
+                      <a:avLst/>
+                    </a:prstGeom>
+                    <a:noFill/>
+                    <a:ln>
+                      <a:noFill/>
+                    </a:ln>
+                  </pic:spPr>
+                </pic:pic>
+              </a:graphicData>
+            </a:graphic>
+          </wp:inline>
+        </w:drawing>
+      </w:r>
+    </w:p>
+    <w:p>
+      <w:pPr>
+        <w:rPr>
+          <w:rFonts w:ascii="Arial" w:hAnsi="Arial" w:cs="Arial"/>
+          <w:b/>
+          <w:bCs/>
+          <w:sz w:val="20"/>
+          <w:szCs w:val="20"/>
+        </w:rPr>
+      </w:pPr>
+      <w:r>
+        <w:rPr>
+          <w:rFonts w:ascii="Garamond" w:hAnsi="Garamond"/>
+          <w:b/>
+          <w:bCs/>
+        </w:rPr>
+        <w:t>Consultation</w:t>
+      </w:r>
+      <w:r>
+        <w:rPr>
+          <w:rFonts w:ascii="Arial" w:hAnsi="Arial" w:cs="Arial"/>
+          <w:b/>
+          <w:bCs/>
+          <w:sz w:val="20"/>
+          <w:szCs w:val="20"/>
+        </w:rPr>
+        <w:t xml:space="preserve"> </w:t>
+      </w:r>
+      <w:r>
+        <w:rPr>
+          <w:rFonts w:ascii="Garamond" w:hAnsi="Garamond"/>
+          <w:b/>
+          <w:bCs/>
+        </w:rPr>
+        <w:t>Price</w:t>
+      </w:r>
+    </w:p>
+    <w:p>
+      <w:pPr>
+        <w:rPr>
+          <w:rFonts w:ascii="Arial" w:hAnsi="Arial" w:cs="Arial"/>
+          <w:sz w:val="20"/>
+          <w:szCs w:val="20"/>
+        </w:rPr>
+      </w:pPr>
+      <w:r>
+        <w:rPr>
+          <w:rFonts w:ascii="Arial" w:hAnsi="Arial" w:cs="Arial"/>
+          <w:sz w:val="20"/>
+          <w:szCs w:val="20"/>
+        </w:rPr>
+        <w:t>E</w:t>
+      </w:r>
+      <w:r>
+        <w:rPr>
+          <w:rFonts w:ascii="Arial" w:hAnsi="Arial" w:cs="Arial"/>
+          <w:sz w:val="20"/>
+          <w:szCs w:val="20"/>
+        </w:rPr>
+        <w:t>xtreme high values (</w:t>
+      </w:r>
+      <w:r>
+        <w:rPr>
+          <w:rFonts w:ascii="Arial" w:hAnsi="Arial" w:cs="Arial"/>
+          <w:sz w:val="20"/>
+          <w:szCs w:val="20"/>
+        </w:rPr>
+        <w:t xml:space="preserve">above </w:t>
+      </w:r>
+      <w:r>
+        <w:rPr>
+          <w:rFonts w:ascii="Arial" w:hAnsi="Arial" w:cs="Arial"/>
+          <w:sz w:val="20"/>
+          <w:szCs w:val="20"/>
+        </w:rPr>
+        <w:t>10000</w:t>
+      </w:r>
+      <w:r>
+        <w:rPr>
+          <w:rFonts w:ascii="Arial" w:hAnsi="Arial" w:cs="Arial"/>
+          <w:sz w:val="20"/>
+          <w:szCs w:val="20"/>
+        </w:rPr>
+        <w:t>€</w:t>
+      </w:r>
+      <w:r>
+        <w:rPr>
+          <w:rFonts w:ascii="Arial" w:hAnsi="Arial" w:cs="Arial"/>
+          <w:sz w:val="20"/>
+          <w:szCs w:val="20"/>
+        </w:rPr>
+        <w:t xml:space="preserve">) were </w:t>
+      </w:r>
+      <w:r>
+        <w:rPr>
+          <w:rFonts w:ascii="Arial" w:hAnsi="Arial" w:cs="Arial"/>
+          <w:sz w:val="20"/>
+          <w:szCs w:val="20"/>
+        </w:rPr>
+        <w:t>considered data</w:t>
+      </w:r>
+      <w:r>
+        <w:rPr>
+          <w:rFonts w:ascii="Arial" w:hAnsi="Arial" w:cs="Arial"/>
+          <w:sz w:val="20"/>
+          <w:szCs w:val="20"/>
+        </w:rPr>
+        <w:t xml:space="preserve"> errors and removed</w:t>
+      </w:r>
+      <w:r>
+        <w:rPr>
+          <w:rFonts w:ascii="Arial" w:hAnsi="Arial" w:cs="Arial"/>
+          <w:sz w:val="20"/>
+          <w:szCs w:val="20"/>
+        </w:rPr>
+        <w:t>, while v</w:t>
+      </w:r>
+      <w:r>
+        <w:rPr>
+          <w:rFonts w:ascii="Arial" w:hAnsi="Arial" w:cs="Arial"/>
+          <w:sz w:val="20"/>
+          <w:szCs w:val="20"/>
+        </w:rPr>
+        <w:t>alues within a plausible range</w:t>
+      </w:r>
+      <w:r>
+        <w:rPr>
+          <w:rFonts w:ascii="Arial" w:hAnsi="Arial" w:cs="Arial"/>
+          <w:sz w:val="20"/>
+          <w:szCs w:val="20"/>
+          <w:lang w:val="en-US"/>
+        </w:rPr>
+        <w:t xml:space="preserve">, </w:t>
+      </w:r>
+      <w:r>
+        <w:rPr>
+          <w:rFonts w:ascii="Arial" w:hAnsi="Arial" w:cs="Arial"/>
+          <w:sz w:val="20"/>
+          <w:szCs w:val="20"/>
+        </w:rPr>
+        <w:t>even if high</w:t>
+      </w:r>
+      <w:r>
+        <w:rPr>
+          <w:rFonts w:ascii="Arial" w:hAnsi="Arial" w:cs="Arial"/>
+          <w:sz w:val="20"/>
+          <w:szCs w:val="20"/>
+          <w:lang w:val="en-US"/>
+        </w:rPr>
+        <w:t>,</w:t>
+      </w:r>
+      <w:r>
+        <w:rPr>
+          <w:rFonts w:ascii="Arial" w:hAnsi="Arial" w:cs="Arial"/>
+          <w:sz w:val="20"/>
+          <w:szCs w:val="20"/>
+        </w:rPr>
+        <w:t xml:space="preserve"> were </w:t>
+      </w:r>
+      <w:proofErr w:type="spellStart"/>
+      <w:r>
+        <w:rPr>
+          <w:rFonts w:ascii="Arial" w:hAnsi="Arial" w:cs="Arial"/>
+          <w:sz w:val="20"/>
+          <w:szCs w:val="20"/>
+        </w:rPr>
+        <w:t>mantained</w:t>
+      </w:r>
       <w:proofErr w:type="spellEnd"/>
       <w:r>
         <w:rPr>
+          <w:rFonts w:ascii="Arial" w:hAnsi="Arial" w:cs="Arial"/>
+          <w:sz w:val="20"/>
+          <w:szCs w:val="20"/>
+        </w:rPr>
+        <w:t>.</w:t>
+      </w:r>
+    </w:p>
+    <w:p>
+      <w:pPr>
+        <w:rPr>
+          <w:rFonts w:ascii="Arial" w:hAnsi="Arial" w:cs="Arial"/>
+          <w:sz w:val="20"/>
+          <w:szCs w:val="20"/>
+        </w:rPr>
+      </w:pPr>
+      <w:r>
+        <w:rPr>
+          <w:rFonts w:ascii="Arial" w:hAnsi="Arial" w:cs="Arial"/>
+          <w:noProof/>
+          <w:sz w:val="20"/>
+          <w:szCs w:val="20"/>
+        </w:rPr>
+        <w:drawing>
+          <wp:inline distT="0" distB="0" distL="0" distR="0" wp14:anchorId="601A9FE5" wp14:editId="562A860C">
+            <wp:extent cx="3471786" cy="2777250"/>
+            <wp:effectExtent l="0" t="0" r="0" b="4445"/>
+            <wp:docPr id="1591212497" name="Picture 4"/>
+            <wp:cNvGraphicFramePr>
+              <a:graphicFrameLocks xmlns:a="http://schemas.openxmlformats.org/drawingml/2006/main" noChangeAspect="1"/>
+            </wp:cNvGraphicFramePr>
+            <a:graphic xmlns:a="http://schemas.openxmlformats.org/drawingml/2006/main">
+              <a:graphicData uri="http://schemas.openxmlformats.org/drawingml/2006/picture">
+                <pic:pic xmlns:pic="http://schemas.openxmlformats.org/drawingml/2006/picture">
+                  <pic:nvPicPr>
+                    <pic:cNvPr id="0" name="Picture 4"/>
+                    <pic:cNvPicPr>
+                      <a:picLocks noChangeAspect="1" noChangeArrowheads="1"/>
+                    </pic:cNvPicPr>
+                  </pic:nvPicPr>
+                  <pic:blipFill>
+                    <a:blip r:embed="rId18">
+                      <a:extLst>
+                        <a:ext uri="{28A0092B-C50C-407E-A947-70E740481C1C}">
+                          <a14:useLocalDpi xmlns:a14="http://schemas.microsoft.com/office/drawing/2010/main" val="0"/>
+                        </a:ext>
+                      </a:extLst>
+                    </a:blip>
+                    <a:srcRect/>
+                    <a:stretch>
+                      <a:fillRect/>
+                    </a:stretch>
+                  </pic:blipFill>
+                  <pic:spPr bwMode="auto">
+                    <a:xfrm>
+                      <a:off x="0" y="0"/>
+                      <a:ext cx="3478789" cy="2782852"/>
+                    </a:xfrm>
+                    <a:prstGeom prst="rect">
+                      <a:avLst/>
+                    </a:prstGeom>
+                    <a:noFill/>
+                    <a:ln>
+                      <a:noFill/>
+                    </a:ln>
+                  </pic:spPr>
+                </pic:pic>
+              </a:graphicData>
+            </a:graphic>
+          </wp:inline>
+        </w:drawing>
+      </w:r>
+    </w:p>
+    <w:p>
+      <w:pPr>
+        <w:rPr>
           <w:rFonts w:ascii="Garamond" w:hAnsi="Garamond"/>
           <w:b/>
           <w:bCs/>
-          <w:lang w:val="pt-PT"/>
-        </w:rPr>
-        <w:t xml:space="preserve"> (POR BOXPLOTS PARA CADA UM)</w:t>
+        </w:rPr>
+      </w:pPr>
+      <w:r>
+        <w:rPr>
+          <w:rFonts w:ascii="Garamond" w:hAnsi="Garamond"/>
+          <w:b/>
+          <w:bCs/>
+        </w:rPr>
+        <w:t>Insurance Cover</w:t>
+      </w:r>
+      <w:r>
+        <w:rPr>
+          <w:rFonts w:ascii="Garamond" w:hAnsi="Garamond"/>
+          <w:b/>
+          <w:bCs/>
+        </w:rPr>
+        <w:t>a</w:t>
+      </w:r>
+      <w:r>
+        <w:rPr>
+          <w:rFonts w:ascii="Garamond" w:hAnsi="Garamond"/>
+          <w:b/>
+          <w:bCs/>
+        </w:rPr>
+        <w:t>ge</w:t>
+      </w:r>
+    </w:p>
+    <w:p>
+      <w:pPr>
+        <w:rPr>
+          <w:rFonts w:ascii="Garamond" w:hAnsi="Garamond"/>
+          <w:b/>
+          <w:bCs/>
+        </w:rPr>
+      </w:pPr>
+      <w:r>
+        <w:rPr>
+          <w:rFonts w:ascii="Arial" w:hAnsi="Arial" w:cs="Arial"/>
+          <w:sz w:val="20"/>
+          <w:szCs w:val="20"/>
+        </w:rPr>
+        <w:t>Some observations had high values however,</w:t>
+      </w:r>
+      <w:r>
+        <w:rPr>
+          <w:rFonts w:ascii="Arial" w:hAnsi="Arial" w:cs="Arial"/>
+          <w:sz w:val="20"/>
+          <w:szCs w:val="20"/>
+        </w:rPr>
+        <w:t xml:space="preserve"> they were plausible given </w:t>
+      </w:r>
+      <w:r>
+        <w:rPr>
+          <w:rFonts w:ascii="Arial" w:hAnsi="Arial" w:cs="Arial"/>
+          <w:sz w:val="20"/>
+          <w:szCs w:val="20"/>
+        </w:rPr>
+        <w:t>that the</w:t>
+      </w:r>
+      <w:r>
+        <w:rPr>
+          <w:rFonts w:ascii="Arial" w:hAnsi="Arial" w:cs="Arial"/>
+          <w:sz w:val="20"/>
+          <w:szCs w:val="20"/>
+        </w:rPr>
+        <w:t xml:space="preserve"> corresponding </w:t>
+      </w:r>
+      <w:r>
+        <w:rPr>
+          <w:rFonts w:ascii="Arial" w:hAnsi="Arial" w:cs="Arial"/>
+          <w:b/>
+          <w:bCs/>
+          <w:sz w:val="20"/>
+          <w:szCs w:val="20"/>
+        </w:rPr>
+        <w:t>Consultation Price</w:t>
+      </w:r>
+      <w:r>
+        <w:rPr>
+          <w:rFonts w:ascii="Arial" w:hAnsi="Arial" w:cs="Arial"/>
+          <w:sz w:val="20"/>
+          <w:szCs w:val="20"/>
+        </w:rPr>
+        <w:t xml:space="preserve"> was also high. Therefore, n</w:t>
+      </w:r>
+      <w:r>
+        <w:rPr>
+          <w:rFonts w:ascii="Arial" w:hAnsi="Arial" w:cs="Arial"/>
+          <w:sz w:val="20"/>
+          <w:szCs w:val="20"/>
+        </w:rPr>
+        <w:t>o removal or clipping was applied</w:t>
+      </w:r>
+      <w:r>
+        <w:rPr>
+          <w:rFonts w:ascii="Arial" w:hAnsi="Arial" w:cs="Arial"/>
+          <w:sz w:val="20"/>
+          <w:szCs w:val="20"/>
+        </w:rPr>
+        <w:t>.</w:t>
+      </w:r>
+      <w:r>
+        <w:rPr>
+          <w:rFonts w:ascii="Arial" w:hAnsi="Arial" w:cs="Arial"/>
+          <w:noProof/>
+          <w:sz w:val="20"/>
+          <w:szCs w:val="20"/>
+        </w:rPr>
+        <w:t xml:space="preserve"> </w:t>
+      </w:r>
+    </w:p>
+    <w:p>
+      <w:pPr>
+        <w:rPr>
+          <w:rFonts w:ascii="Arial" w:hAnsi="Arial" w:cs="Arial"/>
+          <w:sz w:val="20"/>
+          <w:szCs w:val="20"/>
+        </w:rPr>
+      </w:pPr>
+      <w:r>
+        <w:rPr>
+          <w:rFonts w:ascii="Garamond" w:hAnsi="Garamond"/>
+          <w:b/>
+          <w:bCs/>
+          <w:noProof/>
+          <w:lang w:val="en-US"/>
+        </w:rPr>
+        <w:drawing>
+          <wp:anchor distT="0" distB="0" distL="114300" distR="114300" simplePos="0" relativeHeight="251666432" behindDoc="0" locked="0" layoutInCell="1" allowOverlap="1" wp14:anchorId="0FD9473F" wp14:editId="5432F74A">
+            <wp:simplePos x="0" y="0"/>
+            <wp:positionH relativeFrom="column">
+              <wp:posOffset>-73348</wp:posOffset>
+            </wp:positionH>
+            <wp:positionV relativeFrom="paragraph">
+              <wp:posOffset>61578</wp:posOffset>
+            </wp:positionV>
+            <wp:extent cx="2684522" cy="2231364"/>
+            <wp:effectExtent l="0" t="0" r="1905" b="0"/>
+            <wp:wrapNone/>
+            <wp:docPr id="1763820032" name="Picture 8"/>
+            <wp:cNvGraphicFramePr>
+              <a:graphicFrameLocks xmlns:a="http://schemas.openxmlformats.org/drawingml/2006/main" noChangeAspect="1"/>
+            </wp:cNvGraphicFramePr>
+            <a:graphic xmlns:a="http://schemas.openxmlformats.org/drawingml/2006/main">
+              <a:graphicData uri="http://schemas.openxmlformats.org/drawingml/2006/picture">
+                <pic:pic xmlns:pic="http://schemas.openxmlformats.org/drawingml/2006/picture">
+                  <pic:nvPicPr>
+                    <pic:cNvPr id="0" name="Picture 8"/>
+                    <pic:cNvPicPr>
+                      <a:picLocks noChangeAspect="1" noChangeArrowheads="1"/>
+                    </pic:cNvPicPr>
+                  </pic:nvPicPr>
+                  <pic:blipFill>
+                    <a:blip r:embed="rId19">
+                      <a:extLst>
+                        <a:ext uri="{28A0092B-C50C-407E-A947-70E740481C1C}">
+                          <a14:useLocalDpi xmlns:a14="http://schemas.microsoft.com/office/drawing/2010/main" val="0"/>
+                        </a:ext>
+                      </a:extLst>
+                    </a:blip>
+                    <a:srcRect/>
+                    <a:stretch>
+                      <a:fillRect/>
+                    </a:stretch>
+                  </pic:blipFill>
+                  <pic:spPr bwMode="auto">
+                    <a:xfrm>
+                      <a:off x="0" y="0"/>
+                      <a:ext cx="2689327" cy="2235358"/>
+                    </a:xfrm>
+                    <a:prstGeom prst="rect">
+                      <a:avLst/>
+                    </a:prstGeom>
+                    <a:noFill/>
+                    <a:ln>
+                      <a:noFill/>
+                    </a:ln>
+                  </pic:spPr>
+                </pic:pic>
+              </a:graphicData>
+            </a:graphic>
+            <wp14:sizeRelH relativeFrom="margin">
+              <wp14:pctWidth>0</wp14:pctWidth>
+            </wp14:sizeRelH>
+            <wp14:sizeRelV relativeFrom="margin">
+              <wp14:pctHeight>0</wp14:pctHeight>
+            </wp14:sizeRelV>
+          </wp:anchor>
+        </w:drawing>
+      </w:r>
+      <w:r>
+        <w:rPr>
+          <w:rFonts w:ascii="Arial" w:hAnsi="Arial" w:cs="Arial"/>
+          <w:noProof/>
+          <w:sz w:val="20"/>
+          <w:szCs w:val="20"/>
+        </w:rPr>
+        <w:drawing>
+          <wp:anchor distT="0" distB="0" distL="114300" distR="114300" simplePos="0" relativeHeight="251665408" behindDoc="1" locked="0" layoutInCell="1" allowOverlap="1" wp14:anchorId="68C6C462" wp14:editId="34C24AA5">
+            <wp:simplePos x="0" y="0"/>
+            <wp:positionH relativeFrom="column">
+              <wp:posOffset>0</wp:posOffset>
+            </wp:positionH>
+            <wp:positionV relativeFrom="paragraph">
+              <wp:posOffset>-7009130</wp:posOffset>
+            </wp:positionV>
+            <wp:extent cx="2992582" cy="2487621"/>
+            <wp:effectExtent l="0" t="0" r="0" b="8255"/>
+            <wp:wrapNone/>
+            <wp:docPr id="1520503690" name="Picture 5"/>
+            <wp:cNvGraphicFramePr>
+              <a:graphicFrameLocks xmlns:a="http://schemas.openxmlformats.org/drawingml/2006/main" noChangeAspect="1"/>
+            </wp:cNvGraphicFramePr>
+            <a:graphic xmlns:a="http://schemas.openxmlformats.org/drawingml/2006/main">
+              <a:graphicData uri="http://schemas.openxmlformats.org/drawingml/2006/picture">
+                <pic:pic xmlns:pic="http://schemas.openxmlformats.org/drawingml/2006/picture">
+                  <pic:nvPicPr>
+                    <pic:cNvPr id="0" name="Picture 5"/>
+                    <pic:cNvPicPr>
+                      <a:picLocks noChangeAspect="1" noChangeArrowheads="1"/>
+                    </pic:cNvPicPr>
+                  </pic:nvPicPr>
+                  <pic:blipFill>
+                    <a:blip r:embed="rId19">
+                      <a:extLst>
+                        <a:ext uri="{28A0092B-C50C-407E-A947-70E740481C1C}">
+                          <a14:useLocalDpi xmlns:a14="http://schemas.microsoft.com/office/drawing/2010/main" val="0"/>
+                        </a:ext>
+                      </a:extLst>
+                    </a:blip>
+                    <a:srcRect/>
+                    <a:stretch>
+                      <a:fillRect/>
+                    </a:stretch>
+                  </pic:blipFill>
+                  <pic:spPr bwMode="auto">
+                    <a:xfrm>
+                      <a:off x="0" y="0"/>
+                      <a:ext cx="2992582" cy="2487621"/>
+                    </a:xfrm>
+                    <a:prstGeom prst="rect">
+                      <a:avLst/>
+                    </a:prstGeom>
+                    <a:noFill/>
+                    <a:ln>
+                      <a:noFill/>
+                    </a:ln>
+                  </pic:spPr>
+                </pic:pic>
+              </a:graphicData>
+            </a:graphic>
+          </wp:anchor>
+        </w:drawing>
       </w:r>
     </w:p>
     <w:p>
       <w:pPr>
         <w:ind w:firstLine="720"/>
         <w:rPr>
-          <w:rFonts w:ascii="Arial" w:hAnsi="Arial" w:cs="Arial"/>
-          <w:sz w:val="20"/>
-          <w:szCs w:val="20"/>
-        </w:rPr>
-      </w:pPr>
-      <w:r>
-        <w:rPr>
-          <w:rFonts w:ascii="Arial" w:hAnsi="Arial" w:cs="Arial"/>
-          <w:sz w:val="20"/>
-          <w:szCs w:val="20"/>
-        </w:rPr>
-        <w:t xml:space="preserve">In the process of </w:t>
-      </w:r>
-      <w:r>
-        <w:rPr>
-          <w:rFonts w:ascii="Arial" w:hAnsi="Arial" w:cs="Arial"/>
-          <w:b/>
-          <w:bCs/>
-          <w:sz w:val="20"/>
-          <w:szCs w:val="20"/>
-        </w:rPr>
-        <w:t>Exploratory Data Analysis</w:t>
-      </w:r>
-      <w:r>
-        <w:rPr>
-          <w:rFonts w:ascii="Arial" w:hAnsi="Arial" w:cs="Arial"/>
-          <w:sz w:val="20"/>
-          <w:szCs w:val="20"/>
-        </w:rPr>
-        <w:t>, several numerical features showed the presence of extreme values. To maintain the quality of the data and the accuracy of further analysis, an outlier treatment was conducted</w:t>
-      </w:r>
-      <w:r>
-        <w:rPr>
-          <w:rFonts w:ascii="Arial" w:hAnsi="Arial" w:cs="Arial"/>
-          <w:sz w:val="20"/>
-          <w:szCs w:val="20"/>
-        </w:rPr>
-        <w:t xml:space="preserve"> – capping (replacing outliers beyond a certain threshold with the value of that threshold)</w:t>
-      </w:r>
-      <w:r>
-        <w:rPr>
-          <w:rFonts w:ascii="Arial" w:hAnsi="Arial" w:cs="Arial"/>
-          <w:sz w:val="20"/>
-          <w:szCs w:val="20"/>
-        </w:rPr>
-        <w:t>, based on domain knowledge and the Interquartile Range technique (IQR).</w:t>
-      </w:r>
-      <w:r>
-        <w:rPr>
-          <w:rFonts w:ascii="Arial" w:hAnsi="Arial" w:cs="Arial"/>
-          <w:sz w:val="20"/>
-          <w:szCs w:val="20"/>
-        </w:rPr>
-        <w:t xml:space="preserve"> This technique considers to be outliers any value below </w:t>
-      </w:r>
-      <w:r>
-        <w:rPr>
-          <w:rFonts w:ascii="Consolas" w:hAnsi="Consolas" w:cs="Consolas"/>
-          <w:b/>
-          <w:bCs/>
-          <w:sz w:val="20"/>
-          <w:szCs w:val="20"/>
-        </w:rPr>
-        <w:t xml:space="preserve">Q1 – k </w:t>
-      </w:r>
-      <w:r>
-        <w:rPr>
-          <w:rFonts w:ascii="Consolas" w:hAnsi="Consolas" w:cs="Consolas"/>
-          <w:b/>
-          <w:bCs/>
-          <w:sz w:val="20"/>
-          <w:szCs w:val="20"/>
-        </w:rPr>
-        <w:sym w:font="Symbol" w:char="F02A"/>
-      </w:r>
-      <w:r>
-        <w:rPr>
-          <w:rFonts w:ascii="Consolas" w:hAnsi="Consolas" w:cs="Consolas"/>
-          <w:b/>
-          <w:bCs/>
-          <w:sz w:val="20"/>
-          <w:szCs w:val="20"/>
-        </w:rPr>
-        <w:t xml:space="preserve"> IQR</w:t>
-      </w:r>
-      <w:r>
-        <w:rPr>
-          <w:rFonts w:ascii="Arial" w:hAnsi="Arial" w:cs="Arial"/>
-          <w:sz w:val="20"/>
-          <w:szCs w:val="20"/>
-        </w:rPr>
-        <w:t xml:space="preserve"> or above </w:t>
-      </w:r>
-      <w:r>
-        <w:rPr>
-          <w:rFonts w:ascii="Consolas" w:hAnsi="Consolas" w:cs="Consolas"/>
-          <w:b/>
-          <w:bCs/>
-          <w:sz w:val="20"/>
-          <w:szCs w:val="20"/>
-        </w:rPr>
-        <w:t xml:space="preserve">Q3 + k </w:t>
-      </w:r>
-      <w:r>
-        <w:rPr>
-          <w:rFonts w:ascii="Consolas" w:hAnsi="Consolas" w:cs="Consolas"/>
-          <w:b/>
-          <w:bCs/>
-          <w:sz w:val="20"/>
-          <w:szCs w:val="20"/>
-        </w:rPr>
-        <w:sym w:font="Symbol" w:char="F02A"/>
-      </w:r>
-      <w:r>
-        <w:rPr>
-          <w:rFonts w:ascii="Consolas" w:hAnsi="Consolas" w:cs="Consolas"/>
-          <w:b/>
-          <w:bCs/>
-          <w:sz w:val="20"/>
-          <w:szCs w:val="20"/>
-        </w:rPr>
-        <w:t xml:space="preserve"> IQR,</w:t>
-      </w:r>
-      <w:r>
-        <w:rPr>
-          <w:rFonts w:ascii="Arial" w:hAnsi="Arial" w:cs="Arial"/>
-          <w:sz w:val="20"/>
-          <w:szCs w:val="20"/>
-        </w:rPr>
-        <w:t xml:space="preserve"> with </w:t>
-      </w:r>
-      <w:r>
-        <w:rPr>
-          <w:rFonts w:ascii="Consolas" w:hAnsi="Consolas" w:cs="Consolas"/>
-          <w:b/>
-          <w:bCs/>
-          <w:sz w:val="20"/>
-          <w:szCs w:val="20"/>
-        </w:rPr>
-        <w:t>IQR</w:t>
-      </w:r>
-      <w:r>
-        <w:rPr>
-          <w:rFonts w:ascii="Arial" w:hAnsi="Arial" w:cs="Arial"/>
-          <w:sz w:val="20"/>
-          <w:szCs w:val="20"/>
-        </w:rPr>
-        <w:t xml:space="preserve"> being </w:t>
-      </w:r>
-      <w:r>
-        <w:rPr>
-          <w:rFonts w:ascii="Consolas" w:hAnsi="Consolas" w:cs="Consolas"/>
-          <w:b/>
-          <w:bCs/>
-          <w:sz w:val="20"/>
-          <w:szCs w:val="20"/>
-        </w:rPr>
-        <w:t>Q3-Q1</w:t>
-      </w:r>
-      <w:r>
-        <w:rPr>
-          <w:rFonts w:ascii="Arial" w:hAnsi="Arial" w:cs="Arial"/>
-          <w:sz w:val="20"/>
-          <w:szCs w:val="20"/>
-        </w:rPr>
-        <w:t xml:space="preserve"> and </w:t>
-      </w:r>
-      <w:r>
-        <w:rPr>
-          <w:rFonts w:ascii="Consolas" w:hAnsi="Consolas" w:cs="Consolas"/>
-          <w:b/>
-          <w:bCs/>
-          <w:sz w:val="20"/>
-          <w:szCs w:val="20"/>
-        </w:rPr>
-        <w:t>k</w:t>
-      </w:r>
-      <w:r>
-        <w:rPr>
-          <w:rFonts w:ascii="Arial" w:hAnsi="Arial" w:cs="Arial"/>
-          <w:sz w:val="20"/>
-          <w:szCs w:val="20"/>
-        </w:rPr>
-        <w:t>,</w:t>
-      </w:r>
-      <w:r>
-        <w:rPr>
-          <w:rFonts w:ascii="Arial" w:hAnsi="Arial" w:cs="Arial"/>
-          <w:sz w:val="20"/>
-          <w:szCs w:val="20"/>
-        </w:rPr>
-        <w:t xml:space="preserve"> although normally set to </w:t>
-      </w:r>
-      <w:r>
-        <w:rPr>
-          <w:rFonts w:ascii="Consolas" w:hAnsi="Consolas" w:cs="Consolas"/>
-          <w:b/>
-          <w:bCs/>
-          <w:sz w:val="20"/>
-          <w:szCs w:val="20"/>
-        </w:rPr>
-        <w:t>1.5</w:t>
-      </w:r>
-      <w:r>
-        <w:rPr>
-          <w:rFonts w:ascii="Arial" w:hAnsi="Arial" w:cs="Arial"/>
-          <w:sz w:val="20"/>
-          <w:szCs w:val="20"/>
-        </w:rPr>
-        <w:t>, it can be set to any positive number.</w:t>
-      </w:r>
-    </w:p>
-    <w:p>
-      <w:pPr>
-        <w:rPr>
-          <w:rFonts w:ascii="Arial" w:hAnsi="Arial" w:cs="Arial"/>
-          <w:b/>
-          <w:bCs/>
-          <w:sz w:val="20"/>
-          <w:szCs w:val="20"/>
-        </w:rPr>
-      </w:pPr>
-      <w:r>
-        <w:rPr>
           <w:rFonts w:ascii="Garamond" w:hAnsi="Garamond"/>
           <w:b/>
           <w:bCs/>
-        </w:rPr>
-        <w:t>Age</w:t>
-      </w:r>
-    </w:p>
-    <w:p>
-      <w:pPr>
-        <w:rPr>
-          <w:rFonts w:ascii="Arial" w:hAnsi="Arial" w:cs="Arial"/>
-          <w:sz w:val="20"/>
-          <w:szCs w:val="20"/>
-        </w:rPr>
-      </w:pPr>
-      <w:r>
-        <w:rPr>
-          <w:rFonts w:ascii="Arial" w:hAnsi="Arial" w:cs="Arial"/>
-          <w:sz w:val="20"/>
-          <w:szCs w:val="20"/>
-        </w:rPr>
-        <w:t>All observations above 127 (</w:t>
-      </w:r>
-      <w:r>
-        <w:rPr>
-          <w:rFonts w:ascii="Arial" w:hAnsi="Arial" w:cs="Arial"/>
-          <w:sz w:val="20"/>
-          <w:szCs w:val="20"/>
-        </w:rPr>
-        <w:t xml:space="preserve">corresponding to </w:t>
-      </w:r>
-      <w:r>
-        <w:rPr>
-          <w:rFonts w:ascii="Consolas" w:hAnsi="Consolas" w:cs="Consolas"/>
-          <w:b/>
-          <w:bCs/>
-          <w:sz w:val="20"/>
-          <w:szCs w:val="20"/>
-        </w:rPr>
-        <w:t>Q3+IQR</w:t>
-      </w:r>
-      <w:r>
-        <w:rPr>
-          <w:rFonts w:ascii="Consolas" w:hAnsi="Consolas" w:cs="Consolas"/>
-          <w:b/>
-          <w:bCs/>
-          <w:sz w:val="20"/>
-          <w:szCs w:val="20"/>
-        </w:rPr>
-        <w:t>,</w:t>
-      </w:r>
-      <w:r>
-        <w:rPr>
-          <w:rFonts w:ascii="Arial" w:hAnsi="Arial" w:cs="Arial"/>
-          <w:sz w:val="20"/>
-          <w:szCs w:val="20"/>
-        </w:rPr>
-        <w:t xml:space="preserve"> with </w:t>
-      </w:r>
-      <w:r>
-        <w:rPr>
-          <w:rFonts w:ascii="Consolas" w:hAnsi="Consolas" w:cs="Consolas"/>
-          <w:b/>
-          <w:bCs/>
-          <w:sz w:val="20"/>
-          <w:szCs w:val="20"/>
-        </w:rPr>
-        <w:t>k</w:t>
-      </w:r>
-      <w:r>
-        <w:rPr>
-          <w:rFonts w:ascii="Arial" w:hAnsi="Arial" w:cs="Arial"/>
-          <w:sz w:val="20"/>
-          <w:szCs w:val="20"/>
-        </w:rPr>
-        <w:t xml:space="preserve"> set to </w:t>
-      </w:r>
-      <w:r>
-        <w:rPr>
-          <w:rFonts w:ascii="Consolas" w:hAnsi="Consolas" w:cs="Consolas"/>
-          <w:b/>
-          <w:bCs/>
-          <w:sz w:val="20"/>
-          <w:szCs w:val="20"/>
-        </w:rPr>
-        <w:t>1</w:t>
-      </w:r>
-      <w:r>
-        <w:rPr>
-          <w:rFonts w:ascii="Arial" w:hAnsi="Arial" w:cs="Arial"/>
-          <w:sz w:val="20"/>
-          <w:szCs w:val="20"/>
-        </w:rPr>
-        <w:t xml:space="preserve">) </w:t>
-      </w:r>
-      <w:r>
-        <w:rPr>
-          <w:rFonts w:ascii="Arial" w:hAnsi="Arial" w:cs="Arial"/>
-          <w:sz w:val="20"/>
-          <w:szCs w:val="20"/>
-        </w:rPr>
-        <w:t xml:space="preserve">were capped. </w:t>
-      </w:r>
-      <w:r>
-        <w:rPr>
-          <w:rFonts w:ascii="Arial" w:hAnsi="Arial" w:cs="Arial"/>
-          <w:sz w:val="20"/>
-          <w:szCs w:val="20"/>
-        </w:rPr>
-        <w:t xml:space="preserve">If the default value for </w:t>
-      </w:r>
-      <w:r>
-        <w:rPr>
-          <w:rFonts w:ascii="Consolas" w:hAnsi="Consolas" w:cs="Consolas"/>
-          <w:b/>
-          <w:bCs/>
-          <w:sz w:val="20"/>
-          <w:szCs w:val="20"/>
-        </w:rPr>
-        <w:t>k</w:t>
-      </w:r>
-      <w:r>
-        <w:rPr>
-          <w:rFonts w:ascii="Arial" w:hAnsi="Arial" w:cs="Arial"/>
-          <w:sz w:val="20"/>
-          <w:szCs w:val="20"/>
-        </w:rPr>
-        <w:t xml:space="preserve"> was used, the capping threshold would be even higher, allowing unrealistic ages to remain in the dataset.</w:t>
-      </w:r>
-    </w:p>
-    <w:p>
-      <w:pPr>
+          <w:lang w:val="en-US"/>
+        </w:rPr>
+      </w:pPr>
+    </w:p>
+    <w:p>
+      <w:pPr>
+        <w:ind w:firstLine="720"/>
         <w:rPr>
           <w:rFonts w:ascii="Garamond" w:hAnsi="Garamond"/>
           <w:b/>
           <w:bCs/>
-        </w:rPr>
-      </w:pPr>
-      <w:r>
+          <w:lang w:val="en-US"/>
+        </w:rPr>
+      </w:pPr>
+    </w:p>
+    <w:p>
+      <w:pPr>
+        <w:ind w:firstLine="720"/>
         <w:rPr>
           <w:rFonts w:ascii="Garamond" w:hAnsi="Garamond"/>
           <w:b/>
           <w:bCs/>
-        </w:rPr>
-        <w:t>Consultation Duration</w:t>
-      </w:r>
-    </w:p>
-    <w:p>
-      <w:pPr>
-        <w:rPr>
-          <w:rFonts w:ascii="Arial" w:hAnsi="Arial" w:cs="Arial"/>
-          <w:sz w:val="20"/>
-          <w:szCs w:val="20"/>
-        </w:rPr>
-      </w:pPr>
-      <w:r>
-        <w:rPr>
-          <w:rFonts w:ascii="Arial" w:hAnsi="Arial" w:cs="Arial"/>
-          <w:sz w:val="20"/>
-          <w:szCs w:val="20"/>
-        </w:rPr>
-        <w:t xml:space="preserve">All observations above 173.5 minutes </w:t>
-      </w:r>
-      <w:r>
-        <w:rPr>
-          <w:rFonts w:ascii="Arial" w:hAnsi="Arial" w:cs="Arial"/>
-          <w:sz w:val="20"/>
-          <w:szCs w:val="20"/>
-        </w:rPr>
-        <w:t xml:space="preserve">(corresponding to </w:t>
-      </w:r>
-      <w:r>
-        <w:rPr>
-          <w:rFonts w:ascii="Consolas" w:hAnsi="Consolas" w:cs="Consolas"/>
-          <w:b/>
-          <w:bCs/>
-          <w:sz w:val="20"/>
-          <w:szCs w:val="20"/>
-        </w:rPr>
-        <w:t>Q3+IQR</w:t>
-      </w:r>
-      <w:r>
-        <w:rPr>
-          <w:rFonts w:ascii="Consolas" w:hAnsi="Consolas" w:cs="Consolas"/>
-          <w:b/>
-          <w:bCs/>
-          <w:sz w:val="20"/>
-          <w:szCs w:val="20"/>
-        </w:rPr>
-        <w:t>,</w:t>
-      </w:r>
-      <w:r>
-        <w:rPr>
-          <w:rFonts w:ascii="Arial" w:hAnsi="Arial" w:cs="Arial"/>
-          <w:sz w:val="20"/>
-          <w:szCs w:val="20"/>
-        </w:rPr>
-        <w:t xml:space="preserve"> with </w:t>
-      </w:r>
-      <w:r>
-        <w:rPr>
-          <w:rFonts w:ascii="Consolas" w:hAnsi="Consolas" w:cs="Consolas"/>
-          <w:b/>
-          <w:bCs/>
-          <w:sz w:val="20"/>
-          <w:szCs w:val="20"/>
-        </w:rPr>
-        <w:t>k</w:t>
-      </w:r>
-      <w:r>
-        <w:rPr>
-          <w:rFonts w:ascii="Arial" w:hAnsi="Arial" w:cs="Arial"/>
-          <w:sz w:val="20"/>
-          <w:szCs w:val="20"/>
-        </w:rPr>
-        <w:t xml:space="preserve"> set to </w:t>
-      </w:r>
-      <w:r>
-        <w:rPr>
-          <w:rFonts w:ascii="Consolas" w:hAnsi="Consolas" w:cs="Consolas"/>
-          <w:b/>
-          <w:bCs/>
-          <w:sz w:val="20"/>
-          <w:szCs w:val="20"/>
-        </w:rPr>
-        <w:t>1</w:t>
-      </w:r>
-      <w:r>
-        <w:rPr>
-          <w:rFonts w:ascii="Consolas" w:hAnsi="Consolas" w:cs="Consolas"/>
-          <w:b/>
-          <w:bCs/>
-          <w:sz w:val="20"/>
-          <w:szCs w:val="20"/>
-        </w:rPr>
-        <w:t>.5</w:t>
-      </w:r>
-      <w:r>
-        <w:rPr>
-          <w:rFonts w:ascii="Arial" w:hAnsi="Arial" w:cs="Arial"/>
-          <w:sz w:val="20"/>
-          <w:szCs w:val="20"/>
-        </w:rPr>
-        <w:t xml:space="preserve">) </w:t>
-      </w:r>
-      <w:r>
-        <w:rPr>
-          <w:rFonts w:ascii="Arial" w:hAnsi="Arial" w:cs="Arial"/>
-          <w:sz w:val="20"/>
-          <w:szCs w:val="20"/>
-        </w:rPr>
-        <w:t>were considered outliers</w:t>
-      </w:r>
-      <w:r>
-        <w:rPr>
-          <w:rFonts w:ascii="Arial" w:hAnsi="Arial" w:cs="Arial"/>
-          <w:sz w:val="20"/>
-          <w:szCs w:val="20"/>
-        </w:rPr>
-        <w:t xml:space="preserve">. Although </w:t>
-      </w:r>
-      <w:r>
-        <w:rPr>
-          <w:rFonts w:ascii="Arial" w:hAnsi="Arial" w:cs="Arial"/>
-          <w:sz w:val="20"/>
-          <w:szCs w:val="20"/>
-        </w:rPr>
-        <w:t xml:space="preserve">the lower bound </w:t>
-      </w:r>
-      <w:r>
-        <w:rPr>
-          <w:rFonts w:ascii="Arial" w:hAnsi="Arial" w:cs="Arial"/>
-          <w:sz w:val="20"/>
-          <w:szCs w:val="20"/>
-        </w:rPr>
-        <w:t xml:space="preserve">was also calculated with the IQR method, it </w:t>
-      </w:r>
-      <w:r>
-        <w:rPr>
-          <w:rFonts w:ascii="Arial" w:hAnsi="Arial" w:cs="Arial"/>
-          <w:sz w:val="20"/>
-          <w:szCs w:val="20"/>
-        </w:rPr>
-        <w:t>is a negative value</w:t>
-      </w:r>
-      <w:r>
-        <w:rPr>
-          <w:rFonts w:ascii="Arial" w:hAnsi="Arial" w:cs="Arial"/>
-          <w:sz w:val="20"/>
-          <w:szCs w:val="20"/>
-        </w:rPr>
-        <w:t>. As</w:t>
-      </w:r>
-      <w:r>
-        <w:rPr>
-          <w:rFonts w:ascii="Arial" w:hAnsi="Arial" w:cs="Arial"/>
-          <w:sz w:val="20"/>
-          <w:szCs w:val="20"/>
+          <w:lang w:val="en-US"/>
+        </w:rPr>
+      </w:pPr>
+    </w:p>
+    <w:p>
+      <w:pPr>
+        <w:ind w:firstLine="720"/>
+        <w:rPr>
+          <w:rFonts w:ascii="Garamond" w:hAnsi="Garamond"/>
+          <w:b/>
+          <w:bCs/>
+          <w:lang w:val="en-US"/>
+        </w:rPr>
+      </w:pPr>
+    </w:p>
+    <w:p>
+      <w:pPr>
+        <w:ind w:firstLine="720"/>
+        <w:rPr>
+          <w:rFonts w:ascii="Garamond" w:hAnsi="Garamond"/>
+          <w:b/>
+          <w:bCs/>
+          <w:lang w:val="en-US"/>
+        </w:rPr>
+      </w:pPr>
+    </w:p>
+    <w:p>
+      <w:pPr>
+        <w:ind w:firstLine="720"/>
+        <w:rPr>
+          <w:rFonts w:ascii="Garamond" w:hAnsi="Garamond"/>
+          <w:b/>
+          <w:bCs/>
+          <w:lang w:val="en-US"/>
+        </w:rPr>
+      </w:pPr>
+      <w:r>
+        <w:rPr>
+          <w:rFonts w:ascii="Garamond" w:hAnsi="Garamond"/>
+          <w:b/>
+          <w:bCs/>
+          <w:lang w:val="en-US"/>
+        </w:rPr>
+        <w:lastRenderedPageBreak/>
+        <w:t>Data</w:t>
+      </w:r>
+      <w:r>
+        <w:rPr>
+          <w:rFonts w:ascii="Garamond" w:hAnsi="Garamond"/>
+          <w:b/>
+          <w:bCs/>
+          <w:lang w:val="en-US"/>
         </w:rPr>
         <w:t xml:space="preserve"> </w:t>
       </w:r>
       <w:r>
         <w:rPr>
-          <w:rFonts w:ascii="Arial" w:hAnsi="Arial" w:cs="Arial"/>
-          <w:sz w:val="20"/>
-          <w:szCs w:val="20"/>
-        </w:rPr>
-        <w:t>consultation durations cannot be negative, no outliers were removed at the lower end.</w:t>
-      </w:r>
-    </w:p>
-    <w:p>
-      <w:pPr>
-        <w:rPr>
           <w:rFonts w:ascii="Garamond" w:hAnsi="Garamond"/>
           <w:b/>
           <w:bCs/>
-        </w:rPr>
-      </w:pPr>
-      <w:r>
+          <w:lang w:val="en-US"/>
+        </w:rPr>
+        <w:t>Types</w:t>
+      </w:r>
+    </w:p>
+    <w:p>
+      <w:pPr>
+        <w:rPr>
+          <w:rFonts w:ascii="Arial" w:hAnsi="Arial" w:cs="Arial"/>
+          <w:sz w:val="20"/>
+          <w:szCs w:val="20"/>
+        </w:rPr>
+      </w:pPr>
+      <w:r>
+        <w:rPr>
+          <w:rFonts w:ascii="Arial" w:hAnsi="Arial" w:cs="Arial"/>
+          <w:sz w:val="20"/>
+          <w:szCs w:val="20"/>
+        </w:rPr>
+        <w:t>For memory optimization and improved performance, a mapping of the appropriate datatypes for each column was applied.</w:t>
+      </w:r>
+    </w:p>
+    <w:p>
+      <w:pPr>
+        <w:ind w:firstLine="720"/>
         <w:rPr>
           <w:rFonts w:ascii="Garamond" w:hAnsi="Garamond"/>
           <w:b/>
           <w:bCs/>
-        </w:rPr>
-        <w:t>Satisfaction Level</w:t>
-      </w:r>
-    </w:p>
-    <w:p>
-      <w:pPr>
-        <w:rPr>
-          <w:rFonts w:ascii="Arial" w:hAnsi="Arial" w:cs="Arial"/>
-          <w:sz w:val="20"/>
-          <w:szCs w:val="20"/>
-        </w:rPr>
-      </w:pPr>
-      <w:r>
-        <w:rPr>
-          <w:rFonts w:ascii="Arial" w:hAnsi="Arial" w:cs="Arial"/>
-          <w:sz w:val="20"/>
-          <w:szCs w:val="20"/>
-        </w:rPr>
-        <w:t xml:space="preserve">Since this feature has only a range of 1-5, all values outside this range were considered data errors and so for values higher than 5 </w:t>
-      </w:r>
-      <w:r>
-        <w:rPr>
-          <w:rFonts w:ascii="Arial" w:hAnsi="Arial" w:cs="Arial"/>
-          <w:sz w:val="20"/>
-          <w:szCs w:val="20"/>
-        </w:rPr>
-        <w:t>–</w:t>
-      </w:r>
-      <w:r>
-        <w:rPr>
-          <w:rFonts w:ascii="Arial" w:hAnsi="Arial" w:cs="Arial"/>
-          <w:sz w:val="20"/>
-          <w:szCs w:val="20"/>
-        </w:rPr>
-        <w:t xml:space="preserve"> observations</w:t>
-      </w:r>
-      <w:r>
-        <w:rPr>
-          <w:rFonts w:ascii="Arial" w:hAnsi="Arial" w:cs="Arial"/>
-          <w:sz w:val="20"/>
-          <w:szCs w:val="20"/>
-        </w:rPr>
-        <w:t xml:space="preserve"> with </w:t>
-      </w:r>
-      <w:r>
-        <w:rPr>
-          <w:rFonts w:ascii="Arial" w:hAnsi="Arial" w:cs="Arial"/>
-          <w:sz w:val="20"/>
-          <w:szCs w:val="20"/>
-        </w:rPr>
-        <w:t xml:space="preserve">a satisfaction level </w:t>
-      </w:r>
-      <w:r>
-        <w:rPr>
-          <w:rFonts w:ascii="Arial" w:hAnsi="Arial" w:cs="Arial"/>
-          <w:sz w:val="20"/>
-          <w:szCs w:val="20"/>
-        </w:rPr>
-        <w:t>of 6 – were replaced by 5.</w:t>
-      </w:r>
-    </w:p>
-    <w:p>
-      <w:pPr>
-        <w:rPr>
-          <w:rFonts w:ascii="Arial" w:hAnsi="Arial" w:cs="Arial"/>
-          <w:b/>
-          <w:bCs/>
-          <w:sz w:val="20"/>
-          <w:szCs w:val="20"/>
+          <w:lang w:val="en-US"/>
         </w:rPr>
       </w:pPr>
       <w:r>
@@ -4897,330 +5688,7 @@
           <w:rFonts w:ascii="Garamond" w:hAnsi="Garamond"/>
           <w:b/>
           <w:bCs/>
-        </w:rPr>
-        <w:t>Consultation</w:t>
-      </w:r>
-      <w:r>
-        <w:rPr>
-          <w:rFonts w:ascii="Arial" w:hAnsi="Arial" w:cs="Arial"/>
-          <w:b/>
-          <w:bCs/>
-          <w:sz w:val="20"/>
-          <w:szCs w:val="20"/>
-        </w:rPr>
-        <w:t xml:space="preserve"> </w:t>
-      </w:r>
-      <w:r>
-        <w:rPr>
-          <w:rFonts w:ascii="Garamond" w:hAnsi="Garamond"/>
-          <w:b/>
-          <w:bCs/>
-        </w:rPr>
-        <w:t>Price</w:t>
-      </w:r>
-    </w:p>
-    <w:p>
-      <w:pPr>
-        <w:rPr>
-          <w:rFonts w:ascii="Arial" w:hAnsi="Arial" w:cs="Arial"/>
-          <w:sz w:val="20"/>
-          <w:szCs w:val="20"/>
-        </w:rPr>
-      </w:pPr>
-      <w:r>
-        <w:rPr>
-          <w:rFonts w:ascii="Arial" w:hAnsi="Arial" w:cs="Arial"/>
-          <w:sz w:val="20"/>
-          <w:szCs w:val="20"/>
-        </w:rPr>
-        <w:t>E</w:t>
-      </w:r>
-      <w:r>
-        <w:rPr>
-          <w:rFonts w:ascii="Arial" w:hAnsi="Arial" w:cs="Arial"/>
-          <w:sz w:val="20"/>
-          <w:szCs w:val="20"/>
-        </w:rPr>
-        <w:t>xtreme high values (</w:t>
-      </w:r>
-      <w:r>
-        <w:rPr>
-          <w:rFonts w:ascii="Arial" w:hAnsi="Arial" w:cs="Arial"/>
-          <w:sz w:val="20"/>
-          <w:szCs w:val="20"/>
-        </w:rPr>
-        <w:t xml:space="preserve">above </w:t>
-      </w:r>
-      <w:r>
-        <w:rPr>
-          <w:rFonts w:ascii="Arial" w:hAnsi="Arial" w:cs="Arial"/>
-          <w:sz w:val="20"/>
-          <w:szCs w:val="20"/>
-        </w:rPr>
-        <w:t>10000</w:t>
-      </w:r>
-      <w:r>
-        <w:rPr>
-          <w:rFonts w:ascii="Arial" w:hAnsi="Arial" w:cs="Arial"/>
-          <w:sz w:val="20"/>
-          <w:szCs w:val="20"/>
-        </w:rPr>
-        <w:t>€</w:t>
-      </w:r>
-      <w:r>
-        <w:rPr>
-          <w:rFonts w:ascii="Arial" w:hAnsi="Arial" w:cs="Arial"/>
-          <w:sz w:val="20"/>
-          <w:szCs w:val="20"/>
-        </w:rPr>
-        <w:t xml:space="preserve">) were </w:t>
-      </w:r>
-      <w:r>
-        <w:rPr>
-          <w:rFonts w:ascii="Arial" w:hAnsi="Arial" w:cs="Arial"/>
-          <w:sz w:val="20"/>
-          <w:szCs w:val="20"/>
-        </w:rPr>
-        <w:t>considered data</w:t>
-      </w:r>
-      <w:r>
-        <w:rPr>
-          <w:rFonts w:ascii="Arial" w:hAnsi="Arial" w:cs="Arial"/>
-          <w:sz w:val="20"/>
-          <w:szCs w:val="20"/>
-        </w:rPr>
-        <w:t xml:space="preserve"> errors and removed</w:t>
-      </w:r>
-      <w:r>
-        <w:rPr>
-          <w:rFonts w:ascii="Arial" w:hAnsi="Arial" w:cs="Arial"/>
-          <w:sz w:val="20"/>
-          <w:szCs w:val="20"/>
-        </w:rPr>
-        <w:t>, while v</w:t>
-      </w:r>
-      <w:r>
-        <w:rPr>
-          <w:rFonts w:ascii="Arial" w:hAnsi="Arial" w:cs="Arial"/>
-          <w:sz w:val="20"/>
-          <w:szCs w:val="20"/>
-        </w:rPr>
-        <w:t>alues within a plausible range</w:t>
-      </w:r>
-      <w:r>
-        <w:rPr>
-          <w:rFonts w:ascii="Arial" w:hAnsi="Arial" w:cs="Arial"/>
-          <w:sz w:val="20"/>
-          <w:szCs w:val="20"/>
-          <w:lang w:val="en-US"/>
-        </w:rPr>
-        <w:t xml:space="preserve">, </w:t>
-      </w:r>
-      <w:r>
-        <w:rPr>
-          <w:rFonts w:ascii="Arial" w:hAnsi="Arial" w:cs="Arial"/>
-          <w:sz w:val="20"/>
-          <w:szCs w:val="20"/>
-        </w:rPr>
-        <w:t>even if high</w:t>
-      </w:r>
-      <w:r>
-        <w:rPr>
-          <w:rFonts w:ascii="Arial" w:hAnsi="Arial" w:cs="Arial"/>
-          <w:sz w:val="20"/>
-          <w:szCs w:val="20"/>
-          <w:lang w:val="en-US"/>
-        </w:rPr>
-        <w:t>,</w:t>
-      </w:r>
-      <w:r>
-        <w:rPr>
-          <w:rFonts w:ascii="Arial" w:hAnsi="Arial" w:cs="Arial"/>
-          <w:sz w:val="20"/>
-          <w:szCs w:val="20"/>
-        </w:rPr>
-        <w:t xml:space="preserve"> were </w:t>
-      </w:r>
-      <w:r>
-        <w:rPr>
-          <w:rFonts w:ascii="Arial" w:hAnsi="Arial" w:cs="Arial"/>
-          <w:sz w:val="20"/>
-          <w:szCs w:val="20"/>
-        </w:rPr>
-        <w:t>mantained</w:t>
-      </w:r>
-      <w:r>
-        <w:rPr>
-          <w:rFonts w:ascii="Arial" w:hAnsi="Arial" w:cs="Arial"/>
-          <w:sz w:val="20"/>
-          <w:szCs w:val="20"/>
-        </w:rPr>
-        <w:t>.</w:t>
-      </w:r>
-    </w:p>
-    <w:p>
-      <w:pPr>
-        <w:rPr>
-          <w:rFonts w:ascii="Garamond" w:hAnsi="Garamond"/>
-          <w:b/>
-          <w:bCs/>
-        </w:rPr>
-      </w:pPr>
-      <w:r>
-        <w:rPr>
-          <w:rFonts w:ascii="Garamond" w:hAnsi="Garamond"/>
-          <w:b/>
-          <w:bCs/>
-        </w:rPr>
-        <w:t>Insurance Coverage</w:t>
-      </w:r>
-    </w:p>
-    <w:p>
-      <w:pPr>
-        <w:rPr>
-          <w:rFonts w:ascii="Arial" w:hAnsi="Arial" w:cs="Arial"/>
-          <w:sz w:val="20"/>
-          <w:szCs w:val="20"/>
-        </w:rPr>
-      </w:pPr>
-      <w:r>
-        <w:rPr>
-          <w:rFonts w:ascii="Arial" w:hAnsi="Arial" w:cs="Arial"/>
-          <w:sz w:val="20"/>
-          <w:szCs w:val="20"/>
-        </w:rPr>
-        <w:t>Some observations had high values however,</w:t>
-      </w:r>
-      <w:r>
-        <w:rPr>
-          <w:rFonts w:ascii="Arial" w:hAnsi="Arial" w:cs="Arial"/>
-          <w:sz w:val="20"/>
-          <w:szCs w:val="20"/>
-        </w:rPr>
-        <w:t xml:space="preserve"> they were plausible given </w:t>
-      </w:r>
-      <w:r>
-        <w:rPr>
-          <w:rFonts w:ascii="Arial" w:hAnsi="Arial" w:cs="Arial"/>
-          <w:sz w:val="20"/>
-          <w:szCs w:val="20"/>
-        </w:rPr>
-        <w:t>that the</w:t>
-      </w:r>
-      <w:r>
-        <w:rPr>
-          <w:rFonts w:ascii="Arial" w:hAnsi="Arial" w:cs="Arial"/>
-          <w:sz w:val="20"/>
-          <w:szCs w:val="20"/>
-        </w:rPr>
-        <w:t xml:space="preserve"> corresponding </w:t>
-      </w:r>
-      <w:r>
-        <w:rPr>
-          <w:rFonts w:ascii="Arial" w:hAnsi="Arial" w:cs="Arial"/>
-          <w:b/>
-          <w:bCs/>
-          <w:sz w:val="20"/>
-          <w:szCs w:val="20"/>
-        </w:rPr>
-        <w:t>Consultation Price</w:t>
-      </w:r>
-      <w:r>
-        <w:rPr>
-          <w:rFonts w:ascii="Arial" w:hAnsi="Arial" w:cs="Arial"/>
-          <w:sz w:val="20"/>
-          <w:szCs w:val="20"/>
-        </w:rPr>
-        <w:t xml:space="preserve"> was also high. Therefore, n</w:t>
-      </w:r>
-      <w:r>
-        <w:rPr>
-          <w:rFonts w:ascii="Arial" w:hAnsi="Arial" w:cs="Arial"/>
-          <w:sz w:val="20"/>
-          <w:szCs w:val="20"/>
-        </w:rPr>
-        <w:t>o removal or clipping was applied</w:t>
-      </w:r>
-      <w:r>
-        <w:rPr>
-          <w:rFonts w:ascii="Arial" w:hAnsi="Arial" w:cs="Arial"/>
-          <w:sz w:val="20"/>
-          <w:szCs w:val="20"/>
-        </w:rPr>
-        <w:t>.</w:t>
-      </w:r>
-    </w:p>
-    <w:p>
-      <w:pPr>
-        <w:ind w:firstLine="720"/>
-        <w:rPr>
-          <w:rFonts w:ascii="Garamond" w:hAnsi="Garamond"/>
-          <w:b/>
-          <w:bCs/>
-          <w:lang w:val="pt-PT"/>
-        </w:rPr>
-      </w:pPr>
-      <w:r>
-        <w:rPr>
-          <w:rFonts w:ascii="Garamond" w:hAnsi="Garamond"/>
-          <w:b/>
-          <w:bCs/>
-          <w:lang w:val="pt-PT"/>
-        </w:rPr>
-        <w:t>Data</w:t>
-      </w:r>
-      <w:r>
-        <w:rPr>
-          <w:rFonts w:ascii="Garamond" w:hAnsi="Garamond"/>
-          <w:b/>
-          <w:bCs/>
-          <w:lang w:val="pt-PT"/>
-        </w:rPr>
-        <w:t xml:space="preserve"> </w:t>
-      </w:r>
-      <w:r>
-        <w:rPr>
-          <w:rFonts w:ascii="Garamond" w:hAnsi="Garamond"/>
-          <w:b/>
-          <w:bCs/>
-          <w:lang w:val="pt-PT"/>
-        </w:rPr>
-        <w:t>Types</w:t>
-      </w:r>
-    </w:p>
-    <w:p>
-      <w:pPr>
-        <w:rPr>
-          <w:rFonts w:ascii="Arial" w:hAnsi="Arial" w:cs="Arial"/>
-          <w:sz w:val="20"/>
-          <w:szCs w:val="20"/>
-        </w:rPr>
-      </w:pPr>
-      <w:r>
-        <w:rPr>
-          <w:rFonts w:ascii="Arial" w:hAnsi="Arial" w:cs="Arial"/>
-          <w:sz w:val="20"/>
-          <w:szCs w:val="20"/>
-        </w:rPr>
-        <w:t>For memory optimization and improved performance, a mapping of the appropriate datatypes for each column was applied.</w:t>
-      </w:r>
-    </w:p>
-    <w:p>
-      <w:pPr>
-        <w:ind w:firstLine="720"/>
-        <w:rPr>
-          <w:rFonts w:ascii="Garamond" w:hAnsi="Garamond"/>
-          <w:b/>
-          <w:bCs/>
-          <w:lang w:val="pt-PT"/>
-        </w:rPr>
-      </w:pPr>
-      <w:r>
-        <w:rPr>
-          <w:rFonts w:ascii="Garamond" w:hAnsi="Garamond"/>
-          <w:b/>
-          <w:bCs/>
-          <w:lang w:val="pt-PT"/>
+          <w:lang w:val="en-US"/>
         </w:rPr>
         <w:t>Deduplication</w:t>
       </w:r>
@@ -5289,7 +5757,7 @@
           <w:rFonts w:ascii="Garamond" w:hAnsi="Garamond"/>
           <w:b/>
           <w:bCs/>
-          <w:lang w:val="pt-PT"/>
+          <w:lang w:val="en-US"/>
         </w:rPr>
       </w:pPr>
       <w:r>
@@ -5297,7 +5765,7 @@
           <w:rFonts w:ascii="Garamond" w:hAnsi="Garamond"/>
           <w:b/>
           <w:bCs/>
-          <w:lang w:val="pt-PT"/>
+          <w:lang w:val="en-US"/>
         </w:rPr>
         <w:t>Distribution and Skewness Analysis</w:t>
       </w:r>
@@ -5487,7 +5955,6 @@
           <w:sz w:val="20"/>
           <w:szCs w:val="20"/>
         </w:rPr>
-        <w:lastRenderedPageBreak/>
         <w:t>Consultation Duration showed moderate right-skewness, indicating occasional long consultations</w:t>
       </w:r>
       <w:r>
@@ -5904,6 +6371,7 @@
           <w:sz w:val="20"/>
           <w:szCs w:val="20"/>
         </w:rPr>
+        <w:lastRenderedPageBreak/>
         <w:t>City of Residence, Profession, Insurance Provider, Family History, Education Level, Marital Status, Age Range, Days since last visit</w:t>
       </w:r>
       <w:r>
@@ -6140,7 +6608,6 @@
           <w:szCs w:val="20"/>
           <w:lang w:val="en-US"/>
         </w:rPr>
-        <w:lastRenderedPageBreak/>
         <w:drawing>
           <wp:anchor distT="0" distB="0" distL="114300" distR="114300" simplePos="0" relativeHeight="251659264" behindDoc="1" locked="0" layoutInCell="1" allowOverlap="1" wp14:anchorId="1AADA9F1" wp14:editId="6A4B4FDA">
             <wp:simplePos x="0" y="0"/>
@@ -6173,7 +6640,7 @@
                     <pic:cNvPicPr/>
                   </pic:nvPicPr>
                   <pic:blipFill>
-                    <a:blip r:embed="rId14" cstate="print">
+                    <a:blip r:embed="rId20" cstate="print">
                       <a:extLst>
                         <a:ext uri="{28A0092B-C50C-407E-A947-70E740481C1C}">
                           <a14:useLocalDpi xmlns:a14="http://schemas.microsoft.com/office/drawing/2010/main" val="0"/>
@@ -6230,7 +6697,7 @@
                     <pic:cNvPicPr/>
                   </pic:nvPicPr>
                   <pic:blipFill rotWithShape="1">
-                    <a:blip r:embed="rId15"/>
+                    <a:blip r:embed="rId21"/>
                     <a:srcRect b="847"/>
                     <a:stretch>
                       <a:fillRect/>
@@ -6308,7 +6775,7 @@
                     <pic:cNvPicPr/>
                   </pic:nvPicPr>
                   <pic:blipFill>
-                    <a:blip r:embed="rId16" cstate="print">
+                    <a:blip r:embed="rId22" cstate="print">
                       <a:extLst>
                         <a:ext uri="{28A0092B-C50C-407E-A947-70E740481C1C}">
                           <a14:useLocalDpi xmlns:a14="http://schemas.microsoft.com/office/drawing/2010/main" val="0"/>
@@ -6363,7 +6830,7 @@
                     <pic:cNvPicPr/>
                   </pic:nvPicPr>
                   <pic:blipFill>
-                    <a:blip r:embed="rId17"/>
+                    <a:blip r:embed="rId23"/>
                     <a:stretch>
                       <a:fillRect/>
                     </a:stretch>
@@ -6416,6 +6883,7 @@
           <w:szCs w:val="20"/>
           <w:lang w:val="en-US"/>
         </w:rPr>
+        <w:lastRenderedPageBreak/>
         <w:t>Number of visits per department over time</w:t>
       </w:r>
     </w:p>
@@ -6454,7 +6922,7 @@
                     </pic:cNvPicPr>
                   </pic:nvPicPr>
                   <pic:blipFill>
-                    <a:blip r:embed="rId18">
+                    <a:blip r:embed="rId24">
                       <a:extLst>
                         <a:ext uri="{28A0092B-C50C-407E-A947-70E740481C1C}">
                           <a14:useLocalDpi xmlns:a14="http://schemas.microsoft.com/office/drawing/2010/main" val="0"/>
@@ -6531,7 +6999,6 @@
           <w:szCs w:val="20"/>
           <w:lang w:val="en-US"/>
         </w:rPr>
-        <w:lastRenderedPageBreak/>
         <w:drawing>
           <wp:inline distT="0" distB="0" distL="0" distR="0" wp14:anchorId="433903E1" wp14:editId="15BC48FB">
             <wp:extent cx="5725795" cy="2547620"/>
@@ -6550,7 +7017,7 @@
                     </pic:cNvPicPr>
                   </pic:nvPicPr>
                   <pic:blipFill>
-                    <a:blip r:embed="rId19">
+                    <a:blip r:embed="rId25">
                       <a:extLst>
                         <a:ext uri="{28A0092B-C50C-407E-A947-70E740481C1C}">
                           <a14:useLocalDpi xmlns:a14="http://schemas.microsoft.com/office/drawing/2010/main" val="0"/>
@@ -6693,7 +7160,7 @@
                     </pic:cNvPicPr>
                   </pic:nvPicPr>
                   <pic:blipFill>
-                    <a:blip r:embed="rId20">
+                    <a:blip r:embed="rId26">
                       <a:extLst>
                         <a:ext uri="{28A0092B-C50C-407E-A947-70E740481C1C}">
                           <a14:useLocalDpi xmlns:a14="http://schemas.microsoft.com/office/drawing/2010/main" val="0"/>
@@ -6839,7 +7306,7 @@
                     </pic:cNvPicPr>
                   </pic:nvPicPr>
                   <pic:blipFill>
-                    <a:blip r:embed="rId21">
+                    <a:blip r:embed="rId27">
                       <a:extLst>
                         <a:ext uri="{28A0092B-C50C-407E-A947-70E740481C1C}">
                           <a14:useLocalDpi xmlns:a14="http://schemas.microsoft.com/office/drawing/2010/main" val="0"/>
@@ -6945,7 +7412,7 @@
                     </pic:cNvPicPr>
                   </pic:nvPicPr>
                   <pic:blipFill>
-                    <a:blip r:embed="rId22">
+                    <a:blip r:embed="rId28">
                       <a:extLst>
                         <a:ext uri="{28A0092B-C50C-407E-A947-70E740481C1C}">
                           <a14:useLocalDpi xmlns:a14="http://schemas.microsoft.com/office/drawing/2010/main" val="0"/>
@@ -7051,7 +7518,7 @@
                     </pic:cNvPicPr>
                   </pic:nvPicPr>
                   <pic:blipFill>
-                    <a:blip r:embed="rId23">
+                    <a:blip r:embed="rId29">
                       <a:extLst>
                         <a:ext uri="{28A0092B-C50C-407E-A947-70E740481C1C}">
                           <a14:useLocalDpi xmlns:a14="http://schemas.microsoft.com/office/drawing/2010/main" val="0"/>
@@ -8786,6 +9253,25 @@
       <w:iCs/>
     </w:rPr>
   </w:style>
+  <w:style w:type="paragraph" w:styleId="Caption">
+    <w:name w:val="caption"/>
+    <w:basedOn w:val="Normal"/>
+    <w:next w:val="Normal"/>
+    <w:uiPriority w:val="35"/>
+    <w:unhideWhenUsed/>
+    <w:qFormat/>
+    <w:rsid w:val="005F15E9"/>
+    <w:pPr>
+      <w:spacing w:after="200" w:line="240" w:lineRule="auto"/>
+    </w:pPr>
+    <w:rPr>
+      <w:i/>
+      <w:iCs/>
+      <w:color w:val="0E2841" w:themeColor="text2"/>
+      <w:sz w:val="18"/>
+      <w:szCs w:val="18"/>
+    </w:rPr>
+  </w:style>
 </w:styles>
 </file>
 

</xml_diff>

<commit_message>
mudei os graficos pra rosa nada de especial
</commit_message>
<xml_diff>
--- a/report_data_preprocessing.docx
+++ b/report_data_preprocessing.docx
@@ -2071,27 +2071,7 @@
           <w:szCs w:val="20"/>
           <w:lang w:val="en-US"/>
         </w:rPr>
-        <w:t xml:space="preserve"> For </w:t>
-      </w:r>
-      <w:proofErr w:type="gramStart"/>
-      <w:r>
-        <w:rPr>
-          <w:rFonts w:ascii="Arial" w:hAnsi="Arial" w:cs="Arial"/>
-          <w:sz w:val="20"/>
-          <w:szCs w:val="20"/>
-          <w:lang w:val="en-US"/>
-        </w:rPr>
-        <w:t>some</w:t>
-      </w:r>
-      <w:proofErr w:type="gramEnd"/>
-      <w:r>
-        <w:rPr>
-          <w:rFonts w:ascii="Arial" w:hAnsi="Arial" w:cs="Arial"/>
-          <w:sz w:val="20"/>
-          <w:szCs w:val="20"/>
-          <w:lang w:val="en-US"/>
-        </w:rPr>
-        <w:t xml:space="preserve"> features, this </w:t>
+        <w:t xml:space="preserve"> For some features, this </w:t>
       </w:r>
       <w:r>
         <w:rPr>
@@ -2136,19 +2116,8 @@
           <w:szCs w:val="20"/>
           <w:lang w:val="en-US"/>
         </w:rPr>
-        <w:t xml:space="preserve"> while for others additional strategies </w:t>
-      </w:r>
-      <w:proofErr w:type="gramStart"/>
-      <w:r>
-        <w:rPr>
-          <w:rFonts w:ascii="Arial" w:hAnsi="Arial" w:cs="Arial"/>
-          <w:sz w:val="20"/>
-          <w:szCs w:val="20"/>
-          <w:lang w:val="en-US"/>
-        </w:rPr>
-        <w:t>were used</w:t>
-      </w:r>
-      <w:proofErr w:type="gramEnd"/>
+        <w:t xml:space="preserve"> while for others additional strategies were used</w:t>
+      </w:r>
       <w:r>
         <w:rPr>
           <w:rFonts w:ascii="Arial" w:hAnsi="Arial" w:cs="Arial"/>
@@ -2215,7 +2184,6 @@
         </w:rPr>
         <w:t xml:space="preserve">missing values </w:t>
       </w:r>
-      <w:proofErr w:type="gramStart"/>
       <w:r>
         <w:rPr>
           <w:rFonts w:ascii="Arial" w:hAnsi="Arial" w:cs="Arial"/>
@@ -2232,17 +2200,7 @@
           <w:szCs w:val="20"/>
           <w:lang w:val="en-US"/>
         </w:rPr>
-        <w:t>e considered</w:t>
-      </w:r>
-      <w:proofErr w:type="gramEnd"/>
-      <w:r>
-        <w:rPr>
-          <w:rFonts w:ascii="Arial" w:hAnsi="Arial" w:cs="Arial"/>
-          <w:sz w:val="20"/>
-          <w:szCs w:val="20"/>
-          <w:lang w:val="en-US"/>
-        </w:rPr>
-        <w:t xml:space="preserve"> Missing Completely at Random (MCAR) since</w:t>
+        <w:t>e considered Missing Completely at Random (MCAR) since</w:t>
       </w:r>
       <w:r>
         <w:rPr>
@@ -3346,27 +3304,7 @@
           <w:szCs w:val="20"/>
           <w:lang w:val="en-US"/>
         </w:rPr>
-        <w:t xml:space="preserve">missing values </w:t>
-      </w:r>
-      <w:proofErr w:type="gramStart"/>
-      <w:r>
-        <w:rPr>
-          <w:rFonts w:ascii="Arial" w:hAnsi="Arial" w:cs="Arial"/>
-          <w:sz w:val="20"/>
-          <w:szCs w:val="20"/>
-          <w:lang w:val="en-US"/>
-        </w:rPr>
-        <w:t>were analyzed</w:t>
-      </w:r>
-      <w:proofErr w:type="gramEnd"/>
-      <w:r>
-        <w:rPr>
-          <w:rFonts w:ascii="Arial" w:hAnsi="Arial" w:cs="Arial"/>
-          <w:sz w:val="20"/>
-          <w:szCs w:val="20"/>
-          <w:lang w:val="en-US"/>
-        </w:rPr>
-        <w:t xml:space="preserve"> separately for Provider B and Provider D</w:t>
+        <w:t>missing values were analyzed separately for Provider B and Provider D</w:t>
       </w:r>
       <w:r>
         <w:rPr>
@@ -3420,17 +3358,7 @@
           <w:szCs w:val="20"/>
           <w:lang w:val="en-US"/>
         </w:rPr>
-        <w:t xml:space="preserve"> </w:t>
-      </w:r>
-      <w:proofErr w:type="gramStart"/>
-      <w:r>
-        <w:rPr>
-          <w:rFonts w:ascii="Arial" w:hAnsi="Arial" w:cs="Arial"/>
-          <w:sz w:val="20"/>
-          <w:szCs w:val="20"/>
-          <w:lang w:val="en-US"/>
-        </w:rPr>
-        <w:t>Before imput</w:t>
+        <w:t xml:space="preserve"> Before imput</w:t>
       </w:r>
       <w:r>
         <w:rPr>
@@ -3448,17 +3376,7 @@
           <w:szCs w:val="20"/>
           <w:lang w:val="en-US"/>
         </w:rPr>
-        <w:t>, it</w:t>
-      </w:r>
-      <w:proofErr w:type="gramEnd"/>
-      <w:r>
-        <w:rPr>
-          <w:rFonts w:ascii="Arial" w:hAnsi="Arial" w:cs="Arial"/>
-          <w:sz w:val="20"/>
-          <w:szCs w:val="20"/>
-          <w:lang w:val="en-US"/>
-        </w:rPr>
-        <w:t xml:space="preserve"> is important to note that there are no patients with </w:t>
+        <w:t xml:space="preserve">, it is important to note that there are no patients with </w:t>
       </w:r>
       <w:r>
         <w:rPr>
@@ -7500,7 +7418,7 @@
           <w:noProof/>
         </w:rPr>
         <w:drawing>
-          <wp:anchor distT="0" distB="0" distL="114300" distR="114300" simplePos="0" relativeHeight="251682816" behindDoc="0" locked="0" layoutInCell="1" allowOverlap="1" wp14:anchorId="2508838A" wp14:editId="49DEA0BF">
+          <wp:anchor distT="0" distB="0" distL="114300" distR="114300" simplePos="0" relativeHeight="251682816" behindDoc="0" locked="0" layoutInCell="1" allowOverlap="1" wp14:anchorId="2508838A" wp14:editId="73668C9B">
             <wp:simplePos x="0" y="0"/>
             <wp:positionH relativeFrom="margin">
               <wp:posOffset>241300</wp:posOffset>
@@ -7926,7 +7844,7 @@
           <w:szCs w:val="20"/>
         </w:rPr>
         <w:drawing>
-          <wp:anchor distT="0" distB="0" distL="114300" distR="114300" simplePos="0" relativeHeight="251683840" behindDoc="0" locked="0" layoutInCell="1" allowOverlap="1" wp14:anchorId="762F711A" wp14:editId="52A40CF4">
+          <wp:anchor distT="0" distB="0" distL="114300" distR="114300" simplePos="0" relativeHeight="251683840" behindDoc="0" locked="0" layoutInCell="1" allowOverlap="1" wp14:anchorId="762F711A" wp14:editId="2E20DF3C">
             <wp:simplePos x="0" y="0"/>
             <wp:positionH relativeFrom="margin">
               <wp:posOffset>3197225</wp:posOffset>
@@ -7996,7 +7914,7 @@
           <w:noProof/>
         </w:rPr>
         <w:drawing>
-          <wp:anchor distT="0" distB="0" distL="114300" distR="114300" simplePos="0" relativeHeight="251684864" behindDoc="0" locked="0" layoutInCell="1" allowOverlap="1" wp14:anchorId="1A26C334" wp14:editId="2380CB19">
+          <wp:anchor distT="0" distB="0" distL="114300" distR="114300" simplePos="0" relativeHeight="251684864" behindDoc="0" locked="0" layoutInCell="1" allowOverlap="1" wp14:anchorId="1A26C334" wp14:editId="489218C7">
             <wp:simplePos x="0" y="0"/>
             <wp:positionH relativeFrom="margin">
               <wp:posOffset>656489</wp:posOffset>
@@ -8240,16 +8158,16 @@
         <mc:AlternateContent>
           <mc:Choice Requires="wps">
             <w:drawing>
-              <wp:anchor distT="0" distB="0" distL="114300" distR="114300" simplePos="0" relativeHeight="251693056" behindDoc="0" locked="0" layoutInCell="1" allowOverlap="1" wp14:anchorId="73474467" wp14:editId="7F025A3E">
+              <wp:anchor distT="0" distB="0" distL="114300" distR="114300" simplePos="0" relativeHeight="251693056" behindDoc="0" locked="0" layoutInCell="1" allowOverlap="1" wp14:anchorId="73474467" wp14:editId="5E791CA0">
                 <wp:simplePos x="0" y="0"/>
                 <wp:positionH relativeFrom="margin">
-                  <wp:posOffset>1184021</wp:posOffset>
+                  <wp:posOffset>1183640</wp:posOffset>
                 </wp:positionH>
                 <wp:positionV relativeFrom="margin">
-                  <wp:posOffset>9298305</wp:posOffset>
+                  <wp:posOffset>9253061</wp:posOffset>
                 </wp:positionV>
                 <wp:extent cx="3664585" cy="635"/>
-                <wp:effectExtent l="0" t="0" r="5715" b="0"/>
+                <wp:effectExtent l="0" t="0" r="0" b="0"/>
                 <wp:wrapSquare wrapText="bothSides"/>
                 <wp:docPr id="267266999" name="Text Box 1"/>
                 <wp:cNvGraphicFramePr/>
@@ -8332,7 +8250,7 @@
           </mc:Choice>
           <mc:Fallback>
             <w:pict>
-              <v:shape w14:anchorId="73474467" id="_x0000_s1033" type="#_x0000_t202" style="position:absolute;margin-left:93.25pt;margin-top:732.15pt;width:288.55pt;height:.05pt;z-index:251693056;visibility:visible;mso-wrap-style:square;mso-width-percent:0;mso-wrap-distance-left:9pt;mso-wrap-distance-top:0;mso-wrap-distance-right:9pt;mso-wrap-distance-bottom:0;mso-position-horizontal:absolute;mso-position-horizontal-relative:margin;mso-position-vertical:absolute;mso-position-vertical-relative:margin;mso-width-percent:0;mso-width-relative:margin;v-text-anchor:top" o:gfxdata="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" stroked="f">
+              <v:shape w14:anchorId="73474467" id="_x0000_s1033" type="#_x0000_t202" style="position:absolute;margin-left:93.2pt;margin-top:728.6pt;width:288.55pt;height:.05pt;z-index:251693056;visibility:visible;mso-wrap-style:square;mso-width-percent:0;mso-wrap-distance-left:9pt;mso-wrap-distance-top:0;mso-wrap-distance-right:9pt;mso-wrap-distance-bottom:0;mso-position-horizontal:absolute;mso-position-horizontal-relative:margin;mso-position-vertical:absolute;mso-position-vertical-relative:margin;mso-width-percent:0;mso-width-relative:margin;v-text-anchor:top" o:gfxdata="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" stroked="f">
                 <v:textbox style="mso-fit-shape-to-text:t" inset="0,0,0,0">
                   <w:txbxContent>
                     <w:p>
@@ -9179,13 +9097,7 @@
                               <w:fldChar w:fldCharType="end"/>
                             </w:r>
                             <w:r>
-                              <w:t>4</w:t>
-                            </w:r>
-                            <w:r>
-                              <w:t xml:space="preserve">: </w:t>
-                            </w:r>
-                            <w:r>
-                              <w:t>data.info() before and after data type conversion</w:t>
+                              <w:t>4: data.info() before and after data type conversion</w:t>
                             </w:r>
                           </w:p>
                         </w:txbxContent>
@@ -9241,13 +9153,7 @@
                         <w:fldChar w:fldCharType="end"/>
                       </w:r>
                       <w:r>
-                        <w:t>4</w:t>
-                      </w:r>
-                      <w:r>
-                        <w:t xml:space="preserve">: </w:t>
-                      </w:r>
-                      <w:r>
-                        <w:t>data.info() before and after data type conversion</w:t>
+                        <w:t>4: data.info() before and after data type conversion</w:t>
                       </w:r>
                     </w:p>
                   </w:txbxContent>
@@ -10918,17 +10824,7 @@
           <w:szCs w:val="20"/>
           <w:lang w:val="en-US"/>
         </w:rPr>
-        <w:t xml:space="preserve">the column names </w:t>
-      </w:r>
-      <w:proofErr w:type="gramStart"/>
-      <w:r>
-        <w:rPr>
-          <w:rFonts w:ascii="Arial" w:hAnsi="Arial" w:cs="Arial"/>
-          <w:sz w:val="20"/>
-          <w:szCs w:val="20"/>
-          <w:lang w:val="en-US"/>
-        </w:rPr>
-        <w:t xml:space="preserve">were </w:t>
+        <w:t xml:space="preserve">the column names were </w:t>
       </w:r>
       <w:r>
         <w:rPr>
@@ -10939,7 +10835,6 @@
         </w:rPr>
         <w:t>adjusted</w:t>
       </w:r>
-      <w:proofErr w:type="gramEnd"/>
       <w:r>
         <w:rPr>
           <w:rFonts w:ascii="Arial" w:hAnsi="Arial" w:cs="Arial"/>
@@ -11032,25 +10927,14 @@
         </w:rPr>
         <w:t xml:space="preserve"> </w:t>
       </w:r>
-      <w:proofErr w:type="gramStart"/>
-      <w:r>
-        <w:rPr>
-          <w:rFonts w:ascii="Arial" w:hAnsi="Arial" w:cs="Arial"/>
-          <w:sz w:val="20"/>
-          <w:szCs w:val="20"/>
-          <w:lang w:val="en-US"/>
-        </w:rPr>
-        <w:t>was modified</w:t>
-      </w:r>
-      <w:proofErr w:type="gramEnd"/>
-      <w:r>
-        <w:rPr>
-          <w:rFonts w:ascii="Arial" w:hAnsi="Arial" w:cs="Arial"/>
-          <w:sz w:val="20"/>
-          <w:szCs w:val="20"/>
-          <w:lang w:val="en-US"/>
-        </w:rPr>
-        <w:t xml:space="preserve"> to</w:t>
+      <w:r>
+        <w:rPr>
+          <w:rFonts w:ascii="Arial" w:hAnsi="Arial" w:cs="Arial"/>
+          <w:sz w:val="20"/>
+          <w:szCs w:val="20"/>
+          <w:lang w:val="en-US"/>
+        </w:rPr>
+        <w:t>was modified to</w:t>
       </w:r>
       <w:r>
         <w:rPr>
@@ -11189,7 +11073,6 @@
         </w:rPr>
         <w:t xml:space="preserve"> </w:t>
       </w:r>
-      <w:proofErr w:type="gramStart"/>
       <w:r>
         <w:rPr>
           <w:rFonts w:ascii="Arial" w:hAnsi="Arial" w:cs="Arial"/>
@@ -11206,17 +11089,7 @@
           <w:szCs w:val="20"/>
           <w:lang w:val="en-US"/>
         </w:rPr>
-        <w:t xml:space="preserve"> converted</w:t>
-      </w:r>
-      <w:proofErr w:type="gramEnd"/>
-      <w:r>
-        <w:rPr>
-          <w:rFonts w:ascii="Arial" w:hAnsi="Arial" w:cs="Arial"/>
-          <w:sz w:val="20"/>
-          <w:szCs w:val="20"/>
-          <w:lang w:val="en-US"/>
-        </w:rPr>
-        <w:t xml:space="preserve"> </w:t>
+        <w:t xml:space="preserve"> converted </w:t>
       </w:r>
       <w:r>
         <w:rPr>
@@ -11432,27 +11305,7 @@
           <w:szCs w:val="20"/>
           <w:lang w:val="en-US"/>
         </w:rPr>
-        <w:t xml:space="preserve">The resulting Analytical Base Table </w:t>
-      </w:r>
-      <w:proofErr w:type="gramStart"/>
-      <w:r>
-        <w:rPr>
-          <w:rFonts w:ascii="Arial" w:hAnsi="Arial" w:cs="Arial"/>
-          <w:sz w:val="20"/>
-          <w:szCs w:val="20"/>
-          <w:lang w:val="en-US"/>
-        </w:rPr>
-        <w:t>was saved</w:t>
-      </w:r>
-      <w:proofErr w:type="gramEnd"/>
-      <w:r>
-        <w:rPr>
-          <w:rFonts w:ascii="Arial" w:hAnsi="Arial" w:cs="Arial"/>
-          <w:sz w:val="20"/>
-          <w:szCs w:val="20"/>
-          <w:lang w:val="en-US"/>
-        </w:rPr>
-        <w:t xml:space="preserve"> as a CSV file named ‘</w:t>
+        <w:t>The resulting Analytical Base Table was saved as a CSV file named ‘</w:t>
       </w:r>
       <w:r>
         <w:rPr>
@@ -11464,7 +11317,6 @@
         </w:rPr>
         <w:t>ABT_city_hospital</w:t>
       </w:r>
-      <w:proofErr w:type="gramStart"/>
       <w:r>
         <w:rPr>
           <w:rFonts w:ascii="Arial" w:hAnsi="Arial" w:cs="Arial"/>
@@ -11474,7 +11326,6 @@
         </w:rPr>
         <w:t>’,</w:t>
       </w:r>
-      <w:proofErr w:type="gramEnd"/>
       <w:r>
         <w:rPr>
           <w:rFonts w:ascii="Consolas" w:hAnsi="Consolas" w:cs="Consolas"/>
@@ -11725,23 +11576,7 @@
           <w:rFonts w:ascii="Garamond" w:hAnsi="Garamond"/>
           <w:lang w:val="en-US"/>
         </w:rPr>
-        <w:t xml:space="preserve">Distributions of Age, Gender, Approximate Annual </w:t>
-      </w:r>
-      <w:proofErr w:type="gramStart"/>
-      <w:r>
-        <w:rPr>
-          <w:rFonts w:ascii="Garamond" w:hAnsi="Garamond"/>
-          <w:lang w:val="en-US"/>
-        </w:rPr>
-        <w:t>Income</w:t>
-      </w:r>
-      <w:proofErr w:type="gramEnd"/>
-      <w:r>
-        <w:rPr>
-          <w:rFonts w:ascii="Garamond" w:hAnsi="Garamond"/>
-          <w:lang w:val="en-US"/>
-        </w:rPr>
-        <w:t xml:space="preserve"> and Income_log</w:t>
+        <w:t>Distributions of Age, Gender, Approximate Annual Income and Income_log</w:t>
       </w:r>
     </w:p>
     <w:p>
@@ -12937,27 +12772,7 @@
           <w:szCs w:val="20"/>
           <w:lang w:val="en-US"/>
         </w:rPr>
-        <w:t xml:space="preserve">data – January, February, March, April, </w:t>
-      </w:r>
-      <w:proofErr w:type="gramStart"/>
-      <w:r>
-        <w:rPr>
-          <w:rFonts w:ascii="Arial" w:hAnsi="Arial" w:cs="Arial"/>
-          <w:sz w:val="20"/>
-          <w:szCs w:val="20"/>
-          <w:lang w:val="en-US"/>
-        </w:rPr>
-        <w:t>May</w:t>
-      </w:r>
-      <w:proofErr w:type="gramEnd"/>
-      <w:r>
-        <w:rPr>
-          <w:rFonts w:ascii="Arial" w:hAnsi="Arial" w:cs="Arial"/>
-          <w:sz w:val="20"/>
-          <w:szCs w:val="20"/>
-          <w:lang w:val="en-US"/>
-        </w:rPr>
-        <w:t xml:space="preserve"> and June of 2024.</w:t>
+        <w:t>data – January, February, March, April, May and June of 2024.</w:t>
       </w:r>
       <w:r>
         <w:rPr>
@@ -13237,7 +13052,6 @@
         </w:rPr>
         <w:t xml:space="preserve"> being smaller than </w:t>
       </w:r>
-      <w:proofErr w:type="gramStart"/>
       <w:r>
         <w:rPr>
           <w:rFonts w:ascii="Arial" w:hAnsi="Arial" w:cs="Arial"/>
@@ -13256,7 +13070,6 @@
         </w:rPr>
         <w:t>5</w:t>
       </w:r>
-      <w:proofErr w:type="gramEnd"/>
       <w:r>
         <w:rPr>
           <w:rFonts w:ascii="Arial" w:hAnsi="Arial" w:cs="Arial"/>
@@ -13929,7 +13742,6 @@
         </w:rPr>
         <w:t xml:space="preserve"> is </w:t>
       </w:r>
-      <w:proofErr w:type="gramStart"/>
       <w:r>
         <w:rPr>
           <w:rFonts w:ascii="Arial" w:hAnsi="Arial" w:cs="Arial"/>
@@ -13939,7 +13751,6 @@
         </w:rPr>
         <w:t>60</w:t>
       </w:r>
-      <w:proofErr w:type="gramEnd"/>
       <w:r>
         <w:rPr>
           <w:rFonts w:ascii="Arial" w:hAnsi="Arial" w:cs="Arial"/>
@@ -14226,27 +14037,7 @@
           <w:szCs w:val="20"/>
           <w:lang w:val="en-US"/>
         </w:rPr>
-        <w:t xml:space="preserve">gender gap is smaller than </w:t>
-      </w:r>
-      <w:proofErr w:type="gramStart"/>
-      <w:r>
-        <w:rPr>
-          <w:rFonts w:ascii="Arial" w:hAnsi="Arial" w:cs="Arial"/>
-          <w:sz w:val="20"/>
-          <w:szCs w:val="20"/>
-          <w:lang w:val="en-US"/>
-        </w:rPr>
-        <w:t>30</w:t>
-      </w:r>
-      <w:proofErr w:type="gramEnd"/>
-      <w:r>
-        <w:rPr>
-          <w:rFonts w:ascii="Arial" w:hAnsi="Arial" w:cs="Arial"/>
-          <w:sz w:val="20"/>
-          <w:szCs w:val="20"/>
-          <w:lang w:val="en-US"/>
-        </w:rPr>
-        <w:t xml:space="preserve"> patients.</w:t>
+        <w:t>gender gap is smaller than 30 patients.</w:t>
       </w:r>
     </w:p>
     <w:p>
@@ -14292,7 +14083,7 @@
           <w:lang w:val="en-US"/>
         </w:rPr>
         <w:drawing>
-          <wp:anchor distT="0" distB="0" distL="114300" distR="114300" simplePos="0" relativeHeight="251704320" behindDoc="0" locked="0" layoutInCell="1" allowOverlap="1" wp14:anchorId="154D8D88" wp14:editId="3A5BD7CB">
+          <wp:anchor distT="0" distB="0" distL="114300" distR="114300" simplePos="0" relativeHeight="251704320" behindDoc="0" locked="0" layoutInCell="1" allowOverlap="1" wp14:anchorId="154D8D88" wp14:editId="0AF4FBA5">
             <wp:simplePos x="0" y="0"/>
             <wp:positionH relativeFrom="margin">
               <wp:align>right</wp:align>
@@ -14648,21 +14439,8 @@
           <w:szCs w:val="20"/>
           <w:lang w:val="en-US"/>
         </w:rPr>
-        <w:t xml:space="preserve">over </w:t>
-      </w:r>
-      <w:proofErr w:type="gramStart"/>
-      <w:r>
-        <w:rPr>
-          <w:rFonts w:ascii="Arial" w:hAnsi="Arial" w:cs="Arial"/>
-          <w:b/>
-          <w:bCs/>
-          <w:sz w:val="20"/>
-          <w:szCs w:val="20"/>
-          <w:lang w:val="en-US"/>
-        </w:rPr>
-        <w:t>100</w:t>
-      </w:r>
-      <w:proofErr w:type="gramEnd"/>
+        <w:t>over 100</w:t>
+      </w:r>
       <w:r>
         <w:rPr>
           <w:rFonts w:ascii="Arial" w:hAnsi="Arial" w:cs="Arial"/>
@@ -14856,16 +14634,7 @@
           <w:szCs w:val="20"/>
           <w:lang w:val="en-US"/>
         </w:rPr>
-        <w:t>Th</w:t>
-      </w:r>
-      <w:r>
-        <w:rPr>
-          <w:rFonts w:ascii="Arial" w:hAnsi="Arial" w:cs="Arial"/>
-          <w:sz w:val="20"/>
-          <w:szCs w:val="20"/>
-          <w:lang w:val="en-US"/>
-        </w:rPr>
-        <w:t xml:space="preserve">e figure above displays the average </w:t>
+        <w:t xml:space="preserve">The figure above displays the average </w:t>
       </w:r>
       <w:r>
         <w:rPr>
@@ -18923,6 +18692,7 @@
   <w:style w:type="character" w:default="1" w:styleId="DefaultParagraphFont">
     <w:name w:val="Default Paragraph Font"/>
     <w:uiPriority w:val="1"/>
+    <w:semiHidden/>
     <w:unhideWhenUsed/>
   </w:style>
   <w:style w:type="table" w:default="1" w:styleId="TableNormal">

</xml_diff>

<commit_message>
report graficos e feature engineering + promenores codigo
</commit_message>
<xml_diff>
--- a/report_data_preprocessing.docx
+++ b/report_data_preprocessing.docx
@@ -2883,25 +2883,7 @@
           <w:sz w:val="20"/>
           <w:szCs w:val="20"/>
         </w:rPr>
-        <w:t xml:space="preserve">, </w:t>
-      </w:r>
-      <w:proofErr w:type="gramStart"/>
-      <w:r>
-        <w:rPr>
-          <w:rFonts w:ascii="Arial" w:hAnsi="Arial" w:cs="Arial"/>
-          <w:sz w:val="20"/>
-          <w:szCs w:val="20"/>
-        </w:rPr>
-        <w:t>in order to</w:t>
-      </w:r>
-      <w:proofErr w:type="gramEnd"/>
-      <w:r>
-        <w:rPr>
-          <w:rFonts w:ascii="Arial" w:hAnsi="Arial" w:cs="Arial"/>
-          <w:sz w:val="20"/>
-          <w:szCs w:val="20"/>
-        </w:rPr>
-        <w:t xml:space="preserve"> fill in the missing values:</w:t>
+        <w:t>, in order to fill in the missing values:</w:t>
       </w:r>
     </w:p>
     <w:p>
@@ -3765,6 +3747,92 @@
     </w:p>
     <w:p>
       <w:pPr>
+        <w:jc w:val="both"/>
+        <w:rPr>
+          <w:rFonts w:ascii="Arial" w:hAnsi="Arial" w:cs="Arial"/>
+          <w:sz w:val="20"/>
+          <w:szCs w:val="20"/>
+        </w:rPr>
+      </w:pPr>
+      <w:r>
+        <w:rPr>
+          <w:rFonts w:ascii="Arial" w:hAnsi="Arial" w:cs="Arial"/>
+          <w:sz w:val="20"/>
+          <w:szCs w:val="20"/>
+        </w:rPr>
+        <w:t xml:space="preserve">Lastly, we check if there are more cases where </w:t>
+      </w:r>
+      <w:r>
+        <w:rPr>
+          <w:rFonts w:ascii="Arial" w:hAnsi="Arial" w:cs="Arial"/>
+          <w:b/>
+          <w:bCs/>
+          <w:sz w:val="20"/>
+          <w:szCs w:val="20"/>
+        </w:rPr>
+        <w:t>Insurance Coverage</w:t>
+      </w:r>
+      <w:r>
+        <w:rPr>
+          <w:rFonts w:ascii="Arial" w:hAnsi="Arial" w:cs="Arial"/>
+          <w:sz w:val="20"/>
+          <w:szCs w:val="20"/>
+        </w:rPr>
+        <w:t xml:space="preserve"> surpassed the </w:t>
+      </w:r>
+      <w:r>
+        <w:rPr>
+          <w:rFonts w:ascii="Arial" w:hAnsi="Arial" w:cs="Arial"/>
+          <w:b/>
+          <w:bCs/>
+          <w:sz w:val="20"/>
+          <w:szCs w:val="20"/>
+        </w:rPr>
+        <w:t>Consultation Price</w:t>
+      </w:r>
+      <w:r>
+        <w:rPr>
+          <w:rFonts w:ascii="Arial" w:hAnsi="Arial" w:cs="Arial"/>
+          <w:sz w:val="20"/>
+          <w:szCs w:val="20"/>
+        </w:rPr>
+        <w:t>,</w:t>
+      </w:r>
+      <w:r>
+        <w:rPr>
+          <w:rFonts w:ascii="Arial" w:hAnsi="Arial" w:cs="Arial"/>
+          <w:sz w:val="20"/>
+          <w:szCs w:val="20"/>
+        </w:rPr>
+        <w:t xml:space="preserve"> as exists another record where this happens </w:t>
+      </w:r>
+      <w:r>
+        <w:rPr>
+          <w:rFonts w:ascii="Arial" w:hAnsi="Arial" w:cs="Arial"/>
+          <w:sz w:val="20"/>
+          <w:szCs w:val="20"/>
+        </w:rPr>
+        <w:t>we check the Insurance Coverage Percentage of the Insurance Provider – in this case Provider A. The Insurance Coverage Percentage is approximately 80% for all patient</w:t>
+      </w:r>
+      <w:r>
+        <w:rPr>
+          <w:rFonts w:ascii="Arial" w:hAnsi="Arial" w:cs="Arial"/>
+          <w:sz w:val="20"/>
+          <w:szCs w:val="20"/>
+        </w:rPr>
+        <w:t>s</w:t>
+      </w:r>
+      <w:r>
+        <w:rPr>
+          <w:rFonts w:ascii="Arial" w:hAnsi="Arial" w:cs="Arial"/>
+          <w:sz w:val="20"/>
+          <w:szCs w:val="20"/>
+        </w:rPr>
+        <w:t xml:space="preserve"> with Provider A, so we replace Insurance Coverage with 80% of Consultation Price for this case.</w:t>
+      </w:r>
+    </w:p>
+    <w:p>
+      <w:pPr>
         <w:rPr>
           <w:rFonts w:ascii="Garamond" w:hAnsi="Garamond"/>
           <w:b/>
@@ -3791,6 +3859,83 @@
     <w:p>
       <w:pPr>
         <w:jc w:val="both"/>
+        <w:rPr>
+          <w:rFonts w:ascii="Arial" w:hAnsi="Arial" w:cs="Arial"/>
+          <w:sz w:val="20"/>
+          <w:szCs w:val="20"/>
+        </w:rPr>
+      </w:pPr>
+      <w:r>
+        <w:rPr>
+          <w:rFonts w:ascii="Arial" w:hAnsi="Arial" w:cs="Arial"/>
+          <w:sz w:val="20"/>
+          <w:szCs w:val="20"/>
+        </w:rPr>
+        <w:tab/>
+        <w:t xml:space="preserve">The missing values in Education Level </w:t>
+      </w:r>
+      <w:r>
+        <w:rPr>
+          <w:rFonts w:ascii="Arial" w:hAnsi="Arial" w:cs="Arial"/>
+          <w:sz w:val="20"/>
+          <w:szCs w:val="20"/>
+        </w:rPr>
+        <w:t>were</w:t>
+      </w:r>
+      <w:r>
+        <w:rPr>
+          <w:rFonts w:ascii="Arial" w:hAnsi="Arial" w:cs="Arial"/>
+          <w:sz w:val="20"/>
+          <w:szCs w:val="20"/>
+        </w:rPr>
+        <w:t xml:space="preserve"> considered </w:t>
+      </w:r>
+      <w:r>
+        <w:rPr>
+          <w:rFonts w:ascii="Arial" w:hAnsi="Arial" w:cs="Arial"/>
+          <w:b/>
+          <w:bCs/>
+          <w:sz w:val="20"/>
+          <w:szCs w:val="20"/>
+        </w:rPr>
+        <w:t>Missing At Random</w:t>
+      </w:r>
+      <w:r>
+        <w:rPr>
+          <w:rFonts w:ascii="Arial" w:hAnsi="Arial" w:cs="Arial"/>
+          <w:sz w:val="20"/>
+          <w:szCs w:val="20"/>
+        </w:rPr>
+        <w:t xml:space="preserve">, </w:t>
+      </w:r>
+      <w:r>
+        <w:rPr>
+          <w:rFonts w:ascii="Arial" w:hAnsi="Arial" w:cs="Arial"/>
+          <w:sz w:val="20"/>
+          <w:szCs w:val="20"/>
+        </w:rPr>
+        <w:t>as they seem to depend</w:t>
+      </w:r>
+      <w:r>
+        <w:rPr>
+          <w:rFonts w:ascii="Arial" w:hAnsi="Arial" w:cs="Arial"/>
+          <w:sz w:val="20"/>
+          <w:szCs w:val="20"/>
+        </w:rPr>
+        <w:t xml:space="preserve"> on the patients’ age</w:t>
+      </w:r>
+      <w:r>
+        <w:rPr>
+          <w:rFonts w:ascii="Arial" w:hAnsi="Arial" w:cs="Arial"/>
+          <w:sz w:val="20"/>
+          <w:szCs w:val="20"/>
+        </w:rPr>
+        <w:t>.</w:t>
+      </w:r>
+    </w:p>
+    <w:p>
+      <w:pPr>
+        <w:jc w:val="center"/>
         <w:rPr>
           <w:rFonts w:ascii="Arial" w:hAnsi="Arial" w:cs="Arial"/>
           <w:sz w:val="20"/>
@@ -3804,13 +3949,13 @@
         <mc:AlternateContent>
           <mc:Choice Requires="wps">
             <w:drawing>
-              <wp:anchor distT="0" distB="0" distL="114300" distR="114300" simplePos="0" relativeHeight="251673600" behindDoc="0" locked="0" layoutInCell="1" allowOverlap="1" wp14:anchorId="74460961" wp14:editId="7A1B0E65">
+              <wp:anchor distT="0" distB="0" distL="114300" distR="114300" simplePos="0" relativeHeight="251673600" behindDoc="0" locked="0" layoutInCell="1" allowOverlap="1" wp14:anchorId="74460961" wp14:editId="5CD97013">
                 <wp:simplePos x="0" y="0"/>
                 <wp:positionH relativeFrom="column">
-                  <wp:posOffset>633095</wp:posOffset>
+                  <wp:posOffset>819951</wp:posOffset>
                 </wp:positionH>
                 <wp:positionV relativeFrom="paragraph">
-                  <wp:posOffset>3113405</wp:posOffset>
+                  <wp:posOffset>2450714</wp:posOffset>
                 </wp:positionV>
                 <wp:extent cx="4503420" cy="635"/>
                 <wp:effectExtent l="0" t="0" r="5080" b="12065"/>
@@ -3890,7 +4035,7 @@
           </mc:Choice>
           <mc:Fallback>
             <w:pict>
-              <v:shape w14:anchorId="74460961" id="_x0000_s1028" type="#_x0000_t202" style="position:absolute;left:0;text-align:left;margin-left:49.85pt;margin-top:245.15pt;width:354.6pt;height:.05pt;z-index:251673600;visibility:visible;mso-wrap-style:square;mso-wrap-distance-left:9pt;mso-wrap-distance-top:0;mso-wrap-distance-right:9pt;mso-wrap-distance-bottom:0;mso-position-horizontal:absolute;mso-position-horizontal-relative:text;mso-position-vertical:absolute;mso-position-vertical-relative:text;v-text-anchor:top" o:gfxdata="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" stroked="f">
+              <v:shape w14:anchorId="74460961" id="_x0000_s1028" type="#_x0000_t202" style="position:absolute;left:0;text-align:left;margin-left:64.55pt;margin-top:192.95pt;width:354.6pt;height:.05pt;z-index:251673600;visibility:visible;mso-wrap-style:square;mso-wrap-distance-left:9pt;mso-wrap-distance-top:0;mso-wrap-distance-right:9pt;mso-wrap-distance-bottom:0;mso-position-horizontal:absolute;mso-position-horizontal-relative:text;mso-position-vertical:absolute;mso-position-vertical-relative:text;v-text-anchor:top" o:gfxdata="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" stroked="f">
                 <v:textbox style="mso-fit-shape-to-text:t" inset="0,0,0,0">
                   <w:txbxContent>
                     <w:p>
@@ -3945,18 +4090,10 @@
           <w:szCs w:val="20"/>
         </w:rPr>
         <w:drawing>
-          <wp:anchor distT="0" distB="0" distL="114300" distR="114300" simplePos="0" relativeHeight="251664384" behindDoc="0" locked="0" layoutInCell="1" allowOverlap="1" wp14:anchorId="1C3EF36F" wp14:editId="43609D38">
-            <wp:simplePos x="0" y="0"/>
-            <wp:positionH relativeFrom="margin">
-              <wp:posOffset>633095</wp:posOffset>
-            </wp:positionH>
-            <wp:positionV relativeFrom="margin">
-              <wp:posOffset>4690999</wp:posOffset>
-            </wp:positionV>
-            <wp:extent cx="4503420" cy="2661920"/>
-            <wp:effectExtent l="0" t="0" r="5080" b="5080"/>
-            <wp:wrapSquare wrapText="bothSides"/>
-            <wp:docPr id="1581414083" name="Picture 1"/>
+          <wp:inline distT="0" distB="0" distL="0" distR="0" wp14:anchorId="69A69B7F" wp14:editId="3165FBC4">
+            <wp:extent cx="3764942" cy="2397352"/>
+            <wp:effectExtent l="0" t="0" r="6985" b="3175"/>
+            <wp:docPr id="2033443699" name="Picture 16"/>
             <wp:cNvGraphicFramePr>
               <a:graphicFrameLocks xmlns:a="http://schemas.openxmlformats.org/drawingml/2006/main" noChangeAspect="1"/>
             </wp:cNvGraphicFramePr>
@@ -3964,8 +4101,10 @@
               <a:graphicData uri="http://schemas.openxmlformats.org/drawingml/2006/picture">
                 <pic:pic xmlns:pic="http://schemas.openxmlformats.org/drawingml/2006/picture">
                   <pic:nvPicPr>
-                    <pic:cNvPr id="1581414083" name=""/>
-                    <pic:cNvPicPr/>
+                    <pic:cNvPr id="0" name="Picture 5"/>
+                    <pic:cNvPicPr>
+                      <a:picLocks noChangeAspect="1" noChangeArrowheads="1"/>
+                    </pic:cNvPicPr>
                   </pic:nvPicPr>
                   <pic:blipFill>
                     <a:blip r:embed="rId12">
@@ -3975,105 +4114,33 @@
                         </a:ext>
                       </a:extLst>
                     </a:blip>
+                    <a:srcRect/>
                     <a:stretch>
                       <a:fillRect/>
                     </a:stretch>
                   </pic:blipFill>
-                  <pic:spPr>
+                  <pic:spPr bwMode="auto">
                     <a:xfrm>
                       <a:off x="0" y="0"/>
-                      <a:ext cx="4503420" cy="2661920"/>
+                      <a:ext cx="3782784" cy="2408713"/>
                     </a:xfrm>
                     <a:prstGeom prst="rect">
                       <a:avLst/>
                     </a:prstGeom>
+                    <a:noFill/>
+                    <a:ln>
+                      <a:noFill/>
+                    </a:ln>
                   </pic:spPr>
                 </pic:pic>
               </a:graphicData>
             </a:graphic>
-          </wp:anchor>
+          </wp:inline>
         </w:drawing>
       </w:r>
-      <w:r>
-        <w:rPr>
-          <w:rFonts w:ascii="Arial" w:hAnsi="Arial" w:cs="Arial"/>
-          <w:sz w:val="20"/>
-          <w:szCs w:val="20"/>
-        </w:rPr>
-        <w:tab/>
-        <w:t xml:space="preserve">The missing values in Education Level </w:t>
-      </w:r>
-      <w:r>
-        <w:rPr>
-          <w:rFonts w:ascii="Arial" w:hAnsi="Arial" w:cs="Arial"/>
-          <w:sz w:val="20"/>
-          <w:szCs w:val="20"/>
-        </w:rPr>
-        <w:t>were</w:t>
-      </w:r>
-      <w:r>
-        <w:rPr>
-          <w:rFonts w:ascii="Arial" w:hAnsi="Arial" w:cs="Arial"/>
-          <w:sz w:val="20"/>
-          <w:szCs w:val="20"/>
-        </w:rPr>
-        <w:t xml:space="preserve"> considered </w:t>
-      </w:r>
-      <w:r>
-        <w:rPr>
-          <w:rFonts w:ascii="Arial" w:hAnsi="Arial" w:cs="Arial"/>
-          <w:b/>
-          <w:bCs/>
-          <w:sz w:val="20"/>
-          <w:szCs w:val="20"/>
-        </w:rPr>
-        <w:t>Missing At Random</w:t>
-      </w:r>
-      <w:r>
-        <w:rPr>
-          <w:rFonts w:ascii="Arial" w:hAnsi="Arial" w:cs="Arial"/>
-          <w:sz w:val="20"/>
-          <w:szCs w:val="20"/>
-        </w:rPr>
-        <w:t xml:space="preserve">, </w:t>
-      </w:r>
-      <w:r>
-        <w:rPr>
-          <w:rFonts w:ascii="Arial" w:hAnsi="Arial" w:cs="Arial"/>
-          <w:sz w:val="20"/>
-          <w:szCs w:val="20"/>
-        </w:rPr>
-        <w:t>as they seem to depend</w:t>
-      </w:r>
-      <w:r>
-        <w:rPr>
-          <w:rFonts w:ascii="Arial" w:hAnsi="Arial" w:cs="Arial"/>
-          <w:sz w:val="20"/>
-          <w:szCs w:val="20"/>
-        </w:rPr>
-        <w:t xml:space="preserve"> on the patients’ age</w:t>
-      </w:r>
-      <w:r>
-        <w:rPr>
-          <w:rFonts w:ascii="Arial" w:hAnsi="Arial" w:cs="Arial"/>
-          <w:sz w:val="20"/>
-          <w:szCs w:val="20"/>
-        </w:rPr>
-        <w:t>.</w:t>
-      </w:r>
-    </w:p>
-    <w:p>
-      <w:pPr>
-        <w:rPr>
-          <w:rFonts w:ascii="Arial" w:hAnsi="Arial" w:cs="Arial"/>
-          <w:sz w:val="20"/>
-          <w:szCs w:val="20"/>
-        </w:rPr>
-      </w:pPr>
-    </w:p>
-    <w:p>
-      <w:pPr>
-        <w:ind w:firstLine="720"/>
+    </w:p>
+    <w:p>
+      <w:pPr>
         <w:rPr>
           <w:rFonts w:ascii="Arial" w:hAnsi="Arial" w:cs="Arial"/>
           <w:sz w:val="20"/>
@@ -4123,7 +4190,16 @@
           <w:sz w:val="20"/>
           <w:szCs w:val="20"/>
         </w:rPr>
-        <w:t xml:space="preserve">to be </w:t>
+        <w:t xml:space="preserve">to </w:t>
+      </w:r>
+      <w:r>
+        <w:rPr>
+          <w:rFonts w:ascii="Arial" w:hAnsi="Arial" w:cs="Arial"/>
+          <w:sz w:val="20"/>
+          <w:szCs w:val="20"/>
+        </w:rPr>
+        <w:lastRenderedPageBreak/>
+        <w:t xml:space="preserve">be </w:t>
       </w:r>
       <w:r>
         <w:rPr>
@@ -4190,7 +4266,6 @@
           <w:b/>
           <w:bCs/>
         </w:rPr>
-        <w:lastRenderedPageBreak/>
         <w:t>Approximate Annual Income</w:t>
       </w:r>
       <w:r>
@@ -4880,6 +4955,7 @@
         <w:rPr>
           <w:noProof/>
         </w:rPr>
+        <w:lastRenderedPageBreak/>
         <mc:AlternateContent>
           <mc:Choice Requires="wps">
             <w:drawing>
@@ -5182,7 +5258,6 @@
           <w:sz w:val="20"/>
           <w:szCs w:val="20"/>
         </w:rPr>
-        <w:lastRenderedPageBreak/>
         <w:t xml:space="preserve">For example, patient </w:t>
       </w:r>
       <w:r>
@@ -5800,13 +5875,15 @@
           <w:color w:val="EE0000"/>
           <w:sz w:val="32"/>
           <w:szCs w:val="32"/>
-        </w:rPr>
-      </w:pPr>
-      <w:r>
-        <w:rPr>
-          <w:rFonts w:ascii="Arial" w:hAnsi="Arial" w:cs="Arial"/>
-          <w:sz w:val="20"/>
-          <w:szCs w:val="20"/>
+          <w:lang w:val="pt-PT"/>
+        </w:rPr>
+      </w:pPr>
+      <w:r>
+        <w:rPr>
+          <w:rFonts w:ascii="Arial" w:hAnsi="Arial" w:cs="Arial"/>
+          <w:sz w:val="20"/>
+          <w:szCs w:val="20"/>
+          <w:lang w:val="pt-PT"/>
         </w:rPr>
         <w:t xml:space="preserve">Insurance Coverage </w:t>
       </w:r>
@@ -5815,64 +5892,10 @@
           <w:rFonts w:ascii="Arial" w:hAnsi="Arial" w:cs="Arial"/>
           <w:sz w:val="20"/>
           <w:szCs w:val="20"/>
-        </w:rPr>
-        <w:t xml:space="preserve">(é </w:t>
-      </w:r>
-      <w:proofErr w:type="spellStart"/>
-      <w:r>
-        <w:rPr>
-          <w:rFonts w:ascii="Arial" w:hAnsi="Arial" w:cs="Arial"/>
-          <w:sz w:val="20"/>
-          <w:szCs w:val="20"/>
-        </w:rPr>
-        <w:t>kinda</w:t>
-      </w:r>
-      <w:proofErr w:type="spellEnd"/>
-      <w:r>
-        <w:rPr>
-          <w:rFonts w:ascii="Arial" w:hAnsi="Arial" w:cs="Arial"/>
-          <w:sz w:val="20"/>
-          <w:szCs w:val="20"/>
-        </w:rPr>
-        <w:t xml:space="preserve"> </w:t>
-      </w:r>
-      <w:proofErr w:type="spellStart"/>
-      <w:r>
-        <w:rPr>
-          <w:rFonts w:ascii="Arial" w:hAnsi="Arial" w:cs="Arial"/>
-          <w:sz w:val="20"/>
-          <w:szCs w:val="20"/>
-        </w:rPr>
-        <w:t>parecida</w:t>
-      </w:r>
-      <w:proofErr w:type="spellEnd"/>
-      <w:r>
-        <w:rPr>
-          <w:rFonts w:ascii="Arial" w:hAnsi="Arial" w:cs="Arial"/>
-          <w:sz w:val="20"/>
-          <w:szCs w:val="20"/>
-        </w:rPr>
-        <w:t xml:space="preserve"> com normal </w:t>
-      </w:r>
-      <w:proofErr w:type="spellStart"/>
-      <w:r>
-        <w:rPr>
-          <w:rFonts w:ascii="Arial" w:hAnsi="Arial" w:cs="Arial"/>
-          <w:sz w:val="20"/>
-          <w:szCs w:val="20"/>
-        </w:rPr>
-        <w:t>tbh</w:t>
-      </w:r>
-      <w:proofErr w:type="spellEnd"/>
-      <w:r>
-        <w:rPr>
-          <w:rFonts w:ascii="Arial" w:hAnsi="Arial" w:cs="Arial"/>
-          <w:sz w:val="20"/>
-          <w:szCs w:val="20"/>
-        </w:rPr>
-        <w:t>)</w:t>
-      </w:r>
-      <w:proofErr w:type="spellStart"/>
+          <w:lang w:val="pt-PT"/>
+        </w:rPr>
+        <w:t>(é kinda parecida com normal tbh)</w:t>
+      </w:r>
       <w:r>
         <w:rPr>
           <w:rFonts w:ascii="Arial" w:hAnsi="Arial" w:cs="Arial"/>
@@ -5881,164 +5904,9 @@
           <w:color w:val="EE0000"/>
           <w:sz w:val="32"/>
           <w:szCs w:val="32"/>
-        </w:rPr>
-        <w:t>falta</w:t>
-      </w:r>
-      <w:proofErr w:type="spellEnd"/>
-      <w:r>
-        <w:rPr>
-          <w:rFonts w:ascii="Arial" w:hAnsi="Arial" w:cs="Arial"/>
-          <w:b/>
-          <w:bCs/>
-          <w:color w:val="EE0000"/>
-          <w:sz w:val="32"/>
-          <w:szCs w:val="32"/>
-        </w:rPr>
-        <w:t xml:space="preserve"> </w:t>
-      </w:r>
-      <w:proofErr w:type="spellStart"/>
-      <w:r>
-        <w:rPr>
-          <w:rFonts w:ascii="Arial" w:hAnsi="Arial" w:cs="Arial"/>
-          <w:b/>
-          <w:bCs/>
-          <w:color w:val="EE0000"/>
-          <w:sz w:val="32"/>
-          <w:szCs w:val="32"/>
-        </w:rPr>
-        <w:t>este</w:t>
-      </w:r>
-      <w:proofErr w:type="spellEnd"/>
-      <w:r>
-        <w:rPr>
-          <w:rFonts w:ascii="Arial" w:hAnsi="Arial" w:cs="Arial"/>
-          <w:b/>
-          <w:bCs/>
-          <w:color w:val="EE0000"/>
-          <w:sz w:val="32"/>
-          <w:szCs w:val="32"/>
-        </w:rPr>
-        <w:t xml:space="preserve"> e </w:t>
-      </w:r>
-      <w:proofErr w:type="spellStart"/>
-      <w:r>
-        <w:rPr>
-          <w:rFonts w:ascii="Arial" w:hAnsi="Arial" w:cs="Arial"/>
-          <w:b/>
-          <w:bCs/>
-          <w:color w:val="EE0000"/>
-          <w:sz w:val="32"/>
-          <w:szCs w:val="32"/>
-        </w:rPr>
-        <w:t>escolher</w:t>
-      </w:r>
-      <w:proofErr w:type="spellEnd"/>
-      <w:r>
-        <w:rPr>
-          <w:rFonts w:ascii="Arial" w:hAnsi="Arial" w:cs="Arial"/>
-          <w:b/>
-          <w:bCs/>
-          <w:color w:val="EE0000"/>
-          <w:sz w:val="32"/>
-          <w:szCs w:val="32"/>
-        </w:rPr>
-        <w:t xml:space="preserve"> </w:t>
-      </w:r>
-      <w:proofErr w:type="spellStart"/>
-      <w:r>
-        <w:rPr>
-          <w:rFonts w:ascii="Arial" w:hAnsi="Arial" w:cs="Arial"/>
-          <w:b/>
-          <w:bCs/>
-          <w:color w:val="EE0000"/>
-          <w:sz w:val="32"/>
-          <w:szCs w:val="32"/>
-        </w:rPr>
-        <w:t>em</w:t>
-      </w:r>
-      <w:proofErr w:type="spellEnd"/>
-      <w:r>
-        <w:rPr>
-          <w:rFonts w:ascii="Arial" w:hAnsi="Arial" w:cs="Arial"/>
-          <w:b/>
-          <w:bCs/>
-          <w:color w:val="EE0000"/>
-          <w:sz w:val="32"/>
-          <w:szCs w:val="32"/>
-        </w:rPr>
-        <w:t xml:space="preserve"> qual é </w:t>
-      </w:r>
-      <w:proofErr w:type="spellStart"/>
-      <w:r>
-        <w:rPr>
-          <w:rFonts w:ascii="Arial" w:hAnsi="Arial" w:cs="Arial"/>
-          <w:b/>
-          <w:bCs/>
-          <w:color w:val="EE0000"/>
-          <w:sz w:val="32"/>
-          <w:szCs w:val="32"/>
-        </w:rPr>
-        <w:t>que</w:t>
-      </w:r>
-      <w:proofErr w:type="spellEnd"/>
-      <w:r>
-        <w:rPr>
-          <w:rFonts w:ascii="Arial" w:hAnsi="Arial" w:cs="Arial"/>
-          <w:b/>
-          <w:bCs/>
-          <w:color w:val="EE0000"/>
-          <w:sz w:val="32"/>
-          <w:szCs w:val="32"/>
-        </w:rPr>
-        <w:t xml:space="preserve"> </w:t>
-      </w:r>
-      <w:proofErr w:type="spellStart"/>
-      <w:r>
-        <w:rPr>
-          <w:rFonts w:ascii="Arial" w:hAnsi="Arial" w:cs="Arial"/>
-          <w:b/>
-          <w:bCs/>
-          <w:color w:val="EE0000"/>
-          <w:sz w:val="32"/>
-          <w:szCs w:val="32"/>
-        </w:rPr>
-        <w:t>vai</w:t>
-      </w:r>
-      <w:proofErr w:type="spellEnd"/>
-      <w:r>
-        <w:rPr>
-          <w:rFonts w:ascii="Arial" w:hAnsi="Arial" w:cs="Arial"/>
-          <w:b/>
-          <w:bCs/>
-          <w:color w:val="EE0000"/>
-          <w:sz w:val="32"/>
-          <w:szCs w:val="32"/>
-        </w:rPr>
-        <w:t xml:space="preserve"> </w:t>
-      </w:r>
-      <w:proofErr w:type="spellStart"/>
-      <w:r>
-        <w:rPr>
-          <w:rFonts w:ascii="Arial" w:hAnsi="Arial" w:cs="Arial"/>
-          <w:b/>
-          <w:bCs/>
-          <w:color w:val="EE0000"/>
-          <w:sz w:val="32"/>
-          <w:szCs w:val="32"/>
-        </w:rPr>
-        <w:t>ficar</w:t>
-      </w:r>
-      <w:proofErr w:type="spellEnd"/>
-      <w:r>
-        <w:rPr>
-          <w:rFonts w:ascii="Arial" w:hAnsi="Arial" w:cs="Arial"/>
-          <w:b/>
-          <w:bCs/>
-          <w:color w:val="EE0000"/>
-          <w:sz w:val="32"/>
-          <w:szCs w:val="32"/>
-        </w:rPr>
-        <w:t xml:space="preserve"> o consultation duration</w:t>
+          <w:lang w:val="pt-PT"/>
+        </w:rPr>
+        <w:t>falta este e escolher em qual é que vai ficar o consultation duration</w:t>
       </w:r>
     </w:p>
     <w:p>
@@ -6121,7 +5989,16 @@
           <w:sz w:val="20"/>
           <w:szCs w:val="20"/>
         </w:rPr>
-        <w:t xml:space="preserve"> This technique considers to be outliers any value below </w:t>
+        <w:t xml:space="preserve"> This technique </w:t>
+      </w:r>
+      <w:r>
+        <w:rPr>
+          <w:rFonts w:ascii="Arial" w:hAnsi="Arial" w:cs="Arial"/>
+          <w:sz w:val="20"/>
+          <w:szCs w:val="20"/>
+        </w:rPr>
+        <w:lastRenderedPageBreak/>
+        <w:t xml:space="preserve">considers to be outliers any value below </w:t>
       </w:r>
       <w:r>
         <w:rPr>
@@ -6796,7 +6673,6 @@
           <w:b/>
           <w:bCs/>
         </w:rPr>
-        <w:lastRenderedPageBreak/>
         <w:t>Consultation Duration</w:t>
       </w:r>
     </w:p>
@@ -7328,6 +7204,7 @@
           <w:b/>
           <w:bCs/>
         </w:rPr>
+        <w:lastRenderedPageBreak/>
         <w:t>Satisfaction Level</w:t>
       </w:r>
     </w:p>
@@ -7418,7 +7295,7 @@
           <w:noProof/>
         </w:rPr>
         <w:drawing>
-          <wp:anchor distT="0" distB="0" distL="114300" distR="114300" simplePos="0" relativeHeight="251682816" behindDoc="0" locked="0" layoutInCell="1" allowOverlap="1" wp14:anchorId="2508838A" wp14:editId="73668C9B">
+          <wp:anchor distT="0" distB="0" distL="114300" distR="114300" simplePos="0" relativeHeight="251682816" behindDoc="0" locked="0" layoutInCell="1" allowOverlap="1" wp14:anchorId="2508838A" wp14:editId="43C488F8">
             <wp:simplePos x="0" y="0"/>
             <wp:positionH relativeFrom="margin">
               <wp:posOffset>241300</wp:posOffset>
@@ -8315,7 +8192,6 @@
           <w:b/>
           <w:bCs/>
         </w:rPr>
-        <w:lastRenderedPageBreak/>
         <w:t>Insurance Cover</w:t>
       </w:r>
       <w:r>
@@ -9368,7 +9244,6 @@
           <w:szCs w:val="20"/>
           <w:u w:val="single"/>
         </w:rPr>
-        <w:lastRenderedPageBreak/>
         <w:t>Insurance Coverage Percentage</w:t>
       </w:r>
       <w:r>
@@ -9546,15 +9421,79 @@
           <w:sz w:val="20"/>
           <w:szCs w:val="20"/>
         </w:rPr>
-        <w:t>the process of discretization applied to the column Age. This new feature is composed of five-year intervals, from 0 to 130, to determine in which bin each patient belongs.</w:t>
-      </w:r>
-      <w:r>
-        <w:rPr>
-          <w:rFonts w:ascii="Arial" w:hAnsi="Arial" w:cs="Arial"/>
-          <w:sz w:val="20"/>
-          <w:szCs w:val="20"/>
-        </w:rPr>
-        <w:t xml:space="preserve"> This step might be important for patient segmentation (if distinct behaviour is detected).</w:t>
+        <w:t xml:space="preserve">the process of discretization applied to the column Age. This new feature is composed of </w:t>
+      </w:r>
+      <w:r>
+        <w:rPr>
+          <w:rFonts w:ascii="Arial" w:hAnsi="Arial" w:cs="Arial"/>
+          <w:sz w:val="20"/>
+          <w:szCs w:val="20"/>
+        </w:rPr>
+        <w:t>3 intervals</w:t>
+      </w:r>
+      <w:r>
+        <w:rPr>
+          <w:rFonts w:ascii="Arial" w:hAnsi="Arial" w:cs="Arial"/>
+          <w:sz w:val="20"/>
+          <w:szCs w:val="20"/>
+        </w:rPr>
+        <w:t xml:space="preserve">, from </w:t>
+      </w:r>
+      <w:r>
+        <w:rPr>
+          <w:rFonts w:ascii="Arial" w:hAnsi="Arial" w:cs="Arial"/>
+          <w:sz w:val="20"/>
+          <w:szCs w:val="20"/>
+        </w:rPr>
+        <w:t>0 to 17 – representing Children, from 18 to 64 – representing Adults and from 65 to 127 – representing Elders.</w:t>
+      </w:r>
+    </w:p>
+    <w:p>
+      <w:pPr>
+        <w:jc w:val="both"/>
+        <w:rPr>
+          <w:rFonts w:ascii="Arial" w:hAnsi="Arial" w:cs="Arial"/>
+          <w:sz w:val="20"/>
+          <w:szCs w:val="20"/>
+        </w:rPr>
+      </w:pPr>
+      <w:r>
+        <w:rPr>
+          <w:rFonts w:ascii="Arial" w:hAnsi="Arial" w:cs="Arial"/>
+          <w:b/>
+          <w:bCs/>
+          <w:sz w:val="20"/>
+          <w:szCs w:val="20"/>
+          <w:u w:val="single"/>
+        </w:rPr>
+        <w:t>Age</w:t>
+      </w:r>
+      <w:r>
+        <w:rPr>
+          <w:rFonts w:ascii="Arial" w:hAnsi="Arial" w:cs="Arial"/>
+          <w:b/>
+          <w:bCs/>
+          <w:sz w:val="20"/>
+          <w:szCs w:val="20"/>
+          <w:u w:val="single"/>
+        </w:rPr>
+        <w:t xml:space="preserve"> Group</w:t>
+      </w:r>
+      <w:r>
+        <w:rPr>
+          <w:rFonts w:ascii="Arial" w:hAnsi="Arial" w:cs="Arial"/>
+          <w:sz w:val="20"/>
+          <w:szCs w:val="20"/>
+        </w:rPr>
+        <w:t xml:space="preserve"> – </w:t>
+      </w:r>
+      <w:r>
+        <w:rPr>
+          <w:rFonts w:ascii="Arial" w:hAnsi="Arial" w:cs="Arial"/>
+          <w:sz w:val="20"/>
+          <w:szCs w:val="20"/>
+        </w:rPr>
+        <w:t>This column consists of the three categories associated with each Age Range – Children, Adults and Elders.</w:t>
       </w:r>
     </w:p>
     <w:p>
@@ -9743,6 +9682,7 @@
           <w:bCs/>
           <w:lang w:val="en-US"/>
         </w:rPr>
+        <w:lastRenderedPageBreak/>
         <w:t>Analytical Base Table (ABT) Construction</w:t>
       </w:r>
     </w:p>
@@ -10805,7 +10745,6 @@
           <w:szCs w:val="20"/>
           <w:lang w:val="en-US"/>
         </w:rPr>
-        <w:lastRenderedPageBreak/>
         <w:t>For a better understanding of what each column represents</w:t>
       </w:r>
       <w:r>
@@ -11401,33 +11340,24 @@
         </w:rPr>
         <w:t xml:space="preserve"> </w:t>
       </w:r>
-      <w:r>
+    </w:p>
+    <w:p>
+      <w:pPr>
         <w:rPr>
           <w:rFonts w:ascii="Garamond" w:hAnsi="Garamond"/>
-          <w:color w:val="EE0000"/>
-          <w:sz w:val="27"/>
-          <w:szCs w:val="27"/>
-          <w:lang w:val="en-US"/>
-        </w:rPr>
-        <w:t>(TEM QUE SE ESCREVER INSIGHTS)</w:t>
-      </w:r>
-    </w:p>
-    <w:p>
-      <w:pPr>
+          <w:b/>
+          <w:bCs/>
+          <w:lang w:val="en-US"/>
+        </w:rPr>
+      </w:pPr>
+      <w:r>
         <w:rPr>
           <w:rFonts w:ascii="Garamond" w:hAnsi="Garamond"/>
           <w:b/>
           <w:bCs/>
           <w:lang w:val="en-US"/>
         </w:rPr>
-      </w:pPr>
-      <w:r>
-        <w:rPr>
-          <w:rFonts w:ascii="Garamond" w:hAnsi="Garamond"/>
-          <w:b/>
-          <w:bCs/>
-          <w:lang w:val="en-US"/>
-        </w:rPr>
+        <w:lastRenderedPageBreak/>
         <w:t>Patient Demographics - Distributions</w:t>
       </w:r>
     </w:p>
@@ -12154,7 +12084,6 @@
         </w:rPr>
         <w:t xml:space="preserve">, so we might be facing a case of people who chose the </w:t>
       </w:r>
-      <w:proofErr w:type="gramStart"/>
       <w:r>
         <w:rPr>
           <w:rFonts w:ascii="Arial" w:hAnsi="Arial" w:cs="Arial"/>
@@ -12166,7 +12095,6 @@
         </w:rPr>
         <w:t>Other</w:t>
       </w:r>
-      <w:proofErr w:type="gramEnd"/>
       <w:r>
         <w:rPr>
           <w:rFonts w:ascii="Arial" w:hAnsi="Arial" w:cs="Arial"/>
@@ -12268,394 +12196,394 @@
           <w:szCs w:val="20"/>
           <w:lang w:val="en-US"/>
         </w:rPr>
+        <w:t>Th</w:t>
+      </w:r>
+      <w:r>
+        <w:rPr>
+          <w:rFonts w:ascii="Arial" w:hAnsi="Arial" w:cs="Arial"/>
+          <w:sz w:val="20"/>
+          <w:szCs w:val="20"/>
+          <w:lang w:val="en-US"/>
+        </w:rPr>
+        <w:t>e</w:t>
+      </w:r>
+      <w:r>
+        <w:rPr>
+          <w:rFonts w:ascii="Arial" w:hAnsi="Arial" w:cs="Arial"/>
+          <w:sz w:val="20"/>
+          <w:szCs w:val="20"/>
+          <w:lang w:val="en-US"/>
+        </w:rPr>
+        <w:t xml:space="preserve"> figure</w:t>
+      </w:r>
+      <w:r>
+        <w:rPr>
+          <w:rFonts w:ascii="Arial" w:hAnsi="Arial" w:cs="Arial"/>
+          <w:sz w:val="20"/>
+          <w:szCs w:val="20"/>
+          <w:lang w:val="en-US"/>
+        </w:rPr>
+        <w:t xml:space="preserve"> above on the left</w:t>
+      </w:r>
+      <w:r>
+        <w:rPr>
+          <w:rFonts w:ascii="Arial" w:hAnsi="Arial" w:cs="Arial"/>
+          <w:sz w:val="20"/>
+          <w:szCs w:val="20"/>
+          <w:lang w:val="en-US"/>
+        </w:rPr>
+        <w:t xml:space="preserve"> </w:t>
+      </w:r>
+      <w:r>
+        <w:rPr>
+          <w:rFonts w:ascii="Arial" w:hAnsi="Arial" w:cs="Arial"/>
+          <w:sz w:val="20"/>
+          <w:szCs w:val="20"/>
+          <w:lang w:val="en-US"/>
+        </w:rPr>
+        <w:t xml:space="preserve">shows the distribution of </w:t>
+      </w:r>
+      <w:r>
+        <w:rPr>
+          <w:rFonts w:ascii="Arial" w:hAnsi="Arial" w:cs="Arial"/>
+          <w:sz w:val="20"/>
+          <w:szCs w:val="20"/>
+          <w:lang w:val="en-US"/>
+        </w:rPr>
+        <w:t>patients by the</w:t>
+      </w:r>
+      <w:r>
+        <w:rPr>
+          <w:rFonts w:ascii="Arial" w:hAnsi="Arial" w:cs="Arial"/>
+          <w:sz w:val="20"/>
+          <w:szCs w:val="20"/>
+          <w:lang w:val="en-US"/>
+        </w:rPr>
+        <w:t xml:space="preserve"> </w:t>
+      </w:r>
+      <w:r>
+        <w:rPr>
+          <w:rFonts w:ascii="Arial" w:hAnsi="Arial" w:cs="Arial"/>
+          <w:b/>
+          <w:bCs/>
+          <w:sz w:val="20"/>
+          <w:szCs w:val="20"/>
+          <w:lang w:val="en-US"/>
+        </w:rPr>
+        <w:t>Approximate A</w:t>
+      </w:r>
+      <w:r>
+        <w:rPr>
+          <w:rFonts w:ascii="Arial" w:hAnsi="Arial" w:cs="Arial"/>
+          <w:b/>
+          <w:bCs/>
+          <w:sz w:val="20"/>
+          <w:szCs w:val="20"/>
+          <w:lang w:val="en-US"/>
+        </w:rPr>
+        <w:t xml:space="preserve">nnual </w:t>
+      </w:r>
+      <w:r>
+        <w:rPr>
+          <w:rFonts w:ascii="Arial" w:hAnsi="Arial" w:cs="Arial"/>
+          <w:b/>
+          <w:bCs/>
+          <w:sz w:val="20"/>
+          <w:szCs w:val="20"/>
+          <w:lang w:val="en-US"/>
+        </w:rPr>
+        <w:t>I</w:t>
+      </w:r>
+      <w:r>
+        <w:rPr>
+          <w:rFonts w:ascii="Arial" w:hAnsi="Arial" w:cs="Arial"/>
+          <w:b/>
+          <w:bCs/>
+          <w:sz w:val="20"/>
+          <w:szCs w:val="20"/>
+          <w:lang w:val="en-US"/>
+        </w:rPr>
+        <w:t>ncome</w:t>
+      </w:r>
+      <w:r>
+        <w:rPr>
+          <w:rFonts w:ascii="Arial" w:hAnsi="Arial" w:cs="Arial"/>
+          <w:b/>
+          <w:bCs/>
+          <w:sz w:val="20"/>
+          <w:szCs w:val="20"/>
+          <w:lang w:val="en-US"/>
+        </w:rPr>
+        <w:t xml:space="preserve">. </w:t>
+      </w:r>
+      <w:r>
+        <w:rPr>
+          <w:rFonts w:ascii="Arial" w:hAnsi="Arial" w:cs="Arial"/>
+          <w:sz w:val="20"/>
+          <w:szCs w:val="20"/>
+          <w:lang w:val="en-US"/>
+        </w:rPr>
+        <w:t>Almost every</w:t>
+      </w:r>
+      <w:r>
+        <w:rPr>
+          <w:rFonts w:ascii="Arial" w:hAnsi="Arial" w:cs="Arial"/>
+          <w:sz w:val="20"/>
+          <w:szCs w:val="20"/>
+          <w:lang w:val="en-US"/>
+        </w:rPr>
+        <w:t xml:space="preserve"> </w:t>
+      </w:r>
+      <w:r>
+        <w:rPr>
+          <w:rFonts w:ascii="Arial" w:hAnsi="Arial" w:cs="Arial"/>
+          <w:sz w:val="20"/>
+          <w:szCs w:val="20"/>
+          <w:lang w:val="en-US"/>
+        </w:rPr>
+        <w:t>patient</w:t>
+      </w:r>
+      <w:r>
+        <w:rPr>
+          <w:rFonts w:ascii="Arial" w:hAnsi="Arial" w:cs="Arial"/>
+          <w:sz w:val="20"/>
+          <w:szCs w:val="20"/>
+          <w:lang w:val="en-US"/>
+        </w:rPr>
+        <w:t xml:space="preserve"> registered </w:t>
+      </w:r>
+      <w:r>
+        <w:rPr>
+          <w:rFonts w:ascii="Arial" w:hAnsi="Arial" w:cs="Arial"/>
+          <w:sz w:val="20"/>
+          <w:szCs w:val="20"/>
+          <w:lang w:val="en-US"/>
+        </w:rPr>
+        <w:t>an annual income</w:t>
+      </w:r>
+      <w:r>
+        <w:rPr>
+          <w:rFonts w:ascii="Arial" w:hAnsi="Arial" w:cs="Arial"/>
+          <w:sz w:val="20"/>
+          <w:szCs w:val="20"/>
+          <w:lang w:val="en-US"/>
+        </w:rPr>
+        <w:t xml:space="preserve"> between 0 and </w:t>
+      </w:r>
+      <w:r>
+        <w:rPr>
+          <w:rFonts w:ascii="Arial" w:hAnsi="Arial" w:cs="Arial"/>
+          <w:sz w:val="20"/>
+          <w:szCs w:val="20"/>
+          <w:lang w:val="en-US"/>
+        </w:rPr>
+        <w:t>3</w:t>
+      </w:r>
+      <w:r>
+        <w:rPr>
+          <w:rFonts w:ascii="Arial" w:hAnsi="Arial" w:cs="Arial"/>
+          <w:sz w:val="20"/>
+          <w:szCs w:val="20"/>
+          <w:lang w:val="en-US"/>
+        </w:rPr>
+        <w:t>770</w:t>
+      </w:r>
+      <w:r>
+        <w:rPr>
+          <w:rFonts w:ascii="Arial" w:hAnsi="Arial" w:cs="Arial"/>
+          <w:sz w:val="20"/>
+          <w:szCs w:val="20"/>
+          <w:lang w:val="en-US"/>
+        </w:rPr>
+        <w:t xml:space="preserve">7. Two patients </w:t>
+      </w:r>
+      <w:r>
+        <w:rPr>
+          <w:rFonts w:ascii="Arial" w:hAnsi="Arial" w:cs="Arial"/>
+          <w:sz w:val="20"/>
+          <w:szCs w:val="20"/>
+          <w:lang w:val="en-US"/>
+        </w:rPr>
+        <w:t>are out</w:t>
+      </w:r>
+      <w:r>
+        <w:rPr>
+          <w:rFonts w:ascii="Arial" w:hAnsi="Arial" w:cs="Arial"/>
+          <w:sz w:val="20"/>
+          <w:szCs w:val="20"/>
+          <w:lang w:val="en-US"/>
+        </w:rPr>
+        <w:t>side</w:t>
+      </w:r>
+      <w:r>
+        <w:rPr>
+          <w:rFonts w:ascii="Arial" w:hAnsi="Arial" w:cs="Arial"/>
+          <w:sz w:val="20"/>
+          <w:szCs w:val="20"/>
+          <w:lang w:val="en-US"/>
+        </w:rPr>
+        <w:t xml:space="preserve"> of this group. One of them registered </w:t>
+      </w:r>
+      <w:r>
+        <w:rPr>
+          <w:rFonts w:ascii="Arial" w:hAnsi="Arial" w:cs="Arial"/>
+          <w:sz w:val="20"/>
+          <w:szCs w:val="20"/>
+          <w:lang w:val="en-US"/>
+        </w:rPr>
+        <w:t>two</w:t>
+      </w:r>
+      <w:r>
+        <w:rPr>
+          <w:rFonts w:ascii="Arial" w:hAnsi="Arial" w:cs="Arial"/>
+          <w:sz w:val="20"/>
+          <w:szCs w:val="20"/>
+          <w:lang w:val="en-US"/>
+        </w:rPr>
+        <w:t xml:space="preserve"> million, and the other </w:t>
+      </w:r>
+      <w:r>
+        <w:rPr>
+          <w:rFonts w:ascii="Arial" w:hAnsi="Arial" w:cs="Arial"/>
+          <w:sz w:val="20"/>
+          <w:szCs w:val="20"/>
+          <w:lang w:val="en-US"/>
+        </w:rPr>
+        <w:t>ten</w:t>
+      </w:r>
+      <w:r>
+        <w:rPr>
+          <w:rFonts w:ascii="Arial" w:hAnsi="Arial" w:cs="Arial"/>
+          <w:sz w:val="20"/>
+          <w:szCs w:val="20"/>
+          <w:lang w:val="en-US"/>
+        </w:rPr>
+        <w:t xml:space="preserve"> million.</w:t>
+      </w:r>
+    </w:p>
+    <w:p>
+      <w:pPr>
+        <w:jc w:val="both"/>
+        <w:rPr>
+          <w:rFonts w:ascii="Arial" w:hAnsi="Arial" w:cs="Arial"/>
+          <w:sz w:val="20"/>
+          <w:szCs w:val="20"/>
+          <w:lang w:val="en-US"/>
+        </w:rPr>
+      </w:pPr>
+      <w:r>
+        <w:rPr>
+          <w:rFonts w:ascii="Arial" w:hAnsi="Arial" w:cs="Arial"/>
+          <w:sz w:val="20"/>
+          <w:szCs w:val="20"/>
+          <w:lang w:val="en-US"/>
+        </w:rPr>
+        <w:t xml:space="preserve">The </w:t>
+      </w:r>
+      <w:r>
+        <w:rPr>
+          <w:rFonts w:ascii="Arial" w:hAnsi="Arial" w:cs="Arial"/>
+          <w:sz w:val="20"/>
+          <w:szCs w:val="20"/>
+          <w:lang w:val="en-US"/>
+        </w:rPr>
+        <w:t xml:space="preserve">one beside it </w:t>
+      </w:r>
+      <w:r>
+        <w:rPr>
+          <w:rFonts w:ascii="Arial" w:hAnsi="Arial" w:cs="Arial"/>
+          <w:sz w:val="20"/>
+          <w:szCs w:val="20"/>
+          <w:lang w:val="en-US"/>
+        </w:rPr>
+        <w:t xml:space="preserve">is a log transformation of the previous </w:t>
+      </w:r>
+      <w:r>
+        <w:rPr>
+          <w:rFonts w:ascii="Arial" w:hAnsi="Arial" w:cs="Arial"/>
+          <w:sz w:val="20"/>
+          <w:szCs w:val="20"/>
+          <w:lang w:val="en-US"/>
+        </w:rPr>
+        <w:t>graph, in order to reduce the skewness</w:t>
+      </w:r>
+      <w:r>
+        <w:rPr>
+          <w:rFonts w:ascii="Arial" w:hAnsi="Arial" w:cs="Arial"/>
+          <w:sz w:val="20"/>
+          <w:szCs w:val="20"/>
+          <w:lang w:val="en-US"/>
+        </w:rPr>
+        <w:t xml:space="preserve"> and facilitate </w:t>
+      </w:r>
+      <w:r>
+        <w:rPr>
+          <w:rFonts w:ascii="Arial" w:hAnsi="Arial" w:cs="Arial"/>
+          <w:sz w:val="20"/>
+          <w:szCs w:val="20"/>
+          <w:lang w:val="en-US"/>
+        </w:rPr>
+        <w:t>the analysis of the distribution of the graph</w:t>
+      </w:r>
+      <w:r>
+        <w:rPr>
+          <w:rFonts w:ascii="Arial" w:hAnsi="Arial" w:cs="Arial"/>
+          <w:sz w:val="20"/>
+          <w:szCs w:val="20"/>
+          <w:lang w:val="en-US"/>
+        </w:rPr>
+        <w:t>.</w:t>
+      </w:r>
+      <w:r>
+        <w:rPr>
+          <w:rFonts w:ascii="Arial" w:hAnsi="Arial" w:cs="Arial"/>
+          <w:sz w:val="20"/>
+          <w:szCs w:val="20"/>
+          <w:lang w:val="en-US"/>
+        </w:rPr>
+        <w:t xml:space="preserve"> </w:t>
+      </w:r>
+    </w:p>
+    <w:p>
+      <w:pPr>
+        <w:rPr>
+          <w:rFonts w:ascii="Garamond" w:hAnsi="Garamond"/>
+          <w:lang w:val="en-US"/>
+        </w:rPr>
+      </w:pPr>
+      <w:r>
+        <w:rPr>
+          <w:rFonts w:ascii="Garamond" w:hAnsi="Garamond"/>
+          <w:lang w:val="en-US"/>
+        </w:rPr>
+        <w:t>Number of visits per department over time</w:t>
+      </w:r>
+      <w:r>
+        <w:rPr>
+          <w:rFonts w:ascii="Garamond" w:hAnsi="Garamond"/>
+          <w:lang w:val="en-US"/>
+        </w:rPr>
+        <w:t xml:space="preserve"> </w:t>
+      </w:r>
+    </w:p>
+    <w:p>
+      <w:pPr>
+        <w:rPr>
+          <w:rFonts w:ascii="Arial" w:hAnsi="Arial" w:cs="Arial"/>
+          <w:sz w:val="20"/>
+          <w:szCs w:val="20"/>
+          <w:lang w:val="en-US"/>
+        </w:rPr>
+      </w:pPr>
+      <w:r>
+        <w:rPr>
+          <w:rFonts w:ascii="Arial" w:hAnsi="Arial" w:cs="Arial"/>
+          <w:noProof/>
+          <w:sz w:val="20"/>
+          <w:szCs w:val="20"/>
+          <w:lang w:val="en-US"/>
+        </w:rPr>
         <w:lastRenderedPageBreak/>
-        <w:t>Th</w:t>
-      </w:r>
-      <w:r>
-        <w:rPr>
-          <w:rFonts w:ascii="Arial" w:hAnsi="Arial" w:cs="Arial"/>
-          <w:sz w:val="20"/>
-          <w:szCs w:val="20"/>
-          <w:lang w:val="en-US"/>
-        </w:rPr>
-        <w:t>e</w:t>
-      </w:r>
-      <w:r>
-        <w:rPr>
-          <w:rFonts w:ascii="Arial" w:hAnsi="Arial" w:cs="Arial"/>
-          <w:sz w:val="20"/>
-          <w:szCs w:val="20"/>
-          <w:lang w:val="en-US"/>
-        </w:rPr>
-        <w:t xml:space="preserve"> figure</w:t>
-      </w:r>
-      <w:r>
-        <w:rPr>
-          <w:rFonts w:ascii="Arial" w:hAnsi="Arial" w:cs="Arial"/>
-          <w:sz w:val="20"/>
-          <w:szCs w:val="20"/>
-          <w:lang w:val="en-US"/>
-        </w:rPr>
-        <w:t xml:space="preserve"> above on the left</w:t>
-      </w:r>
-      <w:r>
-        <w:rPr>
-          <w:rFonts w:ascii="Arial" w:hAnsi="Arial" w:cs="Arial"/>
-          <w:sz w:val="20"/>
-          <w:szCs w:val="20"/>
-          <w:lang w:val="en-US"/>
-        </w:rPr>
-        <w:t xml:space="preserve"> </w:t>
-      </w:r>
-      <w:r>
-        <w:rPr>
-          <w:rFonts w:ascii="Arial" w:hAnsi="Arial" w:cs="Arial"/>
-          <w:sz w:val="20"/>
-          <w:szCs w:val="20"/>
-          <w:lang w:val="en-US"/>
-        </w:rPr>
-        <w:t xml:space="preserve">shows the distribution of </w:t>
-      </w:r>
-      <w:r>
-        <w:rPr>
-          <w:rFonts w:ascii="Arial" w:hAnsi="Arial" w:cs="Arial"/>
-          <w:sz w:val="20"/>
-          <w:szCs w:val="20"/>
-          <w:lang w:val="en-US"/>
-        </w:rPr>
-        <w:t>patients by the</w:t>
-      </w:r>
-      <w:r>
-        <w:rPr>
-          <w:rFonts w:ascii="Arial" w:hAnsi="Arial" w:cs="Arial"/>
-          <w:sz w:val="20"/>
-          <w:szCs w:val="20"/>
-          <w:lang w:val="en-US"/>
-        </w:rPr>
-        <w:t xml:space="preserve"> </w:t>
-      </w:r>
-      <w:r>
-        <w:rPr>
-          <w:rFonts w:ascii="Arial" w:hAnsi="Arial" w:cs="Arial"/>
-          <w:b/>
-          <w:bCs/>
-          <w:sz w:val="20"/>
-          <w:szCs w:val="20"/>
-          <w:lang w:val="en-US"/>
-        </w:rPr>
-        <w:t>Approximate A</w:t>
-      </w:r>
-      <w:r>
-        <w:rPr>
-          <w:rFonts w:ascii="Arial" w:hAnsi="Arial" w:cs="Arial"/>
-          <w:b/>
-          <w:bCs/>
-          <w:sz w:val="20"/>
-          <w:szCs w:val="20"/>
-          <w:lang w:val="en-US"/>
-        </w:rPr>
-        <w:t xml:space="preserve">nnual </w:t>
-      </w:r>
-      <w:r>
-        <w:rPr>
-          <w:rFonts w:ascii="Arial" w:hAnsi="Arial" w:cs="Arial"/>
-          <w:b/>
-          <w:bCs/>
-          <w:sz w:val="20"/>
-          <w:szCs w:val="20"/>
-          <w:lang w:val="en-US"/>
-        </w:rPr>
-        <w:t>I</w:t>
-      </w:r>
-      <w:r>
-        <w:rPr>
-          <w:rFonts w:ascii="Arial" w:hAnsi="Arial" w:cs="Arial"/>
-          <w:b/>
-          <w:bCs/>
-          <w:sz w:val="20"/>
-          <w:szCs w:val="20"/>
-          <w:lang w:val="en-US"/>
-        </w:rPr>
-        <w:t>ncome</w:t>
-      </w:r>
-      <w:r>
-        <w:rPr>
-          <w:rFonts w:ascii="Arial" w:hAnsi="Arial" w:cs="Arial"/>
-          <w:b/>
-          <w:bCs/>
-          <w:sz w:val="20"/>
-          <w:szCs w:val="20"/>
-          <w:lang w:val="en-US"/>
-        </w:rPr>
-        <w:t xml:space="preserve">. </w:t>
-      </w:r>
-      <w:r>
-        <w:rPr>
-          <w:rFonts w:ascii="Arial" w:hAnsi="Arial" w:cs="Arial"/>
-          <w:sz w:val="20"/>
-          <w:szCs w:val="20"/>
-          <w:lang w:val="en-US"/>
-        </w:rPr>
-        <w:t>Almost every</w:t>
-      </w:r>
-      <w:r>
-        <w:rPr>
-          <w:rFonts w:ascii="Arial" w:hAnsi="Arial" w:cs="Arial"/>
-          <w:sz w:val="20"/>
-          <w:szCs w:val="20"/>
-          <w:lang w:val="en-US"/>
-        </w:rPr>
-        <w:t xml:space="preserve"> </w:t>
-      </w:r>
-      <w:r>
-        <w:rPr>
-          <w:rFonts w:ascii="Arial" w:hAnsi="Arial" w:cs="Arial"/>
-          <w:sz w:val="20"/>
-          <w:szCs w:val="20"/>
-          <w:lang w:val="en-US"/>
-        </w:rPr>
-        <w:t>patient</w:t>
-      </w:r>
-      <w:r>
-        <w:rPr>
-          <w:rFonts w:ascii="Arial" w:hAnsi="Arial" w:cs="Arial"/>
-          <w:sz w:val="20"/>
-          <w:szCs w:val="20"/>
-          <w:lang w:val="en-US"/>
-        </w:rPr>
-        <w:t xml:space="preserve"> registered </w:t>
-      </w:r>
-      <w:r>
-        <w:rPr>
-          <w:rFonts w:ascii="Arial" w:hAnsi="Arial" w:cs="Arial"/>
-          <w:sz w:val="20"/>
-          <w:szCs w:val="20"/>
-          <w:lang w:val="en-US"/>
-        </w:rPr>
-        <w:t>an annual income</w:t>
-      </w:r>
-      <w:r>
-        <w:rPr>
-          <w:rFonts w:ascii="Arial" w:hAnsi="Arial" w:cs="Arial"/>
-          <w:sz w:val="20"/>
-          <w:szCs w:val="20"/>
-          <w:lang w:val="en-US"/>
-        </w:rPr>
-        <w:t xml:space="preserve"> between 0 and </w:t>
-      </w:r>
-      <w:r>
-        <w:rPr>
-          <w:rFonts w:ascii="Arial" w:hAnsi="Arial" w:cs="Arial"/>
-          <w:sz w:val="20"/>
-          <w:szCs w:val="20"/>
-          <w:lang w:val="en-US"/>
-        </w:rPr>
-        <w:t>3</w:t>
-      </w:r>
-      <w:r>
-        <w:rPr>
-          <w:rFonts w:ascii="Arial" w:hAnsi="Arial" w:cs="Arial"/>
-          <w:sz w:val="20"/>
-          <w:szCs w:val="20"/>
-          <w:lang w:val="en-US"/>
-        </w:rPr>
-        <w:t>770</w:t>
-      </w:r>
-      <w:r>
-        <w:rPr>
-          <w:rFonts w:ascii="Arial" w:hAnsi="Arial" w:cs="Arial"/>
-          <w:sz w:val="20"/>
-          <w:szCs w:val="20"/>
-          <w:lang w:val="en-US"/>
-        </w:rPr>
-        <w:t xml:space="preserve">7. Two patients </w:t>
-      </w:r>
-      <w:r>
-        <w:rPr>
-          <w:rFonts w:ascii="Arial" w:hAnsi="Arial" w:cs="Arial"/>
-          <w:sz w:val="20"/>
-          <w:szCs w:val="20"/>
-          <w:lang w:val="en-US"/>
-        </w:rPr>
-        <w:t>are out</w:t>
-      </w:r>
-      <w:r>
-        <w:rPr>
-          <w:rFonts w:ascii="Arial" w:hAnsi="Arial" w:cs="Arial"/>
-          <w:sz w:val="20"/>
-          <w:szCs w:val="20"/>
-          <w:lang w:val="en-US"/>
-        </w:rPr>
-        <w:t>side</w:t>
-      </w:r>
-      <w:r>
-        <w:rPr>
-          <w:rFonts w:ascii="Arial" w:hAnsi="Arial" w:cs="Arial"/>
-          <w:sz w:val="20"/>
-          <w:szCs w:val="20"/>
-          <w:lang w:val="en-US"/>
-        </w:rPr>
-        <w:t xml:space="preserve"> of this group. One of them registered </w:t>
-      </w:r>
-      <w:r>
-        <w:rPr>
-          <w:rFonts w:ascii="Arial" w:hAnsi="Arial" w:cs="Arial"/>
-          <w:sz w:val="20"/>
-          <w:szCs w:val="20"/>
-          <w:lang w:val="en-US"/>
-        </w:rPr>
-        <w:t>two</w:t>
-      </w:r>
-      <w:r>
-        <w:rPr>
-          <w:rFonts w:ascii="Arial" w:hAnsi="Arial" w:cs="Arial"/>
-          <w:sz w:val="20"/>
-          <w:szCs w:val="20"/>
-          <w:lang w:val="en-US"/>
-        </w:rPr>
-        <w:t xml:space="preserve"> million, and the other </w:t>
-      </w:r>
-      <w:r>
-        <w:rPr>
-          <w:rFonts w:ascii="Arial" w:hAnsi="Arial" w:cs="Arial"/>
-          <w:sz w:val="20"/>
-          <w:szCs w:val="20"/>
-          <w:lang w:val="en-US"/>
-        </w:rPr>
-        <w:t>ten</w:t>
-      </w:r>
-      <w:r>
-        <w:rPr>
-          <w:rFonts w:ascii="Arial" w:hAnsi="Arial" w:cs="Arial"/>
-          <w:sz w:val="20"/>
-          <w:szCs w:val="20"/>
-          <w:lang w:val="en-US"/>
-        </w:rPr>
-        <w:t xml:space="preserve"> million.</w:t>
-      </w:r>
-    </w:p>
-    <w:p>
-      <w:pPr>
-        <w:jc w:val="both"/>
-        <w:rPr>
-          <w:rFonts w:ascii="Arial" w:hAnsi="Arial" w:cs="Arial"/>
-          <w:sz w:val="20"/>
-          <w:szCs w:val="20"/>
-          <w:lang w:val="en-US"/>
-        </w:rPr>
-      </w:pPr>
-      <w:r>
-        <w:rPr>
-          <w:rFonts w:ascii="Arial" w:hAnsi="Arial" w:cs="Arial"/>
-          <w:sz w:val="20"/>
-          <w:szCs w:val="20"/>
-          <w:lang w:val="en-US"/>
-        </w:rPr>
-        <w:t xml:space="preserve">The </w:t>
-      </w:r>
-      <w:r>
-        <w:rPr>
-          <w:rFonts w:ascii="Arial" w:hAnsi="Arial" w:cs="Arial"/>
-          <w:sz w:val="20"/>
-          <w:szCs w:val="20"/>
-          <w:lang w:val="en-US"/>
-        </w:rPr>
-        <w:t xml:space="preserve">one beside it </w:t>
-      </w:r>
-      <w:r>
-        <w:rPr>
-          <w:rFonts w:ascii="Arial" w:hAnsi="Arial" w:cs="Arial"/>
-          <w:sz w:val="20"/>
-          <w:szCs w:val="20"/>
-          <w:lang w:val="en-US"/>
-        </w:rPr>
-        <w:t xml:space="preserve">is a log transformation of the previous </w:t>
-      </w:r>
-      <w:r>
-        <w:rPr>
-          <w:rFonts w:ascii="Arial" w:hAnsi="Arial" w:cs="Arial"/>
-          <w:sz w:val="20"/>
-          <w:szCs w:val="20"/>
-          <w:lang w:val="en-US"/>
-        </w:rPr>
-        <w:t>graph, in order to reduce the skewness</w:t>
-      </w:r>
-      <w:r>
-        <w:rPr>
-          <w:rFonts w:ascii="Arial" w:hAnsi="Arial" w:cs="Arial"/>
-          <w:sz w:val="20"/>
-          <w:szCs w:val="20"/>
-          <w:lang w:val="en-US"/>
-        </w:rPr>
-        <w:t xml:space="preserve"> and facilitate </w:t>
-      </w:r>
-      <w:r>
-        <w:rPr>
-          <w:rFonts w:ascii="Arial" w:hAnsi="Arial" w:cs="Arial"/>
-          <w:sz w:val="20"/>
-          <w:szCs w:val="20"/>
-          <w:lang w:val="en-US"/>
-        </w:rPr>
-        <w:t>the analysis of the distribution of the graph</w:t>
-      </w:r>
-      <w:r>
-        <w:rPr>
-          <w:rFonts w:ascii="Arial" w:hAnsi="Arial" w:cs="Arial"/>
-          <w:sz w:val="20"/>
-          <w:szCs w:val="20"/>
-          <w:lang w:val="en-US"/>
-        </w:rPr>
-        <w:t>.</w:t>
-      </w:r>
-      <w:r>
-        <w:rPr>
-          <w:rFonts w:ascii="Arial" w:hAnsi="Arial" w:cs="Arial"/>
-          <w:sz w:val="20"/>
-          <w:szCs w:val="20"/>
-          <w:lang w:val="en-US"/>
-        </w:rPr>
-        <w:t xml:space="preserve"> </w:t>
-      </w:r>
-    </w:p>
-    <w:p>
-      <w:pPr>
-        <w:rPr>
-          <w:rFonts w:ascii="Garamond" w:hAnsi="Garamond"/>
-          <w:lang w:val="en-US"/>
-        </w:rPr>
-      </w:pPr>
-      <w:r>
-        <w:rPr>
-          <w:rFonts w:ascii="Garamond" w:hAnsi="Garamond"/>
-          <w:lang w:val="en-US"/>
-        </w:rPr>
-        <w:t>Number of visits per department over time</w:t>
-      </w:r>
-      <w:r>
-        <w:rPr>
-          <w:rFonts w:ascii="Garamond" w:hAnsi="Garamond"/>
-          <w:lang w:val="en-US"/>
-        </w:rPr>
-        <w:t xml:space="preserve"> </w:t>
-      </w:r>
-    </w:p>
-    <w:p>
-      <w:pPr>
-        <w:rPr>
-          <w:rFonts w:ascii="Arial" w:hAnsi="Arial" w:cs="Arial"/>
-          <w:sz w:val="20"/>
-          <w:szCs w:val="20"/>
-          <w:lang w:val="en-US"/>
-        </w:rPr>
-      </w:pPr>
-      <w:r>
-        <w:rPr>
-          <w:rFonts w:ascii="Arial" w:hAnsi="Arial" w:cs="Arial"/>
-          <w:noProof/>
-          <w:sz w:val="20"/>
-          <w:szCs w:val="20"/>
-          <w:lang w:val="en-US"/>
-        </w:rPr>
         <w:drawing>
           <wp:inline distT="0" distB="0" distL="0" distR="0" wp14:anchorId="00203866" wp14:editId="70BB8AAD">
             <wp:extent cx="5725795" cy="2547620"/>
@@ -13658,443 +13586,423 @@
           <w:szCs w:val="20"/>
           <w:lang w:val="en-US"/>
         </w:rPr>
+        <w:t>Orthopedics</w:t>
+      </w:r>
+      <w:r>
+        <w:rPr>
+          <w:rFonts w:ascii="Arial" w:hAnsi="Arial" w:cs="Arial"/>
+          <w:sz w:val="20"/>
+          <w:szCs w:val="20"/>
+          <w:lang w:val="en-US"/>
+        </w:rPr>
+        <w:t xml:space="preserve">, with </w:t>
+      </w:r>
+      <w:r>
+        <w:rPr>
+          <w:rFonts w:ascii="Arial" w:hAnsi="Arial" w:cs="Arial"/>
+          <w:sz w:val="20"/>
+          <w:szCs w:val="20"/>
+          <w:lang w:val="en-US"/>
+        </w:rPr>
+        <w:t xml:space="preserve">a </w:t>
+      </w:r>
+      <w:r>
+        <w:rPr>
+          <w:rFonts w:ascii="Arial" w:hAnsi="Arial" w:cs="Arial"/>
+          <w:sz w:val="20"/>
+          <w:szCs w:val="20"/>
+          <w:lang w:val="en-US"/>
+        </w:rPr>
+        <w:t xml:space="preserve">similar distribution between the Gender groups. </w:t>
+      </w:r>
+      <w:r>
+        <w:rPr>
+          <w:rFonts w:ascii="Arial" w:hAnsi="Arial" w:cs="Arial"/>
+          <w:sz w:val="20"/>
+          <w:szCs w:val="20"/>
+          <w:lang w:val="en-US"/>
+        </w:rPr>
+        <w:t xml:space="preserve">The </w:t>
+      </w:r>
+      <w:r>
+        <w:rPr>
+          <w:rFonts w:ascii="Arial" w:hAnsi="Arial" w:cs="Arial"/>
+          <w:sz w:val="20"/>
+          <w:szCs w:val="20"/>
+          <w:lang w:val="en-US"/>
+        </w:rPr>
+        <w:t>largest</w:t>
+      </w:r>
+      <w:r>
+        <w:rPr>
+          <w:rFonts w:ascii="Arial" w:hAnsi="Arial" w:cs="Arial"/>
+          <w:sz w:val="20"/>
+          <w:szCs w:val="20"/>
+          <w:lang w:val="en-US"/>
+        </w:rPr>
+        <w:t xml:space="preserve"> </w:t>
+      </w:r>
+      <w:r>
+        <w:rPr>
+          <w:rFonts w:ascii="Arial" w:hAnsi="Arial" w:cs="Arial"/>
+          <w:sz w:val="20"/>
+          <w:szCs w:val="20"/>
+          <w:lang w:val="en-US"/>
+        </w:rPr>
+        <w:t xml:space="preserve">Gender </w:t>
+      </w:r>
+      <w:r>
+        <w:rPr>
+          <w:rFonts w:ascii="Arial" w:hAnsi="Arial" w:cs="Arial"/>
+          <w:sz w:val="20"/>
+          <w:szCs w:val="20"/>
+          <w:lang w:val="en-US"/>
+        </w:rPr>
+        <w:t>gap</w:t>
+      </w:r>
+      <w:r>
+        <w:rPr>
+          <w:rFonts w:ascii="Arial" w:hAnsi="Arial" w:cs="Arial"/>
+          <w:sz w:val="20"/>
+          <w:szCs w:val="20"/>
+          <w:lang w:val="en-US"/>
+        </w:rPr>
+        <w:t xml:space="preserve"> is </w:t>
+      </w:r>
+      <w:r>
+        <w:rPr>
+          <w:rFonts w:ascii="Arial" w:hAnsi="Arial" w:cs="Arial"/>
+          <w:sz w:val="20"/>
+          <w:szCs w:val="20"/>
+          <w:lang w:val="en-US"/>
+        </w:rPr>
+        <w:t>60</w:t>
+      </w:r>
+      <w:r>
+        <w:rPr>
+          <w:rFonts w:ascii="Arial" w:hAnsi="Arial" w:cs="Arial"/>
+          <w:sz w:val="20"/>
+          <w:szCs w:val="20"/>
+          <w:lang w:val="en-US"/>
+        </w:rPr>
+        <w:t xml:space="preserve"> </w:t>
+      </w:r>
+      <w:r>
+        <w:rPr>
+          <w:rFonts w:ascii="Arial" w:hAnsi="Arial" w:cs="Arial"/>
+          <w:sz w:val="20"/>
+          <w:szCs w:val="20"/>
+          <w:lang w:val="en-US"/>
+        </w:rPr>
+        <w:t xml:space="preserve">and appears in the </w:t>
+      </w:r>
+      <w:r>
+        <w:rPr>
+          <w:rFonts w:ascii="Arial" w:hAnsi="Arial" w:cs="Arial"/>
+          <w:b/>
+          <w:bCs/>
+          <w:sz w:val="20"/>
+          <w:szCs w:val="20"/>
+          <w:lang w:val="en-US"/>
+        </w:rPr>
+        <w:t>Psychia</w:t>
+      </w:r>
+      <w:r>
+        <w:rPr>
+          <w:rFonts w:ascii="Arial" w:hAnsi="Arial" w:cs="Arial"/>
+          <w:b/>
+          <w:bCs/>
+          <w:sz w:val="20"/>
+          <w:szCs w:val="20"/>
+          <w:lang w:val="en-US"/>
+        </w:rPr>
+        <w:t>try</w:t>
+      </w:r>
+      <w:r>
+        <w:rPr>
+          <w:rFonts w:ascii="Arial" w:hAnsi="Arial" w:cs="Arial"/>
+          <w:sz w:val="20"/>
+          <w:szCs w:val="20"/>
+          <w:lang w:val="en-US"/>
+        </w:rPr>
+        <w:t xml:space="preserve"> department.</w:t>
+      </w:r>
+      <w:r>
+        <w:rPr>
+          <w:rFonts w:ascii="Arial" w:hAnsi="Arial" w:cs="Arial"/>
+          <w:sz w:val="20"/>
+          <w:szCs w:val="20"/>
+          <w:lang w:val="en-US"/>
+        </w:rPr>
+        <w:t xml:space="preserve"> </w:t>
+      </w:r>
+      <w:r>
+        <w:rPr>
+          <w:rFonts w:ascii="Arial" w:hAnsi="Arial" w:cs="Arial"/>
+          <w:sz w:val="20"/>
+          <w:szCs w:val="20"/>
+          <w:lang w:val="en-US"/>
+        </w:rPr>
+        <w:t xml:space="preserve">Overall, </w:t>
+      </w:r>
+      <w:r>
+        <w:rPr>
+          <w:rFonts w:ascii="Arial" w:hAnsi="Arial" w:cs="Arial"/>
+          <w:sz w:val="20"/>
+          <w:szCs w:val="20"/>
+          <w:lang w:val="en-US"/>
+        </w:rPr>
+        <w:t>gender distributions across departments show minor</w:t>
+      </w:r>
+      <w:r>
+        <w:rPr>
+          <w:rFonts w:ascii="Arial" w:hAnsi="Arial" w:cs="Arial"/>
+          <w:sz w:val="20"/>
+          <w:szCs w:val="20"/>
+          <w:lang w:val="en-US"/>
+        </w:rPr>
+        <w:t xml:space="preserve"> fluctuations</w:t>
+      </w:r>
+      <w:r>
+        <w:rPr>
+          <w:rFonts w:ascii="Arial" w:hAnsi="Arial" w:cs="Arial"/>
+          <w:sz w:val="20"/>
+          <w:szCs w:val="20"/>
+          <w:lang w:val="en-US"/>
+        </w:rPr>
+        <w:t xml:space="preserve">. In </w:t>
+      </w:r>
+      <w:r>
+        <w:rPr>
+          <w:rFonts w:ascii="Arial" w:hAnsi="Arial" w:cs="Arial"/>
+          <w:sz w:val="20"/>
+          <w:szCs w:val="20"/>
+          <w:lang w:val="en-US"/>
+        </w:rPr>
+        <w:t>seven de</w:t>
+      </w:r>
+      <w:r>
+        <w:rPr>
+          <w:rFonts w:ascii="Arial" w:hAnsi="Arial" w:cs="Arial"/>
+          <w:sz w:val="20"/>
+          <w:szCs w:val="20"/>
+          <w:lang w:val="en-US"/>
+        </w:rPr>
+        <w:t>partments</w:t>
+      </w:r>
+      <w:r>
+        <w:rPr>
+          <w:rFonts w:ascii="Arial" w:hAnsi="Arial" w:cs="Arial"/>
+          <w:sz w:val="20"/>
+          <w:szCs w:val="20"/>
+          <w:lang w:val="en-US"/>
+        </w:rPr>
+        <w:t xml:space="preserve">, </w:t>
+      </w:r>
+      <w:r>
+        <w:rPr>
+          <w:rFonts w:ascii="Arial" w:hAnsi="Arial" w:cs="Arial"/>
+          <w:b/>
+          <w:bCs/>
+          <w:sz w:val="20"/>
+          <w:szCs w:val="20"/>
+          <w:lang w:val="en-US"/>
+        </w:rPr>
+        <w:t>Allergology</w:t>
+      </w:r>
+      <w:r>
+        <w:rPr>
+          <w:rFonts w:ascii="Arial" w:hAnsi="Arial" w:cs="Arial"/>
+          <w:sz w:val="20"/>
+          <w:szCs w:val="20"/>
+          <w:lang w:val="en-US"/>
+        </w:rPr>
+        <w:t xml:space="preserve">, </w:t>
+      </w:r>
+      <w:r>
+        <w:rPr>
+          <w:rFonts w:ascii="Arial" w:hAnsi="Arial" w:cs="Arial"/>
+          <w:b/>
+          <w:bCs/>
+          <w:sz w:val="20"/>
+          <w:szCs w:val="20"/>
+          <w:lang w:val="en-US"/>
+        </w:rPr>
+        <w:t>Cardiology</w:t>
+      </w:r>
+      <w:r>
+        <w:rPr>
+          <w:rFonts w:ascii="Arial" w:hAnsi="Arial" w:cs="Arial"/>
+          <w:sz w:val="20"/>
+          <w:szCs w:val="20"/>
+          <w:lang w:val="en-US"/>
+        </w:rPr>
+        <w:t xml:space="preserve">, </w:t>
+      </w:r>
+      <w:r>
+        <w:rPr>
+          <w:rFonts w:ascii="Arial" w:hAnsi="Arial" w:cs="Arial"/>
+          <w:b/>
+          <w:bCs/>
+          <w:sz w:val="20"/>
+          <w:szCs w:val="20"/>
+          <w:lang w:val="en-US"/>
+        </w:rPr>
+        <w:t>Dermatology</w:t>
+      </w:r>
+      <w:r>
+        <w:rPr>
+          <w:rFonts w:ascii="Arial" w:hAnsi="Arial" w:cs="Arial"/>
+          <w:sz w:val="20"/>
+          <w:szCs w:val="20"/>
+          <w:lang w:val="en-US"/>
+        </w:rPr>
+        <w:t xml:space="preserve">, </w:t>
+      </w:r>
+      <w:r>
+        <w:rPr>
+          <w:rFonts w:ascii="Arial" w:hAnsi="Arial" w:cs="Arial"/>
+          <w:b/>
+          <w:bCs/>
+          <w:sz w:val="20"/>
+          <w:szCs w:val="20"/>
+          <w:lang w:val="en-US"/>
+        </w:rPr>
+        <w:t>ENT</w:t>
+      </w:r>
+      <w:r>
+        <w:rPr>
+          <w:rFonts w:ascii="Arial" w:hAnsi="Arial" w:cs="Arial"/>
+          <w:sz w:val="20"/>
+          <w:szCs w:val="20"/>
+          <w:lang w:val="en-US"/>
+        </w:rPr>
+        <w:t xml:space="preserve">, </w:t>
+      </w:r>
+      <w:r>
+        <w:rPr>
+          <w:rFonts w:ascii="Arial" w:hAnsi="Arial" w:cs="Arial"/>
+          <w:b/>
+          <w:bCs/>
+          <w:sz w:val="20"/>
+          <w:szCs w:val="20"/>
+          <w:lang w:val="en-US"/>
+        </w:rPr>
+        <w:t>Endocrinology</w:t>
+      </w:r>
+      <w:r>
+        <w:rPr>
+          <w:rFonts w:ascii="Arial" w:hAnsi="Arial" w:cs="Arial"/>
+          <w:sz w:val="20"/>
+          <w:szCs w:val="20"/>
+          <w:lang w:val="en-US"/>
+        </w:rPr>
+        <w:t xml:space="preserve">, </w:t>
+      </w:r>
+      <w:r>
+        <w:rPr>
+          <w:rFonts w:ascii="Arial" w:hAnsi="Arial" w:cs="Arial"/>
+          <w:b/>
+          <w:bCs/>
+          <w:sz w:val="20"/>
+          <w:szCs w:val="20"/>
+          <w:lang w:val="en-US"/>
+        </w:rPr>
+        <w:t>Orthopedics</w:t>
+      </w:r>
+      <w:r>
+        <w:rPr>
+          <w:rFonts w:ascii="Arial" w:hAnsi="Arial" w:cs="Arial"/>
+          <w:sz w:val="20"/>
+          <w:szCs w:val="20"/>
+          <w:lang w:val="en-US"/>
+        </w:rPr>
+        <w:t xml:space="preserve">, and </w:t>
+      </w:r>
+      <w:r>
+        <w:rPr>
+          <w:rFonts w:ascii="Arial" w:hAnsi="Arial" w:cs="Arial"/>
+          <w:b/>
+          <w:bCs/>
+          <w:sz w:val="20"/>
+          <w:szCs w:val="20"/>
+          <w:lang w:val="en-US"/>
+        </w:rPr>
+        <w:t>Pulmonology</w:t>
+      </w:r>
+      <w:r>
+        <w:rPr>
+          <w:rFonts w:ascii="Arial" w:hAnsi="Arial" w:cs="Arial"/>
+          <w:sz w:val="20"/>
+          <w:szCs w:val="20"/>
+          <w:lang w:val="en-US"/>
+        </w:rPr>
+        <w:t>,</w:t>
+      </w:r>
+      <w:r>
+        <w:rPr>
+          <w:rFonts w:ascii="Arial" w:hAnsi="Arial" w:cs="Arial"/>
+          <w:sz w:val="20"/>
+          <w:szCs w:val="20"/>
+          <w:lang w:val="en-US"/>
+        </w:rPr>
+        <w:t xml:space="preserve"> </w:t>
+      </w:r>
+      <w:r>
+        <w:rPr>
+          <w:rFonts w:ascii="Arial" w:hAnsi="Arial" w:cs="Arial"/>
+          <w:sz w:val="20"/>
+          <w:szCs w:val="20"/>
+          <w:lang w:val="en-US"/>
+        </w:rPr>
+        <w:t xml:space="preserve">the </w:t>
+      </w:r>
+      <w:r>
+        <w:rPr>
+          <w:rFonts w:ascii="Arial" w:hAnsi="Arial" w:cs="Arial"/>
+          <w:sz w:val="20"/>
+          <w:szCs w:val="20"/>
+          <w:lang w:val="en-US"/>
+        </w:rPr>
+        <w:t>gender gap is smaller than 30 patients.</w:t>
+      </w:r>
+    </w:p>
+    <w:p>
+      <w:pPr>
+        <w:rPr>
+          <w:rFonts w:ascii="Garamond" w:hAnsi="Garamond"/>
+          <w:lang w:val="en-US"/>
+        </w:rPr>
+      </w:pPr>
+      <w:r>
+        <w:rPr>
+          <w:rFonts w:ascii="Garamond" w:hAnsi="Garamond"/>
+          <w:lang w:val="en-US"/>
+        </w:rPr>
+        <w:t>Satisfaction Level by Department and by Age Range</w:t>
+      </w:r>
+    </w:p>
+    <w:p>
+      <w:pPr>
+        <w:rPr>
+          <w:rFonts w:ascii="Garamond" w:hAnsi="Garamond"/>
+          <w:lang w:val="en-US"/>
+        </w:rPr>
+      </w:pPr>
+      <w:r>
+        <w:rPr>
+          <w:rFonts w:ascii="Arial" w:hAnsi="Arial" w:cs="Arial"/>
+          <w:noProof/>
+          <w:sz w:val="20"/>
+          <w:szCs w:val="20"/>
+          <w:lang w:val="en-US"/>
+        </w:rPr>
         <w:lastRenderedPageBreak/>
-        <w:t>Orthopedics</w:t>
-      </w:r>
-      <w:r>
-        <w:rPr>
-          <w:rFonts w:ascii="Arial" w:hAnsi="Arial" w:cs="Arial"/>
-          <w:sz w:val="20"/>
-          <w:szCs w:val="20"/>
-          <w:lang w:val="en-US"/>
-        </w:rPr>
-        <w:t xml:space="preserve">, with </w:t>
-      </w:r>
-      <w:r>
-        <w:rPr>
-          <w:rFonts w:ascii="Arial" w:hAnsi="Arial" w:cs="Arial"/>
-          <w:sz w:val="20"/>
-          <w:szCs w:val="20"/>
-          <w:lang w:val="en-US"/>
-        </w:rPr>
-        <w:t xml:space="preserve">a </w:t>
-      </w:r>
-      <w:r>
-        <w:rPr>
-          <w:rFonts w:ascii="Arial" w:hAnsi="Arial" w:cs="Arial"/>
-          <w:sz w:val="20"/>
-          <w:szCs w:val="20"/>
-          <w:lang w:val="en-US"/>
-        </w:rPr>
-        <w:t xml:space="preserve">similar distribution between the Gender groups. </w:t>
-      </w:r>
-      <w:r>
-        <w:rPr>
-          <w:rFonts w:ascii="Arial" w:hAnsi="Arial" w:cs="Arial"/>
-          <w:sz w:val="20"/>
-          <w:szCs w:val="20"/>
-          <w:lang w:val="en-US"/>
-        </w:rPr>
-        <w:t xml:space="preserve">The </w:t>
-      </w:r>
-      <w:r>
-        <w:rPr>
-          <w:rFonts w:ascii="Arial" w:hAnsi="Arial" w:cs="Arial"/>
-          <w:sz w:val="20"/>
-          <w:szCs w:val="20"/>
-          <w:lang w:val="en-US"/>
-        </w:rPr>
-        <w:t>largest</w:t>
-      </w:r>
-      <w:r>
-        <w:rPr>
-          <w:rFonts w:ascii="Arial" w:hAnsi="Arial" w:cs="Arial"/>
-          <w:sz w:val="20"/>
-          <w:szCs w:val="20"/>
-          <w:lang w:val="en-US"/>
-        </w:rPr>
-        <w:t xml:space="preserve"> </w:t>
-      </w:r>
-      <w:r>
-        <w:rPr>
-          <w:rFonts w:ascii="Arial" w:hAnsi="Arial" w:cs="Arial"/>
-          <w:sz w:val="20"/>
-          <w:szCs w:val="20"/>
-          <w:lang w:val="en-US"/>
-        </w:rPr>
-        <w:t xml:space="preserve">Gender </w:t>
-      </w:r>
-      <w:r>
-        <w:rPr>
-          <w:rFonts w:ascii="Arial" w:hAnsi="Arial" w:cs="Arial"/>
-          <w:sz w:val="20"/>
-          <w:szCs w:val="20"/>
-          <w:lang w:val="en-US"/>
-        </w:rPr>
-        <w:t>gap</w:t>
-      </w:r>
-      <w:r>
-        <w:rPr>
-          <w:rFonts w:ascii="Arial" w:hAnsi="Arial" w:cs="Arial"/>
-          <w:sz w:val="20"/>
-          <w:szCs w:val="20"/>
-          <w:lang w:val="en-US"/>
-        </w:rPr>
-        <w:t xml:space="preserve"> is </w:t>
-      </w:r>
-      <w:r>
-        <w:rPr>
-          <w:rFonts w:ascii="Arial" w:hAnsi="Arial" w:cs="Arial"/>
-          <w:sz w:val="20"/>
-          <w:szCs w:val="20"/>
-          <w:lang w:val="en-US"/>
-        </w:rPr>
-        <w:t>60</w:t>
-      </w:r>
-      <w:r>
-        <w:rPr>
-          <w:rFonts w:ascii="Arial" w:hAnsi="Arial" w:cs="Arial"/>
-          <w:sz w:val="20"/>
-          <w:szCs w:val="20"/>
-          <w:lang w:val="en-US"/>
-        </w:rPr>
-        <w:t xml:space="preserve"> </w:t>
-      </w:r>
-      <w:r>
-        <w:rPr>
-          <w:rFonts w:ascii="Arial" w:hAnsi="Arial" w:cs="Arial"/>
-          <w:sz w:val="20"/>
-          <w:szCs w:val="20"/>
-          <w:lang w:val="en-US"/>
-        </w:rPr>
-        <w:t xml:space="preserve">and appears in the </w:t>
-      </w:r>
-      <w:r>
-        <w:rPr>
-          <w:rFonts w:ascii="Arial" w:hAnsi="Arial" w:cs="Arial"/>
-          <w:b/>
-          <w:bCs/>
-          <w:sz w:val="20"/>
-          <w:szCs w:val="20"/>
-          <w:lang w:val="en-US"/>
-        </w:rPr>
-        <w:t>Psychia</w:t>
-      </w:r>
-      <w:r>
-        <w:rPr>
-          <w:rFonts w:ascii="Arial" w:hAnsi="Arial" w:cs="Arial"/>
-          <w:b/>
-          <w:bCs/>
-          <w:sz w:val="20"/>
-          <w:szCs w:val="20"/>
-          <w:lang w:val="en-US"/>
-        </w:rPr>
-        <w:t>try</w:t>
-      </w:r>
-      <w:r>
-        <w:rPr>
-          <w:rFonts w:ascii="Arial" w:hAnsi="Arial" w:cs="Arial"/>
-          <w:sz w:val="20"/>
-          <w:szCs w:val="20"/>
-          <w:lang w:val="en-US"/>
-        </w:rPr>
-        <w:t xml:space="preserve"> department.</w:t>
-      </w:r>
-      <w:r>
-        <w:rPr>
-          <w:rFonts w:ascii="Arial" w:hAnsi="Arial" w:cs="Arial"/>
-          <w:sz w:val="20"/>
-          <w:szCs w:val="20"/>
-          <w:lang w:val="en-US"/>
-        </w:rPr>
-        <w:t xml:space="preserve"> </w:t>
-      </w:r>
-      <w:r>
-        <w:rPr>
-          <w:rFonts w:ascii="Arial" w:hAnsi="Arial" w:cs="Arial"/>
-          <w:sz w:val="20"/>
-          <w:szCs w:val="20"/>
-          <w:lang w:val="en-US"/>
-        </w:rPr>
-        <w:t xml:space="preserve">Overall, </w:t>
-      </w:r>
-      <w:r>
-        <w:rPr>
-          <w:rFonts w:ascii="Arial" w:hAnsi="Arial" w:cs="Arial"/>
-          <w:sz w:val="20"/>
-          <w:szCs w:val="20"/>
-          <w:lang w:val="en-US"/>
-        </w:rPr>
-        <w:t>gender distributions across departments show minor</w:t>
-      </w:r>
-      <w:r>
-        <w:rPr>
-          <w:rFonts w:ascii="Arial" w:hAnsi="Arial" w:cs="Arial"/>
-          <w:sz w:val="20"/>
-          <w:szCs w:val="20"/>
-          <w:lang w:val="en-US"/>
-        </w:rPr>
-        <w:t xml:space="preserve"> fluctuations</w:t>
-      </w:r>
-      <w:r>
-        <w:rPr>
-          <w:rFonts w:ascii="Arial" w:hAnsi="Arial" w:cs="Arial"/>
-          <w:sz w:val="20"/>
-          <w:szCs w:val="20"/>
-          <w:lang w:val="en-US"/>
-        </w:rPr>
-        <w:t xml:space="preserve">. In </w:t>
-      </w:r>
-      <w:r>
-        <w:rPr>
-          <w:rFonts w:ascii="Arial" w:hAnsi="Arial" w:cs="Arial"/>
-          <w:sz w:val="20"/>
-          <w:szCs w:val="20"/>
-          <w:lang w:val="en-US"/>
-        </w:rPr>
-        <w:t>seven de</w:t>
-      </w:r>
-      <w:r>
-        <w:rPr>
-          <w:rFonts w:ascii="Arial" w:hAnsi="Arial" w:cs="Arial"/>
-          <w:sz w:val="20"/>
-          <w:szCs w:val="20"/>
-          <w:lang w:val="en-US"/>
-        </w:rPr>
-        <w:t>partments</w:t>
-      </w:r>
-      <w:r>
-        <w:rPr>
-          <w:rFonts w:ascii="Arial" w:hAnsi="Arial" w:cs="Arial"/>
-          <w:sz w:val="20"/>
-          <w:szCs w:val="20"/>
-          <w:lang w:val="en-US"/>
-        </w:rPr>
-        <w:t xml:space="preserve">, </w:t>
-      </w:r>
-      <w:r>
-        <w:rPr>
-          <w:rFonts w:ascii="Arial" w:hAnsi="Arial" w:cs="Arial"/>
-          <w:b/>
-          <w:bCs/>
-          <w:sz w:val="20"/>
-          <w:szCs w:val="20"/>
-          <w:lang w:val="en-US"/>
-        </w:rPr>
-        <w:t>Allergology</w:t>
-      </w:r>
-      <w:r>
-        <w:rPr>
-          <w:rFonts w:ascii="Arial" w:hAnsi="Arial" w:cs="Arial"/>
-          <w:sz w:val="20"/>
-          <w:szCs w:val="20"/>
-          <w:lang w:val="en-US"/>
-        </w:rPr>
-        <w:t xml:space="preserve">, </w:t>
-      </w:r>
-      <w:r>
-        <w:rPr>
-          <w:rFonts w:ascii="Arial" w:hAnsi="Arial" w:cs="Arial"/>
-          <w:b/>
-          <w:bCs/>
-          <w:sz w:val="20"/>
-          <w:szCs w:val="20"/>
-          <w:lang w:val="en-US"/>
-        </w:rPr>
-        <w:t>Cardiology</w:t>
-      </w:r>
-      <w:r>
-        <w:rPr>
-          <w:rFonts w:ascii="Arial" w:hAnsi="Arial" w:cs="Arial"/>
-          <w:sz w:val="20"/>
-          <w:szCs w:val="20"/>
-          <w:lang w:val="en-US"/>
-        </w:rPr>
-        <w:t xml:space="preserve">, </w:t>
-      </w:r>
-      <w:r>
-        <w:rPr>
-          <w:rFonts w:ascii="Arial" w:hAnsi="Arial" w:cs="Arial"/>
-          <w:b/>
-          <w:bCs/>
-          <w:sz w:val="20"/>
-          <w:szCs w:val="20"/>
-          <w:lang w:val="en-US"/>
-        </w:rPr>
-        <w:t>Dermatology</w:t>
-      </w:r>
-      <w:r>
-        <w:rPr>
-          <w:rFonts w:ascii="Arial" w:hAnsi="Arial" w:cs="Arial"/>
-          <w:sz w:val="20"/>
-          <w:szCs w:val="20"/>
-          <w:lang w:val="en-US"/>
-        </w:rPr>
-        <w:t xml:space="preserve">, </w:t>
-      </w:r>
-      <w:r>
-        <w:rPr>
-          <w:rFonts w:ascii="Arial" w:hAnsi="Arial" w:cs="Arial"/>
-          <w:b/>
-          <w:bCs/>
-          <w:sz w:val="20"/>
-          <w:szCs w:val="20"/>
-          <w:lang w:val="en-US"/>
-        </w:rPr>
-        <w:t>ENT</w:t>
-      </w:r>
-      <w:r>
-        <w:rPr>
-          <w:rFonts w:ascii="Arial" w:hAnsi="Arial" w:cs="Arial"/>
-          <w:sz w:val="20"/>
-          <w:szCs w:val="20"/>
-          <w:lang w:val="en-US"/>
-        </w:rPr>
-        <w:t xml:space="preserve">, </w:t>
-      </w:r>
-      <w:r>
-        <w:rPr>
-          <w:rFonts w:ascii="Arial" w:hAnsi="Arial" w:cs="Arial"/>
-          <w:b/>
-          <w:bCs/>
-          <w:sz w:val="20"/>
-          <w:szCs w:val="20"/>
-          <w:lang w:val="en-US"/>
-        </w:rPr>
-        <w:t>Endocrinology</w:t>
-      </w:r>
-      <w:r>
-        <w:rPr>
-          <w:rFonts w:ascii="Arial" w:hAnsi="Arial" w:cs="Arial"/>
-          <w:sz w:val="20"/>
-          <w:szCs w:val="20"/>
-          <w:lang w:val="en-US"/>
-        </w:rPr>
-        <w:t xml:space="preserve">, </w:t>
-      </w:r>
-      <w:r>
-        <w:rPr>
-          <w:rFonts w:ascii="Arial" w:hAnsi="Arial" w:cs="Arial"/>
-          <w:b/>
-          <w:bCs/>
-          <w:sz w:val="20"/>
-          <w:szCs w:val="20"/>
-          <w:lang w:val="en-US"/>
-        </w:rPr>
-        <w:t>Orthopedics</w:t>
-      </w:r>
-      <w:r>
-        <w:rPr>
-          <w:rFonts w:ascii="Arial" w:hAnsi="Arial" w:cs="Arial"/>
-          <w:sz w:val="20"/>
-          <w:szCs w:val="20"/>
-          <w:lang w:val="en-US"/>
-        </w:rPr>
-        <w:t xml:space="preserve">, and </w:t>
-      </w:r>
-      <w:r>
-        <w:rPr>
-          <w:rFonts w:ascii="Arial" w:hAnsi="Arial" w:cs="Arial"/>
-          <w:b/>
-          <w:bCs/>
-          <w:sz w:val="20"/>
-          <w:szCs w:val="20"/>
-          <w:lang w:val="en-US"/>
-        </w:rPr>
-        <w:t>Pulmonology</w:t>
-      </w:r>
-      <w:r>
-        <w:rPr>
-          <w:rFonts w:ascii="Arial" w:hAnsi="Arial" w:cs="Arial"/>
-          <w:sz w:val="20"/>
-          <w:szCs w:val="20"/>
-          <w:lang w:val="en-US"/>
-        </w:rPr>
-        <w:t>,</w:t>
-      </w:r>
-      <w:r>
-        <w:rPr>
-          <w:rFonts w:ascii="Arial" w:hAnsi="Arial" w:cs="Arial"/>
-          <w:sz w:val="20"/>
-          <w:szCs w:val="20"/>
-          <w:lang w:val="en-US"/>
-        </w:rPr>
-        <w:t xml:space="preserve"> </w:t>
-      </w:r>
-      <w:r>
-        <w:rPr>
-          <w:rFonts w:ascii="Arial" w:hAnsi="Arial" w:cs="Arial"/>
-          <w:sz w:val="20"/>
-          <w:szCs w:val="20"/>
-          <w:lang w:val="en-US"/>
-        </w:rPr>
-        <w:t xml:space="preserve">the </w:t>
-      </w:r>
-      <w:r>
-        <w:rPr>
-          <w:rFonts w:ascii="Arial" w:hAnsi="Arial" w:cs="Arial"/>
-          <w:sz w:val="20"/>
-          <w:szCs w:val="20"/>
-          <w:lang w:val="en-US"/>
-        </w:rPr>
-        <w:t>gender gap is smaller than 30 patients.</w:t>
-      </w:r>
-    </w:p>
-    <w:p>
-      <w:pPr>
-        <w:rPr>
-          <w:rFonts w:ascii="Garamond" w:hAnsi="Garamond"/>
-          <w:lang w:val="en-US"/>
-        </w:rPr>
-      </w:pPr>
-      <w:r>
-        <w:rPr>
-          <w:rFonts w:ascii="Garamond" w:hAnsi="Garamond"/>
-          <w:lang w:val="en-US"/>
-        </w:rPr>
-        <w:t xml:space="preserve">Department visits by </w:t>
-      </w:r>
-      <w:r>
-        <w:rPr>
-          <w:rFonts w:ascii="Garamond" w:hAnsi="Garamond"/>
-          <w:lang w:val="en-US"/>
-        </w:rPr>
-        <w:t>Age Range</w:t>
-      </w:r>
-      <w:r>
-        <w:rPr>
-          <w:rFonts w:ascii="Garamond" w:hAnsi="Garamond"/>
-          <w:lang w:val="en-US"/>
-        </w:rPr>
-        <w:t xml:space="preserve"> </w:t>
-      </w:r>
-    </w:p>
-    <w:p>
-      <w:pPr>
-        <w:rPr>
-          <w:rFonts w:ascii="Garamond" w:hAnsi="Garamond"/>
-          <w:lang w:val="en-US"/>
-        </w:rPr>
-      </w:pPr>
-      <w:r>
-        <w:rPr>
-          <w:rFonts w:ascii="Garamond" w:hAnsi="Garamond"/>
-          <w:noProof/>
-          <w:lang w:val="en-US"/>
-        </w:rPr>
         <w:drawing>
-          <wp:anchor distT="0" distB="0" distL="114300" distR="114300" simplePos="0" relativeHeight="251704320" behindDoc="0" locked="0" layoutInCell="1" allowOverlap="1" wp14:anchorId="154D8D88" wp14:editId="0AF4FBA5">
-            <wp:simplePos x="0" y="0"/>
-            <wp:positionH relativeFrom="margin">
-              <wp:align>right</wp:align>
-            </wp:positionH>
-            <wp:positionV relativeFrom="paragraph">
-              <wp:posOffset>5951</wp:posOffset>
-            </wp:positionV>
-            <wp:extent cx="5731510" cy="2442845"/>
-            <wp:effectExtent l="0" t="0" r="2540" b="0"/>
-            <wp:wrapNone/>
-            <wp:docPr id="771680575" name="Picture 14" descr="A graph with green and blue lines&#10;&#10;AI-generated content may be incorrect."/>
+          <wp:inline distT="0" distB="0" distL="0" distR="0" wp14:anchorId="32EC7E8C" wp14:editId="32688260">
+            <wp:extent cx="5373934" cy="3074651"/>
+            <wp:effectExtent l="0" t="0" r="0" b="0"/>
+            <wp:docPr id="1308426963" name="Picture 12"/>
             <wp:cNvGraphicFramePr>
               <a:graphicFrameLocks xmlns:a="http://schemas.openxmlformats.org/drawingml/2006/main" noChangeAspect="1"/>
             </wp:cNvGraphicFramePr>
@@ -14102,842 +14010,351 @@
               <a:graphicData uri="http://schemas.openxmlformats.org/drawingml/2006/picture">
                 <pic:pic xmlns:pic="http://schemas.openxmlformats.org/drawingml/2006/picture">
                   <pic:nvPicPr>
-                    <pic:cNvPr id="771680575" name="Picture 14" descr="A graph with green and blue lines&#10;&#10;AI-generated content may be incorrect."/>
-                    <pic:cNvPicPr/>
+                    <pic:cNvPr id="0" name="Picture 1"/>
+                    <pic:cNvPicPr>
+                      <a:picLocks noChangeAspect="1" noChangeArrowheads="1"/>
+                    </pic:cNvPicPr>
                   </pic:nvPicPr>
                   <pic:blipFill>
-                    <a:blip r:embed="rId32" cstate="print">
+                    <a:blip r:embed="rId32">
                       <a:extLst>
                         <a:ext uri="{28A0092B-C50C-407E-A947-70E740481C1C}">
                           <a14:useLocalDpi xmlns:a14="http://schemas.microsoft.com/office/drawing/2010/main" val="0"/>
                         </a:ext>
                       </a:extLst>
                     </a:blip>
+                    <a:srcRect/>
                     <a:stretch>
                       <a:fillRect/>
                     </a:stretch>
                   </pic:blipFill>
-                  <pic:spPr>
+                  <pic:spPr bwMode="auto">
                     <a:xfrm>
                       <a:off x="0" y="0"/>
-                      <a:ext cx="5731510" cy="2442845"/>
+                      <a:ext cx="5380928" cy="3078653"/>
                     </a:xfrm>
                     <a:prstGeom prst="rect">
                       <a:avLst/>
                     </a:prstGeom>
+                    <a:noFill/>
+                    <a:ln>
+                      <a:noFill/>
+                    </a:ln>
                   </pic:spPr>
                 </pic:pic>
               </a:graphicData>
             </a:graphic>
-          </wp:anchor>
+          </wp:inline>
         </w:drawing>
       </w:r>
     </w:p>
     <w:p>
       <w:pPr>
+        <w:jc w:val="both"/>
+        <w:rPr>
+          <w:rFonts w:ascii="Arial" w:hAnsi="Arial" w:cs="Arial"/>
+          <w:sz w:val="20"/>
+          <w:szCs w:val="20"/>
+          <w:lang w:val="en-US"/>
+        </w:rPr>
+      </w:pPr>
+      <w:r>
+        <w:rPr>
+          <w:rFonts w:ascii="Arial" w:hAnsi="Arial" w:cs="Arial"/>
+          <w:sz w:val="20"/>
+          <w:szCs w:val="20"/>
+          <w:lang w:val="en-US"/>
+        </w:rPr>
+        <w:t xml:space="preserve">The figure above displays the average </w:t>
+      </w:r>
+      <w:r>
+        <w:rPr>
+          <w:rFonts w:ascii="Arial" w:hAnsi="Arial" w:cs="Arial"/>
+          <w:b/>
+          <w:bCs/>
+          <w:sz w:val="20"/>
+          <w:szCs w:val="20"/>
+          <w:lang w:val="en-US"/>
+        </w:rPr>
+        <w:t>Satisfaction Level</w:t>
+      </w:r>
+      <w:r>
+        <w:rPr>
+          <w:rFonts w:ascii="Arial" w:hAnsi="Arial" w:cs="Arial"/>
+          <w:sz w:val="20"/>
+          <w:szCs w:val="20"/>
+          <w:lang w:val="en-US"/>
+        </w:rPr>
+        <w:t xml:space="preserve"> per </w:t>
+      </w:r>
+      <w:r>
+        <w:rPr>
+          <w:rFonts w:ascii="Arial" w:hAnsi="Arial" w:cs="Arial"/>
+          <w:b/>
+          <w:bCs/>
+          <w:sz w:val="20"/>
+          <w:szCs w:val="20"/>
+          <w:lang w:val="en-US"/>
+        </w:rPr>
+        <w:t>Department</w:t>
+      </w:r>
+      <w:r>
+        <w:rPr>
+          <w:rFonts w:ascii="Arial" w:hAnsi="Arial" w:cs="Arial"/>
+          <w:sz w:val="20"/>
+          <w:szCs w:val="20"/>
+          <w:lang w:val="en-US"/>
+        </w:rPr>
+        <w:t xml:space="preserve"> and per </w:t>
+      </w:r>
+      <w:r>
+        <w:rPr>
+          <w:rFonts w:ascii="Arial" w:hAnsi="Arial" w:cs="Arial"/>
+          <w:b/>
+          <w:bCs/>
+          <w:sz w:val="20"/>
+          <w:szCs w:val="20"/>
+          <w:lang w:val="en-US"/>
+        </w:rPr>
+        <w:t xml:space="preserve">Age </w:t>
+      </w:r>
+      <w:r>
+        <w:rPr>
+          <w:rFonts w:ascii="Arial" w:hAnsi="Arial" w:cs="Arial"/>
+          <w:b/>
+          <w:bCs/>
+          <w:sz w:val="20"/>
+          <w:szCs w:val="20"/>
+          <w:lang w:val="en-US"/>
+        </w:rPr>
+        <w:t>Group</w:t>
+      </w:r>
+      <w:r>
+        <w:rPr>
+          <w:rFonts w:ascii="Arial" w:hAnsi="Arial" w:cs="Arial"/>
+          <w:sz w:val="20"/>
+          <w:szCs w:val="20"/>
+          <w:lang w:val="en-US"/>
+        </w:rPr>
+        <w:t xml:space="preserve">. </w:t>
+      </w:r>
+      <w:r>
+        <w:rPr>
+          <w:rFonts w:ascii="Arial" w:hAnsi="Arial" w:cs="Arial"/>
+          <w:sz w:val="20"/>
+          <w:szCs w:val="20"/>
+          <w:lang w:val="en-US"/>
+        </w:rPr>
+        <w:t xml:space="preserve">The department with the best Satisfaction Level across all ages appears to be </w:t>
+      </w:r>
+      <w:r>
+        <w:rPr>
+          <w:rFonts w:ascii="Arial" w:hAnsi="Arial" w:cs="Arial"/>
+          <w:b/>
+          <w:bCs/>
+          <w:sz w:val="20"/>
+          <w:szCs w:val="20"/>
+          <w:lang w:val="en-US"/>
+        </w:rPr>
+        <w:t>ENT</w:t>
+      </w:r>
+      <w:r>
+        <w:rPr>
+          <w:rFonts w:ascii="Arial" w:hAnsi="Arial" w:cs="Arial"/>
+          <w:sz w:val="20"/>
+          <w:szCs w:val="20"/>
+          <w:lang w:val="en-US"/>
+        </w:rPr>
+        <w:t>, with the highest value</w:t>
+      </w:r>
+      <w:r>
+        <w:rPr>
+          <w:rFonts w:ascii="Arial" w:hAnsi="Arial" w:cs="Arial"/>
+          <w:sz w:val="20"/>
+          <w:szCs w:val="20"/>
+          <w:lang w:val="en-US"/>
+        </w:rPr>
+        <w:t xml:space="preserve"> for the Elders group</w:t>
+      </w:r>
+      <w:r>
+        <w:rPr>
+          <w:rFonts w:ascii="Arial" w:hAnsi="Arial" w:cs="Arial"/>
+          <w:sz w:val="20"/>
+          <w:szCs w:val="20"/>
+          <w:lang w:val="en-US"/>
+        </w:rPr>
+        <w:t xml:space="preserve">, followed by </w:t>
+      </w:r>
+      <w:r>
+        <w:rPr>
+          <w:rFonts w:ascii="Arial" w:hAnsi="Arial" w:cs="Arial"/>
+          <w:b/>
+          <w:bCs/>
+          <w:sz w:val="20"/>
+          <w:szCs w:val="20"/>
+          <w:lang w:val="en-US"/>
+        </w:rPr>
+        <w:t>General Practice</w:t>
+      </w:r>
+      <w:r>
+        <w:rPr>
+          <w:rFonts w:ascii="Arial" w:hAnsi="Arial" w:cs="Arial"/>
+          <w:sz w:val="20"/>
+          <w:szCs w:val="20"/>
+          <w:lang w:val="en-US"/>
+        </w:rPr>
+        <w:t xml:space="preserve">. The Age </w:t>
+      </w:r>
+      <w:r>
+        <w:rPr>
+          <w:rFonts w:ascii="Arial" w:hAnsi="Arial" w:cs="Arial"/>
+          <w:sz w:val="20"/>
+          <w:szCs w:val="20"/>
+          <w:lang w:val="en-US"/>
+        </w:rPr>
+        <w:t>Group</w:t>
+      </w:r>
+      <w:r>
+        <w:rPr>
+          <w:rFonts w:ascii="Arial" w:hAnsi="Arial" w:cs="Arial"/>
+          <w:sz w:val="20"/>
+          <w:szCs w:val="20"/>
+          <w:lang w:val="en-US"/>
+        </w:rPr>
+        <w:t xml:space="preserve"> that rated the best overall was </w:t>
+      </w:r>
+      <w:r>
+        <w:rPr>
+          <w:rFonts w:ascii="Arial" w:hAnsi="Arial" w:cs="Arial"/>
+          <w:b/>
+          <w:bCs/>
+          <w:sz w:val="20"/>
+          <w:szCs w:val="20"/>
+          <w:lang w:val="en-US"/>
+        </w:rPr>
+        <w:t>5 to 10</w:t>
+      </w:r>
+      <w:r>
+        <w:rPr>
+          <w:rFonts w:ascii="Arial" w:hAnsi="Arial" w:cs="Arial"/>
+          <w:sz w:val="20"/>
+          <w:szCs w:val="20"/>
+          <w:lang w:val="en-US"/>
+        </w:rPr>
+        <w:t xml:space="preserve"> years old, with an average of </w:t>
+      </w:r>
+      <w:r>
+        <w:rPr>
+          <w:rFonts w:ascii="Arial" w:hAnsi="Arial" w:cs="Arial"/>
+          <w:b/>
+          <w:bCs/>
+          <w:sz w:val="20"/>
+          <w:szCs w:val="20"/>
+          <w:lang w:val="en-US"/>
+        </w:rPr>
+        <w:t>3.3</w:t>
+      </w:r>
+      <w:r>
+        <w:rPr>
+          <w:rFonts w:ascii="Arial" w:hAnsi="Arial" w:cs="Arial"/>
+          <w:sz w:val="20"/>
+          <w:szCs w:val="20"/>
+          <w:lang w:val="en-US"/>
+        </w:rPr>
+        <w:t xml:space="preserve"> across all departments, peaking at </w:t>
+      </w:r>
+      <w:r>
+        <w:rPr>
+          <w:rFonts w:ascii="Arial" w:hAnsi="Arial" w:cs="Arial"/>
+          <w:b/>
+          <w:bCs/>
+          <w:sz w:val="20"/>
+          <w:szCs w:val="20"/>
+          <w:lang w:val="en-US"/>
+        </w:rPr>
+        <w:t>4</w:t>
+      </w:r>
+      <w:r>
+        <w:rPr>
+          <w:rFonts w:ascii="Arial" w:hAnsi="Arial" w:cs="Arial"/>
+          <w:sz w:val="20"/>
+          <w:szCs w:val="20"/>
+          <w:lang w:val="en-US"/>
+        </w:rPr>
+        <w:t xml:space="preserve"> for the two highest-rated ones.</w:t>
+      </w:r>
+      <w:r>
+        <w:rPr>
+          <w:rFonts w:ascii="Arial" w:hAnsi="Arial" w:cs="Arial"/>
+          <w:sz w:val="20"/>
+          <w:szCs w:val="20"/>
+          <w:lang w:val="en-US"/>
+        </w:rPr>
+        <w:t xml:space="preserve"> On the other hand, the Age Range with the lowest ratings was </w:t>
+      </w:r>
+      <w:r>
+        <w:rPr>
+          <w:rFonts w:ascii="Arial" w:hAnsi="Arial" w:cs="Arial"/>
+          <w:b/>
+          <w:bCs/>
+          <w:sz w:val="20"/>
+          <w:szCs w:val="20"/>
+          <w:lang w:val="en-US"/>
+        </w:rPr>
+        <w:t>125 to 130</w:t>
+      </w:r>
+      <w:r>
+        <w:rPr>
+          <w:rFonts w:ascii="Arial" w:hAnsi="Arial" w:cs="Arial"/>
+          <w:sz w:val="20"/>
+          <w:szCs w:val="20"/>
+          <w:lang w:val="en-US"/>
+        </w:rPr>
+        <w:t xml:space="preserve">-year-olds, most being </w:t>
+      </w:r>
+      <w:r>
+        <w:rPr>
+          <w:rFonts w:ascii="Arial" w:hAnsi="Arial" w:cs="Arial"/>
+          <w:b/>
+          <w:bCs/>
+          <w:sz w:val="20"/>
+          <w:szCs w:val="20"/>
+          <w:lang w:val="en-US"/>
+        </w:rPr>
+        <w:t>under level 3</w:t>
+      </w:r>
+      <w:r>
+        <w:rPr>
+          <w:rFonts w:ascii="Arial" w:hAnsi="Arial" w:cs="Arial"/>
+          <w:sz w:val="20"/>
+          <w:szCs w:val="20"/>
+          <w:lang w:val="en-US"/>
+        </w:rPr>
+        <w:t>.</w:t>
+      </w:r>
+    </w:p>
+    <w:p>
+      <w:pPr>
+        <w:rPr>
+          <w:rFonts w:ascii="Arial" w:hAnsi="Arial" w:cs="Arial"/>
+          <w:sz w:val="20"/>
+          <w:szCs w:val="20"/>
+          <w:lang w:val="en-US"/>
+        </w:rPr>
+      </w:pPr>
+    </w:p>
+    <w:p>
+      <w:pPr>
         <w:rPr>
           <w:rFonts w:ascii="Garamond" w:hAnsi="Garamond"/>
           <w:lang w:val="en-US"/>
         </w:rPr>
       </w:pPr>
-    </w:p>
-    <w:p>
-      <w:pPr>
+      <w:r>
         <w:rPr>
           <w:rFonts w:ascii="Garamond" w:hAnsi="Garamond"/>
           <w:lang w:val="en-US"/>
         </w:rPr>
-      </w:pPr>
-    </w:p>
-    <w:p>
-      <w:pPr>
-        <w:rPr>
-          <w:rFonts w:ascii="Garamond" w:hAnsi="Garamond"/>
-          <w:lang w:val="en-US"/>
-        </w:rPr>
-      </w:pPr>
-    </w:p>
-    <w:p>
-      <w:pPr>
-        <w:rPr>
-          <w:rFonts w:ascii="Garamond" w:hAnsi="Garamond"/>
-          <w:lang w:val="en-US"/>
-        </w:rPr>
-      </w:pPr>
-    </w:p>
-    <w:p>
-      <w:pPr>
-        <w:rPr>
-          <w:rFonts w:ascii="Garamond" w:hAnsi="Garamond"/>
-          <w:lang w:val="en-US"/>
-        </w:rPr>
-      </w:pPr>
-    </w:p>
-    <w:p>
-      <w:pPr>
-        <w:rPr>
-          <w:rFonts w:ascii="Garamond" w:hAnsi="Garamond"/>
-          <w:lang w:val="en-US"/>
-        </w:rPr>
-      </w:pPr>
-    </w:p>
-    <w:p>
-      <w:pPr>
-        <w:rPr>
-          <w:rFonts w:ascii="Garamond" w:hAnsi="Garamond"/>
-          <w:lang w:val="en-US"/>
-        </w:rPr>
-      </w:pPr>
-    </w:p>
-    <w:p>
-      <w:pPr>
-        <w:rPr>
-          <w:rFonts w:ascii="Garamond" w:hAnsi="Garamond"/>
-          <w:lang w:val="en-US"/>
-        </w:rPr>
-      </w:pPr>
-    </w:p>
-    <w:p>
-      <w:pPr>
-        <w:jc w:val="both"/>
-        <w:rPr>
-          <w:rFonts w:ascii="Arial" w:hAnsi="Arial" w:cs="Arial"/>
-          <w:sz w:val="20"/>
-          <w:szCs w:val="20"/>
-          <w:lang w:val="en-US"/>
-        </w:rPr>
-      </w:pPr>
-      <w:r>
-        <w:rPr>
-          <w:rFonts w:ascii="Arial" w:hAnsi="Arial" w:cs="Arial"/>
-          <w:sz w:val="20"/>
-          <w:szCs w:val="20"/>
-          <w:lang w:val="en-US"/>
-        </w:rPr>
-        <w:t xml:space="preserve">This graph shows the number of </w:t>
-      </w:r>
-      <w:r>
-        <w:rPr>
-          <w:rFonts w:ascii="Arial" w:hAnsi="Arial" w:cs="Arial"/>
-          <w:b/>
-          <w:bCs/>
-          <w:sz w:val="20"/>
-          <w:szCs w:val="20"/>
-          <w:lang w:val="en-US"/>
-        </w:rPr>
-        <w:t>Department visits</w:t>
-      </w:r>
-      <w:r>
-        <w:rPr>
-          <w:rFonts w:ascii="Arial" w:hAnsi="Arial" w:cs="Arial"/>
-          <w:sz w:val="20"/>
-          <w:szCs w:val="20"/>
-          <w:lang w:val="en-US"/>
-        </w:rPr>
-        <w:t xml:space="preserve"> by </w:t>
-      </w:r>
-      <w:r>
-        <w:rPr>
-          <w:rFonts w:ascii="Arial" w:hAnsi="Arial" w:cs="Arial"/>
-          <w:b/>
-          <w:bCs/>
-          <w:sz w:val="20"/>
-          <w:szCs w:val="20"/>
-          <w:lang w:val="en-US"/>
-        </w:rPr>
-        <w:t>Age Range</w:t>
-      </w:r>
-      <w:r>
-        <w:rPr>
-          <w:rFonts w:ascii="Arial" w:hAnsi="Arial" w:cs="Arial"/>
-          <w:sz w:val="20"/>
-          <w:szCs w:val="20"/>
-          <w:lang w:val="en-US"/>
-        </w:rPr>
-        <w:t xml:space="preserve">. Most clients are </w:t>
-      </w:r>
-      <w:r>
-        <w:rPr>
-          <w:rFonts w:ascii="Arial" w:hAnsi="Arial" w:cs="Arial"/>
-          <w:b/>
-          <w:bCs/>
-          <w:sz w:val="20"/>
-          <w:szCs w:val="20"/>
-          <w:lang w:val="en-US"/>
-        </w:rPr>
-        <w:t>under 30</w:t>
-      </w:r>
-      <w:r>
-        <w:rPr>
-          <w:rFonts w:ascii="Arial" w:hAnsi="Arial" w:cs="Arial"/>
-          <w:sz w:val="20"/>
-          <w:szCs w:val="20"/>
-          <w:lang w:val="en-US"/>
-        </w:rPr>
-        <w:t xml:space="preserve"> years old</w:t>
-      </w:r>
-      <w:r>
-        <w:rPr>
-          <w:rFonts w:ascii="Arial" w:hAnsi="Arial" w:cs="Arial"/>
-          <w:sz w:val="20"/>
-          <w:szCs w:val="20"/>
-          <w:lang w:val="en-US"/>
-        </w:rPr>
-        <w:t xml:space="preserve">, and the most visited departments by them are </w:t>
-      </w:r>
-      <w:r>
-        <w:rPr>
-          <w:rFonts w:ascii="Arial" w:hAnsi="Arial" w:cs="Arial"/>
-          <w:b/>
-          <w:bCs/>
-          <w:sz w:val="20"/>
-          <w:szCs w:val="20"/>
-          <w:lang w:val="en-US"/>
-        </w:rPr>
-        <w:t xml:space="preserve">General Practice </w:t>
-      </w:r>
-      <w:r>
-        <w:rPr>
-          <w:rFonts w:ascii="Arial" w:hAnsi="Arial" w:cs="Arial"/>
-          <w:sz w:val="20"/>
-          <w:szCs w:val="20"/>
-          <w:lang w:val="en-US"/>
-        </w:rPr>
-        <w:t>and</w:t>
-      </w:r>
-      <w:r>
-        <w:rPr>
-          <w:rFonts w:ascii="Arial" w:hAnsi="Arial" w:cs="Arial"/>
-          <w:b/>
-          <w:bCs/>
-          <w:sz w:val="20"/>
-          <w:szCs w:val="20"/>
-          <w:lang w:val="en-US"/>
-        </w:rPr>
-        <w:t xml:space="preserve"> Psychiatry</w:t>
-      </w:r>
-      <w:r>
-        <w:rPr>
-          <w:rFonts w:ascii="Arial" w:hAnsi="Arial" w:cs="Arial"/>
-          <w:sz w:val="20"/>
-          <w:szCs w:val="20"/>
-          <w:lang w:val="en-US"/>
-        </w:rPr>
-        <w:t>, with t</w:t>
-      </w:r>
-      <w:r>
-        <w:rPr>
-          <w:rFonts w:ascii="Arial" w:hAnsi="Arial" w:cs="Arial"/>
-          <w:sz w:val="20"/>
-          <w:szCs w:val="20"/>
-          <w:lang w:val="en-US"/>
-        </w:rPr>
-        <w:t xml:space="preserve">he highest occurrence </w:t>
-      </w:r>
-      <w:r>
-        <w:rPr>
-          <w:rFonts w:ascii="Arial" w:hAnsi="Arial" w:cs="Arial"/>
-          <w:sz w:val="20"/>
-          <w:szCs w:val="20"/>
-          <w:lang w:val="en-US"/>
-        </w:rPr>
-        <w:t>being</w:t>
-      </w:r>
-      <w:r>
-        <w:rPr>
-          <w:rFonts w:ascii="Arial" w:hAnsi="Arial" w:cs="Arial"/>
-          <w:sz w:val="20"/>
-          <w:szCs w:val="20"/>
-          <w:lang w:val="en-US"/>
-        </w:rPr>
-        <w:t xml:space="preserve"> visits to </w:t>
-      </w:r>
-      <w:r>
-        <w:rPr>
-          <w:rFonts w:ascii="Arial" w:hAnsi="Arial" w:cs="Arial"/>
-          <w:b/>
-          <w:bCs/>
-          <w:sz w:val="20"/>
-          <w:szCs w:val="20"/>
-          <w:lang w:val="en-US"/>
-        </w:rPr>
-        <w:t>General Practice</w:t>
-      </w:r>
-      <w:r>
-        <w:rPr>
-          <w:rFonts w:ascii="Arial" w:hAnsi="Arial" w:cs="Arial"/>
-          <w:b/>
-          <w:bCs/>
-          <w:sz w:val="20"/>
-          <w:szCs w:val="20"/>
-          <w:lang w:val="en-US"/>
-        </w:rPr>
-        <w:t xml:space="preserve"> </w:t>
-      </w:r>
-      <w:r>
-        <w:rPr>
-          <w:rFonts w:ascii="Arial" w:hAnsi="Arial" w:cs="Arial"/>
-          <w:sz w:val="20"/>
-          <w:szCs w:val="20"/>
-          <w:lang w:val="en-US"/>
-        </w:rPr>
-        <w:t xml:space="preserve">by </w:t>
-      </w:r>
-      <w:r>
-        <w:rPr>
-          <w:rFonts w:ascii="Arial" w:hAnsi="Arial" w:cs="Arial"/>
-          <w:b/>
-          <w:bCs/>
-          <w:sz w:val="20"/>
-          <w:szCs w:val="20"/>
-          <w:lang w:val="en-US"/>
-        </w:rPr>
-        <w:t>10 to 15</w:t>
-      </w:r>
-      <w:r>
-        <w:rPr>
-          <w:rFonts w:ascii="Arial" w:hAnsi="Arial" w:cs="Arial"/>
-          <w:sz w:val="20"/>
-          <w:szCs w:val="20"/>
-          <w:lang w:val="en-US"/>
-        </w:rPr>
-        <w:t>-year</w:t>
-      </w:r>
-      <w:r>
-        <w:rPr>
-          <w:rFonts w:ascii="Arial" w:hAnsi="Arial" w:cs="Arial"/>
-          <w:sz w:val="20"/>
-          <w:szCs w:val="20"/>
-          <w:lang w:val="en-US"/>
-        </w:rPr>
-        <w:t>-</w:t>
-      </w:r>
-      <w:r>
-        <w:rPr>
-          <w:rFonts w:ascii="Arial" w:hAnsi="Arial" w:cs="Arial"/>
-          <w:sz w:val="20"/>
-          <w:szCs w:val="20"/>
-          <w:lang w:val="en-US"/>
-        </w:rPr>
-        <w:t>olds.</w:t>
-      </w:r>
-      <w:r>
-        <w:rPr>
-          <w:rFonts w:ascii="Arial" w:hAnsi="Arial" w:cs="Arial"/>
-          <w:sz w:val="20"/>
-          <w:szCs w:val="20"/>
-          <w:lang w:val="en-US"/>
-        </w:rPr>
-        <w:t xml:space="preserve"> The people who visit less are </w:t>
-      </w:r>
-      <w:r>
-        <w:rPr>
-          <w:rFonts w:ascii="Arial" w:hAnsi="Arial" w:cs="Arial"/>
-          <w:b/>
-          <w:bCs/>
-          <w:sz w:val="20"/>
-          <w:szCs w:val="20"/>
-          <w:lang w:val="en-US"/>
-        </w:rPr>
-        <w:t>over 100</w:t>
-      </w:r>
-      <w:r>
-        <w:rPr>
-          <w:rFonts w:ascii="Arial" w:hAnsi="Arial" w:cs="Arial"/>
-          <w:sz w:val="20"/>
-          <w:szCs w:val="20"/>
-          <w:lang w:val="en-US"/>
-        </w:rPr>
-        <w:t xml:space="preserve"> years old, their least visited department being </w:t>
-      </w:r>
-      <w:r>
-        <w:rPr>
-          <w:rFonts w:ascii="Arial" w:hAnsi="Arial" w:cs="Arial"/>
-          <w:b/>
-          <w:bCs/>
-          <w:sz w:val="20"/>
-          <w:szCs w:val="20"/>
-          <w:lang w:val="en-US"/>
-        </w:rPr>
-        <w:t>Orthopedics</w:t>
-      </w:r>
-      <w:r>
-        <w:rPr>
-          <w:rFonts w:ascii="Arial" w:hAnsi="Arial" w:cs="Arial"/>
-          <w:sz w:val="20"/>
-          <w:szCs w:val="20"/>
-          <w:lang w:val="en-US"/>
-        </w:rPr>
-        <w:t>.</w:t>
-      </w:r>
-    </w:p>
-    <w:p>
-      <w:pPr>
-        <w:jc w:val="both"/>
-        <w:rPr>
-          <w:rFonts w:ascii="Garamond" w:hAnsi="Garamond"/>
-          <w:lang w:val="en-US"/>
-        </w:rPr>
-      </w:pPr>
-    </w:p>
-    <w:p>
-      <w:pPr>
-        <w:rPr>
-          <w:rFonts w:ascii="Garamond" w:hAnsi="Garamond"/>
-          <w:lang w:val="en-US"/>
-        </w:rPr>
-      </w:pPr>
-      <w:r>
-        <w:rPr>
-          <w:rFonts w:ascii="Garamond" w:hAnsi="Garamond"/>
-          <w:lang w:val="en-US"/>
-        </w:rPr>
-        <w:t>Satisfaction Level by Department and by Age Range</w:t>
-      </w:r>
-    </w:p>
-    <w:p>
-      <w:pPr>
-        <w:rPr>
-          <w:rFonts w:ascii="Garamond" w:hAnsi="Garamond"/>
-          <w:lang w:val="en-US"/>
-        </w:rPr>
-      </w:pPr>
-      <w:r>
-        <w:rPr>
-          <w:rFonts w:ascii="Arial" w:hAnsi="Arial" w:cs="Arial"/>
-          <w:noProof/>
-          <w:sz w:val="20"/>
-          <w:szCs w:val="20"/>
-          <w:lang w:val="en-US"/>
-        </w:rPr>
-        <w:drawing>
-          <wp:anchor distT="0" distB="0" distL="114300" distR="114300" simplePos="0" relativeHeight="251703296" behindDoc="0" locked="0" layoutInCell="1" allowOverlap="1" wp14:anchorId="27C9F891" wp14:editId="0AA15AF6">
-            <wp:simplePos x="0" y="0"/>
-            <wp:positionH relativeFrom="margin">
-              <wp:align>right</wp:align>
-            </wp:positionH>
-            <wp:positionV relativeFrom="paragraph">
-              <wp:posOffset>6985</wp:posOffset>
-            </wp:positionV>
-            <wp:extent cx="5731510" cy="2332355"/>
-            <wp:effectExtent l="0" t="0" r="2540" b="0"/>
-            <wp:wrapNone/>
-            <wp:docPr id="1925193295" name="Picture 12" descr="A colorful squares with numbers&#10;&#10;AI-generated content may be incorrect."/>
-            <wp:cNvGraphicFramePr>
-              <a:graphicFrameLocks xmlns:a="http://schemas.openxmlformats.org/drawingml/2006/main" noChangeAspect="1"/>
-            </wp:cNvGraphicFramePr>
-            <a:graphic xmlns:a="http://schemas.openxmlformats.org/drawingml/2006/main">
-              <a:graphicData uri="http://schemas.openxmlformats.org/drawingml/2006/picture">
-                <pic:pic xmlns:pic="http://schemas.openxmlformats.org/drawingml/2006/picture">
-                  <pic:nvPicPr>
-                    <pic:cNvPr id="1925193295" name="Picture 12" descr="A colorful squares with numbers&#10;&#10;AI-generated content may be incorrect."/>
-                    <pic:cNvPicPr/>
-                  </pic:nvPicPr>
-                  <pic:blipFill>
-                    <a:blip r:embed="rId33">
-                      <a:extLst>
-                        <a:ext uri="{28A0092B-C50C-407E-A947-70E740481C1C}">
-                          <a14:useLocalDpi xmlns:a14="http://schemas.microsoft.com/office/drawing/2010/main" val="0"/>
-                        </a:ext>
-                      </a:extLst>
-                    </a:blip>
-                    <a:stretch>
-                      <a:fillRect/>
-                    </a:stretch>
-                  </pic:blipFill>
-                  <pic:spPr>
-                    <a:xfrm>
-                      <a:off x="0" y="0"/>
-                      <a:ext cx="5731510" cy="2332355"/>
-                    </a:xfrm>
-                    <a:prstGeom prst="rect">
-                      <a:avLst/>
-                    </a:prstGeom>
-                  </pic:spPr>
-                </pic:pic>
-              </a:graphicData>
-            </a:graphic>
-          </wp:anchor>
-        </w:drawing>
-      </w:r>
-    </w:p>
-    <w:p>
-      <w:pPr>
-        <w:rPr>
-          <w:rFonts w:ascii="Garamond" w:hAnsi="Garamond"/>
-          <w:lang w:val="en-US"/>
-        </w:rPr>
-      </w:pPr>
-    </w:p>
-    <w:p>
-      <w:pPr>
-        <w:rPr>
-          <w:rFonts w:ascii="Garamond" w:hAnsi="Garamond"/>
-          <w:lang w:val="en-US"/>
-        </w:rPr>
-      </w:pPr>
-    </w:p>
-    <w:p>
-      <w:pPr>
-        <w:rPr>
-          <w:rFonts w:ascii="Garamond" w:hAnsi="Garamond"/>
-          <w:lang w:val="en-US"/>
-        </w:rPr>
-      </w:pPr>
-    </w:p>
-    <w:p>
-      <w:pPr>
-        <w:rPr>
-          <w:rFonts w:ascii="Garamond" w:hAnsi="Garamond"/>
-          <w:lang w:val="en-US"/>
-        </w:rPr>
-      </w:pPr>
-    </w:p>
-    <w:p>
-      <w:pPr>
-        <w:rPr>
-          <w:rFonts w:ascii="Garamond" w:hAnsi="Garamond"/>
-          <w:lang w:val="en-US"/>
-        </w:rPr>
-      </w:pPr>
-    </w:p>
-    <w:p>
-      <w:pPr>
-        <w:rPr>
-          <w:rFonts w:ascii="Garamond" w:hAnsi="Garamond"/>
-          <w:lang w:val="en-US"/>
-        </w:rPr>
-      </w:pPr>
-    </w:p>
-    <w:p>
-      <w:pPr>
-        <w:rPr>
-          <w:rFonts w:ascii="Garamond" w:hAnsi="Garamond"/>
-          <w:lang w:val="en-US"/>
-        </w:rPr>
-      </w:pPr>
-    </w:p>
-    <w:p>
-      <w:pPr>
-        <w:jc w:val="both"/>
-        <w:rPr>
-          <w:rFonts w:ascii="Arial" w:hAnsi="Arial" w:cs="Arial"/>
-          <w:sz w:val="20"/>
-          <w:szCs w:val="20"/>
-          <w:lang w:val="en-US"/>
-        </w:rPr>
-      </w:pPr>
-      <w:r>
-        <w:rPr>
-          <w:rFonts w:ascii="Arial" w:hAnsi="Arial" w:cs="Arial"/>
-          <w:sz w:val="20"/>
-          <w:szCs w:val="20"/>
-          <w:lang w:val="en-US"/>
-        </w:rPr>
-        <w:t xml:space="preserve">The figure above displays the average </w:t>
-      </w:r>
-      <w:r>
-        <w:rPr>
-          <w:rFonts w:ascii="Arial" w:hAnsi="Arial" w:cs="Arial"/>
-          <w:b/>
-          <w:bCs/>
-          <w:sz w:val="20"/>
-          <w:szCs w:val="20"/>
-          <w:lang w:val="en-US"/>
-        </w:rPr>
-        <w:t>Satisfaction Level</w:t>
-      </w:r>
-      <w:r>
-        <w:rPr>
-          <w:rFonts w:ascii="Arial" w:hAnsi="Arial" w:cs="Arial"/>
-          <w:sz w:val="20"/>
-          <w:szCs w:val="20"/>
-          <w:lang w:val="en-US"/>
-        </w:rPr>
-        <w:t xml:space="preserve"> per </w:t>
-      </w:r>
-      <w:r>
-        <w:rPr>
-          <w:rFonts w:ascii="Arial" w:hAnsi="Arial" w:cs="Arial"/>
-          <w:b/>
-          <w:bCs/>
-          <w:sz w:val="20"/>
-          <w:szCs w:val="20"/>
-          <w:lang w:val="en-US"/>
-        </w:rPr>
-        <w:t>Department</w:t>
-      </w:r>
-      <w:r>
-        <w:rPr>
-          <w:rFonts w:ascii="Arial" w:hAnsi="Arial" w:cs="Arial"/>
-          <w:sz w:val="20"/>
-          <w:szCs w:val="20"/>
-          <w:lang w:val="en-US"/>
-        </w:rPr>
-        <w:t xml:space="preserve"> and per </w:t>
-      </w:r>
-      <w:r>
-        <w:rPr>
-          <w:rFonts w:ascii="Arial" w:hAnsi="Arial" w:cs="Arial"/>
-          <w:b/>
-          <w:bCs/>
-          <w:sz w:val="20"/>
-          <w:szCs w:val="20"/>
-          <w:lang w:val="en-US"/>
-        </w:rPr>
-        <w:t>Age Range</w:t>
-      </w:r>
-      <w:r>
-        <w:rPr>
-          <w:rFonts w:ascii="Arial" w:hAnsi="Arial" w:cs="Arial"/>
-          <w:sz w:val="20"/>
-          <w:szCs w:val="20"/>
-          <w:lang w:val="en-US"/>
-        </w:rPr>
-        <w:t xml:space="preserve">. </w:t>
-      </w:r>
-      <w:r>
-        <w:rPr>
-          <w:rFonts w:ascii="Arial" w:hAnsi="Arial" w:cs="Arial"/>
-          <w:sz w:val="20"/>
-          <w:szCs w:val="20"/>
-          <w:lang w:val="en-US"/>
-        </w:rPr>
-        <w:t xml:space="preserve">The department with the best Satisfaction Level across all ages appears to be </w:t>
-      </w:r>
-      <w:r>
-        <w:rPr>
-          <w:rFonts w:ascii="Arial" w:hAnsi="Arial" w:cs="Arial"/>
-          <w:b/>
-          <w:bCs/>
-          <w:sz w:val="20"/>
-          <w:szCs w:val="20"/>
-          <w:lang w:val="en-US"/>
-        </w:rPr>
-        <w:t>ENT</w:t>
-      </w:r>
-      <w:r>
-        <w:rPr>
-          <w:rFonts w:ascii="Arial" w:hAnsi="Arial" w:cs="Arial"/>
-          <w:sz w:val="20"/>
-          <w:szCs w:val="20"/>
-          <w:lang w:val="en-US"/>
-        </w:rPr>
-        <w:t xml:space="preserve">, with the highest value reaching </w:t>
-      </w:r>
-      <w:r>
-        <w:rPr>
-          <w:rFonts w:ascii="Arial" w:hAnsi="Arial" w:cs="Arial"/>
-          <w:b/>
-          <w:bCs/>
-          <w:sz w:val="20"/>
-          <w:szCs w:val="20"/>
-          <w:lang w:val="en-US"/>
-        </w:rPr>
-        <w:t>4.3</w:t>
-      </w:r>
-      <w:r>
-        <w:rPr>
-          <w:rFonts w:ascii="Arial" w:hAnsi="Arial" w:cs="Arial"/>
-          <w:sz w:val="20"/>
-          <w:szCs w:val="20"/>
-          <w:lang w:val="en-US"/>
-        </w:rPr>
-        <w:t xml:space="preserve"> for </w:t>
-      </w:r>
-      <w:r>
-        <w:rPr>
-          <w:rFonts w:ascii="Arial" w:hAnsi="Arial" w:cs="Arial"/>
-          <w:b/>
-          <w:bCs/>
-          <w:sz w:val="20"/>
-          <w:szCs w:val="20"/>
-          <w:lang w:val="en-US"/>
-        </w:rPr>
-        <w:t>115 to 120</w:t>
-      </w:r>
-      <w:r>
-        <w:rPr>
-          <w:rFonts w:ascii="Arial" w:hAnsi="Arial" w:cs="Arial"/>
-          <w:sz w:val="20"/>
-          <w:szCs w:val="20"/>
-          <w:lang w:val="en-US"/>
-        </w:rPr>
-        <w:t xml:space="preserve">-year-old patients, followed by </w:t>
-      </w:r>
-      <w:r>
-        <w:rPr>
-          <w:rFonts w:ascii="Arial" w:hAnsi="Arial" w:cs="Arial"/>
-          <w:b/>
-          <w:bCs/>
-          <w:sz w:val="20"/>
-          <w:szCs w:val="20"/>
-          <w:lang w:val="en-US"/>
-        </w:rPr>
-        <w:t>General Practice</w:t>
-      </w:r>
-      <w:r>
-        <w:rPr>
-          <w:rFonts w:ascii="Arial" w:hAnsi="Arial" w:cs="Arial"/>
-          <w:sz w:val="20"/>
-          <w:szCs w:val="20"/>
-          <w:lang w:val="en-US"/>
-        </w:rPr>
-        <w:t xml:space="preserve">, with most values around </w:t>
-      </w:r>
-      <w:r>
-        <w:rPr>
-          <w:rFonts w:ascii="Arial" w:hAnsi="Arial" w:cs="Arial"/>
-          <w:b/>
-          <w:bCs/>
-          <w:sz w:val="20"/>
-          <w:szCs w:val="20"/>
-          <w:lang w:val="en-US"/>
-        </w:rPr>
-        <w:t>3.6</w:t>
-      </w:r>
-      <w:r>
-        <w:rPr>
-          <w:rFonts w:ascii="Arial" w:hAnsi="Arial" w:cs="Arial"/>
-          <w:sz w:val="20"/>
-          <w:szCs w:val="20"/>
-          <w:lang w:val="en-US"/>
-        </w:rPr>
-        <w:t xml:space="preserve">. The Age Range that rated the best overall was </w:t>
-      </w:r>
-      <w:r>
-        <w:rPr>
-          <w:rFonts w:ascii="Arial" w:hAnsi="Arial" w:cs="Arial"/>
-          <w:b/>
-          <w:bCs/>
-          <w:sz w:val="20"/>
-          <w:szCs w:val="20"/>
-          <w:lang w:val="en-US"/>
-        </w:rPr>
-        <w:t>5 to 10</w:t>
-      </w:r>
-      <w:r>
-        <w:rPr>
-          <w:rFonts w:ascii="Arial" w:hAnsi="Arial" w:cs="Arial"/>
-          <w:sz w:val="20"/>
-          <w:szCs w:val="20"/>
-          <w:lang w:val="en-US"/>
-        </w:rPr>
-        <w:t xml:space="preserve"> years old, with an average of </w:t>
-      </w:r>
-      <w:r>
-        <w:rPr>
-          <w:rFonts w:ascii="Arial" w:hAnsi="Arial" w:cs="Arial"/>
-          <w:b/>
-          <w:bCs/>
-          <w:sz w:val="20"/>
-          <w:szCs w:val="20"/>
-          <w:lang w:val="en-US"/>
-        </w:rPr>
-        <w:t>3.3</w:t>
-      </w:r>
-      <w:r>
-        <w:rPr>
-          <w:rFonts w:ascii="Arial" w:hAnsi="Arial" w:cs="Arial"/>
-          <w:sz w:val="20"/>
-          <w:szCs w:val="20"/>
-          <w:lang w:val="en-US"/>
-        </w:rPr>
-        <w:t xml:space="preserve"> across all departments, peaking at </w:t>
-      </w:r>
-      <w:r>
-        <w:rPr>
-          <w:rFonts w:ascii="Arial" w:hAnsi="Arial" w:cs="Arial"/>
-          <w:b/>
-          <w:bCs/>
-          <w:sz w:val="20"/>
-          <w:szCs w:val="20"/>
-          <w:lang w:val="en-US"/>
-        </w:rPr>
-        <w:t>4</w:t>
-      </w:r>
-      <w:r>
-        <w:rPr>
-          <w:rFonts w:ascii="Arial" w:hAnsi="Arial" w:cs="Arial"/>
-          <w:sz w:val="20"/>
-          <w:szCs w:val="20"/>
-          <w:lang w:val="en-US"/>
-        </w:rPr>
-        <w:t xml:space="preserve"> for the two highest-rated ones.</w:t>
-      </w:r>
-      <w:r>
-        <w:rPr>
-          <w:rFonts w:ascii="Arial" w:hAnsi="Arial" w:cs="Arial"/>
-          <w:sz w:val="20"/>
-          <w:szCs w:val="20"/>
-          <w:lang w:val="en-US"/>
-        </w:rPr>
-        <w:t xml:space="preserve"> On the other hand, the Age Range with the lowest ratings was </w:t>
-      </w:r>
-      <w:r>
-        <w:rPr>
-          <w:rFonts w:ascii="Arial" w:hAnsi="Arial" w:cs="Arial"/>
-          <w:b/>
-          <w:bCs/>
-          <w:sz w:val="20"/>
-          <w:szCs w:val="20"/>
-          <w:lang w:val="en-US"/>
-        </w:rPr>
-        <w:t>125 to 130</w:t>
-      </w:r>
-      <w:r>
-        <w:rPr>
-          <w:rFonts w:ascii="Arial" w:hAnsi="Arial" w:cs="Arial"/>
-          <w:sz w:val="20"/>
-          <w:szCs w:val="20"/>
-          <w:lang w:val="en-US"/>
-        </w:rPr>
-        <w:t xml:space="preserve">-year-olds, most being </w:t>
-      </w:r>
-      <w:r>
-        <w:rPr>
-          <w:rFonts w:ascii="Arial" w:hAnsi="Arial" w:cs="Arial"/>
-          <w:b/>
-          <w:bCs/>
-          <w:sz w:val="20"/>
-          <w:szCs w:val="20"/>
-          <w:lang w:val="en-US"/>
-        </w:rPr>
-        <w:t>under level 3</w:t>
-      </w:r>
-      <w:r>
-        <w:rPr>
-          <w:rFonts w:ascii="Arial" w:hAnsi="Arial" w:cs="Arial"/>
-          <w:sz w:val="20"/>
-          <w:szCs w:val="20"/>
-          <w:lang w:val="en-US"/>
-        </w:rPr>
-        <w:t>.</w:t>
-      </w:r>
-    </w:p>
-    <w:p>
-      <w:pPr>
-        <w:rPr>
-          <w:rFonts w:ascii="Arial" w:hAnsi="Arial" w:cs="Arial"/>
-          <w:sz w:val="20"/>
-          <w:szCs w:val="20"/>
-          <w:lang w:val="en-US"/>
-        </w:rPr>
-      </w:pPr>
-    </w:p>
-    <w:p>
-      <w:pPr>
-        <w:rPr>
-          <w:rFonts w:ascii="Garamond" w:hAnsi="Garamond"/>
-          <w:lang w:val="en-US"/>
-        </w:rPr>
-      </w:pPr>
-      <w:r>
-        <w:rPr>
-          <w:rFonts w:ascii="Garamond" w:hAnsi="Garamond"/>
-          <w:lang w:val="en-US"/>
-        </w:rPr>
-        <w:lastRenderedPageBreak/>
         <w:t>Consultation Price and Duration by Satisfaction Level</w:t>
       </w:r>
     </w:p>
@@ -14984,7 +14401,7 @@
                     </pic:cNvPicPr>
                   </pic:nvPicPr>
                   <pic:blipFill>
-                    <a:blip r:embed="rId34">
+                    <a:blip r:embed="rId33">
                       <a:extLst>
                         <a:ext uri="{28A0092B-C50C-407E-A947-70E740481C1C}">
                           <a14:useLocalDpi xmlns:a14="http://schemas.microsoft.com/office/drawing/2010/main" val="0"/>
@@ -15447,6 +14864,7 @@
           <w:szCs w:val="20"/>
           <w:lang w:val="en-US"/>
         </w:rPr>
+        <w:lastRenderedPageBreak/>
         <w:drawing>
           <wp:anchor distT="0" distB="0" distL="114300" distR="114300" simplePos="0" relativeHeight="251706368" behindDoc="0" locked="0" layoutInCell="1" allowOverlap="1" wp14:anchorId="2B20D42E" wp14:editId="3915CB13">
             <wp:simplePos x="0" y="0"/>
@@ -15473,7 +14891,7 @@
                     </pic:cNvPicPr>
                   </pic:nvPicPr>
                   <pic:blipFill>
-                    <a:blip r:embed="rId35">
+                    <a:blip r:embed="rId34">
                       <a:extLst>
                         <a:ext uri="{28A0092B-C50C-407E-A947-70E740481C1C}">
                           <a14:useLocalDpi xmlns:a14="http://schemas.microsoft.com/office/drawing/2010/main" val="0"/>
@@ -15947,7 +15365,6 @@
           <w:rFonts w:ascii="Garamond" w:hAnsi="Garamond"/>
           <w:lang w:val="en-US"/>
         </w:rPr>
-        <w:lastRenderedPageBreak/>
         <w:t>Consultation Price by Department</w:t>
       </w:r>
     </w:p>
@@ -15997,7 +15414,7 @@
                     </pic:cNvPicPr>
                   </pic:nvPicPr>
                   <pic:blipFill>
-                    <a:blip r:embed="rId36">
+                    <a:blip r:embed="rId35">
                       <a:extLst>
                         <a:ext uri="{28A0092B-C50C-407E-A947-70E740481C1C}">
                           <a14:useLocalDpi xmlns:a14="http://schemas.microsoft.com/office/drawing/2010/main" val="0"/>
@@ -16179,6 +15596,7 @@
           <w:szCs w:val="20"/>
           <w:lang w:val="en-US"/>
         </w:rPr>
+        <w:lastRenderedPageBreak/>
         <w:t>Th</w:t>
       </w:r>
       <w:r>
@@ -17002,8 +16420,711 @@
         <w:t>classification, the higher the variance.</w:t>
       </w:r>
     </w:p>
+    <w:p>
+      <w:pPr>
+        <w:rPr>
+          <w:rFonts w:ascii="Garamond" w:hAnsi="Garamond"/>
+          <w:lang w:val="en-US"/>
+        </w:rPr>
+      </w:pPr>
+      <w:r>
+        <w:rPr>
+          <w:rFonts w:ascii="Garamond" w:hAnsi="Garamond"/>
+          <w:lang w:val="en-US"/>
+        </w:rPr>
+        <w:t xml:space="preserve">Department visits by </w:t>
+      </w:r>
+      <w:r>
+        <w:rPr>
+          <w:rFonts w:ascii="Garamond" w:hAnsi="Garamond"/>
+          <w:lang w:val="en-US"/>
+        </w:rPr>
+        <w:t>Age Group</w:t>
+      </w:r>
+    </w:p>
+    <w:p>
+      <w:pPr>
+        <w:rPr>
+          <w:rFonts w:ascii="Garamond" w:hAnsi="Garamond"/>
+          <w:lang w:val="en-US"/>
+        </w:rPr>
+      </w:pPr>
+      <w:r>
+        <w:rPr>
+          <w:rFonts w:ascii="Garamond" w:hAnsi="Garamond"/>
+          <w:noProof/>
+          <w:lang w:val="en-US"/>
+        </w:rPr>
+        <w:drawing>
+          <wp:inline distT="0" distB="0" distL="0" distR="0" wp14:anchorId="099EC046" wp14:editId="671AAF31">
+            <wp:extent cx="5728970" cy="2548255"/>
+            <wp:effectExtent l="0" t="0" r="5080" b="4445"/>
+            <wp:docPr id="182193961" name="Picture 14" descr="A graph of a bar graph&#10;&#10;AI-generated content may be incorrect."/>
+            <wp:cNvGraphicFramePr>
+              <a:graphicFrameLocks xmlns:a="http://schemas.openxmlformats.org/drawingml/2006/main" noChangeAspect="1"/>
+            </wp:cNvGraphicFramePr>
+            <a:graphic xmlns:a="http://schemas.openxmlformats.org/drawingml/2006/main">
+              <a:graphicData uri="http://schemas.openxmlformats.org/drawingml/2006/picture">
+                <pic:pic xmlns:pic="http://schemas.openxmlformats.org/drawingml/2006/picture">
+                  <pic:nvPicPr>
+                    <pic:cNvPr id="182193961" name="Picture 14" descr="A graph of a bar graph&#10;&#10;AI-generated content may be incorrect."/>
+                    <pic:cNvPicPr>
+                      <a:picLocks noChangeAspect="1" noChangeArrowheads="1"/>
+                    </pic:cNvPicPr>
+                  </pic:nvPicPr>
+                  <pic:blipFill>
+                    <a:blip r:embed="rId36">
+                      <a:extLst>
+                        <a:ext uri="{28A0092B-C50C-407E-A947-70E740481C1C}">
+                          <a14:useLocalDpi xmlns:a14="http://schemas.microsoft.com/office/drawing/2010/main" val="0"/>
+                        </a:ext>
+                      </a:extLst>
+                    </a:blip>
+                    <a:srcRect/>
+                    <a:stretch>
+                      <a:fillRect/>
+                    </a:stretch>
+                  </pic:blipFill>
+                  <pic:spPr bwMode="auto">
+                    <a:xfrm>
+                      <a:off x="0" y="0"/>
+                      <a:ext cx="5728970" cy="2548255"/>
+                    </a:xfrm>
+                    <a:prstGeom prst="rect">
+                      <a:avLst/>
+                    </a:prstGeom>
+                    <a:noFill/>
+                    <a:ln>
+                      <a:noFill/>
+                    </a:ln>
+                  </pic:spPr>
+                </pic:pic>
+              </a:graphicData>
+            </a:graphic>
+          </wp:inline>
+        </w:drawing>
+      </w:r>
+    </w:p>
+    <w:p>
+      <w:pPr>
+        <w:jc w:val="both"/>
+        <w:rPr>
+          <w:rFonts w:ascii="Arial" w:hAnsi="Arial" w:cs="Arial"/>
+          <w:sz w:val="20"/>
+          <w:szCs w:val="20"/>
+          <w:lang w:val="en-US"/>
+        </w:rPr>
+      </w:pPr>
+      <w:r>
+        <w:rPr>
+          <w:rFonts w:ascii="Arial" w:hAnsi="Arial" w:cs="Arial"/>
+          <w:sz w:val="20"/>
+          <w:szCs w:val="20"/>
+          <w:lang w:val="en-US"/>
+        </w:rPr>
+        <w:t xml:space="preserve">This graph shows the number of </w:t>
+      </w:r>
+      <w:r>
+        <w:rPr>
+          <w:rFonts w:ascii="Arial" w:hAnsi="Arial" w:cs="Arial"/>
+          <w:b/>
+          <w:bCs/>
+          <w:sz w:val="20"/>
+          <w:szCs w:val="20"/>
+          <w:lang w:val="en-US"/>
+        </w:rPr>
+        <w:t>Department visits</w:t>
+      </w:r>
+      <w:r>
+        <w:rPr>
+          <w:rFonts w:ascii="Arial" w:hAnsi="Arial" w:cs="Arial"/>
+          <w:sz w:val="20"/>
+          <w:szCs w:val="20"/>
+          <w:lang w:val="en-US"/>
+        </w:rPr>
+        <w:t xml:space="preserve"> by </w:t>
+      </w:r>
+      <w:r>
+        <w:rPr>
+          <w:rFonts w:ascii="Arial" w:hAnsi="Arial" w:cs="Arial"/>
+          <w:b/>
+          <w:bCs/>
+          <w:sz w:val="20"/>
+          <w:szCs w:val="20"/>
+          <w:lang w:val="en-US"/>
+        </w:rPr>
+        <w:t>Age Group</w:t>
+      </w:r>
+      <w:r>
+        <w:rPr>
+          <w:rFonts w:ascii="Arial" w:hAnsi="Arial" w:cs="Arial"/>
+          <w:sz w:val="20"/>
+          <w:szCs w:val="20"/>
+          <w:lang w:val="en-US"/>
+        </w:rPr>
+        <w:t xml:space="preserve">. Most clients are </w:t>
+      </w:r>
+      <w:r>
+        <w:rPr>
+          <w:rFonts w:ascii="Arial" w:hAnsi="Arial" w:cs="Arial"/>
+          <w:b/>
+          <w:bCs/>
+          <w:sz w:val="20"/>
+          <w:szCs w:val="20"/>
+          <w:lang w:val="en-US"/>
+        </w:rPr>
+        <w:t>Adults</w:t>
+      </w:r>
+      <w:r>
+        <w:rPr>
+          <w:rFonts w:ascii="Arial" w:hAnsi="Arial" w:cs="Arial"/>
+          <w:sz w:val="20"/>
+          <w:szCs w:val="20"/>
+          <w:lang w:val="en-US"/>
+        </w:rPr>
+        <w:t xml:space="preserve">, and the most visited departments by them are </w:t>
+      </w:r>
+      <w:r>
+        <w:rPr>
+          <w:rFonts w:ascii="Arial" w:hAnsi="Arial" w:cs="Arial"/>
+          <w:b/>
+          <w:bCs/>
+          <w:sz w:val="20"/>
+          <w:szCs w:val="20"/>
+          <w:lang w:val="en-US"/>
+        </w:rPr>
+        <w:t xml:space="preserve">General Practice </w:t>
+      </w:r>
+      <w:r>
+        <w:rPr>
+          <w:rFonts w:ascii="Arial" w:hAnsi="Arial" w:cs="Arial"/>
+          <w:sz w:val="20"/>
+          <w:szCs w:val="20"/>
+          <w:lang w:val="en-US"/>
+        </w:rPr>
+        <w:t>and</w:t>
+      </w:r>
+      <w:r>
+        <w:rPr>
+          <w:rFonts w:ascii="Arial" w:hAnsi="Arial" w:cs="Arial"/>
+          <w:b/>
+          <w:bCs/>
+          <w:sz w:val="20"/>
+          <w:szCs w:val="20"/>
+          <w:lang w:val="en-US"/>
+        </w:rPr>
+        <w:t xml:space="preserve"> Psychiatry</w:t>
+      </w:r>
+      <w:r>
+        <w:rPr>
+          <w:rFonts w:ascii="Arial" w:hAnsi="Arial" w:cs="Arial"/>
+          <w:sz w:val="20"/>
+          <w:szCs w:val="20"/>
+          <w:lang w:val="en-US"/>
+        </w:rPr>
+        <w:t>, with the highest occurrence being visits to</w:t>
+      </w:r>
+      <w:r>
+        <w:rPr>
+          <w:rFonts w:ascii="Arial" w:hAnsi="Arial" w:cs="Arial"/>
+          <w:b/>
+          <w:bCs/>
+          <w:sz w:val="20"/>
+          <w:szCs w:val="20"/>
+          <w:lang w:val="en-US"/>
+        </w:rPr>
+        <w:t xml:space="preserve"> Psychiatry</w:t>
+      </w:r>
+      <w:r>
+        <w:rPr>
+          <w:rFonts w:ascii="Arial" w:hAnsi="Arial" w:cs="Arial"/>
+          <w:sz w:val="20"/>
+          <w:szCs w:val="20"/>
+          <w:lang w:val="en-US"/>
+        </w:rPr>
+        <w:t xml:space="preserve">. The people who visit less are </w:t>
+      </w:r>
+      <w:r>
+        <w:rPr>
+          <w:rFonts w:ascii="Arial" w:hAnsi="Arial" w:cs="Arial"/>
+          <w:b/>
+          <w:bCs/>
+          <w:sz w:val="20"/>
+          <w:szCs w:val="20"/>
+          <w:lang w:val="en-US"/>
+        </w:rPr>
+        <w:t>Children</w:t>
+      </w:r>
+      <w:r>
+        <w:rPr>
+          <w:rFonts w:ascii="Arial" w:hAnsi="Arial" w:cs="Arial"/>
+          <w:sz w:val="20"/>
+          <w:szCs w:val="20"/>
+          <w:lang w:val="en-US"/>
+        </w:rPr>
+        <w:t xml:space="preserve">, their most visited department being </w:t>
+      </w:r>
+      <w:r>
+        <w:rPr>
+          <w:rFonts w:ascii="Arial" w:hAnsi="Arial" w:cs="Arial"/>
+          <w:b/>
+          <w:bCs/>
+          <w:sz w:val="20"/>
+          <w:szCs w:val="20"/>
+          <w:lang w:val="en-US"/>
+        </w:rPr>
+        <w:t>General Practice</w:t>
+      </w:r>
+      <w:r>
+        <w:rPr>
+          <w:rFonts w:ascii="Arial" w:hAnsi="Arial" w:cs="Arial"/>
+          <w:sz w:val="20"/>
+          <w:szCs w:val="20"/>
+          <w:lang w:val="en-US"/>
+        </w:rPr>
+        <w:t>.</w:t>
+      </w:r>
+      <w:r>
+        <w:rPr>
+          <w:rFonts w:ascii="Arial" w:hAnsi="Arial" w:cs="Arial"/>
+          <w:sz w:val="20"/>
+          <w:szCs w:val="20"/>
+          <w:lang w:val="en-US"/>
+        </w:rPr>
+        <w:t xml:space="preserve"> </w:t>
+      </w:r>
+    </w:p>
+    <w:p>
+      <w:pPr>
+        <w:jc w:val="both"/>
+        <w:rPr>
+          <w:rFonts w:ascii="Garamond" w:hAnsi="Garamond"/>
+          <w:lang w:val="en-US"/>
+        </w:rPr>
+      </w:pPr>
+    </w:p>
+    <w:p>
+      <w:pPr>
+        <w:jc w:val="both"/>
+        <w:rPr>
+          <w:rFonts w:ascii="Garamond" w:hAnsi="Garamond"/>
+          <w:lang w:val="en-US"/>
+        </w:rPr>
+      </w:pPr>
+    </w:p>
+    <w:p>
+      <w:pPr>
+        <w:jc w:val="both"/>
+        <w:rPr>
+          <w:rFonts w:ascii="Garamond" w:hAnsi="Garamond"/>
+          <w:lang w:val="en-US"/>
+        </w:rPr>
+      </w:pPr>
+    </w:p>
+    <w:p>
+      <w:pPr>
+        <w:jc w:val="both"/>
+        <w:rPr>
+          <w:rFonts w:ascii="Garamond" w:hAnsi="Garamond"/>
+          <w:lang w:val="en-US"/>
+        </w:rPr>
+      </w:pPr>
+    </w:p>
+    <w:p>
+      <w:pPr>
+        <w:jc w:val="both"/>
+        <w:rPr>
+          <w:rFonts w:ascii="Garamond" w:hAnsi="Garamond"/>
+          <w:lang w:val="en-US"/>
+        </w:rPr>
+      </w:pPr>
+    </w:p>
+    <w:p>
+      <w:pPr>
+        <w:jc w:val="both"/>
+        <w:rPr>
+          <w:rFonts w:ascii="Garamond" w:hAnsi="Garamond"/>
+          <w:lang w:val="en-US"/>
+        </w:rPr>
+      </w:pPr>
+    </w:p>
+    <w:p>
+      <w:pPr>
+        <w:jc w:val="both"/>
+        <w:rPr>
+          <w:rFonts w:ascii="Garamond" w:hAnsi="Garamond"/>
+          <w:lang w:val="en-US"/>
+        </w:rPr>
+      </w:pPr>
+      <w:r>
+        <w:rPr>
+          <w:rFonts w:ascii="Garamond" w:hAnsi="Garamond"/>
+          <w:noProof/>
+          <w:lang w:val="en-US"/>
+        </w:rPr>
+        <w:lastRenderedPageBreak/>
+        <w:drawing>
+          <wp:anchor distT="0" distB="0" distL="114300" distR="114300" simplePos="0" relativeHeight="251708416" behindDoc="1" locked="0" layoutInCell="1" allowOverlap="1" wp14:anchorId="5EAE853E" wp14:editId="19DE811D">
+            <wp:simplePos x="0" y="0"/>
+            <wp:positionH relativeFrom="margin">
+              <wp:align>left</wp:align>
+            </wp:positionH>
+            <wp:positionV relativeFrom="paragraph">
+              <wp:posOffset>214630</wp:posOffset>
+            </wp:positionV>
+            <wp:extent cx="2190115" cy="2172970"/>
+            <wp:effectExtent l="0" t="0" r="635" b="0"/>
+            <wp:wrapTight wrapText="bothSides">
+              <wp:wrapPolygon edited="0">
+                <wp:start x="0" y="0"/>
+                <wp:lineTo x="0" y="21398"/>
+                <wp:lineTo x="21418" y="21398"/>
+                <wp:lineTo x="21418" y="0"/>
+                <wp:lineTo x="0" y="0"/>
+              </wp:wrapPolygon>
+            </wp:wrapTight>
+            <wp:docPr id="486162840" name="Picture 15"/>
+            <wp:cNvGraphicFramePr>
+              <a:graphicFrameLocks xmlns:a="http://schemas.openxmlformats.org/drawingml/2006/main" noChangeAspect="1"/>
+            </wp:cNvGraphicFramePr>
+            <a:graphic xmlns:a="http://schemas.openxmlformats.org/drawingml/2006/main">
+              <a:graphicData uri="http://schemas.openxmlformats.org/drawingml/2006/picture">
+                <pic:pic xmlns:pic="http://schemas.openxmlformats.org/drawingml/2006/picture">
+                  <pic:nvPicPr>
+                    <pic:cNvPr id="0" name="Picture 4"/>
+                    <pic:cNvPicPr>
+                      <a:picLocks noChangeAspect="1" noChangeArrowheads="1"/>
+                    </pic:cNvPicPr>
+                  </pic:nvPicPr>
+                  <pic:blipFill>
+                    <a:blip r:embed="rId37">
+                      <a:extLst>
+                        <a:ext uri="{28A0092B-C50C-407E-A947-70E740481C1C}">
+                          <a14:useLocalDpi xmlns:a14="http://schemas.microsoft.com/office/drawing/2010/main" val="0"/>
+                        </a:ext>
+                      </a:extLst>
+                    </a:blip>
+                    <a:srcRect/>
+                    <a:stretch>
+                      <a:fillRect/>
+                    </a:stretch>
+                  </pic:blipFill>
+                  <pic:spPr bwMode="auto">
+                    <a:xfrm>
+                      <a:off x="0" y="0"/>
+                      <a:ext cx="2190115" cy="2172970"/>
+                    </a:xfrm>
+                    <a:prstGeom prst="rect">
+                      <a:avLst/>
+                    </a:prstGeom>
+                    <a:noFill/>
+                    <a:ln>
+                      <a:noFill/>
+                    </a:ln>
+                  </pic:spPr>
+                </pic:pic>
+              </a:graphicData>
+            </a:graphic>
+            <wp14:sizeRelH relativeFrom="margin">
+              <wp14:pctWidth>0</wp14:pctWidth>
+            </wp14:sizeRelH>
+            <wp14:sizeRelV relativeFrom="margin">
+              <wp14:pctHeight>0</wp14:pctHeight>
+            </wp14:sizeRelV>
+          </wp:anchor>
+        </w:drawing>
+      </w:r>
+      <w:r>
+        <w:rPr>
+          <w:rFonts w:ascii="Garamond" w:hAnsi="Garamond"/>
+          <w:lang w:val="en-US"/>
+        </w:rPr>
+        <w:t>Average Annual Income by Age Group and Gender</w:t>
+      </w:r>
+    </w:p>
+    <w:p>
+      <w:pPr>
+        <w:jc w:val="both"/>
+        <w:rPr>
+          <w:rFonts w:ascii="Arial" w:hAnsi="Arial" w:cs="Arial"/>
+          <w:sz w:val="20"/>
+          <w:szCs w:val="20"/>
+          <w:lang w:val="en-US"/>
+        </w:rPr>
+      </w:pPr>
+    </w:p>
+    <w:p>
+      <w:pPr>
+        <w:rPr>
+          <w:rFonts w:ascii="Arial" w:hAnsi="Arial" w:cs="Arial"/>
+          <w:sz w:val="20"/>
+          <w:szCs w:val="20"/>
+          <w:lang w:val="en-US"/>
+        </w:rPr>
+      </w:pPr>
+    </w:p>
+    <w:p>
+      <w:pPr>
+        <w:rPr>
+          <w:rFonts w:ascii="Arial" w:hAnsi="Arial" w:cs="Arial"/>
+          <w:sz w:val="20"/>
+          <w:szCs w:val="20"/>
+          <w:lang w:val="en-US"/>
+        </w:rPr>
+      </w:pPr>
+    </w:p>
+    <w:p>
+      <w:pPr>
+        <w:rPr>
+          <w:rFonts w:ascii="Arial" w:hAnsi="Arial" w:cs="Arial"/>
+          <w:sz w:val="20"/>
+          <w:szCs w:val="20"/>
+          <w:lang w:val="en-US"/>
+        </w:rPr>
+      </w:pPr>
+    </w:p>
+    <w:p>
+      <w:pPr>
+        <w:rPr>
+          <w:rFonts w:ascii="Arial" w:hAnsi="Arial" w:cs="Arial"/>
+          <w:sz w:val="20"/>
+          <w:szCs w:val="20"/>
+          <w:lang w:val="en-US"/>
+        </w:rPr>
+      </w:pPr>
+    </w:p>
+    <w:p>
+      <w:pPr>
+        <w:rPr>
+          <w:rFonts w:ascii="Arial" w:hAnsi="Arial" w:cs="Arial"/>
+          <w:sz w:val="20"/>
+          <w:szCs w:val="20"/>
+          <w:lang w:val="en-US"/>
+        </w:rPr>
+      </w:pPr>
+    </w:p>
+    <w:p>
+      <w:pPr>
+        <w:rPr>
+          <w:rFonts w:ascii="Arial" w:hAnsi="Arial" w:cs="Arial"/>
+          <w:sz w:val="20"/>
+          <w:szCs w:val="20"/>
+          <w:lang w:val="en-US"/>
+        </w:rPr>
+      </w:pPr>
+    </w:p>
+    <w:p>
+      <w:pPr>
+        <w:rPr>
+          <w:rFonts w:ascii="Arial" w:hAnsi="Arial" w:cs="Arial"/>
+          <w:sz w:val="20"/>
+          <w:szCs w:val="20"/>
+          <w:lang w:val="en-US"/>
+        </w:rPr>
+      </w:pPr>
+    </w:p>
+    <w:p>
+      <w:pPr>
+        <w:rPr>
+          <w:rFonts w:ascii="Arial" w:hAnsi="Arial" w:cs="Arial"/>
+          <w:sz w:val="20"/>
+          <w:szCs w:val="20"/>
+          <w:lang w:val="en-US"/>
+        </w:rPr>
+      </w:pPr>
+      <w:r>
+        <w:rPr>
+          <w:rFonts w:ascii="Arial" w:hAnsi="Arial" w:cs="Arial"/>
+          <w:sz w:val="20"/>
+          <w:szCs w:val="20"/>
+          <w:lang w:val="en-US"/>
+        </w:rPr>
+        <w:t xml:space="preserve">This graph shows </w:t>
+      </w:r>
+      <w:r>
+        <w:rPr>
+          <w:rFonts w:ascii="Arial" w:hAnsi="Arial" w:cs="Arial"/>
+          <w:sz w:val="20"/>
+          <w:szCs w:val="20"/>
+          <w:lang w:val="en-US"/>
+        </w:rPr>
+        <w:t xml:space="preserve">the </w:t>
+      </w:r>
+      <w:r>
+        <w:rPr>
+          <w:rFonts w:ascii="Arial" w:hAnsi="Arial" w:cs="Arial"/>
+          <w:b/>
+          <w:bCs/>
+          <w:sz w:val="20"/>
+          <w:szCs w:val="20"/>
+          <w:lang w:val="en-US"/>
+        </w:rPr>
+        <w:t xml:space="preserve">Average Annual Income </w:t>
+      </w:r>
+      <w:r>
+        <w:rPr>
+          <w:rFonts w:ascii="Arial" w:hAnsi="Arial" w:cs="Arial"/>
+          <w:sz w:val="20"/>
+          <w:szCs w:val="20"/>
+          <w:lang w:val="en-US"/>
+        </w:rPr>
+        <w:t>by</w:t>
+      </w:r>
+      <w:r>
+        <w:rPr>
+          <w:rFonts w:ascii="Arial" w:hAnsi="Arial" w:cs="Arial"/>
+          <w:b/>
+          <w:bCs/>
+          <w:sz w:val="20"/>
+          <w:szCs w:val="20"/>
+          <w:lang w:val="en-US"/>
+        </w:rPr>
+        <w:t xml:space="preserve"> Age Group </w:t>
+      </w:r>
+      <w:r>
+        <w:rPr>
+          <w:rFonts w:ascii="Arial" w:hAnsi="Arial" w:cs="Arial"/>
+          <w:sz w:val="20"/>
+          <w:szCs w:val="20"/>
+          <w:lang w:val="en-US"/>
+        </w:rPr>
+        <w:t>and</w:t>
+      </w:r>
+      <w:r>
+        <w:rPr>
+          <w:rFonts w:ascii="Arial" w:hAnsi="Arial" w:cs="Arial"/>
+          <w:b/>
+          <w:bCs/>
+          <w:sz w:val="20"/>
+          <w:szCs w:val="20"/>
+          <w:lang w:val="en-US"/>
+        </w:rPr>
+        <w:t xml:space="preserve"> Gender</w:t>
+      </w:r>
+      <w:r>
+        <w:rPr>
+          <w:rFonts w:ascii="Arial" w:hAnsi="Arial" w:cs="Arial"/>
+          <w:sz w:val="20"/>
+          <w:szCs w:val="20"/>
+          <w:lang w:val="en-US"/>
+        </w:rPr>
+        <w:t xml:space="preserve">. The highest </w:t>
+      </w:r>
+      <w:r>
+        <w:rPr>
+          <w:rFonts w:ascii="Arial" w:hAnsi="Arial" w:cs="Arial"/>
+          <w:sz w:val="20"/>
+          <w:szCs w:val="20"/>
+          <w:lang w:val="en-US"/>
+        </w:rPr>
+        <w:t>A</w:t>
+      </w:r>
+      <w:r>
+        <w:rPr>
+          <w:rFonts w:ascii="Arial" w:hAnsi="Arial" w:cs="Arial"/>
+          <w:sz w:val="20"/>
+          <w:szCs w:val="20"/>
+          <w:lang w:val="en-US"/>
+        </w:rPr>
+        <w:t xml:space="preserve">verage </w:t>
+      </w:r>
+      <w:r>
+        <w:rPr>
+          <w:rFonts w:ascii="Arial" w:hAnsi="Arial" w:cs="Arial"/>
+          <w:sz w:val="20"/>
+          <w:szCs w:val="20"/>
+          <w:lang w:val="en-US"/>
+        </w:rPr>
+        <w:t>I</w:t>
+      </w:r>
+      <w:r>
+        <w:rPr>
+          <w:rFonts w:ascii="Arial" w:hAnsi="Arial" w:cs="Arial"/>
+          <w:sz w:val="20"/>
+          <w:szCs w:val="20"/>
+          <w:lang w:val="en-US"/>
+        </w:rPr>
+        <w:t xml:space="preserve">ncome is for </w:t>
+      </w:r>
+      <w:r>
+        <w:rPr>
+          <w:rFonts w:ascii="Arial" w:hAnsi="Arial" w:cs="Arial"/>
+          <w:b/>
+          <w:bCs/>
+          <w:sz w:val="20"/>
+          <w:szCs w:val="20"/>
+          <w:lang w:val="en-US"/>
+        </w:rPr>
+        <w:t xml:space="preserve">Adults </w:t>
+      </w:r>
+      <w:r>
+        <w:rPr>
+          <w:rFonts w:ascii="Arial" w:hAnsi="Arial" w:cs="Arial"/>
+          <w:sz w:val="20"/>
+          <w:szCs w:val="20"/>
+          <w:lang w:val="en-US"/>
+        </w:rPr>
+        <w:t>for</w:t>
+      </w:r>
+      <w:r>
+        <w:rPr>
+          <w:rFonts w:ascii="Arial" w:hAnsi="Arial" w:cs="Arial"/>
+          <w:sz w:val="20"/>
+          <w:szCs w:val="20"/>
+          <w:lang w:val="en-US"/>
+        </w:rPr>
+        <w:t xml:space="preserve"> </w:t>
+      </w:r>
+      <w:r>
+        <w:rPr>
+          <w:rFonts w:ascii="Arial" w:hAnsi="Arial" w:cs="Arial"/>
+          <w:sz w:val="20"/>
+          <w:szCs w:val="20"/>
+          <w:lang w:val="en-US"/>
+        </w:rPr>
+        <w:t>g</w:t>
+      </w:r>
+      <w:r>
+        <w:rPr>
+          <w:rFonts w:ascii="Arial" w:hAnsi="Arial" w:cs="Arial"/>
+          <w:sz w:val="20"/>
+          <w:szCs w:val="20"/>
+          <w:lang w:val="en-US"/>
+        </w:rPr>
+        <w:t xml:space="preserve">ender </w:t>
+      </w:r>
+      <w:r>
+        <w:rPr>
+          <w:rFonts w:ascii="Arial" w:hAnsi="Arial" w:cs="Arial"/>
+          <w:b/>
+          <w:bCs/>
+          <w:sz w:val="20"/>
+          <w:szCs w:val="20"/>
+          <w:lang w:val="en-US"/>
+        </w:rPr>
+        <w:t>Other</w:t>
+      </w:r>
+      <w:r>
+        <w:rPr>
+          <w:rFonts w:ascii="Arial" w:hAnsi="Arial" w:cs="Arial"/>
+          <w:sz w:val="20"/>
+          <w:szCs w:val="20"/>
+          <w:lang w:val="en-US"/>
+        </w:rPr>
+        <w:t xml:space="preserve">. For the Age Group Elders the Average Annual Income is </w:t>
+      </w:r>
+      <w:r>
+        <w:rPr>
+          <w:rFonts w:ascii="Arial" w:hAnsi="Arial" w:cs="Arial"/>
+          <w:sz w:val="20"/>
+          <w:szCs w:val="20"/>
+          <w:lang w:val="en-US"/>
+        </w:rPr>
+        <w:t>almost the same independently of the Gender. The Age Group Children is not shown in the graph as Children have no Income.</w:t>
+      </w:r>
+    </w:p>
     <w:sectPr>
-      <w:footerReference w:type="default" r:id="rId37"/>
+      <w:footerReference w:type="default" r:id="rId38"/>
       <w:pgSz w:w="11906" w:h="16838"/>
       <w:pgMar w:top="1440" w:right="1440" w:bottom="1440" w:left="1440" w:header="708" w:footer="708" w:gutter="0"/>
       <w:cols w:space="708"/>
@@ -17110,7 +17231,7 @@
                               <w:color w:val="808080" w:themeColor="background1" w:themeShade="80"/>
                               <w:sz w:val="20"/>
                               <w:szCs w:val="20"/>
-                              <w:lang w:val="en-US"/>
+                              <w:lang w:val="pt-PT"/>
                             </w:rPr>
                           </w:pPr>
                           <w:r>
@@ -17118,63 +17239,9 @@
                               <w:color w:val="808080" w:themeColor="background1" w:themeShade="80"/>
                               <w:sz w:val="20"/>
                               <w:szCs w:val="20"/>
-                              <w:lang w:val="en-US"/>
+                              <w:lang w:val="pt-PT"/>
                             </w:rPr>
-                            <w:t>Beatriz Alves 20241747</w:t>
-                          </w:r>
-                          <w:r>
-                            <w:rPr>
-                              <w:color w:val="808080" w:themeColor="background1" w:themeShade="80"/>
-                              <w:sz w:val="20"/>
-                              <w:szCs w:val="20"/>
-                              <w:lang w:val="en-US"/>
-                            </w:rPr>
-                            <w:t>,</w:t>
-                          </w:r>
-                          <w:r>
-                            <w:rPr>
-                              <w:color w:val="808080" w:themeColor="background1" w:themeShade="80"/>
-                              <w:sz w:val="20"/>
-                              <w:szCs w:val="20"/>
-                              <w:lang w:val="en-US"/>
-                            </w:rPr>
-                            <w:t xml:space="preserve"> Inês Caseiro 20241780</w:t>
-                          </w:r>
-                          <w:r>
-                            <w:rPr>
-                              <w:color w:val="808080" w:themeColor="background1" w:themeShade="80"/>
-                              <w:sz w:val="20"/>
-                              <w:szCs w:val="20"/>
-                              <w:lang w:val="en-US"/>
-                            </w:rPr>
-                            <w:t xml:space="preserve">, </w:t>
-                          </w:r>
-                          <w:r>
-                            <w:rPr>
-                              <w:color w:val="808080" w:themeColor="background1" w:themeShade="80"/>
-                              <w:sz w:val="20"/>
-                              <w:szCs w:val="20"/>
-                              <w:lang w:val="en-US"/>
-                            </w:rPr>
-                            <w:t>Inês Claro 20241760</w:t>
-                          </w:r>
-                          <w:r>
-                            <w:rPr>
-                              <w:color w:val="808080" w:themeColor="background1" w:themeShade="80"/>
-                              <w:sz w:val="20"/>
-                              <w:szCs w:val="20"/>
-                              <w:lang w:val="en-US"/>
-                            </w:rPr>
-                            <w:t>,</w:t>
-                          </w:r>
-                          <w:r>
-                            <w:rPr>
-                              <w:color w:val="808080" w:themeColor="background1" w:themeShade="80"/>
-                              <w:sz w:val="20"/>
-                              <w:szCs w:val="20"/>
-                              <w:lang w:val="en-US"/>
-                            </w:rPr>
-                            <w:t xml:space="preserve"> Marta Silva 20241822</w:t>
+                            <w:t>Beatriz Alves 20241747, Inês Caseiro 20241780, Inês Claro 20241760, Marta Silva 20241822</w:t>
                           </w:r>
                         </w:p>
                         <w:p>
@@ -17227,7 +17294,7 @@
                         <w:color w:val="808080" w:themeColor="background1" w:themeShade="80"/>
                         <w:sz w:val="20"/>
                         <w:szCs w:val="20"/>
-                        <w:lang w:val="en-US"/>
+                        <w:lang w:val="pt-PT"/>
                       </w:rPr>
                     </w:pPr>
                     <w:r>
@@ -17235,63 +17302,9 @@
                         <w:color w:val="808080" w:themeColor="background1" w:themeShade="80"/>
                         <w:sz w:val="20"/>
                         <w:szCs w:val="20"/>
-                        <w:lang w:val="en-US"/>
+                        <w:lang w:val="pt-PT"/>
                       </w:rPr>
-                      <w:t>Beatriz Alves 20241747</w:t>
-                    </w:r>
-                    <w:r>
-                      <w:rPr>
-                        <w:color w:val="808080" w:themeColor="background1" w:themeShade="80"/>
-                        <w:sz w:val="20"/>
-                        <w:szCs w:val="20"/>
-                        <w:lang w:val="en-US"/>
-                      </w:rPr>
-                      <w:t>,</w:t>
-                    </w:r>
-                    <w:r>
-                      <w:rPr>
-                        <w:color w:val="808080" w:themeColor="background1" w:themeShade="80"/>
-                        <w:sz w:val="20"/>
-                        <w:szCs w:val="20"/>
-                        <w:lang w:val="en-US"/>
-                      </w:rPr>
-                      <w:t xml:space="preserve"> Inês Caseiro 20241780</w:t>
-                    </w:r>
-                    <w:r>
-                      <w:rPr>
-                        <w:color w:val="808080" w:themeColor="background1" w:themeShade="80"/>
-                        <w:sz w:val="20"/>
-                        <w:szCs w:val="20"/>
-                        <w:lang w:val="en-US"/>
-                      </w:rPr>
-                      <w:t xml:space="preserve">, </w:t>
-                    </w:r>
-                    <w:r>
-                      <w:rPr>
-                        <w:color w:val="808080" w:themeColor="background1" w:themeShade="80"/>
-                        <w:sz w:val="20"/>
-                        <w:szCs w:val="20"/>
-                        <w:lang w:val="en-US"/>
-                      </w:rPr>
-                      <w:t>Inês Claro 20241760</w:t>
-                    </w:r>
-                    <w:r>
-                      <w:rPr>
-                        <w:color w:val="808080" w:themeColor="background1" w:themeShade="80"/>
-                        <w:sz w:val="20"/>
-                        <w:szCs w:val="20"/>
-                        <w:lang w:val="en-US"/>
-                      </w:rPr>
-                      <w:t>,</w:t>
-                    </w:r>
-                    <w:r>
-                      <w:rPr>
-                        <w:color w:val="808080" w:themeColor="background1" w:themeShade="80"/>
-                        <w:sz w:val="20"/>
-                        <w:szCs w:val="20"/>
-                        <w:lang w:val="en-US"/>
-                      </w:rPr>
-                      <w:t xml:space="preserve"> Marta Silva 20241822</w:t>
+                      <w:t>Beatriz Alves 20241747, Inês Caseiro 20241780, Inês Claro 20241760, Marta Silva 20241822</w:t>
                     </w:r>
                   </w:p>
                   <w:p>

</xml_diff>

<commit_message>
só por o texto justified
</commit_message>
<xml_diff>
--- a/report_data_preprocessing.docx
+++ b/report_data_preprocessing.docx
@@ -281,7 +281,6 @@
         </w:rPr>
         <w:t xml:space="preserve">as a </w:t>
       </w:r>
-      <w:proofErr w:type="gramStart"/>
       <w:r>
         <w:rPr>
           <w:rFonts w:ascii="Arial" w:hAnsi="Arial" w:cs="Arial"/>
@@ -336,7 +335,6 @@
         </w:rPr>
         <w:t>)</w:t>
       </w:r>
-      <w:proofErr w:type="gramEnd"/>
       <w:r>
         <w:rPr>
           <w:rFonts w:ascii="Arial" w:hAnsi="Arial" w:cs="Arial"/>
@@ -1275,7 +1273,7 @@
                 <v:stroke joinstyle="miter"/>
                 <v:path gradientshapeok="t" o:connecttype="rect"/>
               </v:shapetype>
-              <v:shape id="Text Box 1" o:spid="_x0000_s1026" type="#_x0000_t202" style="position:absolute;margin-left:163.15pt;margin-top:703pt;width:222.55pt;height:.05pt;z-index:251668480;visibility:visible;mso-wrap-style:none;mso-wrap-distance-left:9pt;mso-wrap-distance-top:0;mso-wrap-distance-right:9pt;mso-wrap-distance-bottom:0;mso-position-horizontal:absolute;mso-position-horizontal-relative:margin;mso-position-vertical:absolute;mso-position-vertical-relative:margin;v-text-anchor:top" o:gfxdata="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" stroked="f">
+              <v:shape id="Text Box 1" o:spid="_x0000_s1026" type="#_x0000_t202" style="position:absolute;margin-left:163.15pt;margin-top:703pt;width:222.55pt;height:.05pt;z-index:251668480;visibility:visible;mso-wrap-style:none;mso-wrap-distance-left:9pt;mso-wrap-distance-top:0;mso-wrap-distance-right:9pt;mso-wrap-distance-bottom:0;mso-position-horizontal:absolute;mso-position-horizontal-relative:margin;mso-position-vertical:absolute;mso-position-vertical-relative:margin;v-text-anchor:top" o:gfxdata="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" stroked="f">
                 <v:textbox style="mso-fit-shape-to-text:t" inset="0,0,0,0">
                   <w:txbxContent>
                     <w:p>
@@ -1426,7 +1424,7 @@
           </mc:Choice>
           <mc:Fallback>
             <w:pict>
-              <v:shape w14:anchorId="66D1AE61" id="_x0000_s1027" type="#_x0000_t202" style="position:absolute;left:0;text-align:left;margin-left:-9.95pt;margin-top:414.25pt;width:451.3pt;height:.05pt;z-index:251671552;visibility:visible;mso-wrap-style:square;mso-wrap-distance-left:9pt;mso-wrap-distance-top:0;mso-wrap-distance-right:9pt;mso-wrap-distance-bottom:0;mso-position-horizontal:absolute;mso-position-horizontal-relative:text;mso-position-vertical:absolute;mso-position-vertical-relative:text;v-text-anchor:top" o:gfxdata="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" stroked="f">
+              <v:shape w14:anchorId="66D1AE61" id="_x0000_s1027" type="#_x0000_t202" style="position:absolute;left:0;text-align:left;margin-left:-9.95pt;margin-top:414.25pt;width:451.3pt;height:.05pt;z-index:251671552;visibility:visible;mso-wrap-style:square;mso-wrap-distance-left:9pt;mso-wrap-distance-top:0;mso-wrap-distance-right:9pt;mso-wrap-distance-bottom:0;mso-position-horizontal:absolute;mso-position-horizontal-relative:text;mso-position-vertical:absolute;mso-position-vertical-relative:text;v-text-anchor:top" o:gfxdata="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" stroked="f">
                 <v:textbox style="mso-fit-shape-to-text:t" inset="0,0,0,0">
                   <w:txbxContent>
                     <w:p>
@@ -2729,7 +2727,6 @@
         </w:rPr>
         <w:t xml:space="preserve">issing </w:t>
       </w:r>
-      <w:proofErr w:type="gramStart"/>
       <w:r>
         <w:rPr>
           <w:rFonts w:ascii="Arial" w:hAnsi="Arial" w:cs="Arial"/>
@@ -2748,18 +2745,7 @@
           <w:sz w:val="20"/>
           <w:szCs w:val="20"/>
         </w:rPr>
-        <w:t>t</w:t>
-      </w:r>
-      <w:proofErr w:type="gramEnd"/>
-      <w:r>
-        <w:rPr>
-          <w:rFonts w:ascii="Arial" w:hAnsi="Arial" w:cs="Arial"/>
-          <w:b/>
-          <w:bCs/>
-          <w:sz w:val="20"/>
-          <w:szCs w:val="20"/>
-        </w:rPr>
-        <w:t xml:space="preserve"> </w:t>
+        <w:t xml:space="preserve">t </w:t>
       </w:r>
       <w:r>
         <w:rPr>
@@ -4126,29 +4112,7 @@
           <w:sz w:val="20"/>
           <w:szCs w:val="20"/>
         </w:rPr>
-        <w:t xml:space="preserve">Missing </w:t>
-      </w:r>
-      <w:proofErr w:type="gramStart"/>
-      <w:r>
-        <w:rPr>
-          <w:rFonts w:ascii="Arial" w:hAnsi="Arial" w:cs="Arial"/>
-          <w:b/>
-          <w:bCs/>
-          <w:sz w:val="20"/>
-          <w:szCs w:val="20"/>
-        </w:rPr>
-        <w:t>At</w:t>
-      </w:r>
-      <w:proofErr w:type="gramEnd"/>
-      <w:r>
-        <w:rPr>
-          <w:rFonts w:ascii="Arial" w:hAnsi="Arial" w:cs="Arial"/>
-          <w:b/>
-          <w:bCs/>
-          <w:sz w:val="20"/>
-          <w:szCs w:val="20"/>
-        </w:rPr>
-        <w:t xml:space="preserve"> Random</w:t>
+        <w:t>Missing At Random</w:t>
       </w:r>
       <w:r>
         <w:rPr>
@@ -4285,7 +4249,7 @@
           </mc:Choice>
           <mc:Fallback>
             <w:pict>
-              <v:shape w14:anchorId="74460961" id="_x0000_s1028" type="#_x0000_t202" style="position:absolute;left:0;text-align:left;margin-left:64.55pt;margin-top:192.95pt;width:354.6pt;height:.05pt;z-index:251673600;visibility:visible;mso-wrap-style:square;mso-wrap-distance-left:9pt;mso-wrap-distance-top:0;mso-wrap-distance-right:9pt;mso-wrap-distance-bottom:0;mso-position-horizontal:absolute;mso-position-horizontal-relative:text;mso-position-vertical:absolute;mso-position-vertical-relative:text;v-text-anchor:top" o:gfxdata="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" stroked="f">
+              <v:shape w14:anchorId="74460961" id="_x0000_s1028" type="#_x0000_t202" style="position:absolute;left:0;text-align:left;margin-left:64.55pt;margin-top:192.95pt;width:354.6pt;height:.05pt;z-index:251673600;visibility:visible;mso-wrap-style:square;mso-wrap-distance-left:9pt;mso-wrap-distance-top:0;mso-wrap-distance-right:9pt;mso-wrap-distance-bottom:0;mso-position-horizontal:absolute;mso-position-horizontal-relative:text;mso-position-vertical:absolute;mso-position-vertical-relative:text;v-text-anchor:top" o:gfxdata="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" stroked="f">
                 <v:textbox style="mso-fit-shape-to-text:t" inset="0,0,0,0">
                   <w:txbxContent>
                     <w:p>
@@ -5017,7 +4981,6 @@
         </w:rPr>
         <w:t xml:space="preserve">ot </w:t>
       </w:r>
-      <w:proofErr w:type="gramStart"/>
       <w:r>
         <w:rPr>
           <w:rFonts w:ascii="Garamond" w:hAnsi="Garamond"/>
@@ -5026,7 +4989,6 @@
         </w:rPr>
         <w:t>At</w:t>
       </w:r>
-      <w:proofErr w:type="gramEnd"/>
       <w:r>
         <w:rPr>
           <w:rFonts w:ascii="Garamond" w:hAnsi="Garamond"/>
@@ -5111,29 +5073,7 @@
           <w:sz w:val="20"/>
           <w:szCs w:val="20"/>
         </w:rPr>
-        <w:t xml:space="preserve">Missing Not </w:t>
-      </w:r>
-      <w:proofErr w:type="gramStart"/>
-      <w:r>
-        <w:rPr>
-          <w:rFonts w:ascii="Arial" w:hAnsi="Arial" w:cs="Arial"/>
-          <w:b/>
-          <w:bCs/>
-          <w:sz w:val="20"/>
-          <w:szCs w:val="20"/>
-        </w:rPr>
-        <w:t>At</w:t>
-      </w:r>
-      <w:proofErr w:type="gramEnd"/>
-      <w:r>
-        <w:rPr>
-          <w:rFonts w:ascii="Arial" w:hAnsi="Arial" w:cs="Arial"/>
-          <w:b/>
-          <w:bCs/>
-          <w:sz w:val="20"/>
-          <w:szCs w:val="20"/>
-        </w:rPr>
-        <w:t xml:space="preserve"> Random (MNAR) </w:t>
+        <w:t xml:space="preserve">Missing Not At Random (MNAR) </w:t>
       </w:r>
       <w:r>
         <w:rPr>
@@ -5297,7 +5237,7 @@
           </mc:Choice>
           <mc:Fallback>
             <w:pict>
-              <v:shape w14:anchorId="2980C777" id="_x0000_s1029" type="#_x0000_t202" style="position:absolute;left:0;text-align:left;margin-left:8.6pt;margin-top:722.05pt;width:451.3pt;height:.05pt;z-index:251677696;visibility:visible;mso-wrap-style:square;mso-wrap-distance-left:9pt;mso-wrap-distance-top:0;mso-wrap-distance-right:9pt;mso-wrap-distance-bottom:0;mso-position-horizontal:absolute;mso-position-horizontal-relative:margin;mso-position-vertical:absolute;mso-position-vertical-relative:margin;v-text-anchor:top" o:gfxdata="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" stroked="f">
+              <v:shape w14:anchorId="2980C777" id="_x0000_s1029" type="#_x0000_t202" style="position:absolute;left:0;text-align:left;margin-left:8.6pt;margin-top:722.05pt;width:451.3pt;height:.05pt;z-index:251677696;visibility:visible;mso-wrap-style:square;mso-wrap-distance-left:9pt;mso-wrap-distance-top:0;mso-wrap-distance-right:9pt;mso-wrap-distance-bottom:0;mso-position-horizontal:absolute;mso-position-horizontal-relative:margin;mso-position-vertical:absolute;mso-position-vertical-relative:margin;v-text-anchor:top" o:gfxdata="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" stroked="f">
                 <v:textbox style="mso-fit-shape-to-text:t" inset="0,0,0,0">
                   <w:txbxContent>
                     <w:p>
@@ -6036,7 +5976,7 @@
           </mc:Choice>
           <mc:Fallback>
             <w:pict>
-              <v:shape w14:anchorId="394D01FA" id="_x0000_s1030" type="#_x0000_t202" style="position:absolute;left:0;text-align:left;margin-left:235.55pt;margin-top:8.15pt;width:193.8pt;height:.05pt;z-index:251716608;visibility:visible;mso-wrap-style:square;mso-wrap-distance-left:9pt;mso-wrap-distance-top:0;mso-wrap-distance-right:9pt;mso-wrap-distance-bottom:0;mso-position-horizontal:absolute;mso-position-horizontal-relative:text;mso-position-vertical:absolute;mso-position-vertical-relative:text;v-text-anchor:top" o:gfxdata="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" stroked="f">
+              <v:shape w14:anchorId="394D01FA" id="_x0000_s1030" type="#_x0000_t202" style="position:absolute;left:0;text-align:left;margin-left:235.55pt;margin-top:8.15pt;width:193.8pt;height:.05pt;z-index:251716608;visibility:visible;mso-wrap-style:square;mso-wrap-distance-left:9pt;mso-wrap-distance-top:0;mso-wrap-distance-right:9pt;mso-wrap-distance-bottom:0;mso-position-horizontal:absolute;mso-position-horizontal-relative:text;mso-position-vertical:absolute;mso-position-vertical-relative:text;v-text-anchor:top" o:gfxdata="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" stroked="f">
                 <v:textbox style="mso-fit-shape-to-text:t" inset="0,0,0,0">
                   <w:txbxContent>
                     <w:p>
@@ -6389,7 +6329,7 @@
           </mc:Choice>
           <mc:Fallback>
             <w:pict>
-              <v:shape w14:anchorId="5D3A1955" id="_x0000_s1031" type="#_x0000_t202" style="position:absolute;left:0;text-align:left;margin-left:214.8pt;margin-top:1.65pt;width:209.35pt;height:.05pt;z-index:251718656;visibility:visible;mso-wrap-style:square;mso-wrap-distance-left:9pt;mso-wrap-distance-top:0;mso-wrap-distance-right:9pt;mso-wrap-distance-bottom:0;mso-position-horizontal:absolute;mso-position-horizontal-relative:text;mso-position-vertical:absolute;mso-position-vertical-relative:text;v-text-anchor:top" o:gfxdata="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" stroked="f">
+              <v:shape w14:anchorId="5D3A1955" id="_x0000_s1031" type="#_x0000_t202" style="position:absolute;left:0;text-align:left;margin-left:214.8pt;margin-top:1.65pt;width:209.35pt;height:.05pt;z-index:251718656;visibility:visible;mso-wrap-style:square;mso-wrap-distance-left:9pt;mso-wrap-distance-top:0;mso-wrap-distance-right:9pt;mso-wrap-distance-bottom:0;mso-position-horizontal:absolute;mso-position-horizontal-relative:text;mso-position-vertical:absolute;mso-position-vertical-relative:text;v-text-anchor:top" o:gfxdata="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" stroked="f">
                 <v:textbox style="mso-fit-shape-to-text:t" inset="0,0,0,0">
                   <w:txbxContent>
                     <w:p>
@@ -6764,7 +6704,7 @@
           </mc:Choice>
           <mc:Fallback>
             <w:pict>
-              <v:shape w14:anchorId="5E064FE6" id="_x0000_s1032" type="#_x0000_t202" style="position:absolute;left:0;text-align:left;margin-left:219.9pt;margin-top:24.85pt;width:209.4pt;height:.05pt;z-index:251720704;visibility:visible;mso-wrap-style:square;mso-wrap-distance-left:9pt;mso-wrap-distance-top:0;mso-wrap-distance-right:9pt;mso-wrap-distance-bottom:0;mso-position-horizontal:absolute;mso-position-horizontal-relative:text;mso-position-vertical:absolute;mso-position-vertical-relative:text;v-text-anchor:top" o:gfxdata="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" stroked="f">
+              <v:shape w14:anchorId="5E064FE6" id="_x0000_s1032" type="#_x0000_t202" style="position:absolute;left:0;text-align:left;margin-left:219.9pt;margin-top:24.85pt;width:209.4pt;height:.05pt;z-index:251720704;visibility:visible;mso-wrap-style:square;mso-wrap-distance-left:9pt;mso-wrap-distance-top:0;mso-wrap-distance-right:9pt;mso-wrap-distance-bottom:0;mso-position-horizontal:absolute;mso-position-horizontal-relative:text;mso-position-vertical:absolute;mso-position-vertical-relative:text;v-text-anchor:top" o:gfxdata="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" stroked="f">
                 <v:textbox style="mso-fit-shape-to-text:t" inset="0,0,0,0">
                   <w:txbxContent>
                     <w:p>
@@ -7166,7 +7106,7 @@
           </mc:Choice>
           <mc:Fallback>
             <w:pict>
-              <v:shape w14:anchorId="1B4740BE" id="_x0000_s1033" type="#_x0000_t202" style="position:absolute;left:0;text-align:left;margin-left:206.75pt;margin-top:18.9pt;width:248.25pt;height:.05pt;z-index:251722752;visibility:visible;mso-wrap-style:square;mso-width-percent:0;mso-wrap-distance-left:9pt;mso-wrap-distance-top:0;mso-wrap-distance-right:9pt;mso-wrap-distance-bottom:0;mso-position-horizontal:absolute;mso-position-horizontal-relative:text;mso-position-vertical:absolute;mso-position-vertical-relative:text;mso-width-percent:0;mso-width-relative:margin;v-text-anchor:top" o:gfxdata="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" stroked="f">
+              <v:shape w14:anchorId="1B4740BE" id="_x0000_s1033" type="#_x0000_t202" style="position:absolute;left:0;text-align:left;margin-left:206.75pt;margin-top:18.9pt;width:248.25pt;height:.05pt;z-index:251722752;visibility:visible;mso-wrap-style:square;mso-width-percent:0;mso-wrap-distance-left:9pt;mso-wrap-distance-top:0;mso-wrap-distance-right:9pt;mso-wrap-distance-bottom:0;mso-position-horizontal:absolute;mso-position-horizontal-relative:text;mso-position-vertical:absolute;mso-position-vertical-relative:text;mso-width-percent:0;mso-width-relative:margin;v-text-anchor:top" o:gfxdata="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" stroked="f">
                 <v:textbox style="mso-fit-shape-to-text:t" inset="0,0,0,0">
                   <w:txbxContent>
                     <w:p>
@@ -7529,7 +7469,7 @@
           </mc:Choice>
           <mc:Fallback>
             <w:pict>
-              <v:shape w14:anchorId="0DB80E8D" id="_x0000_s1034" type="#_x0000_t202" style="position:absolute;left:0;text-align:left;margin-left:210.65pt;margin-top:14.25pt;width:210.2pt;height:.05pt;z-index:251724800;visibility:visible;mso-wrap-style:square;mso-wrap-distance-left:9pt;mso-wrap-distance-top:0;mso-wrap-distance-right:9pt;mso-wrap-distance-bottom:0;mso-position-horizontal:absolute;mso-position-horizontal-relative:text;mso-position-vertical:absolute;mso-position-vertical-relative:text;v-text-anchor:top" o:gfxdata="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" stroked="f">
+              <v:shape w14:anchorId="0DB80E8D" id="_x0000_s1034" type="#_x0000_t202" style="position:absolute;left:0;text-align:left;margin-left:210.65pt;margin-top:14.25pt;width:210.2pt;height:.05pt;z-index:251724800;visibility:visible;mso-wrap-style:square;mso-wrap-distance-left:9pt;mso-wrap-distance-top:0;mso-wrap-distance-right:9pt;mso-wrap-distance-bottom:0;mso-position-horizontal:absolute;mso-position-horizontal-relative:text;mso-position-vertical:absolute;mso-position-vertical-relative:text;v-text-anchor:top" o:gfxdata="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" stroked="f">
                 <v:textbox style="mso-fit-shape-to-text:t" inset="0,0,0,0">
                   <w:txbxContent>
                     <w:p>
@@ -8083,7 +8023,7 @@
           <w:noProof/>
         </w:rPr>
         <w:drawing>
-          <wp:anchor distT="0" distB="0" distL="114300" distR="114300" simplePos="0" relativeHeight="251678720" behindDoc="0" locked="0" layoutInCell="1" allowOverlap="1" wp14:anchorId="0F6AE97E" wp14:editId="5400C69A">
+          <wp:anchor distT="0" distB="0" distL="114300" distR="114300" simplePos="0" relativeHeight="251678720" behindDoc="0" locked="0" layoutInCell="1" allowOverlap="1" wp14:anchorId="0F6AE97E" wp14:editId="7D0C6055">
             <wp:simplePos x="0" y="0"/>
             <wp:positionH relativeFrom="margin">
               <wp:posOffset>116205</wp:posOffset>
@@ -8279,7 +8219,7 @@
           </mc:Choice>
           <mc:Fallback>
             <w:pict>
-              <v:shape w14:anchorId="200F3775" id="_x0000_s1035" type="#_x0000_t202" style="position:absolute;margin-left:129.05pt;margin-top:717.8pt;width:215.4pt;height:.05pt;z-index:251686912;visibility:visible;mso-wrap-style:square;mso-wrap-distance-left:9pt;mso-wrap-distance-top:0;mso-wrap-distance-right:9pt;mso-wrap-distance-bottom:0;mso-position-horizontal:absolute;mso-position-horizontal-relative:margin;mso-position-vertical:absolute;mso-position-vertical-relative:margin;v-text-anchor:top" o:gfxdata="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" stroked="f">
+              <v:shape w14:anchorId="200F3775" id="_x0000_s1035" type="#_x0000_t202" style="position:absolute;margin-left:129.05pt;margin-top:717.8pt;width:215.4pt;height:.05pt;z-index:251686912;visibility:visible;mso-wrap-style:square;mso-wrap-distance-left:9pt;mso-wrap-distance-top:0;mso-wrap-distance-right:9pt;mso-wrap-distance-bottom:0;mso-position-horizontal:absolute;mso-position-horizontal-relative:margin;mso-position-vertical:absolute;mso-position-vertical-relative:margin;v-text-anchor:top" o:gfxdata="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" stroked="f">
                 <v:textbox style="mso-fit-shape-to-text:t" inset="0,0,0,0">
                   <w:txbxContent>
                     <w:p>
@@ -8812,7 +8752,7 @@
           </mc:Choice>
           <mc:Fallback>
             <w:pict>
-              <v:shape w14:anchorId="2FCCE975" id="_x0000_s1036" type="#_x0000_t202" style="position:absolute;margin-left:76.55pt;margin-top:18.3pt;width:296.6pt;height:.05pt;z-index:251688960;visibility:visible;mso-wrap-style:square;mso-width-percent:0;mso-wrap-distance-left:9pt;mso-wrap-distance-top:0;mso-wrap-distance-right:9pt;mso-wrap-distance-bottom:0;mso-position-horizontal:absolute;mso-position-horizontal-relative:text;mso-position-vertical:absolute;mso-position-vertical-relative:text;mso-width-percent:0;mso-width-relative:margin;v-text-anchor:top" o:gfxdata="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" stroked="f">
+              <v:shape w14:anchorId="2FCCE975" id="_x0000_s1036" type="#_x0000_t202" style="position:absolute;margin-left:76.55pt;margin-top:18.3pt;width:296.6pt;height:.05pt;z-index:251688960;visibility:visible;mso-wrap-style:square;mso-width-percent:0;mso-wrap-distance-left:9pt;mso-wrap-distance-top:0;mso-wrap-distance-right:9pt;mso-wrap-distance-bottom:0;mso-position-horizontal:absolute;mso-position-horizontal-relative:text;mso-position-vertical:absolute;mso-position-vertical-relative:text;mso-width-percent:0;mso-width-relative:margin;v-text-anchor:top" o:gfxdata="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" stroked="f">
                 <v:textbox style="mso-fit-shape-to-text:t" inset="0,0,0,0">
                   <w:txbxContent>
                     <w:p>
@@ -8975,7 +8915,7 @@
           <w:noProof/>
         </w:rPr>
         <w:drawing>
-          <wp:anchor distT="0" distB="0" distL="114300" distR="114300" simplePos="0" relativeHeight="251682816" behindDoc="0" locked="0" layoutInCell="1" allowOverlap="1" wp14:anchorId="2508838A" wp14:editId="513E098A">
+          <wp:anchor distT="0" distB="0" distL="114300" distR="114300" simplePos="0" relativeHeight="251682816" behindDoc="0" locked="0" layoutInCell="1" allowOverlap="1" wp14:anchorId="2508838A" wp14:editId="7004A3CA">
             <wp:simplePos x="0" y="0"/>
             <wp:positionH relativeFrom="margin">
               <wp:posOffset>241300</wp:posOffset>
@@ -9224,7 +9164,7 @@
           </mc:Choice>
           <mc:Fallback>
             <w:pict>
-              <v:shape w14:anchorId="2A229856" id="_x0000_s1037" type="#_x0000_t202" style="position:absolute;margin-left:57pt;margin-top:118.9pt;width:321.95pt;height:.05pt;z-index:251691008;visibility:visible;mso-wrap-style:square;mso-width-percent:0;mso-wrap-distance-left:9pt;mso-wrap-distance-top:0;mso-wrap-distance-right:9pt;mso-wrap-distance-bottom:0;mso-position-horizontal:absolute;mso-position-horizontal-relative:text;mso-position-vertical:absolute;mso-position-vertical-relative:text;mso-width-percent:0;mso-width-relative:margin;v-text-anchor:top" o:gfxdata="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" stroked="f">
+              <v:shape w14:anchorId="2A229856" id="_x0000_s1037" type="#_x0000_t202" style="position:absolute;margin-left:57pt;margin-top:118.9pt;width:321.95pt;height:.05pt;z-index:251691008;visibility:visible;mso-wrap-style:square;mso-width-percent:0;mso-wrap-distance-left:9pt;mso-wrap-distance-top:0;mso-wrap-distance-right:9pt;mso-wrap-distance-bottom:0;mso-position-horizontal:absolute;mso-position-horizontal-relative:text;mso-position-vertical:absolute;mso-position-vertical-relative:text;mso-width-percent:0;mso-width-relative:margin;v-text-anchor:top" o:gfxdata="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" stroked="f">
                 <v:textbox style="mso-fit-shape-to-text:t" inset="0,0,0,0">
                   <w:txbxContent>
                     <w:p>
@@ -9561,7 +9501,7 @@
           </mc:Choice>
           <mc:Fallback>
             <w:pict>
-              <v:shape w14:anchorId="4C8E2777" id="_x0000_s1038" type="#_x0000_t202" style="position:absolute;left:0;text-align:left;margin-left:220.9pt;margin-top:21.5pt;width:217.55pt;height:.05pt;z-index:251727872;visibility:visible;mso-wrap-style:square;mso-wrap-distance-left:9pt;mso-wrap-distance-top:0;mso-wrap-distance-right:9pt;mso-wrap-distance-bottom:0;mso-position-horizontal:absolute;mso-position-horizontal-relative:text;mso-position-vertical:absolute;mso-position-vertical-relative:text;v-text-anchor:top" o:gfxdata="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" stroked="f">
+              <v:shape w14:anchorId="4C8E2777" id="_x0000_s1038" type="#_x0000_t202" style="position:absolute;left:0;text-align:left;margin-left:220.9pt;margin-top:21.5pt;width:217.55pt;height:.05pt;z-index:251727872;visibility:visible;mso-wrap-style:square;mso-wrap-distance-left:9pt;mso-wrap-distance-top:0;mso-wrap-distance-right:9pt;mso-wrap-distance-bottom:0;mso-position-horizontal:absolute;mso-position-horizontal-relative:text;mso-position-vertical:absolute;mso-position-vertical-relative:text;v-text-anchor:top" o:gfxdata="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" stroked="f">
                 <v:textbox style="mso-fit-shape-to-text:t" inset="0,0,0,0">
                   <w:txbxContent>
                     <w:p>
@@ -10036,7 +9976,7 @@
           </mc:Choice>
           <mc:Fallback>
             <w:pict>
-              <v:shape w14:anchorId="73474467" id="_x0000_s1039" type="#_x0000_t202" style="position:absolute;margin-left:325.2pt;margin-top:79.85pt;width:126.35pt;height:.05pt;z-index:251693056;visibility:visible;mso-wrap-style:square;mso-width-percent:0;mso-wrap-distance-left:9pt;mso-wrap-distance-top:0;mso-wrap-distance-right:9pt;mso-wrap-distance-bottom:0;mso-position-horizontal:absolute;mso-position-horizontal-relative:margin;mso-position-vertical:absolute;mso-position-vertical-relative:margin;mso-width-percent:0;mso-width-relative:margin;v-text-anchor:top" o:gfxdata="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" stroked="f">
+              <v:shape w14:anchorId="73474467" id="_x0000_s1039" type="#_x0000_t202" style="position:absolute;margin-left:325.2pt;margin-top:79.85pt;width:126.35pt;height:.05pt;z-index:251693056;visibility:visible;mso-wrap-style:square;mso-width-percent:0;mso-wrap-distance-left:9pt;mso-wrap-distance-top:0;mso-wrap-distance-right:9pt;mso-wrap-distance-bottom:0;mso-position-horizontal:absolute;mso-position-horizontal-relative:margin;mso-position-vertical:absolute;mso-position-vertical-relative:margin;mso-width-percent:0;mso-width-relative:margin;v-text-anchor:top" o:gfxdata="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" stroked="f">
                 <v:textbox style="mso-fit-shape-to-text:t" inset="0,0,0,0">
                   <w:txbxContent>
                     <w:p>
@@ -10468,7 +10408,7 @@
           </mc:Choice>
           <mc:Fallback>
             <w:pict>
-              <v:shape w14:anchorId="5A61769C" id="_x0000_s1040" type="#_x0000_t202" style="position:absolute;left:0;text-align:left;margin-left:199.25pt;margin-top:17.45pt;width:230.4pt;height:.05pt;z-index:251695104;visibility:visible;mso-wrap-style:square;mso-wrap-distance-left:9pt;mso-wrap-distance-top:0;mso-wrap-distance-right:9pt;mso-wrap-distance-bottom:0;mso-position-horizontal:absolute;mso-position-horizontal-relative:text;mso-position-vertical:absolute;mso-position-vertical-relative:text;v-text-anchor:top" o:gfxdata="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" stroked="f">
+              <v:shape w14:anchorId="5A61769C" id="_x0000_s1040" type="#_x0000_t202" style="position:absolute;left:0;text-align:left;margin-left:199.25pt;margin-top:17.45pt;width:230.4pt;height:.05pt;z-index:251695104;visibility:visible;mso-wrap-style:square;mso-wrap-distance-left:9pt;mso-wrap-distance-top:0;mso-wrap-distance-right:9pt;mso-wrap-distance-bottom:0;mso-position-horizontal:absolute;mso-position-horizontal-relative:text;mso-position-vertical:absolute;mso-position-vertical-relative:text;v-text-anchor:top" o:gfxdata="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" stroked="f">
                 <v:textbox style="mso-fit-shape-to-text:t" inset="0,0,0,0">
                   <w:txbxContent>
                     <w:p>
@@ -10926,7 +10866,7 @@
           </mc:Choice>
           <mc:Fallback>
             <w:pict>
-              <v:shape w14:anchorId="2419FD0A" id="_x0000_s1041" type="#_x0000_t202" style="position:absolute;left:0;text-align:left;margin-left:108.2pt;margin-top:19.9pt;width:230.4pt;height:.05pt;z-index:251699200;visibility:visible;mso-wrap-style:square;mso-wrap-distance-left:9pt;mso-wrap-distance-top:0;mso-wrap-distance-right:9pt;mso-wrap-distance-bottom:0;mso-position-horizontal:absolute;mso-position-horizontal-relative:text;mso-position-vertical:absolute;mso-position-vertical-relative:text;v-text-anchor:top" o:gfxdata="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" stroked="f">
+              <v:shape w14:anchorId="2419FD0A" id="_x0000_s1041" type="#_x0000_t202" style="position:absolute;left:0;text-align:left;margin-left:108.2pt;margin-top:19.9pt;width:230.4pt;height:.05pt;z-index:251699200;visibility:visible;mso-wrap-style:square;mso-wrap-distance-left:9pt;mso-wrap-distance-top:0;mso-wrap-distance-right:9pt;mso-wrap-distance-bottom:0;mso-position-horizontal:absolute;mso-position-horizontal-relative:text;mso-position-vertical:absolute;mso-position-vertical-relative:text;v-text-anchor:top" o:gfxdata="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" stroked="f">
                 <v:textbox style="mso-fit-shape-to-text:t" inset="0,0,0,0">
                   <w:txbxContent>
                     <w:p>
@@ -18697,6 +18637,7 @@
     </w:p>
     <w:p>
       <w:pPr>
+        <w:jc w:val="both"/>
         <w:rPr>
           <w:rFonts w:ascii="Arial" w:hAnsi="Arial" w:cs="Arial"/>
           <w:sz w:val="20"/>
@@ -18887,20 +18828,61 @@
           <w:szCs w:val="20"/>
           <w:lang w:val="en-US"/>
         </w:rPr>
-        <w:t xml:space="preserve">. For the Age Group Elders the Average Annual Income is </w:t>
-      </w:r>
-      <w:r>
-        <w:rPr>
-          <w:rFonts w:ascii="Arial" w:hAnsi="Arial" w:cs="Arial"/>
-          <w:sz w:val="20"/>
-          <w:szCs w:val="20"/>
-          <w:lang w:val="en-US"/>
-        </w:rPr>
-        <w:t>almost the same independently of the Gender. The Age Group Children is not shown in the graph as Children have no Income.</w:t>
-      </w:r>
-    </w:p>
-    <w:p>
-      <w:pPr>
+        <w:t xml:space="preserve">. For the Age Group </w:t>
+      </w:r>
+      <w:r>
+        <w:rPr>
+          <w:rFonts w:ascii="Arial" w:hAnsi="Arial" w:cs="Arial"/>
+          <w:b/>
+          <w:bCs/>
+          <w:sz w:val="20"/>
+          <w:szCs w:val="20"/>
+          <w:lang w:val="en-US"/>
+        </w:rPr>
+        <w:t>Elders</w:t>
+      </w:r>
+      <w:r>
+        <w:rPr>
+          <w:rFonts w:ascii="Arial" w:hAnsi="Arial" w:cs="Arial"/>
+          <w:sz w:val="20"/>
+          <w:szCs w:val="20"/>
+          <w:lang w:val="en-US"/>
+        </w:rPr>
+        <w:t xml:space="preserve"> the Average Annual Income is </w:t>
+      </w:r>
+      <w:r>
+        <w:rPr>
+          <w:rFonts w:ascii="Arial" w:hAnsi="Arial" w:cs="Arial"/>
+          <w:sz w:val="20"/>
+          <w:szCs w:val="20"/>
+          <w:lang w:val="en-US"/>
+        </w:rPr>
+        <w:t xml:space="preserve">almost the same independently of the Gender. The Age Group </w:t>
+      </w:r>
+      <w:r>
+        <w:rPr>
+          <w:rFonts w:ascii="Arial" w:hAnsi="Arial" w:cs="Arial"/>
+          <w:b/>
+          <w:bCs/>
+          <w:sz w:val="20"/>
+          <w:szCs w:val="20"/>
+          <w:lang w:val="en-US"/>
+        </w:rPr>
+        <w:t>Children</w:t>
+      </w:r>
+      <w:r>
+        <w:rPr>
+          <w:rFonts w:ascii="Arial" w:hAnsi="Arial" w:cs="Arial"/>
+          <w:sz w:val="20"/>
+          <w:szCs w:val="20"/>
+          <w:lang w:val="en-US"/>
+        </w:rPr>
+        <w:t xml:space="preserve"> is not shown in the graph as Children have no Income.</w:t>
+      </w:r>
+    </w:p>
+    <w:p>
+      <w:pPr>
+        <w:jc w:val="both"/>
         <w:rPr>
           <w:rFonts w:ascii="Garamond" w:hAnsi="Garamond"/>
           <w:b/>
@@ -18925,6 +18907,7 @@
     <w:p>
       <w:pPr>
         <w:ind w:firstLine="720"/>
+        <w:jc w:val="both"/>
         <w:rPr>
           <w:rFonts w:ascii="Arial" w:hAnsi="Arial" w:cs="Arial"/>
           <w:sz w:val="20"/>
@@ -19232,7 +19215,7 @@
               <v:stroke joinstyle="miter"/>
               <v:path gradientshapeok="t" o:connecttype="rect"/>
             </v:shapetype>
-            <v:shape id="Text Box 157" o:spid="_x0000_s1041" type="#_x0000_t202" style="position:absolute;left:0;text-align:left;margin-left:-59.35pt;margin-top:19.25pt;width:421.5pt;height:32.1pt;z-index:251659264;visibility:visible;mso-wrap-style:square;mso-wrap-distance-left:9pt;mso-wrap-distance-top:0;mso-wrap-distance-right:9pt;mso-wrap-distance-bottom:0;mso-position-horizontal:absolute;mso-position-horizontal-relative:text;mso-position-vertical:absolute;mso-position-vertical-relative:text;v-text-anchor:top" o:gfxdata="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" filled="f" stroked="f" strokeweight=".5pt">
+            <v:shape id="Text Box 157" o:spid="_x0000_s1042" type="#_x0000_t202" style="position:absolute;left:0;text-align:left;margin-left:-59.35pt;margin-top:19.25pt;width:421.5pt;height:32.1pt;z-index:251659264;visibility:visible;mso-wrap-style:square;mso-wrap-distance-left:9pt;mso-wrap-distance-top:0;mso-wrap-distance-right:9pt;mso-wrap-distance-bottom:0;mso-position-horizontal:absolute;mso-position-horizontal-relative:text;mso-position-vertical:absolute;mso-position-vertical-relative:text;v-text-anchor:top" o:gfxdata="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" filled="f" stroked="f" strokeweight=".5pt">
               <v:textbox style="mso-fit-shape-to-text:t" inset="0,,0">
                 <w:txbxContent>
                   <w:p>

</xml_diff>